<commit_message>
docs: refactor Section 6 discussion for clarity and aseptic tone
</commit_message>
<xml_diff>
--- a/Articulo_Cientifico_IMJETA_Final.docx
+++ b/Articulo_Cientifico_IMJETA_Final.docx
@@ -4884,20 +4884,15 @@
       <w:pPr>
         <w:spacing w:after="80" w:line="240" w:lineRule="auto"/>
       </w:pPr>
-      <w:r>
-        <w:rPr>
-          <w:rFonts w:ascii="Book Antiqua" w:hAnsi="Book Antiqua"/>
-          <w:color w:val="000000"/>
-        </w:rPr>
-        <w:t xml:space="preserve">Los resultados empíricos demuestran que la mitigación basada en GeoAlchemy2 y validación previa con Shapely introduce un overhead de latencia media de apenas 2.63 milisegundos por petición (+15.24%), manteniendo un throughput de 484.36 </w:t>
-      </w:r>
-      <w:r>
-        <w:rPr>
-          <w:rFonts w:ascii="Book Antiqua" w:hAnsi="Book Antiqua"/>
-          <w:color w:val="000000"/>
-        </w:rPr>
-        <w:lastRenderedPageBreak/>
-        <w:t>peticiones por segundo. Particularmente notable es la reducción en la latencia de cola en el percentil 99 (p99), que pasó de 43.75 ms a 38.24 ms (-12.59%), lo cual se atribuye a la reutilización eficiente de planes de ejecución compilados (prepared statements) en PostgreSQL al evitar el re-parseo continuo de consultas dinámicas. Este incremento marginal en el promedio es insignificante frente a la ganancia de seguridad, neutralizando la exfiltración masiva de datos catastrales, el canal lateral de error y la denegación de servicio espacial. Se concluye que los WAFs tradicionales son ineficaces ante payloads espaciales, demandando esquemas de validación sintáctica con conciencia espacial integrados en el código de la aplicación.</w:t>
+      <w:r/>
+      <w:r>
+        <w:rPr>
+          <w:rFonts w:ascii="Book Antiqua" w:hAnsi="Book Antiqua"/>
+          <w:b w:val="0"/>
+          <w:i w:val="0"/>
+          <w:sz w:val="22"/>
+        </w:rPr>
+        <w:t>Los resultados experimentales confirman que la arquitectura propuesta (GeoAlchemy2 junto a la validación previa en Shapely) introduce un sobrecosto medio de latencia de 2.63 ms por petición (+15.24%), conservando una tasa de procesamiento de 484.36 req/s. Un aspecto relevante para el diseño de software es el comportamiento en el percentil 99 (p99): la latencia de cola disminuyó de 43.75 ms a 38.24 ms, lo que representa una mejora del 12.59% en la estabilidad del servicio. Esta optimización se debe a que PostgreSQL reutiliza los planes de ejecución en memoria (prepared statements), eliminando el costo recurrente de re-analizar sintácticamente las consultas dinámicas.</w:t>
       </w:r>
     </w:p>
     <w:p>
@@ -4905,12 +4900,15 @@
         <w:spacing w:after="80" w:line="240" w:lineRule="auto"/>
         <w:ind w:firstLine="432"/>
       </w:pPr>
-      <w:r>
-        <w:rPr>
-          <w:rFonts w:ascii="Book Antiqua" w:hAnsi="Book Antiqua"/>
-          <w:color w:val="000000"/>
-        </w:rPr>
-        <w:t>La Figure 4 sintetiza la tasa de mitigación y bloqueo de ataques (%) a través de los seis vectores evaluados, contrastando una arquitectura desprotegida, un WAF tradicional basado en firmas (OWASP ModSecurity Core Rule Set) y el pipeline propuesto. Mientras que el WAF genérico no logra identificar los ataques espaciales (0% a 20% de bloqueo en vectores topológicos como ST_DWithin y ST_Intersects al carecer de gramática geoespacial), el pipeline de tres barreras logra un bloqueo completo del 100% en todos los vectores evaluados de la tríada CIA.</w:t>
+      <w:r/>
+      <w:r>
+        <w:rPr>
+          <w:rFonts w:ascii="Book Antiqua" w:hAnsi="Book Antiqua"/>
+          <w:b w:val="0"/>
+          <w:i w:val="0"/>
+          <w:sz w:val="22"/>
+        </w:rPr>
+        <w:t>Este sobrecosto medio resulta plenamente asumible frente a las garantías de protección obtenidas: neutraliza la exfiltración masiva de predios, los canales laterales de error y la denegación de servicio espacial. Como se ilustra en la Figura 4, los cortafuegos de aplicaciones web tradicionales (WAF basados en firmas como OWASP CRS) carecen de gramática geoespacial y bloquean únicamente entre el 0% y el 20% de las inyecciones topológicas (ST_DWithin y ST_Intersects). En contraste, el pipeline de tres barreras implementado en la capa de aplicación alcanzó una tasa de mitigación del 100% en todos los vectores evaluados de la tríada CIA.</w:t>
       </w:r>
     </w:p>
     <w:p>

</xml_diff>

<commit_message>
chore: save author working progress before refactoring discussion subsections
</commit_message>
<xml_diff>
--- a/Articulo_Cientifico_IMJETA_Final.docx
+++ b/Articulo_Cientifico_IMJETA_Final.docx
@@ -317,7 +317,7 @@
           <w:color w:val="000000"/>
           <w:sz w:val="20"/>
         </w:rPr>
-        <w:t xml:space="preserve"> de bases de datos espaciales en arquitecturas web ha ampliado la superficie de ataque para las aplicaciones modernas; sin embargo, </w:t>
+        <w:t xml:space="preserve"> de bases de datos espaciales en arquitecturas web ha ampliado la superficie de ataque para las aplicaciones </w:t>
       </w:r>
       <w:proofErr w:type="spellStart"/>
       <w:r>
@@ -326,6 +326,24 @@
           <w:color w:val="000000"/>
           <w:sz w:val="20"/>
         </w:rPr>
+        <w:t>modernas</w:t>
+      </w:r>
+      <w:proofErr w:type="spellEnd"/>
+      <w:r>
+        <w:rPr>
+          <w:rFonts w:ascii="Book Antiqua" w:hAnsi="Book Antiqua"/>
+          <w:color w:val="000000"/>
+          <w:sz w:val="20"/>
+        </w:rPr>
+        <w:t xml:space="preserve">; sin embargo, </w:t>
+      </w:r>
+      <w:proofErr w:type="spellStart"/>
+      <w:r>
+        <w:rPr>
+          <w:rFonts w:ascii="Book Antiqua" w:hAnsi="Book Antiqua"/>
+          <w:color w:val="000000"/>
+          <w:sz w:val="20"/>
+        </w:rPr>
         <w:t>los</w:t>
       </w:r>
       <w:proofErr w:type="spellEnd"/>
@@ -389,7 +407,7 @@
           <w:color w:val="000000"/>
           <w:sz w:val="20"/>
         </w:rPr>
-        <w:t xml:space="preserve"> SQL espaciales siguen estando poco explorados. Este artículo investiga la explotación y mitigación de inyecciones SQL espaciales dentro de sistemas de información catastral que utilizan PostGIS. Se desarrolló un entorno de prueba en contenedores, utilizando Docker, para simular </w:t>
+        <w:t xml:space="preserve"> SQL </w:t>
       </w:r>
       <w:proofErr w:type="spellStart"/>
       <w:r>
@@ -398,6 +416,60 @@
           <w:color w:val="000000"/>
           <w:sz w:val="20"/>
         </w:rPr>
+        <w:t>espaciales</w:t>
+      </w:r>
+      <w:proofErr w:type="spellEnd"/>
+      <w:r>
+        <w:rPr>
+          <w:rFonts w:ascii="Book Antiqua" w:hAnsi="Book Antiqua"/>
+          <w:color w:val="000000"/>
+          <w:sz w:val="20"/>
+        </w:rPr>
+        <w:t xml:space="preserve"> </w:t>
+      </w:r>
+      <w:proofErr w:type="spellStart"/>
+      <w:r>
+        <w:rPr>
+          <w:rFonts w:ascii="Book Antiqua" w:hAnsi="Book Antiqua"/>
+          <w:color w:val="000000"/>
+          <w:sz w:val="20"/>
+        </w:rPr>
+        <w:t>siguen</w:t>
+      </w:r>
+      <w:proofErr w:type="spellEnd"/>
+      <w:r>
+        <w:rPr>
+          <w:rFonts w:ascii="Book Antiqua" w:hAnsi="Book Antiqua"/>
+          <w:color w:val="000000"/>
+          <w:sz w:val="20"/>
+        </w:rPr>
+        <w:t xml:space="preserve"> estando poco explorados. Este artículo investiga la explotación y mitigación de inyecciones SQL espaciales dentro de sistemas de información catastral que utilizan PostGIS. Se desarrolló un entorno de prueba en contenedores, utilizando Docker, para </w:t>
+      </w:r>
+      <w:proofErr w:type="spellStart"/>
+      <w:r>
+        <w:rPr>
+          <w:rFonts w:ascii="Book Antiqua" w:hAnsi="Book Antiqua"/>
+          <w:color w:val="000000"/>
+          <w:sz w:val="20"/>
+        </w:rPr>
+        <w:t>simular</w:t>
+      </w:r>
+      <w:proofErr w:type="spellEnd"/>
+      <w:r>
+        <w:rPr>
+          <w:rFonts w:ascii="Book Antiqua" w:hAnsi="Book Antiqua"/>
+          <w:color w:val="000000"/>
+          <w:sz w:val="20"/>
+        </w:rPr>
+        <w:t xml:space="preserve"> </w:t>
+      </w:r>
+      <w:proofErr w:type="spellStart"/>
+      <w:r>
+        <w:rPr>
+          <w:rFonts w:ascii="Book Antiqua" w:hAnsi="Book Antiqua"/>
+          <w:color w:val="000000"/>
+          <w:sz w:val="20"/>
+        </w:rPr>
         <w:t>una</w:t>
       </w:r>
       <w:proofErr w:type="spellEnd"/>
@@ -443,7 +515,7 @@
           <w:color w:val="000000"/>
           <w:sz w:val="20"/>
         </w:rPr>
-        <w:t xml:space="preserve"> con Python (FastAPI) y PostgreSQL/PostGIS. El estudio demuestra cómo los atacantes pueden aprovechar </w:t>
+        <w:t xml:space="preserve"> con Python (</w:t>
       </w:r>
       <w:proofErr w:type="spellStart"/>
       <w:r>
@@ -452,6 +524,78 @@
           <w:color w:val="000000"/>
           <w:sz w:val="20"/>
         </w:rPr>
+        <w:t>FastAPI</w:t>
+      </w:r>
+      <w:proofErr w:type="spellEnd"/>
+      <w:r>
+        <w:rPr>
+          <w:rFonts w:ascii="Book Antiqua" w:hAnsi="Book Antiqua"/>
+          <w:color w:val="000000"/>
+          <w:sz w:val="20"/>
+        </w:rPr>
+        <w:t xml:space="preserve">) y PostgreSQL/PostGIS. El estudio demuestra cómo los </w:t>
+      </w:r>
+      <w:proofErr w:type="spellStart"/>
+      <w:r>
+        <w:rPr>
+          <w:rFonts w:ascii="Book Antiqua" w:hAnsi="Book Antiqua"/>
+          <w:color w:val="000000"/>
+          <w:sz w:val="20"/>
+        </w:rPr>
+        <w:t>atacantes</w:t>
+      </w:r>
+      <w:proofErr w:type="spellEnd"/>
+      <w:r>
+        <w:rPr>
+          <w:rFonts w:ascii="Book Antiqua" w:hAnsi="Book Antiqua"/>
+          <w:color w:val="000000"/>
+          <w:sz w:val="20"/>
+        </w:rPr>
+        <w:t xml:space="preserve"> </w:t>
+      </w:r>
+      <w:proofErr w:type="spellStart"/>
+      <w:r>
+        <w:rPr>
+          <w:rFonts w:ascii="Book Antiqua" w:hAnsi="Book Antiqua"/>
+          <w:color w:val="000000"/>
+          <w:sz w:val="20"/>
+        </w:rPr>
+        <w:t>pueden</w:t>
+      </w:r>
+      <w:proofErr w:type="spellEnd"/>
+      <w:r>
+        <w:rPr>
+          <w:rFonts w:ascii="Book Antiqua" w:hAnsi="Book Antiqua"/>
+          <w:color w:val="000000"/>
+          <w:sz w:val="20"/>
+        </w:rPr>
+        <w:t xml:space="preserve"> </w:t>
+      </w:r>
+      <w:proofErr w:type="spellStart"/>
+      <w:r>
+        <w:rPr>
+          <w:rFonts w:ascii="Book Antiqua" w:hAnsi="Book Antiqua"/>
+          <w:color w:val="000000"/>
+          <w:sz w:val="20"/>
+        </w:rPr>
+        <w:t>aprovechar</w:t>
+      </w:r>
+      <w:proofErr w:type="spellEnd"/>
+      <w:r>
+        <w:rPr>
+          <w:rFonts w:ascii="Book Antiqua" w:hAnsi="Book Antiqua"/>
+          <w:color w:val="000000"/>
+          <w:sz w:val="20"/>
+        </w:rPr>
+        <w:t xml:space="preserve"> </w:t>
+      </w:r>
+      <w:proofErr w:type="spellStart"/>
+      <w:r>
+        <w:rPr>
+          <w:rFonts w:ascii="Book Antiqua" w:hAnsi="Book Antiqua"/>
+          <w:color w:val="000000"/>
+          <w:sz w:val="20"/>
+        </w:rPr>
         <w:t>funciones</w:t>
       </w:r>
       <w:proofErr w:type="spellEnd"/>
@@ -531,7 +675,25 @@
           <w:color w:val="000000"/>
           <w:sz w:val="20"/>
         </w:rPr>
-        <w:t xml:space="preserve"> que el pipeline propuesto neutralizó el 100% de los vectores de ataque con un </w:t>
+        <w:t xml:space="preserve"> que el pipeline propuesto neutralizó el 100% de los vectores de </w:t>
+      </w:r>
+      <w:proofErr w:type="spellStart"/>
+      <w:r>
+        <w:rPr>
+          <w:rFonts w:ascii="Book Antiqua" w:hAnsi="Book Antiqua"/>
+          <w:color w:val="000000"/>
+          <w:sz w:val="20"/>
+        </w:rPr>
+        <w:t>ataque</w:t>
+      </w:r>
+      <w:proofErr w:type="spellEnd"/>
+      <w:r>
+        <w:rPr>
+          <w:rFonts w:ascii="Book Antiqua" w:hAnsi="Book Antiqua"/>
+          <w:color w:val="000000"/>
+          <w:sz w:val="20"/>
+        </w:rPr>
+        <w:t xml:space="preserve"> con un </w:t>
       </w:r>
       <w:proofErr w:type="spellStart"/>
       <w:r>
@@ -625,7 +787,23 @@
           <w:color w:val="000000"/>
         </w:rPr>
         <w:lastRenderedPageBreak/>
-        <w:t xml:space="preserve">ámbito, PostgreSQL junto a su extensión espacial PostGIS constituyen la solución de </w:t>
+        <w:t xml:space="preserve">ámbito, PostgreSQL junto a su extensión espacial PostGIS constituyen la </w:t>
+      </w:r>
+      <w:proofErr w:type="spellStart"/>
+      <w:r>
+        <w:rPr>
+          <w:rFonts w:ascii="Book Antiqua" w:hAnsi="Book Antiqua"/>
+          <w:color w:val="000000"/>
+        </w:rPr>
+        <w:t>solución</w:t>
+      </w:r>
+      <w:proofErr w:type="spellEnd"/>
+      <w:r>
+        <w:rPr>
+          <w:rFonts w:ascii="Book Antiqua" w:hAnsi="Book Antiqua"/>
+          <w:color w:val="000000"/>
+        </w:rPr>
+        <w:t xml:space="preserve"> de </w:t>
       </w:r>
       <w:proofErr w:type="spellStart"/>
       <w:r>
@@ -718,7 +896,39 @@
           <w:rFonts w:ascii="Book Antiqua" w:hAnsi="Book Antiqua"/>
           <w:color w:val="000000"/>
         </w:rPr>
-        <w:t xml:space="preserve">Sin embargo, la exposición de estos servicios mediante APIs REST introduce vectores de ataque cuando las consultas se construyen mediante concatenación de cadenas dentro de funciones espaciales. Si bien la inyección SQL clásica ha sido ampliamente documentada (Clarke, 2012; Halfond et al., 2006), la manipulación de operadores geométricos de PostGIS —como ST_DWithin, ST_Intersects o </w:t>
+        <w:t xml:space="preserve">Sin embargo, la exposición de estos servicios mediante APIs REST introduce vectores de ataque cuando las consultas se construyen mediante concatenación de cadenas dentro de funciones espaciales. Si bien la inyección SQL clásica ha sido ampliamente documentada (Clarke, 2012; Halfond et al., 2006), la manipulación de operadores geométricos de PostGIS —como </w:t>
+      </w:r>
+      <w:proofErr w:type="spellStart"/>
+      <w:r>
+        <w:rPr>
+          <w:rFonts w:ascii="Book Antiqua" w:hAnsi="Book Antiqua"/>
+          <w:color w:val="000000"/>
+        </w:rPr>
+        <w:t>ST_DWithin</w:t>
+      </w:r>
+      <w:proofErr w:type="spellEnd"/>
+      <w:r>
+        <w:rPr>
+          <w:rFonts w:ascii="Book Antiqua" w:hAnsi="Book Antiqua"/>
+          <w:color w:val="000000"/>
+        </w:rPr>
+        <w:t xml:space="preserve">, </w:t>
+      </w:r>
+      <w:proofErr w:type="spellStart"/>
+      <w:r>
+        <w:rPr>
+          <w:rFonts w:ascii="Book Antiqua" w:hAnsi="Book Antiqua"/>
+          <w:color w:val="000000"/>
+        </w:rPr>
+        <w:t>ST_Intersects</w:t>
+      </w:r>
+      <w:proofErr w:type="spellEnd"/>
+      <w:r>
+        <w:rPr>
+          <w:rFonts w:ascii="Book Antiqua" w:hAnsi="Book Antiqua"/>
+          <w:color w:val="000000"/>
+        </w:rPr>
+        <w:t xml:space="preserve"> o </w:t>
       </w:r>
       <w:proofErr w:type="spellStart"/>
       <w:r>
@@ -798,7 +1008,39 @@
           <w:rFonts w:ascii="Book Antiqua" w:hAnsi="Book Antiqua"/>
           <w:color w:val="000000"/>
         </w:rPr>
-        <w:t xml:space="preserve"> entrada no saneada no solo permite eludir filtros relacionales o exfiltrar datos, sino también desencadenar estados de denegación de servicio </w:t>
+        <w:t xml:space="preserve"> entrada no saneada no solo permite eludir filtros relacionales o exfiltrar datos, sino también desencadenar estados de </w:t>
+      </w:r>
+      <w:proofErr w:type="spellStart"/>
+      <w:r>
+        <w:rPr>
+          <w:rFonts w:ascii="Book Antiqua" w:hAnsi="Book Antiqua"/>
+          <w:color w:val="000000"/>
+        </w:rPr>
+        <w:t>denegación</w:t>
+      </w:r>
+      <w:proofErr w:type="spellEnd"/>
+      <w:r>
+        <w:rPr>
+          <w:rFonts w:ascii="Book Antiqua" w:hAnsi="Book Antiqua"/>
+          <w:color w:val="000000"/>
+        </w:rPr>
+        <w:t xml:space="preserve"> de </w:t>
+      </w:r>
+      <w:proofErr w:type="spellStart"/>
+      <w:r>
+        <w:rPr>
+          <w:rFonts w:ascii="Book Antiqua" w:hAnsi="Book Antiqua"/>
+          <w:color w:val="000000"/>
+        </w:rPr>
+        <w:t>servicio</w:t>
+      </w:r>
+      <w:proofErr w:type="spellEnd"/>
+      <w:r>
+        <w:rPr>
+          <w:rFonts w:ascii="Book Antiqua" w:hAnsi="Book Antiqua"/>
+          <w:color w:val="000000"/>
+        </w:rPr>
+        <w:t xml:space="preserve"> </w:t>
       </w:r>
       <w:proofErr w:type="spellStart"/>
       <w:r>
@@ -921,7 +1163,23 @@
           <w:rFonts w:ascii="Book Antiqua" w:hAnsi="Book Antiqua"/>
           <w:color w:val="000000"/>
         </w:rPr>
-        <w:t xml:space="preserve">Este artículo presenta una evaluación experimental de vulnerabilidades de inyección SQL </w:t>
+        <w:t xml:space="preserve">Este artículo presenta una evaluación experimental de vulnerabilidades de </w:t>
+      </w:r>
+      <w:proofErr w:type="spellStart"/>
+      <w:r>
+        <w:rPr>
+          <w:rFonts w:ascii="Book Antiqua" w:hAnsi="Book Antiqua"/>
+          <w:color w:val="000000"/>
+        </w:rPr>
+        <w:t>inyección</w:t>
+      </w:r>
+      <w:proofErr w:type="spellEnd"/>
+      <w:r>
+        <w:rPr>
+          <w:rFonts w:ascii="Book Antiqua" w:hAnsi="Book Antiqua"/>
+          <w:color w:val="000000"/>
+        </w:rPr>
+        <w:t xml:space="preserve"> SQL </w:t>
       </w:r>
       <w:proofErr w:type="spellStart"/>
       <w:r>
@@ -1468,7 +1726,39 @@
           <w:rFonts w:ascii="Book Antiqua" w:hAnsi="Book Antiqua"/>
           <w:color w:val="000000"/>
         </w:rPr>
-        <w:t xml:space="preserve"> A diferencia de un valor escalar simple, </w:t>
+        <w:t xml:space="preserve"> A diferencia de un </w:t>
+      </w:r>
+      <w:proofErr w:type="spellStart"/>
+      <w:r>
+        <w:rPr>
+          <w:rFonts w:ascii="Book Antiqua" w:hAnsi="Book Antiqua"/>
+          <w:color w:val="000000"/>
+        </w:rPr>
+        <w:t>valor</w:t>
+      </w:r>
+      <w:proofErr w:type="spellEnd"/>
+      <w:r>
+        <w:rPr>
+          <w:rFonts w:ascii="Book Antiqua" w:hAnsi="Book Antiqua"/>
+          <w:color w:val="000000"/>
+        </w:rPr>
+        <w:t xml:space="preserve"> </w:t>
+      </w:r>
+      <w:proofErr w:type="spellStart"/>
+      <w:r>
+        <w:rPr>
+          <w:rFonts w:ascii="Book Antiqua" w:hAnsi="Book Antiqua"/>
+          <w:color w:val="000000"/>
+        </w:rPr>
+        <w:t>escalar</w:t>
+      </w:r>
+      <w:proofErr w:type="spellEnd"/>
+      <w:r>
+        <w:rPr>
+          <w:rFonts w:ascii="Book Antiqua" w:hAnsi="Book Antiqua"/>
+          <w:color w:val="000000"/>
+        </w:rPr>
+        <w:t xml:space="preserve"> simple, </w:t>
       </w:r>
       <w:proofErr w:type="spellStart"/>
       <w:r>
@@ -1564,7 +1854,23 @@
           <w:rFonts w:ascii="Book Antiqua" w:hAnsi="Book Antiqua"/>
           <w:color w:val="000000"/>
         </w:rPr>
-        <w:t>, sistemas de referencia espacial (SRID) y envolventes mínimas (bounding boxes), lo que amplía el área de escape sintáctico. Este vacío teórico en los modelos tradicionales de inyección deja sin caracterizar la manipulación de predicados topológicos nativos en motores relacionales.</w:t>
+        <w:t xml:space="preserve">, </w:t>
+      </w:r>
+      <w:proofErr w:type="spellStart"/>
+      <w:r>
+        <w:rPr>
+          <w:rFonts w:ascii="Book Antiqua" w:hAnsi="Book Antiqua"/>
+          <w:color w:val="000000"/>
+        </w:rPr>
+        <w:t>sistemas</w:t>
+      </w:r>
+      <w:proofErr w:type="spellEnd"/>
+      <w:r>
+        <w:rPr>
+          <w:rFonts w:ascii="Book Antiqua" w:hAnsi="Book Antiqua"/>
+          <w:color w:val="000000"/>
+        </w:rPr>
+        <w:t xml:space="preserve"> de referencia espacial (SRID) y envolventes mínimas (bounding boxes), lo que amplía el área de escape sintáctico. Este vacío teórico en los modelos tradicionales de inyección deja sin caracterizar la manipulación de predicados topológicos nativos en motores relacionales.</w:t>
       </w:r>
     </w:p>
     <w:p>
@@ -1598,7 +1904,39 @@
           <w:color w:val="000000"/>
         </w:rPr>
         <w:lastRenderedPageBreak/>
-        <w:t xml:space="preserve">riesgos de inferencia espacial en SDBMS, donde un usuario no autorizado puede deducir la existencia o atributos de un objeto protegido correlacionando consultas espaciales sucesivas. No obstante, estas aproximaciones asumen que la capa de servicio </w:t>
+        <w:t xml:space="preserve">riesgos de inferencia espacial en SDBMS, donde un usuario no autorizado puede deducir la existencia o atributos de un objeto protegido correlacionando consultas espaciales sucesivas. No obstante, estas aproximaciones asumen que la </w:t>
+      </w:r>
+      <w:proofErr w:type="spellStart"/>
+      <w:r>
+        <w:rPr>
+          <w:rFonts w:ascii="Book Antiqua" w:hAnsi="Book Antiqua"/>
+          <w:color w:val="000000"/>
+        </w:rPr>
+        <w:t>capa</w:t>
+      </w:r>
+      <w:proofErr w:type="spellEnd"/>
+      <w:r>
+        <w:rPr>
+          <w:rFonts w:ascii="Book Antiqua" w:hAnsi="Book Antiqua"/>
+          <w:color w:val="000000"/>
+        </w:rPr>
+        <w:t xml:space="preserve"> de </w:t>
+      </w:r>
+      <w:proofErr w:type="spellStart"/>
+      <w:r>
+        <w:rPr>
+          <w:rFonts w:ascii="Book Antiqua" w:hAnsi="Book Antiqua"/>
+          <w:color w:val="000000"/>
+        </w:rPr>
+        <w:t>servicio</w:t>
+      </w:r>
+      <w:proofErr w:type="spellEnd"/>
+      <w:r>
+        <w:rPr>
+          <w:rFonts w:ascii="Book Antiqua" w:hAnsi="Book Antiqua"/>
+          <w:color w:val="000000"/>
+        </w:rPr>
+        <w:t xml:space="preserve"> </w:t>
       </w:r>
       <w:proofErr w:type="spellStart"/>
       <w:r>
@@ -1935,7 +2273,39 @@
           <w:rFonts w:ascii="Book Antiqua" w:hAnsi="Book Antiqua"/>
           <w:color w:val="000000"/>
         </w:rPr>
-        <w:t xml:space="preserve"> et al. (2015) y van Oosterom et al. (2006) formalizaron las clases fundamentales del </w:t>
+        <w:t xml:space="preserve"> et al. (2015) y van Oosterom et al. (2006) formalizaron las </w:t>
+      </w:r>
+      <w:proofErr w:type="spellStart"/>
+      <w:r>
+        <w:rPr>
+          <w:rFonts w:ascii="Book Antiqua" w:hAnsi="Book Antiqua"/>
+          <w:color w:val="000000"/>
+        </w:rPr>
+        <w:t>clases</w:t>
+      </w:r>
+      <w:proofErr w:type="spellEnd"/>
+      <w:r>
+        <w:rPr>
+          <w:rFonts w:ascii="Book Antiqua" w:hAnsi="Book Antiqua"/>
+          <w:color w:val="000000"/>
+        </w:rPr>
+        <w:t xml:space="preserve"> </w:t>
+      </w:r>
+      <w:proofErr w:type="spellStart"/>
+      <w:r>
+        <w:rPr>
+          <w:rFonts w:ascii="Book Antiqua" w:hAnsi="Book Antiqua"/>
+          <w:color w:val="000000"/>
+        </w:rPr>
+        <w:t>fundamentales</w:t>
+      </w:r>
+      <w:proofErr w:type="spellEnd"/>
+      <w:r>
+        <w:rPr>
+          <w:rFonts w:ascii="Book Antiqua" w:hAnsi="Book Antiqua"/>
+          <w:color w:val="000000"/>
+        </w:rPr>
+        <w:t xml:space="preserve"> del </w:t>
       </w:r>
       <w:proofErr w:type="spellStart"/>
       <w:r>
@@ -2015,7 +2385,39 @@
           <w:rFonts w:ascii="Book Antiqua" w:hAnsi="Book Antiqua"/>
           <w:color w:val="000000"/>
         </w:rPr>
-        <w:t xml:space="preserve">) y LA_Party (titulares prediales). Si bien el estándar prescribe la semántica e interoperabilidad de la información territorial y registral, no define salvaguardas arquitectónicas a nivel de consulta contra </w:t>
+        <w:t xml:space="preserve">) y </w:t>
+      </w:r>
+      <w:proofErr w:type="spellStart"/>
+      <w:r>
+        <w:rPr>
+          <w:rFonts w:ascii="Book Antiqua" w:hAnsi="Book Antiqua"/>
+          <w:color w:val="000000"/>
+        </w:rPr>
+        <w:t>LA_Party</w:t>
+      </w:r>
+      <w:proofErr w:type="spellEnd"/>
+      <w:r>
+        <w:rPr>
+          <w:rFonts w:ascii="Book Antiqua" w:hAnsi="Book Antiqua"/>
+          <w:color w:val="000000"/>
+        </w:rPr>
+        <w:t xml:space="preserve"> (</w:t>
+      </w:r>
+      <w:proofErr w:type="spellStart"/>
+      <w:r>
+        <w:rPr>
+          <w:rFonts w:ascii="Book Antiqua" w:hAnsi="Book Antiqua"/>
+          <w:color w:val="000000"/>
+        </w:rPr>
+        <w:t>titulares</w:t>
+      </w:r>
+      <w:proofErr w:type="spellEnd"/>
+      <w:r>
+        <w:rPr>
+          <w:rFonts w:ascii="Book Antiqua" w:hAnsi="Book Antiqua"/>
+          <w:color w:val="000000"/>
+        </w:rPr>
+        <w:t xml:space="preserve"> prediales). Si bien el estándar prescribe la semántica e interoperabilidad de la información territorial y registral, no define salvaguardas arquitectónicas a nivel de consulta contra </w:t>
       </w:r>
       <w:proofErr w:type="spellStart"/>
       <w:r>
@@ -2047,22 +2449,15 @@
           <w:rFonts w:ascii="Book Antiqua" w:hAnsi="Book Antiqua"/>
           <w:color w:val="000000"/>
         </w:rPr>
-        <w:t xml:space="preserve"> SQL</w:t>
-      </w:r>
-      <w:r>
-        <w:rPr>
-          <w:rFonts w:ascii="Book Antiqua" w:hAnsi="Book Antiqua"/>
-          <w:color w:val="000000"/>
-        </w:rPr>
-        <w:t>, d</w:t>
-      </w:r>
-      <w:proofErr w:type="spellStart"/>
-      <w:r>
-        <w:rPr>
-          <w:rFonts w:ascii="Book Antiqua" w:hAnsi="Book Antiqua"/>
-          <w:color w:val="000000"/>
-        </w:rPr>
-        <w:t>ejando</w:t>
+        <w:t xml:space="preserve"> SQL, </w:t>
+      </w:r>
+      <w:proofErr w:type="spellStart"/>
+      <w:r>
+        <w:rPr>
+          <w:rFonts w:ascii="Book Antiqua" w:hAnsi="Book Antiqua"/>
+          <w:color w:val="000000"/>
+        </w:rPr>
+        <w:t>dejando</w:t>
       </w:r>
       <w:proofErr w:type="spellEnd"/>
       <w:r>
@@ -2086,7 +2481,23 @@
           <w:rFonts w:ascii="Book Antiqua" w:hAnsi="Book Antiqua"/>
           <w:color w:val="000000"/>
         </w:rPr>
-        <w:t xml:space="preserve"> la integridad de los derechos reales de propiedad y la recaudación fiscal ante fallas en la implementación de software.</w:t>
+        <w:t xml:space="preserve"> la </w:t>
+      </w:r>
+      <w:proofErr w:type="spellStart"/>
+      <w:r>
+        <w:rPr>
+          <w:rFonts w:ascii="Book Antiqua" w:hAnsi="Book Antiqua"/>
+          <w:color w:val="000000"/>
+        </w:rPr>
+        <w:t>integridad</w:t>
+      </w:r>
+      <w:proofErr w:type="spellEnd"/>
+      <w:r>
+        <w:rPr>
+          <w:rFonts w:ascii="Book Antiqua" w:hAnsi="Book Antiqua"/>
+          <w:color w:val="000000"/>
+        </w:rPr>
+        <w:t xml:space="preserve"> de los derechos reales de propiedad y la recaudación fiscal ante fallas en la implementación de software.</w:t>
       </w:r>
     </w:p>
     <w:p>
@@ -2222,7 +2633,39 @@
           <w:rFonts w:ascii="Book Antiqua" w:hAnsi="Book Antiqua"/>
           <w:color w:val="000000"/>
         </w:rPr>
-        <w:t xml:space="preserve"> la industria mediante la vulnerabilidad crítica CVE-2023-25157 (con puntaje CVSS de 9.8), donde el software de referencia GeoServer permitía la ejecución remota de SQL no autenticado mediante la evaluación insegura de filtros OGC y expresiones CQL sobre bases de datos PostGIS (National Vulnerability Database, 2023). Por otro lado, en el ámbito de la denegación de servicio, Crosby y Wallach (2003) establecieron el concepto de ataques de complejidad algorítmica (Algorithmic Complexity Attacks), demostrando cómo entradas diseñadas pueden forzar a los algoritmos de peor </w:t>
+        <w:t xml:space="preserve"> la industria mediante la vulnerabilidad crítica CVE-2023-25157 (con puntaje CVSS de 9.8), donde el software de referencia GeoServer permitía la ejecución remota de SQL no autenticado mediante la evaluación insegura de filtros OGC y expresiones CQL sobre bases de datos PostGIS (National Vulnerability Database, 2023). Por otro lado, en el ámbito de la denegación de servicio, Crosby y Wallach (2003) establecieron el concepto de ataques de complejidad algorítmica (Algorithmic Complexity Attacks), demostrando cómo entradas diseñadas pueden forzar a los </w:t>
+      </w:r>
+      <w:proofErr w:type="spellStart"/>
+      <w:r>
+        <w:rPr>
+          <w:rFonts w:ascii="Book Antiqua" w:hAnsi="Book Antiqua"/>
+          <w:color w:val="000000"/>
+        </w:rPr>
+        <w:t>algoritmos</w:t>
+      </w:r>
+      <w:proofErr w:type="spellEnd"/>
+      <w:r>
+        <w:rPr>
+          <w:rFonts w:ascii="Book Antiqua" w:hAnsi="Book Antiqua"/>
+          <w:color w:val="000000"/>
+        </w:rPr>
+        <w:t xml:space="preserve"> de </w:t>
+      </w:r>
+      <w:proofErr w:type="spellStart"/>
+      <w:r>
+        <w:rPr>
+          <w:rFonts w:ascii="Book Antiqua" w:hAnsi="Book Antiqua"/>
+          <w:color w:val="000000"/>
+        </w:rPr>
+        <w:t>peor</w:t>
+      </w:r>
+      <w:proofErr w:type="spellEnd"/>
+      <w:r>
+        <w:rPr>
+          <w:rFonts w:ascii="Book Antiqua" w:hAnsi="Book Antiqua"/>
+          <w:color w:val="000000"/>
+        </w:rPr>
+        <w:t xml:space="preserve"> </w:t>
       </w:r>
       <w:proofErr w:type="spellStart"/>
       <w:r>
@@ -2270,7 +2713,39 @@
           <w:rFonts w:ascii="Book Antiqua" w:hAnsi="Book Antiqua"/>
           <w:color w:val="000000"/>
         </w:rPr>
-        <w:t xml:space="preserve"> la CPU. En motores espaciales, </w:t>
+        <w:t xml:space="preserve"> la CPU. En </w:t>
+      </w:r>
+      <w:proofErr w:type="spellStart"/>
+      <w:r>
+        <w:rPr>
+          <w:rFonts w:ascii="Book Antiqua" w:hAnsi="Book Antiqua"/>
+          <w:color w:val="000000"/>
+        </w:rPr>
+        <w:t>motores</w:t>
+      </w:r>
+      <w:proofErr w:type="spellEnd"/>
+      <w:r>
+        <w:rPr>
+          <w:rFonts w:ascii="Book Antiqua" w:hAnsi="Book Antiqua"/>
+          <w:color w:val="000000"/>
+        </w:rPr>
+        <w:t xml:space="preserve"> </w:t>
+      </w:r>
+      <w:proofErr w:type="spellStart"/>
+      <w:r>
+        <w:rPr>
+          <w:rFonts w:ascii="Book Antiqua" w:hAnsi="Book Antiqua"/>
+          <w:color w:val="000000"/>
+        </w:rPr>
+        <w:t>espaciales</w:t>
+      </w:r>
+      <w:proofErr w:type="spellEnd"/>
+      <w:r>
+        <w:rPr>
+          <w:rFonts w:ascii="Book Antiqua" w:hAnsi="Book Antiqua"/>
+          <w:color w:val="000000"/>
+        </w:rPr>
+        <w:t xml:space="preserve">, </w:t>
       </w:r>
       <w:proofErr w:type="spellStart"/>
       <w:r>
@@ -2286,7 +2761,23 @@
           <w:rFonts w:ascii="Book Antiqua" w:hAnsi="Book Antiqua"/>
           <w:color w:val="000000"/>
         </w:rPr>
-        <w:t xml:space="preserve"> Agarwal y Rajan (2016), los algoritmos computacionales de la </w:t>
+        <w:t xml:space="preserve"> Agarwal y Rajan (2016), los algoritmos </w:t>
+      </w:r>
+      <w:proofErr w:type="spellStart"/>
+      <w:r>
+        <w:rPr>
+          <w:rFonts w:ascii="Book Antiqua" w:hAnsi="Book Antiqua"/>
+          <w:color w:val="000000"/>
+        </w:rPr>
+        <w:t>computacionales</w:t>
+      </w:r>
+      <w:proofErr w:type="spellEnd"/>
+      <w:r>
+        <w:rPr>
+          <w:rFonts w:ascii="Book Antiqua" w:hAnsi="Book Antiqua"/>
+          <w:color w:val="000000"/>
+        </w:rPr>
+        <w:t xml:space="preserve"> de la </w:t>
       </w:r>
       <w:proofErr w:type="spellStart"/>
       <w:r>
@@ -2435,7 +2926,55 @@
           <w:rFonts w:ascii="Book Antiqua" w:hAnsi="Book Antiqua"/>
           <w:color w:val="000000"/>
         </w:rPr>
-        <w:t xml:space="preserve"> cuadrática cuando se ejecutan </w:t>
+        <w:t xml:space="preserve"> </w:t>
+      </w:r>
+      <w:proofErr w:type="spellStart"/>
+      <w:r>
+        <w:rPr>
+          <w:rFonts w:ascii="Book Antiqua" w:hAnsi="Book Antiqua"/>
+          <w:color w:val="000000"/>
+        </w:rPr>
+        <w:t>cuadrática</w:t>
+      </w:r>
+      <w:proofErr w:type="spellEnd"/>
+      <w:r>
+        <w:rPr>
+          <w:rFonts w:ascii="Book Antiqua" w:hAnsi="Book Antiqua"/>
+          <w:color w:val="000000"/>
+        </w:rPr>
+        <w:t xml:space="preserve"> </w:t>
+      </w:r>
+      <w:proofErr w:type="spellStart"/>
+      <w:r>
+        <w:rPr>
+          <w:rFonts w:ascii="Book Antiqua" w:hAnsi="Book Antiqua"/>
+          <w:color w:val="000000"/>
+        </w:rPr>
+        <w:t>cuando</w:t>
+      </w:r>
+      <w:proofErr w:type="spellEnd"/>
+      <w:r>
+        <w:rPr>
+          <w:rFonts w:ascii="Book Antiqua" w:hAnsi="Book Antiqua"/>
+          <w:color w:val="000000"/>
+        </w:rPr>
+        <w:t xml:space="preserve"> se </w:t>
+      </w:r>
+      <w:proofErr w:type="spellStart"/>
+      <w:r>
+        <w:rPr>
+          <w:rFonts w:ascii="Book Antiqua" w:hAnsi="Book Antiqua"/>
+          <w:color w:val="000000"/>
+        </w:rPr>
+        <w:t>ejecutan</w:t>
+      </w:r>
+      <w:proofErr w:type="spellEnd"/>
+      <w:r>
+        <w:rPr>
+          <w:rFonts w:ascii="Book Antiqua" w:hAnsi="Book Antiqua"/>
+          <w:color w:val="000000"/>
+        </w:rPr>
+        <w:t xml:space="preserve"> </w:t>
       </w:r>
       <w:proofErr w:type="spellStart"/>
       <w:r>
@@ -2545,7 +3084,39 @@
           <w:rFonts w:ascii="Book Antiqua" w:hAnsi="Book Antiqua"/>
           <w:color w:val="000000"/>
         </w:rPr>
-        <w:t xml:space="preserve"> índice espacial GiST. Pese a estos antecedentes, la literatura no ha </w:t>
+        <w:t xml:space="preserve"> </w:t>
+      </w:r>
+      <w:proofErr w:type="spellStart"/>
+      <w:r>
+        <w:rPr>
+          <w:rFonts w:ascii="Book Antiqua" w:hAnsi="Book Antiqua"/>
+          <w:color w:val="000000"/>
+        </w:rPr>
+        <w:t>índice</w:t>
+      </w:r>
+      <w:proofErr w:type="spellEnd"/>
+      <w:r>
+        <w:rPr>
+          <w:rFonts w:ascii="Book Antiqua" w:hAnsi="Book Antiqua"/>
+          <w:color w:val="000000"/>
+        </w:rPr>
+        <w:t xml:space="preserve"> espacial GiST. Pese a estos antecedentes, la </w:t>
+      </w:r>
+      <w:proofErr w:type="spellStart"/>
+      <w:r>
+        <w:rPr>
+          <w:rFonts w:ascii="Book Antiqua" w:hAnsi="Book Antiqua"/>
+          <w:color w:val="000000"/>
+        </w:rPr>
+        <w:t>literatura</w:t>
+      </w:r>
+      <w:proofErr w:type="spellEnd"/>
+      <w:r>
+        <w:rPr>
+          <w:rFonts w:ascii="Book Antiqua" w:hAnsi="Book Antiqua"/>
+          <w:color w:val="000000"/>
+        </w:rPr>
+        <w:t xml:space="preserve"> no ha </w:t>
       </w:r>
       <w:proofErr w:type="spellStart"/>
       <w:r>
@@ -2561,7 +3132,39 @@
           <w:rFonts w:ascii="Book Antiqua" w:hAnsi="Book Antiqua"/>
           <w:color w:val="000000"/>
         </w:rPr>
-        <w:t xml:space="preserve"> el impacto de latencia ni ha formalizado esquemas defensivos integrados entre el analizador web y el motor geométrico.</w:t>
+        <w:t xml:space="preserve"> </w:t>
+      </w:r>
+      <w:proofErr w:type="spellStart"/>
+      <w:r>
+        <w:rPr>
+          <w:rFonts w:ascii="Book Antiqua" w:hAnsi="Book Antiqua"/>
+          <w:color w:val="000000"/>
+        </w:rPr>
+        <w:t>el</w:t>
+      </w:r>
+      <w:proofErr w:type="spellEnd"/>
+      <w:r>
+        <w:rPr>
+          <w:rFonts w:ascii="Book Antiqua" w:hAnsi="Book Antiqua"/>
+          <w:color w:val="000000"/>
+        </w:rPr>
+        <w:t xml:space="preserve"> </w:t>
+      </w:r>
+      <w:proofErr w:type="spellStart"/>
+      <w:r>
+        <w:rPr>
+          <w:rFonts w:ascii="Book Antiqua" w:hAnsi="Book Antiqua"/>
+          <w:color w:val="000000"/>
+        </w:rPr>
+        <w:t>impacto</w:t>
+      </w:r>
+      <w:proofErr w:type="spellEnd"/>
+      <w:r>
+        <w:rPr>
+          <w:rFonts w:ascii="Book Antiqua" w:hAnsi="Book Antiqua"/>
+          <w:color w:val="000000"/>
+        </w:rPr>
+        <w:t xml:space="preserve"> de latencia ni ha formalizado esquemas defensivos integrados entre el analizador web y el motor geométrico.</w:t>
       </w:r>
     </w:p>
     <w:p>
@@ -2602,7 +3205,23 @@
           <w:rFonts w:ascii="Book Antiqua" w:hAnsi="Book Antiqua"/>
           <w:color w:val="000000"/>
         </w:rPr>
-        <w:t xml:space="preserve">Se adoptó un </w:t>
+        <w:t xml:space="preserve">Se </w:t>
+      </w:r>
+      <w:proofErr w:type="spellStart"/>
+      <w:r>
+        <w:rPr>
+          <w:rFonts w:ascii="Book Antiqua" w:hAnsi="Book Antiqua"/>
+          <w:color w:val="000000"/>
+        </w:rPr>
+        <w:t>adoptó</w:t>
+      </w:r>
+      <w:proofErr w:type="spellEnd"/>
+      <w:r>
+        <w:rPr>
+          <w:rFonts w:ascii="Book Antiqua" w:hAnsi="Book Antiqua"/>
+          <w:color w:val="000000"/>
+        </w:rPr>
+        <w:t xml:space="preserve"> un </w:t>
       </w:r>
       <w:proofErr w:type="spellStart"/>
       <w:r>
@@ -2705,7 +3324,55 @@
           <w:rFonts w:ascii="Book Antiqua" w:hAnsi="Book Antiqua"/>
           <w:color w:val="000000"/>
         </w:rPr>
-        <w:t xml:space="preserve"> ante inyecciones SQL y medir el impacto en rendimiento </w:t>
+        <w:t xml:space="preserve"> ante inyecciones SQL y medir el </w:t>
+      </w:r>
+      <w:proofErr w:type="spellStart"/>
+      <w:r>
+        <w:rPr>
+          <w:rFonts w:ascii="Book Antiqua" w:hAnsi="Book Antiqua"/>
+          <w:color w:val="000000"/>
+        </w:rPr>
+        <w:t>impacto</w:t>
+      </w:r>
+      <w:proofErr w:type="spellEnd"/>
+      <w:r>
+        <w:rPr>
+          <w:rFonts w:ascii="Book Antiqua" w:hAnsi="Book Antiqua"/>
+          <w:color w:val="000000"/>
+        </w:rPr>
+        <w:t xml:space="preserve"> </w:t>
+      </w:r>
+      <w:proofErr w:type="spellStart"/>
+      <w:r>
+        <w:rPr>
+          <w:rFonts w:ascii="Book Antiqua" w:hAnsi="Book Antiqua"/>
+          <w:color w:val="000000"/>
+        </w:rPr>
+        <w:t>en</w:t>
+      </w:r>
+      <w:proofErr w:type="spellEnd"/>
+      <w:r>
+        <w:rPr>
+          <w:rFonts w:ascii="Book Antiqua" w:hAnsi="Book Antiqua"/>
+          <w:color w:val="000000"/>
+        </w:rPr>
+        <w:t xml:space="preserve"> </w:t>
+      </w:r>
+      <w:proofErr w:type="spellStart"/>
+      <w:r>
+        <w:rPr>
+          <w:rFonts w:ascii="Book Antiqua" w:hAnsi="Book Antiqua"/>
+          <w:color w:val="000000"/>
+        </w:rPr>
+        <w:t>rendimiento</w:t>
+      </w:r>
+      <w:proofErr w:type="spellEnd"/>
+      <w:r>
+        <w:rPr>
+          <w:rFonts w:ascii="Book Antiqua" w:hAnsi="Book Antiqua"/>
+          <w:color w:val="000000"/>
+        </w:rPr>
+        <w:t xml:space="preserve"> </w:t>
       </w:r>
       <w:proofErr w:type="spellStart"/>
       <w:r>
@@ -2721,7 +3388,23 @@
           <w:rFonts w:ascii="Book Antiqua" w:hAnsi="Book Antiqua"/>
           <w:color w:val="000000"/>
         </w:rPr>
-        <w:t xml:space="preserve"> de un esquema de mitigación multicapa. La evaluación contempla dos condiciones: consultas con SQL dinámico desprotegido y consultas compiladas mediante ORM con validación previa de geometrías.</w:t>
+        <w:t xml:space="preserve"> de un </w:t>
+      </w:r>
+      <w:proofErr w:type="spellStart"/>
+      <w:r>
+        <w:rPr>
+          <w:rFonts w:ascii="Book Antiqua" w:hAnsi="Book Antiqua"/>
+          <w:color w:val="000000"/>
+        </w:rPr>
+        <w:t>esquema</w:t>
+      </w:r>
+      <w:proofErr w:type="spellEnd"/>
+      <w:r>
+        <w:rPr>
+          <w:rFonts w:ascii="Book Antiqua" w:hAnsi="Book Antiqua"/>
+          <w:color w:val="000000"/>
+        </w:rPr>
+        <w:t xml:space="preserve"> de mitigación multicapa. La evaluación contempla dos condiciones: consultas con SQL dinámico desprotegido y consultas compiladas mediante ORM con validación previa de geometrías.</w:t>
       </w:r>
     </w:p>
     <w:p>
@@ -2748,7 +3431,23 @@
           <w:rFonts w:ascii="Book Antiqua" w:hAnsi="Book Antiqua"/>
           <w:color w:val="000000"/>
         </w:rPr>
-        <w:t xml:space="preserve">El dataset experimental comprende 1,500 </w:t>
+        <w:t xml:space="preserve">El dataset experimental </w:t>
+      </w:r>
+      <w:proofErr w:type="spellStart"/>
+      <w:r>
+        <w:rPr>
+          <w:rFonts w:ascii="Book Antiqua" w:hAnsi="Book Antiqua"/>
+          <w:color w:val="000000"/>
+        </w:rPr>
+        <w:t>comprende</w:t>
+      </w:r>
+      <w:proofErr w:type="spellEnd"/>
+      <w:r>
+        <w:rPr>
+          <w:rFonts w:ascii="Book Antiqua" w:hAnsi="Book Antiqua"/>
+          <w:color w:val="000000"/>
+        </w:rPr>
+        <w:t xml:space="preserve"> 1,500 </w:t>
       </w:r>
       <w:proofErr w:type="spellStart"/>
       <w:r>
@@ -2764,7 +3463,23 @@
           <w:rFonts w:ascii="Book Antiqua" w:hAnsi="Book Antiqua"/>
           <w:color w:val="000000"/>
         </w:rPr>
-        <w:t xml:space="preserve"> catastrales </w:t>
+        <w:t xml:space="preserve"> </w:t>
+      </w:r>
+      <w:proofErr w:type="spellStart"/>
+      <w:r>
+        <w:rPr>
+          <w:rFonts w:ascii="Book Antiqua" w:hAnsi="Book Antiqua"/>
+          <w:color w:val="000000"/>
+        </w:rPr>
+        <w:t>catastrales</w:t>
+      </w:r>
+      <w:proofErr w:type="spellEnd"/>
+      <w:r>
+        <w:rPr>
+          <w:rFonts w:ascii="Book Antiqua" w:hAnsi="Book Antiqua"/>
+          <w:color w:val="000000"/>
+        </w:rPr>
+        <w:t xml:space="preserve"> </w:t>
       </w:r>
       <w:proofErr w:type="spellStart"/>
       <w:r>
@@ -2854,7 +3569,39 @@
           <w:rFonts w:ascii="Book Antiqua" w:hAnsi="Book Antiqua"/>
           <w:color w:val="000000"/>
         </w:rPr>
-        <w:t xml:space="preserve"> bajo el estándar ISO 19152 (LADM, clase LA_SpatialUnit) y georreferenciadas en EPSG:32719. Para </w:t>
+        <w:t xml:space="preserve"> bajo </w:t>
+      </w:r>
+      <w:proofErr w:type="spellStart"/>
+      <w:r>
+        <w:rPr>
+          <w:rFonts w:ascii="Book Antiqua" w:hAnsi="Book Antiqua"/>
+          <w:color w:val="000000"/>
+        </w:rPr>
+        <w:t>el</w:t>
+      </w:r>
+      <w:proofErr w:type="spellEnd"/>
+      <w:r>
+        <w:rPr>
+          <w:rFonts w:ascii="Book Antiqua" w:hAnsi="Book Antiqua"/>
+          <w:color w:val="000000"/>
+        </w:rPr>
+        <w:t xml:space="preserve"> </w:t>
+      </w:r>
+      <w:proofErr w:type="spellStart"/>
+      <w:r>
+        <w:rPr>
+          <w:rFonts w:ascii="Book Antiqua" w:hAnsi="Book Antiqua"/>
+          <w:color w:val="000000"/>
+        </w:rPr>
+        <w:t>estándar</w:t>
+      </w:r>
+      <w:proofErr w:type="spellEnd"/>
+      <w:r>
+        <w:rPr>
+          <w:rFonts w:ascii="Book Antiqua" w:hAnsi="Book Antiqua"/>
+          <w:color w:val="000000"/>
+        </w:rPr>
+        <w:t xml:space="preserve"> ISO 19152 (LADM, clase LA_SpatialUnit) y georreferenciadas en EPSG:32719. Para </w:t>
       </w:r>
       <w:proofErr w:type="spellStart"/>
       <w:r>
@@ -2886,7 +3633,71 @@
           <w:rFonts w:ascii="Book Antiqua" w:hAnsi="Book Antiqua"/>
           <w:color w:val="000000"/>
         </w:rPr>
-        <w:t xml:space="preserve"> y resguardo ético, la cartografía base se obtuvo de fuentes abiertas y los atributos fiscales fueron </w:t>
+        <w:t xml:space="preserve"> y </w:t>
+      </w:r>
+      <w:proofErr w:type="spellStart"/>
+      <w:r>
+        <w:rPr>
+          <w:rFonts w:ascii="Book Antiqua" w:hAnsi="Book Antiqua"/>
+          <w:color w:val="000000"/>
+        </w:rPr>
+        <w:t>resguardo</w:t>
+      </w:r>
+      <w:proofErr w:type="spellEnd"/>
+      <w:r>
+        <w:rPr>
+          <w:rFonts w:ascii="Book Antiqua" w:hAnsi="Book Antiqua"/>
+          <w:color w:val="000000"/>
+        </w:rPr>
+        <w:t xml:space="preserve"> ético, la cartografía base se obtuvo de fuentes abiertas y los </w:t>
+      </w:r>
+      <w:proofErr w:type="spellStart"/>
+      <w:r>
+        <w:rPr>
+          <w:rFonts w:ascii="Book Antiqua" w:hAnsi="Book Antiqua"/>
+          <w:color w:val="000000"/>
+        </w:rPr>
+        <w:t>atributos</w:t>
+      </w:r>
+      <w:proofErr w:type="spellEnd"/>
+      <w:r>
+        <w:rPr>
+          <w:rFonts w:ascii="Book Antiqua" w:hAnsi="Book Antiqua"/>
+          <w:color w:val="000000"/>
+        </w:rPr>
+        <w:t xml:space="preserve"> </w:t>
+      </w:r>
+      <w:proofErr w:type="spellStart"/>
+      <w:r>
+        <w:rPr>
+          <w:rFonts w:ascii="Book Antiqua" w:hAnsi="Book Antiqua"/>
+          <w:color w:val="000000"/>
+        </w:rPr>
+        <w:t>fiscales</w:t>
+      </w:r>
+      <w:proofErr w:type="spellEnd"/>
+      <w:r>
+        <w:rPr>
+          <w:rFonts w:ascii="Book Antiqua" w:hAnsi="Book Antiqua"/>
+          <w:color w:val="000000"/>
+        </w:rPr>
+        <w:t xml:space="preserve"> </w:t>
+      </w:r>
+      <w:proofErr w:type="spellStart"/>
+      <w:r>
+        <w:rPr>
+          <w:rFonts w:ascii="Book Antiqua" w:hAnsi="Book Antiqua"/>
+          <w:color w:val="000000"/>
+        </w:rPr>
+        <w:t>fueron</w:t>
+      </w:r>
+      <w:proofErr w:type="spellEnd"/>
+      <w:r>
+        <w:rPr>
+          <w:rFonts w:ascii="Book Antiqua" w:hAnsi="Book Antiqua"/>
+          <w:color w:val="000000"/>
+        </w:rPr>
+        <w:t xml:space="preserve"> </w:t>
       </w:r>
       <w:proofErr w:type="spellStart"/>
       <w:r>
@@ -2990,7 +3801,39 @@
           <w:rFonts w:ascii="Book Antiqua" w:hAnsi="Book Antiqua"/>
           <w:color w:val="000000"/>
         </w:rPr>
-        <w:t xml:space="preserve">El banco de pruebas se implementó en contenedores Docker mediante microservicios aislados: (1) un servicio de base de datos con PostgreSQL 15 y PostGIS 3.3, y (2) una API en Python 3.11 con FastAPI y Uvicorn. Las pruebas de estrés se ejecutaron en un entorno </w:t>
+        <w:t xml:space="preserve">El banco de pruebas se implementó en contenedores Docker mediante microservicios aislados: (1) un servicio de base de datos con PostgreSQL 15 y PostGIS 3.3, y (2) una API en Python 3.11 con FastAPI y Uvicorn. Las pruebas de estrés se ejecutaron </w:t>
+      </w:r>
+      <w:proofErr w:type="spellStart"/>
+      <w:r>
+        <w:rPr>
+          <w:rFonts w:ascii="Book Antiqua" w:hAnsi="Book Antiqua"/>
+          <w:color w:val="000000"/>
+        </w:rPr>
+        <w:t>en</w:t>
+      </w:r>
+      <w:proofErr w:type="spellEnd"/>
+      <w:r>
+        <w:rPr>
+          <w:rFonts w:ascii="Book Antiqua" w:hAnsi="Book Antiqua"/>
+          <w:color w:val="000000"/>
+        </w:rPr>
+        <w:t xml:space="preserve"> un </w:t>
+      </w:r>
+      <w:proofErr w:type="spellStart"/>
+      <w:r>
+        <w:rPr>
+          <w:rFonts w:ascii="Book Antiqua" w:hAnsi="Book Antiqua"/>
+          <w:color w:val="000000"/>
+        </w:rPr>
+        <w:t>entorno</w:t>
+      </w:r>
+      <w:proofErr w:type="spellEnd"/>
+      <w:r>
+        <w:rPr>
+          <w:rFonts w:ascii="Book Antiqua" w:hAnsi="Book Antiqua"/>
+          <w:color w:val="000000"/>
+        </w:rPr>
+        <w:t xml:space="preserve"> </w:t>
       </w:r>
       <w:proofErr w:type="spellStart"/>
       <w:r>
@@ -3021,14 +3864,7 @@
           <w:rFonts w:ascii="Book Antiqua" w:hAnsi="Book Antiqua"/>
           <w:color w:val="000000"/>
         </w:rPr>
-        <w:t xml:space="preserve">un </w:t>
-      </w:r>
-      <w:r>
-        <w:rPr>
-          <w:rFonts w:ascii="Book Antiqua" w:hAnsi="Book Antiqua"/>
-          <w:color w:val="000000"/>
-        </w:rPr>
-        <w:t>Intel</w:t>
+        <w:t>un Intel</w:t>
       </w:r>
       <w:proofErr w:type="gramEnd"/>
       <w:r>
@@ -3036,14 +3872,7 @@
           <w:rFonts w:ascii="Book Antiqua" w:hAnsi="Book Antiqua"/>
           <w:color w:val="000000"/>
         </w:rPr>
-        <w:t xml:space="preserve"> Core Ultra 5 245KF</w:t>
-      </w:r>
-      <w:r>
-        <w:rPr>
-          <w:rFonts w:ascii="Book Antiqua" w:hAnsi="Book Antiqua"/>
-          <w:color w:val="000000"/>
-        </w:rPr>
-        <w:t xml:space="preserve"> de</w:t>
+        <w:t xml:space="preserve"> Core Ultra 5 245KF de</w:t>
       </w:r>
       <w:r>
         <w:rPr>
@@ -3140,7 +3969,23 @@
           <w:rFonts w:ascii="Book Antiqua" w:hAnsi="Book Antiqua"/>
           <w:color w:val="000000"/>
         </w:rPr>
-        <w:t>Se estructuraron seis vectores de explotación orientados a las tres dimensiones de la tríada CIA (</w:t>
+        <w:t xml:space="preserve">Se estructuraron seis vectores de explotación orientados a las tres dimensiones de la </w:t>
+      </w:r>
+      <w:proofErr w:type="spellStart"/>
+      <w:r>
+        <w:rPr>
+          <w:rFonts w:ascii="Book Antiqua" w:hAnsi="Book Antiqua"/>
+          <w:color w:val="000000"/>
+        </w:rPr>
+        <w:t>tríada</w:t>
+      </w:r>
+      <w:proofErr w:type="spellEnd"/>
+      <w:r>
+        <w:rPr>
+          <w:rFonts w:ascii="Book Antiqua" w:hAnsi="Book Antiqua"/>
+          <w:color w:val="000000"/>
+        </w:rPr>
+        <w:t xml:space="preserve"> CIA (</w:t>
       </w:r>
       <w:proofErr w:type="spellStart"/>
       <w:r>
@@ -3188,7 +4033,55 @@
           <w:rFonts w:ascii="Book Antiqua" w:hAnsi="Book Antiqua"/>
           <w:color w:val="000000"/>
         </w:rPr>
-        <w:t xml:space="preserve">). La evaluación de rendimiento contempló una </w:t>
+        <w:t xml:space="preserve">). La evaluación de </w:t>
+      </w:r>
+      <w:proofErr w:type="spellStart"/>
+      <w:r>
+        <w:rPr>
+          <w:rFonts w:ascii="Book Antiqua" w:hAnsi="Book Antiqua"/>
+          <w:color w:val="000000"/>
+        </w:rPr>
+        <w:t>rendimiento</w:t>
+      </w:r>
+      <w:proofErr w:type="spellEnd"/>
+      <w:r>
+        <w:rPr>
+          <w:rFonts w:ascii="Book Antiqua" w:hAnsi="Book Antiqua"/>
+          <w:color w:val="000000"/>
+        </w:rPr>
+        <w:t xml:space="preserve"> </w:t>
+      </w:r>
+      <w:proofErr w:type="spellStart"/>
+      <w:r>
+        <w:rPr>
+          <w:rFonts w:ascii="Book Antiqua" w:hAnsi="Book Antiqua"/>
+          <w:color w:val="000000"/>
+        </w:rPr>
+        <w:t>contempló</w:t>
+      </w:r>
+      <w:proofErr w:type="spellEnd"/>
+      <w:r>
+        <w:rPr>
+          <w:rFonts w:ascii="Book Antiqua" w:hAnsi="Book Antiqua"/>
+          <w:color w:val="000000"/>
+        </w:rPr>
+        <w:t xml:space="preserve"> </w:t>
+      </w:r>
+      <w:proofErr w:type="spellStart"/>
+      <w:r>
+        <w:rPr>
+          <w:rFonts w:ascii="Book Antiqua" w:hAnsi="Book Antiqua"/>
+          <w:color w:val="000000"/>
+        </w:rPr>
+        <w:t>una</w:t>
+      </w:r>
+      <w:proofErr w:type="spellEnd"/>
+      <w:r>
+        <w:rPr>
+          <w:rFonts w:ascii="Book Antiqua" w:hAnsi="Book Antiqua"/>
+          <w:color w:val="000000"/>
+        </w:rPr>
+        <w:t xml:space="preserve"> </w:t>
       </w:r>
       <w:proofErr w:type="spellStart"/>
       <w:r>
@@ -3204,7 +4097,23 @@
           <w:rFonts w:ascii="Book Antiqua" w:hAnsi="Book Antiqua"/>
           <w:color w:val="000000"/>
         </w:rPr>
-        <w:t xml:space="preserve"> de 300 peticiones y curvas de concurrencia escalonada (1 a 100 clientes), registrando métricas de latencia (media, p50, p95, p99) y throughput (req/s).</w:t>
+        <w:t xml:space="preserve"> de 300 </w:t>
+      </w:r>
+      <w:proofErr w:type="spellStart"/>
+      <w:r>
+        <w:rPr>
+          <w:rFonts w:ascii="Book Antiqua" w:hAnsi="Book Antiqua"/>
+          <w:color w:val="000000"/>
+        </w:rPr>
+        <w:t>peticiones</w:t>
+      </w:r>
+      <w:proofErr w:type="spellEnd"/>
+      <w:r>
+        <w:rPr>
+          <w:rFonts w:ascii="Book Antiqua" w:hAnsi="Book Antiqua"/>
+          <w:color w:val="000000"/>
+        </w:rPr>
+        <w:t xml:space="preserve"> y curvas de concurrencia escalonada (1 a 100 clientes), registrando métricas de latencia (media, p50, p95, p99) y throughput (req/s).</w:t>
       </w:r>
     </w:p>
     <w:p>
@@ -3245,7 +4154,39 @@
           <w:rFonts w:ascii="Book Antiqua" w:hAnsi="Book Antiqua"/>
           <w:color w:val="000000"/>
         </w:rPr>
-        <w:t xml:space="preserve">El endpoint GET /api/v1/vulnerable/predios/radio está diseñado para retornar lotes dentro de un radio de 50 metros en el sector 0101. Al inyectar en el parámetro distancia el payload '50) OR (1=1', el analizador léxico de PostgreSQL cierra prematuramente el operador ST_DWithin e introduce una tautología que anula tanto el límite espacial como el filtro de sector territorial. Como resultado, la consulta pasó de retornar 1 predio autorizado a </w:t>
+        <w:t xml:space="preserve">El endpoint GET /api/v1/vulnerable/predios/radio está diseñado para retornar lotes dentro de un radio de 50 metros en el sector 0101. Al inyectar en el parámetro distancia el payload '50) OR (1=1', el analizador léxico de PostgreSQL cierra prematuramente el operador ST_DWithin e introduce una tautología que anula tanto el límite espacial como el filtro de sector territorial. Como resultado, la consulta pasó de retornar 1 </w:t>
+      </w:r>
+      <w:proofErr w:type="spellStart"/>
+      <w:r>
+        <w:rPr>
+          <w:rFonts w:ascii="Book Antiqua" w:hAnsi="Book Antiqua"/>
+          <w:color w:val="000000"/>
+        </w:rPr>
+        <w:t>predio</w:t>
+      </w:r>
+      <w:proofErr w:type="spellEnd"/>
+      <w:r>
+        <w:rPr>
+          <w:rFonts w:ascii="Book Antiqua" w:hAnsi="Book Antiqua"/>
+          <w:color w:val="000000"/>
+        </w:rPr>
+        <w:t xml:space="preserve"> </w:t>
+      </w:r>
+      <w:proofErr w:type="spellStart"/>
+      <w:r>
+        <w:rPr>
+          <w:rFonts w:ascii="Book Antiqua" w:hAnsi="Book Antiqua"/>
+          <w:color w:val="000000"/>
+        </w:rPr>
+        <w:t>autorizado</w:t>
+      </w:r>
+      <w:proofErr w:type="spellEnd"/>
+      <w:r>
+        <w:rPr>
+          <w:rFonts w:ascii="Book Antiqua" w:hAnsi="Book Antiqua"/>
+          <w:color w:val="000000"/>
+        </w:rPr>
+        <w:t xml:space="preserve"> a </w:t>
       </w:r>
       <w:proofErr w:type="spellStart"/>
       <w:r>
@@ -3397,7 +4338,39 @@
           <w:rFonts w:ascii="Book Antiqua" w:hAnsi="Book Antiqua"/>
           <w:color w:val="000000"/>
         </w:rPr>
-        <w:t xml:space="preserve">En el endpoint GET /api/v1/vulnerable/predios/poligono, la aplicación dibuja polígonos cartográficos sin exponer datos textuales. El atacante estructuró un canal lateral inferencial acoplado al operador ST_Intersects, inyectando una división por cero condicional a la conjetura de caracteres sobre la tabla administrativa: si el carácter adivinado coincide, se produce una excepción en PostGIS disparando un error HTTP 500; si es falso, el motor responde con HTTP 200. Mediante este mecanismo se </w:t>
+        <w:t xml:space="preserve">En el endpoint GET /api/v1/vulnerable/predios/poligono, la aplicación dibuja polígonos cartográficos sin exponer datos textuales. El atacante estructuró un canal lateral inferencial acoplado al operador ST_Intersects, inyectando una división por cero condicional a la conjetura de caracteres sobre la tabla administrativa: si el carácter adivinado coincide, se produce una excepción en PostGIS disparando un error HTTP 500; si es falso, el motor responde con HTTP 200. Mediante </w:t>
+      </w:r>
+      <w:proofErr w:type="spellStart"/>
+      <w:r>
+        <w:rPr>
+          <w:rFonts w:ascii="Book Antiqua" w:hAnsi="Book Antiqua"/>
+          <w:color w:val="000000"/>
+        </w:rPr>
+        <w:t>este</w:t>
+      </w:r>
+      <w:proofErr w:type="spellEnd"/>
+      <w:r>
+        <w:rPr>
+          <w:rFonts w:ascii="Book Antiqua" w:hAnsi="Book Antiqua"/>
+          <w:color w:val="000000"/>
+        </w:rPr>
+        <w:t xml:space="preserve"> </w:t>
+      </w:r>
+      <w:proofErr w:type="spellStart"/>
+      <w:r>
+        <w:rPr>
+          <w:rFonts w:ascii="Book Antiqua" w:hAnsi="Book Antiqua"/>
+          <w:color w:val="000000"/>
+        </w:rPr>
+        <w:t>mecanismo</w:t>
+      </w:r>
+      <w:proofErr w:type="spellEnd"/>
+      <w:r>
+        <w:rPr>
+          <w:rFonts w:ascii="Book Antiqua" w:hAnsi="Book Antiqua"/>
+          <w:color w:val="000000"/>
+        </w:rPr>
+        <w:t xml:space="preserve"> se </w:t>
       </w:r>
       <w:proofErr w:type="spellStart"/>
       <w:r>
@@ -3413,7 +4386,39 @@
           <w:rFonts w:ascii="Book Antiqua" w:hAnsi="Book Antiqua"/>
           <w:color w:val="000000"/>
         </w:rPr>
-        <w:t xml:space="preserve"> la credencial completa 'admin' en 42 segundos. En la versión </w:t>
+        <w:t xml:space="preserve"> la </w:t>
+      </w:r>
+      <w:proofErr w:type="spellStart"/>
+      <w:r>
+        <w:rPr>
+          <w:rFonts w:ascii="Book Antiqua" w:hAnsi="Book Antiqua"/>
+          <w:color w:val="000000"/>
+        </w:rPr>
+        <w:t>credencial</w:t>
+      </w:r>
+      <w:proofErr w:type="spellEnd"/>
+      <w:r>
+        <w:rPr>
+          <w:rFonts w:ascii="Book Antiqua" w:hAnsi="Book Antiqua"/>
+          <w:color w:val="000000"/>
+        </w:rPr>
+        <w:t xml:space="preserve"> </w:t>
+      </w:r>
+      <w:proofErr w:type="spellStart"/>
+      <w:r>
+        <w:rPr>
+          <w:rFonts w:ascii="Book Antiqua" w:hAnsi="Book Antiqua"/>
+          <w:color w:val="000000"/>
+        </w:rPr>
+        <w:t>completa</w:t>
+      </w:r>
+      <w:proofErr w:type="spellEnd"/>
+      <w:r>
+        <w:rPr>
+          <w:rFonts w:ascii="Book Antiqua" w:hAnsi="Book Antiqua"/>
+          <w:color w:val="000000"/>
+        </w:rPr>
+        <w:t xml:space="preserve"> 'admin' en 42 segundos. En la versión </w:t>
       </w:r>
       <w:r>
         <w:rPr>
@@ -3447,7 +4452,23 @@
           <w:rFonts w:ascii="Book Antiqua" w:hAnsi="Book Antiqua"/>
           <w:color w:val="000000"/>
         </w:rPr>
-        <w:t xml:space="preserve">Aprovechando la complejidad geométrica base de </w:t>
+        <w:t xml:space="preserve">Aprovechando la complejidad </w:t>
+      </w:r>
+      <w:proofErr w:type="spellStart"/>
+      <w:r>
+        <w:rPr>
+          <w:rFonts w:ascii="Book Antiqua" w:hAnsi="Book Antiqua"/>
+          <w:color w:val="000000"/>
+        </w:rPr>
+        <w:t>geométrica</w:t>
+      </w:r>
+      <w:proofErr w:type="spellEnd"/>
+      <w:r>
+        <w:rPr>
+          <w:rFonts w:ascii="Book Antiqua" w:hAnsi="Book Antiqua"/>
+          <w:color w:val="000000"/>
+        </w:rPr>
+        <w:t xml:space="preserve"> base de </w:t>
       </w:r>
       <w:proofErr w:type="spellStart"/>
       <w:r>
@@ -3493,7 +4514,23 @@
           <w:rFonts w:ascii="Book Antiqua" w:hAnsi="Book Antiqua"/>
           <w:color w:val="000000"/>
         </w:rPr>
-        <w:t xml:space="preserve"> (promedio de 9.0 vértices y hasta 222 vértices por polígono), el atacante inyectó en el endpoint GET /api/v1/vulnerable/predios/analisis-expansion una subconsulta con un producto cruzado espacial O(N^2) que computa buffers con alta densidad de segmentos por cuadrante. Como se </w:t>
+        <w:t xml:space="preserve"> (</w:t>
+      </w:r>
+      <w:proofErr w:type="spellStart"/>
+      <w:r>
+        <w:rPr>
+          <w:rFonts w:ascii="Book Antiqua" w:hAnsi="Book Antiqua"/>
+          <w:color w:val="000000"/>
+        </w:rPr>
+        <w:t>promedio</w:t>
+      </w:r>
+      <w:proofErr w:type="spellEnd"/>
+      <w:r>
+        <w:rPr>
+          <w:rFonts w:ascii="Book Antiqua" w:hAnsi="Book Antiqua"/>
+          <w:color w:val="000000"/>
+        </w:rPr>
+        <w:t xml:space="preserve"> de 9.0 vértices y hasta 222 vértices por polígono), el atacante inyectó en el endpoint GET /api/v1/vulnerable/predios/analisis-expansion una subconsulta con un producto cruzado espacial O(N^2) que computa buffers con alta densidad de segmentos por cuadrante. Como se </w:t>
       </w:r>
       <w:proofErr w:type="spellStart"/>
       <w:r>
@@ -3564,7 +4601,39 @@
           <w:rFonts w:ascii="Book Antiqua" w:hAnsi="Book Antiqua"/>
           <w:color w:val="000000"/>
         </w:rPr>
-        <w:t xml:space="preserve"> del producto cartesiano desencadena una explosión de complejidad algorítmica O(N^2) que eleva la latencia desde 10.8 ms hasta 1,665.16 ms a medida que los vértices evaluados en el buffer crecen de 14,400 a más de 345,600 puntos, saturando los workers de PostgreSQL en el procesador Intel Core Ultra 5 245KF. </w:t>
+        <w:t xml:space="preserve"> del </w:t>
+      </w:r>
+      <w:proofErr w:type="spellStart"/>
+      <w:r>
+        <w:rPr>
+          <w:rFonts w:ascii="Book Antiqua" w:hAnsi="Book Antiqua"/>
+          <w:color w:val="000000"/>
+        </w:rPr>
+        <w:t>producto</w:t>
+      </w:r>
+      <w:proofErr w:type="spellEnd"/>
+      <w:r>
+        <w:rPr>
+          <w:rFonts w:ascii="Book Antiqua" w:hAnsi="Book Antiqua"/>
+          <w:color w:val="000000"/>
+        </w:rPr>
+        <w:t xml:space="preserve"> </w:t>
+      </w:r>
+      <w:proofErr w:type="spellStart"/>
+      <w:r>
+        <w:rPr>
+          <w:rFonts w:ascii="Book Antiqua" w:hAnsi="Book Antiqua"/>
+          <w:color w:val="000000"/>
+        </w:rPr>
+        <w:t>cartesiano</w:t>
+      </w:r>
+      <w:proofErr w:type="spellEnd"/>
+      <w:r>
+        <w:rPr>
+          <w:rFonts w:ascii="Book Antiqua" w:hAnsi="Book Antiqua"/>
+          <w:color w:val="000000"/>
+        </w:rPr>
+        <w:t xml:space="preserve"> desencadena una explosión de complejidad algorítmica O(N^2) que eleva la latencia desde 10.8 ms hasta 1,665.16 ms a medida que los vértices evaluados en el buffer crecen de 14,400 a más de 345,600 puntos, saturando los workers de PostgreSQL en el procesador Intel Core Ultra 5 245KF. </w:t>
       </w:r>
       <w:r>
         <w:rPr>
@@ -3603,7 +4672,23 @@
           <w:rFonts w:ascii="Book Antiqua" w:hAnsi="Book Antiqua"/>
           <w:color w:val="000000"/>
         </w:rPr>
-        <w:t xml:space="preserve"> mitigada preserva una latencia acotada de ~15 ms al restringir los parámetros </w:t>
+        <w:t xml:space="preserve"> </w:t>
+      </w:r>
+      <w:proofErr w:type="spellStart"/>
+      <w:r>
+        <w:rPr>
+          <w:rFonts w:ascii="Book Antiqua" w:hAnsi="Book Antiqua"/>
+          <w:color w:val="000000"/>
+        </w:rPr>
+        <w:t>mitigada</w:t>
+      </w:r>
+      <w:proofErr w:type="spellEnd"/>
+      <w:r>
+        <w:rPr>
+          <w:rFonts w:ascii="Book Antiqua" w:hAnsi="Book Antiqua"/>
+          <w:color w:val="000000"/>
+        </w:rPr>
+        <w:t xml:space="preserve"> preserva una latencia acotada de ~15 ms al restringir los parámetros </w:t>
       </w:r>
       <w:proofErr w:type="gramStart"/>
       <w:r>
@@ -3707,7 +4792,23 @@
           <w:rFonts w:ascii="Book Antiqua" w:hAnsi="Book Antiqua"/>
           <w:color w:val="000000"/>
         </w:rPr>
-        <w:t xml:space="preserve">En el endpoint POST /api/v1/vulnerable/ficha/modificar, se simuló un </w:t>
+        <w:t xml:space="preserve">En el endpoint POST /api/v1/vulnerable/ficha/modificar, se </w:t>
+      </w:r>
+      <w:proofErr w:type="spellStart"/>
+      <w:r>
+        <w:rPr>
+          <w:rFonts w:ascii="Book Antiqua" w:hAnsi="Book Antiqua"/>
+          <w:color w:val="000000"/>
+        </w:rPr>
+        <w:t>simuló</w:t>
+      </w:r>
+      <w:proofErr w:type="spellEnd"/>
+      <w:r>
+        <w:rPr>
+          <w:rFonts w:ascii="Book Antiqua" w:hAnsi="Book Antiqua"/>
+          <w:color w:val="000000"/>
+        </w:rPr>
+        <w:t xml:space="preserve"> un </w:t>
       </w:r>
       <w:proofErr w:type="spellStart"/>
       <w:r>
@@ -4696,6 +5797,7 @@
       <w:pPr>
         <w:spacing w:before="80" w:after="160"/>
       </w:pPr>
+      <w:proofErr w:type="spellStart"/>
       <w:r>
         <w:rPr>
           <w:rFonts w:ascii="Book Antiqua" w:hAnsi="Book Antiqua"/>
@@ -4703,9 +5805,9 @@
           <w:color w:val="000000"/>
           <w:sz w:val="18"/>
         </w:rPr>
-        <w:t xml:space="preserve">Nota: Mediciones </w:t>
-      </w:r>
-      <w:proofErr w:type="spellStart"/>
+        <w:t>Nota</w:t>
+      </w:r>
+      <w:proofErr w:type="spellEnd"/>
       <w:r>
         <w:rPr>
           <w:rFonts w:ascii="Book Antiqua" w:hAnsi="Book Antiqua"/>
@@ -4713,6 +5815,36 @@
           <w:color w:val="000000"/>
           <w:sz w:val="18"/>
         </w:rPr>
+        <w:t xml:space="preserve">: </w:t>
+      </w:r>
+      <w:proofErr w:type="spellStart"/>
+      <w:r>
+        <w:rPr>
+          <w:rFonts w:ascii="Book Antiqua" w:hAnsi="Book Antiqua"/>
+          <w:i/>
+          <w:color w:val="000000"/>
+          <w:sz w:val="18"/>
+        </w:rPr>
+        <w:t>Mediciones</w:t>
+      </w:r>
+      <w:proofErr w:type="spellEnd"/>
+      <w:r>
+        <w:rPr>
+          <w:rFonts w:ascii="Book Antiqua" w:hAnsi="Book Antiqua"/>
+          <w:i/>
+          <w:color w:val="000000"/>
+          <w:sz w:val="18"/>
+        </w:rPr>
+        <w:t xml:space="preserve"> </w:t>
+      </w:r>
+      <w:proofErr w:type="spellStart"/>
+      <w:r>
+        <w:rPr>
+          <w:rFonts w:ascii="Book Antiqua" w:hAnsi="Book Antiqua"/>
+          <w:i/>
+          <w:color w:val="000000"/>
+          <w:sz w:val="18"/>
+        </w:rPr>
         <w:t>recopiladas</w:t>
       </w:r>
       <w:proofErr w:type="spellEnd"/>
@@ -4723,7 +5855,27 @@
           <w:color w:val="000000"/>
           <w:sz w:val="18"/>
         </w:rPr>
-        <w:t xml:space="preserve"> bajo 300 peticiones concurrentes (concurrencia=10) sobre una estación de trabajo con procesador Intel Core Ultra 5 245KF, 32 GB RAM DDR5 y almacenamiento NVMe PCIe 4.0 en Docker Desktop (PostgreSQL 15 / PostGIS 3.3).</w:t>
+        <w:t xml:space="preserve"> bajo 300 </w:t>
+      </w:r>
+      <w:proofErr w:type="spellStart"/>
+      <w:r>
+        <w:rPr>
+          <w:rFonts w:ascii="Book Antiqua" w:hAnsi="Book Antiqua"/>
+          <w:i/>
+          <w:color w:val="000000"/>
+          <w:sz w:val="18"/>
+        </w:rPr>
+        <w:t>peticiones</w:t>
+      </w:r>
+      <w:proofErr w:type="spellEnd"/>
+      <w:r>
+        <w:rPr>
+          <w:rFonts w:ascii="Book Antiqua" w:hAnsi="Book Antiqua"/>
+          <w:i/>
+          <w:color w:val="000000"/>
+          <w:sz w:val="18"/>
+        </w:rPr>
+        <w:t xml:space="preserve"> concurrentes (concurrencia=10) sobre una estación de trabajo con procesador Intel Core Ultra 5 245KF, 32 GB RAM DDR5 y almacenamiento NVMe PCIe 4.0 en Docker Desktop (PostgreSQL 15 / PostGIS 3.3).</w:t>
       </w:r>
     </w:p>
     <w:p>
@@ -4752,7 +5904,55 @@
           <w:rFonts w:ascii="Book Antiqua" w:hAnsi="Book Antiqua"/>
           <w:color w:val="000000"/>
         </w:rPr>
-        <w:t xml:space="preserve"> la resiliencia bajo estrés progresivo, se evaluó </w:t>
+        <w:t xml:space="preserve"> la </w:t>
+      </w:r>
+      <w:proofErr w:type="spellStart"/>
+      <w:r>
+        <w:rPr>
+          <w:rFonts w:ascii="Book Antiqua" w:hAnsi="Book Antiqua"/>
+          <w:color w:val="000000"/>
+        </w:rPr>
+        <w:t>resiliencia</w:t>
+      </w:r>
+      <w:proofErr w:type="spellEnd"/>
+      <w:r>
+        <w:rPr>
+          <w:rFonts w:ascii="Book Antiqua" w:hAnsi="Book Antiqua"/>
+          <w:color w:val="000000"/>
+        </w:rPr>
+        <w:t xml:space="preserve"> bajo estrés </w:t>
+      </w:r>
+      <w:proofErr w:type="spellStart"/>
+      <w:r>
+        <w:rPr>
+          <w:rFonts w:ascii="Book Antiqua" w:hAnsi="Book Antiqua"/>
+          <w:color w:val="000000"/>
+        </w:rPr>
+        <w:t>progresivo</w:t>
+      </w:r>
+      <w:proofErr w:type="spellEnd"/>
+      <w:r>
+        <w:rPr>
+          <w:rFonts w:ascii="Book Antiqua" w:hAnsi="Book Antiqua"/>
+          <w:color w:val="000000"/>
+        </w:rPr>
+        <w:t xml:space="preserve">, se </w:t>
+      </w:r>
+      <w:proofErr w:type="spellStart"/>
+      <w:r>
+        <w:rPr>
+          <w:rFonts w:ascii="Book Antiqua" w:hAnsi="Book Antiqua"/>
+          <w:color w:val="000000"/>
+        </w:rPr>
+        <w:t>evaluó</w:t>
+      </w:r>
+      <w:proofErr w:type="spellEnd"/>
+      <w:r>
+        <w:rPr>
+          <w:rFonts w:ascii="Book Antiqua" w:hAnsi="Book Antiqua"/>
+          <w:color w:val="000000"/>
+        </w:rPr>
+        <w:t xml:space="preserve"> </w:t>
       </w:r>
       <w:proofErr w:type="spellStart"/>
       <w:r>
@@ -4784,7 +5984,23 @@
           <w:rFonts w:ascii="Book Antiqua" w:hAnsi="Book Antiqua"/>
           <w:color w:val="000000"/>
         </w:rPr>
-        <w:t xml:space="preserve"> de concurrencia escalonada de 1 a 100 </w:t>
+        <w:t xml:space="preserve"> de </w:t>
+      </w:r>
+      <w:proofErr w:type="spellStart"/>
+      <w:r>
+        <w:rPr>
+          <w:rFonts w:ascii="Book Antiqua" w:hAnsi="Book Antiqua"/>
+          <w:color w:val="000000"/>
+        </w:rPr>
+        <w:t>concurrencia</w:t>
+      </w:r>
+      <w:proofErr w:type="spellEnd"/>
+      <w:r>
+        <w:rPr>
+          <w:rFonts w:ascii="Book Antiqua" w:hAnsi="Book Antiqua"/>
+          <w:color w:val="000000"/>
+        </w:rPr>
+        <w:t xml:space="preserve"> escalonada de 1 a 100 </w:t>
       </w:r>
       <w:proofErr w:type="spellStart"/>
       <w:r>
@@ -4884,15 +6100,88 @@
       <w:pPr>
         <w:spacing w:after="80" w:line="240" w:lineRule="auto"/>
       </w:pPr>
-      <w:r/>
-      <w:r>
-        <w:rPr>
-          <w:rFonts w:ascii="Book Antiqua" w:hAnsi="Book Antiqua"/>
-          <w:b w:val="0"/>
-          <w:i w:val="0"/>
-          <w:sz w:val="22"/>
-        </w:rPr>
-        <w:t>Los resultados experimentales confirman que la arquitectura propuesta (GeoAlchemy2 junto a la validación previa en Shapely) introduce un sobrecosto medio de latencia de 2.63 ms por petición (+15.24%), conservando una tasa de procesamiento de 484.36 req/s. Un aspecto relevante para el diseño de software es el comportamiento en el percentil 99 (p99): la latencia de cola disminuyó de 43.75 ms a 38.24 ms, lo que representa una mejora del 12.59% en la estabilidad del servicio. Esta optimización se debe a que PostgreSQL reutiliza los planes de ejecución en memoria (prepared statements), eliminando el costo recurrente de re-analizar sintácticamente las consultas dinámicas.</w:t>
+      <w:r>
+        <w:rPr>
+          <w:rFonts w:ascii="Book Antiqua" w:hAnsi="Book Antiqua"/>
+        </w:rPr>
+        <w:t xml:space="preserve">Los </w:t>
+      </w:r>
+      <w:proofErr w:type="spellStart"/>
+      <w:r>
+        <w:rPr>
+          <w:rFonts w:ascii="Book Antiqua" w:hAnsi="Book Antiqua"/>
+        </w:rPr>
+        <w:t>resultados</w:t>
+      </w:r>
+      <w:proofErr w:type="spellEnd"/>
+      <w:r>
+        <w:rPr>
+          <w:rFonts w:ascii="Book Antiqua" w:hAnsi="Book Antiqua"/>
+        </w:rPr>
+        <w:t xml:space="preserve"> de las </w:t>
+      </w:r>
+      <w:proofErr w:type="spellStart"/>
+      <w:r>
+        <w:rPr>
+          <w:rFonts w:ascii="Book Antiqua" w:hAnsi="Book Antiqua"/>
+        </w:rPr>
+        <w:t>pruebas</w:t>
+      </w:r>
+      <w:proofErr w:type="spellEnd"/>
+      <w:r>
+        <w:rPr>
+          <w:rFonts w:ascii="Book Antiqua" w:hAnsi="Book Antiqua"/>
+        </w:rPr>
+        <w:t xml:space="preserve"> </w:t>
+      </w:r>
+      <w:proofErr w:type="spellStart"/>
+      <w:r>
+        <w:rPr>
+          <w:rFonts w:ascii="Book Antiqua" w:hAnsi="Book Antiqua"/>
+        </w:rPr>
+        <w:t>experimentales</w:t>
+      </w:r>
+      <w:proofErr w:type="spellEnd"/>
+      <w:r>
+        <w:rPr>
+          <w:rFonts w:ascii="Book Antiqua" w:hAnsi="Book Antiqua"/>
+        </w:rPr>
+        <w:t xml:space="preserve"> </w:t>
+      </w:r>
+      <w:proofErr w:type="spellStart"/>
+      <w:r>
+        <w:rPr>
+          <w:rFonts w:ascii="Book Antiqua" w:hAnsi="Book Antiqua"/>
+        </w:rPr>
+        <w:t>demuestran</w:t>
+      </w:r>
+      <w:proofErr w:type="spellEnd"/>
+      <w:r>
+        <w:rPr>
+          <w:rFonts w:ascii="Book Antiqua" w:hAnsi="Book Antiqua"/>
+        </w:rPr>
+        <w:t xml:space="preserve"> que la </w:t>
+      </w:r>
+      <w:proofErr w:type="spellStart"/>
+      <w:r>
+        <w:rPr>
+          <w:rFonts w:ascii="Book Antiqua" w:hAnsi="Book Antiqua"/>
+        </w:rPr>
+        <w:t>arquitectura</w:t>
+      </w:r>
+      <w:proofErr w:type="spellEnd"/>
+      <w:r>
+        <w:rPr>
+          <w:rFonts w:ascii="Book Antiqua" w:hAnsi="Book Antiqua"/>
+        </w:rPr>
+        <w:t xml:space="preserve"> propuesta (GeoAlchemy2 junto a la validación previa en Shapely) introduce un sobrecosto medio de latencia de 2.63 ms por petición (+15.24%), conservando una </w:t>
+      </w:r>
+      <w:r>
+        <w:rPr>
+          <w:rFonts w:ascii="Book Antiqua" w:hAnsi="Book Antiqua"/>
+        </w:rPr>
+        <w:lastRenderedPageBreak/>
+        <w:t>tasa de procesamiento de 484.36 req/s. Un aspecto relevante para el diseño de software es el comportamiento en el percentil 99 (p99): la latencia de cola disminuyó de 43.75 ms a 38.24 ms, lo que representa una mejora del 12.59% en la estabilidad del servicio. Esta optimización se debe a que PostgreSQL reutiliza los planes de ejecución en memoria (prepared statements), eliminando el costo recurrente de re-analizar sintácticamente las consultas dinámicas.</w:t>
       </w:r>
     </w:p>
     <w:p>
@@ -4900,15 +6189,67 @@
         <w:spacing w:after="80" w:line="240" w:lineRule="auto"/>
         <w:ind w:firstLine="432"/>
       </w:pPr>
-      <w:r/>
-      <w:r>
-        <w:rPr>
-          <w:rFonts w:ascii="Book Antiqua" w:hAnsi="Book Antiqua"/>
-          <w:b w:val="0"/>
-          <w:i w:val="0"/>
-          <w:sz w:val="22"/>
-        </w:rPr>
-        <w:t>Este sobrecosto medio resulta plenamente asumible frente a las garantías de protección obtenidas: neutraliza la exfiltración masiva de predios, los canales laterales de error y la denegación de servicio espacial. Como se ilustra en la Figura 4, los cortafuegos de aplicaciones web tradicionales (WAF basados en firmas como OWASP CRS) carecen de gramática geoespacial y bloquean únicamente entre el 0% y el 20% de las inyecciones topológicas (ST_DWithin y ST_Intersects). En contraste, el pipeline de tres barreras implementado en la capa de aplicación alcanzó una tasa de mitigación del 100% en todos los vectores evaluados de la tríada CIA.</w:t>
+      <w:r>
+        <w:rPr>
+          <w:rFonts w:ascii="Book Antiqua" w:hAnsi="Book Antiqua"/>
+        </w:rPr>
+        <w:t xml:space="preserve">Este sobrecosto medio resulta </w:t>
+      </w:r>
+      <w:proofErr w:type="spellStart"/>
+      <w:r>
+        <w:rPr>
+          <w:rFonts w:ascii="Book Antiqua" w:hAnsi="Book Antiqua"/>
+        </w:rPr>
+        <w:t>asumible</w:t>
+      </w:r>
+      <w:proofErr w:type="spellEnd"/>
+      <w:r>
+        <w:rPr>
+          <w:rFonts w:ascii="Book Antiqua" w:hAnsi="Book Antiqua"/>
+        </w:rPr>
+        <w:t xml:space="preserve"> frente a las garantías de protección obtenidas: neutraliza la </w:t>
+      </w:r>
+      <w:proofErr w:type="spellStart"/>
+      <w:r>
+        <w:rPr>
+          <w:rFonts w:ascii="Book Antiqua" w:hAnsi="Book Antiqua"/>
+        </w:rPr>
+        <w:t>filtración</w:t>
+      </w:r>
+      <w:proofErr w:type="spellEnd"/>
+      <w:r>
+        <w:rPr>
+          <w:rFonts w:ascii="Book Antiqua" w:hAnsi="Book Antiqua"/>
+        </w:rPr>
+        <w:t xml:space="preserve"> masiva de predios, los canales laterales de error y la </w:t>
+      </w:r>
+      <w:proofErr w:type="spellStart"/>
+      <w:r>
+        <w:rPr>
+          <w:rFonts w:ascii="Book Antiqua" w:hAnsi="Book Antiqua"/>
+        </w:rPr>
+        <w:t>denegación</w:t>
+      </w:r>
+      <w:proofErr w:type="spellEnd"/>
+      <w:r>
+        <w:rPr>
+          <w:rFonts w:ascii="Book Antiqua" w:hAnsi="Book Antiqua"/>
+        </w:rPr>
+        <w:t xml:space="preserve"> de </w:t>
+      </w:r>
+      <w:proofErr w:type="spellStart"/>
+      <w:r>
+        <w:rPr>
+          <w:rFonts w:ascii="Book Antiqua" w:hAnsi="Book Antiqua"/>
+        </w:rPr>
+        <w:t>servicio</w:t>
+      </w:r>
+      <w:proofErr w:type="spellEnd"/>
+      <w:r>
+        <w:rPr>
+          <w:rFonts w:ascii="Book Antiqua" w:hAnsi="Book Antiqua"/>
+        </w:rPr>
+        <w:t>. Como se ilustra en la Figura 4, los cortafuegos de aplicaciones web tradicionales (WAF basados en firmas como OWASP CRS) carecen de gramática geoespacial y bloquean únicamente entre el 0% y el 20% de las inyecciones topológicas (ST_DWithin y ST_Intersects). En contraste, el pipeline de tres barreras implementado en la capa de aplicación alcanzó una tasa de mitigación del 100% en todos los vectores evaluados de la tríada CIA.</w:t>
       </w:r>
     </w:p>
     <w:p>
@@ -4991,15 +6332,7 @@
           <w:rFonts w:ascii="Book Antiqua" w:hAnsi="Book Antiqua"/>
           <w:color w:val="000000"/>
         </w:rPr>
-        <w:t xml:space="preserve">Si bien las métricas absolutas de latencia se obtuvieron sobre una estación de trabajo con procesador Intel Core Ultra 5 245KF, la validez metodológica y la generalización de los resultados radican en las proporciones relativas (+15.24% de sobrecosto medio y -12.59% de mejora en cola p99) y en las complejidades asintóticas computacionales. En servidores gubernamentales o instancias de nube con recursos más restringidos (frecuentes en gobiernos locales), el costo computacional del preprocesamiento en Python (GeoAlchemy2/Shapely) sigue siendo despreciable frente a los cuellos de botella dominantes de I/O en disco y concurrencia relacional. Por el contrario, la ausencia de mitigación frente a ataques de complejidad algorítmica (O(N^2)) como el Spatial DoS (Simulación 3) resulta crítica en procesadores de gama de entrada con </w:t>
-      </w:r>
-      <w:r>
-        <w:rPr>
-          <w:rFonts w:ascii="Book Antiqua" w:hAnsi="Book Antiqua"/>
-          <w:color w:val="000000"/>
-        </w:rPr>
-        <w:lastRenderedPageBreak/>
-        <w:t>menor paralelismo, donde unas pocas consultas maliciosas bloquean de inmediato la totalidad del servicio catastral.</w:t>
+        <w:t>Si bien las métricas absolutas de latencia se obtuvieron sobre una estación de trabajo con procesador Intel Core Ultra 5 245KF, la validez metodológica y la generalización de los resultados radican en las proporciones relativas (+15.24% de sobrecosto medio y -12.59% de mejora en cola p99) y en las complejidades asintóticas computacionales. En servidores gubernamentales o instancias de nube con recursos más restringidos (frecuentes en gobiernos locales), el costo computacional del preprocesamiento en Python (GeoAlchemy2/Shapely) sigue siendo despreciable frente a los cuellos de botella dominantes de I/O en disco y concurrencia relacional. Por el contrario, la ausencia de mitigación frente a ataques de complejidad algorítmica (O(N^2)) como el Spatial DoS (Simulación 3) resulta crítica en procesadores de gama de entrada con menor paralelismo, donde unas pocas consultas maliciosas bloquean de inmediato la totalidad del servicio catastral.</w:t>
       </w:r>
     </w:p>
     <w:p>
@@ -5013,6 +6346,7 @@
           <w:b/>
           <w:color w:val="000000"/>
         </w:rPr>
+        <w:lastRenderedPageBreak/>
         <w:t xml:space="preserve">Impacto sistémico en la integridad de trámites y datos catastrales. </w:t>
       </w:r>
       <w:r>
@@ -5088,7 +6422,6 @@
           <w:rFonts w:ascii="Book Antiqua" w:hAnsi="Book Antiqua"/>
           <w:color w:val="000000"/>
         </w:rPr>
-        <w:lastRenderedPageBreak/>
         <w:t>Atluri, V., &amp; Chun, S. A. (2004). An authorization model for geospatial data. IEEE Transactions on Dependable and Secure Computing, 1(4), 238–254. https://doi.org/10.1109/TDSC.2004.34</w:t>
       </w:r>
     </w:p>
@@ -5102,6 +6435,7 @@
           <w:rFonts w:ascii="Book Antiqua" w:hAnsi="Book Antiqua"/>
           <w:color w:val="000000"/>
         </w:rPr>
+        <w:lastRenderedPageBreak/>
         <w:t>Bertino, E., Catania, B., &amp; Damiani, M. L. (2005). GEO-RBAC: A spatially aware RBAC. In Proceedings of the 10th ACM Symposium on Access Control Models and Technologies (SACMAT '05) (pp. 29–37). Association for Computing Machinery. https://doi.org/10.1145/1063979.1063985</w:t>
       </w:r>
     </w:p>
@@ -6961,6 +8295,7 @@
   <w:style w:type="character" w:default="1" w:styleId="Fuentedeprrafopredeter">
     <w:name w:val="Default Paragraph Font"/>
     <w:uiPriority w:val="1"/>
+    <w:semiHidden/>
     <w:unhideWhenUsed/>
   </w:style>
   <w:style w:type="table" w:default="1" w:styleId="Tablanormal">

</xml_diff>

<commit_message>
docs: streamline platform independence and systemic impact subsections
</commit_message>
<xml_diff>
--- a/Articulo_Cientifico_IMJETA_Final.docx
+++ b/Articulo_Cientifico_IMJETA_Final.docx
@@ -6319,20 +6319,24 @@
         <w:spacing w:after="80" w:line="240" w:lineRule="auto"/>
         <w:ind w:firstLine="432"/>
       </w:pPr>
+      <w:r/>
       <w:r>
         <w:rPr>
           <w:rFonts w:ascii="Book Antiqua" w:hAnsi="Book Antiqua"/>
           <w:b/>
-          <w:color w:val="000000"/>
+          <w:i w:val="0"/>
+          <w:sz w:val="22"/>
         </w:rPr>
         <w:t xml:space="preserve">Independencia de plataforma y validez del benchmarking. </w:t>
       </w:r>
       <w:r>
         <w:rPr>
           <w:rFonts w:ascii="Book Antiqua" w:hAnsi="Book Antiqua"/>
-          <w:color w:val="000000"/>
-        </w:rPr>
-        <w:t>Si bien las métricas absolutas de latencia se obtuvieron sobre una estación de trabajo con procesador Intel Core Ultra 5 245KF, la validez metodológica y la generalización de los resultados radican en las proporciones relativas (+15.24% de sobrecosto medio y -12.59% de mejora en cola p99) y en las complejidades asintóticas computacionales. En servidores gubernamentales o instancias de nube con recursos más restringidos (frecuentes en gobiernos locales), el costo computacional del preprocesamiento en Python (GeoAlchemy2/Shapely) sigue siendo despreciable frente a los cuellos de botella dominantes de I/O en disco y concurrencia relacional. Por el contrario, la ausencia de mitigación frente a ataques de complejidad algorítmica (O(N^2)) como el Spatial DoS (Simulación 3) resulta crítica en procesadores de gama de entrada con menor paralelismo, donde unas pocas consultas maliciosas bloquean de inmediato la totalidad del servicio catastral.</w:t>
+          <w:b w:val="0"/>
+          <w:i w:val="0"/>
+          <w:sz w:val="22"/>
+        </w:rPr>
+        <w:t>Aunque los valores absolutos de latencia dependen del hardware base de pruebas, la validez metodológica y la generalización de los resultados residen en las proporciones relativas (+15.24% de sobrecosto medio y -12.59% de mejora en p99) y en las complejidades asintóticas. En servidores municipales o instancias de nube con recursos acotados, el consumo computacional de la validación previa en Python (GeoAlchemy2 y Shapely) es marginal frente a la latencia de acceso a disco y la concurrencia relacional. Por el contrario, omitir la mitigación ante ataques de complejidad cuadrática (O(N^2)), como el DoS espacial (Simulación 3), expone a los procesadores con menor paralelismo a una saturación inmediata, donde un número reducido de peticiones maliciosas bloquea por completo el geoportal catastral.</w:t>
       </w:r>
     </w:p>
     <w:p>
@@ -6340,21 +6344,24 @@
         <w:spacing w:after="80" w:line="240" w:lineRule="auto"/>
         <w:ind w:firstLine="432"/>
       </w:pPr>
+      <w:r/>
       <w:r>
         <w:rPr>
           <w:rFonts w:ascii="Book Antiqua" w:hAnsi="Book Antiqua"/>
           <w:b/>
-          <w:color w:val="000000"/>
-        </w:rPr>
-        <w:lastRenderedPageBreak/>
+          <w:i w:val="0"/>
+          <w:sz w:val="22"/>
+        </w:rPr>
         <w:t xml:space="preserve">Impacto sistémico en la integridad de trámites y datos catastrales. </w:t>
       </w:r>
       <w:r>
         <w:rPr>
           <w:rFonts w:ascii="Book Antiqua" w:hAnsi="Book Antiqua"/>
-          <w:color w:val="000000"/>
-        </w:rPr>
-        <w:t>La viabilidad empírica de la Simulación 4 (manipulación de autovalúo y titularidad mediante inyección directa) demuestra cómo un fallo a nivel de persistencia relacional trasciende la alteración de una tabla y compromete la validez de los trámites de gobierno electrónico municipal. Cuando los sistemas catastrales interoperan automáticamente para emitir certificados catastrales con validación criptográfica QR, constancias de no adeudo fiscal o minutas de transferencia inmobiliaria bajo ISO 19152 LADM, la inyección de datos arbitrarios en catastro_titulares y tg_lote propaga inconsistencias fiscales y registrales sin activar alertas en la interfaz de usuario, evidenciando que la sanitización tipada en el ORM es una salvaguarda indispensable para la fiabilidad de los servicios públicos digitales.</w:t>
+          <w:b w:val="0"/>
+          <w:i w:val="0"/>
+          <w:sz w:val="22"/>
+        </w:rPr>
+        <w:t>La viabilidad empírica del fraude en autovalúos y titularidad (Simulación 4) demuestra que una inyección en la capa de persistencia trasciende la modificación de una tabla aislada y compromete la fe pública del gobierno electrónico local. En la actualidad, los geoportales interoperan de forma autónoma para emitir certificados catastrales con código QR, constancias de no adeudo tributario y transferencias inmobiliarias bajo el estándar ISO 19152 (LADM). La inyección de datos arbitrarios en catastro_titulares y tg_lote propaga inconsistencias jurídicas y fiscales hacia estos documentos oficiales sin generar alertas en la interfaz de usuario. Este escenario ratifica que el tipado estricto en el ORM constituye una salvaguarda indispensable para preservar la legitimidad y trazabilidad de los servicios públicos digitales.</w:t>
       </w:r>
     </w:p>
     <w:p>

</xml_diff>

<commit_message>
chore: save author edits before conclusion refactoring
</commit_message>
<xml_diff>
--- a/Articulo_Cientifico_IMJETA_Final.docx
+++ b/Articulo_Cientifico_IMJETA_Final.docx
@@ -317,7 +317,7 @@
           <w:color w:val="000000"/>
           <w:sz w:val="20"/>
         </w:rPr>
-        <w:t xml:space="preserve"> de bases de datos espaciales en arquitecturas web ha ampliado la superficie de ataque para las aplicaciones </w:t>
+        <w:t xml:space="preserve"> de bases de datos espaciales en arquitecturas web ha ampliado la superficie de ataque para las </w:t>
       </w:r>
       <w:proofErr w:type="spellStart"/>
       <w:r>
@@ -326,6 +326,24 @@
           <w:color w:val="000000"/>
           <w:sz w:val="20"/>
         </w:rPr>
+        <w:t>aplicaciones</w:t>
+      </w:r>
+      <w:proofErr w:type="spellEnd"/>
+      <w:r>
+        <w:rPr>
+          <w:rFonts w:ascii="Book Antiqua" w:hAnsi="Book Antiqua"/>
+          <w:color w:val="000000"/>
+          <w:sz w:val="20"/>
+        </w:rPr>
+        <w:t xml:space="preserve"> </w:t>
+      </w:r>
+      <w:proofErr w:type="spellStart"/>
+      <w:r>
+        <w:rPr>
+          <w:rFonts w:ascii="Book Antiqua" w:hAnsi="Book Antiqua"/>
+          <w:color w:val="000000"/>
+          <w:sz w:val="20"/>
+        </w:rPr>
         <w:t>modernas</w:t>
       </w:r>
       <w:proofErr w:type="spellEnd"/>
@@ -443,7 +461,7 @@
           <w:color w:val="000000"/>
           <w:sz w:val="20"/>
         </w:rPr>
-        <w:t xml:space="preserve"> estando poco explorados. Este artículo investiga la explotación y mitigación de inyecciones SQL espaciales dentro de sistemas de información catastral que utilizan PostGIS. Se desarrolló un entorno de prueba en contenedores, utilizando Docker, para </w:t>
+        <w:t xml:space="preserve"> estando poco explorados. Este artículo investiga la explotación y mitigación de inyecciones SQL espaciales dentro de sistemas de información catastral que utilizan PostGIS. Se desarrolló un entorno de prueba en contenedores, </w:t>
       </w:r>
       <w:proofErr w:type="spellStart"/>
       <w:r>
@@ -452,6 +470,24 @@
           <w:color w:val="000000"/>
           <w:sz w:val="20"/>
         </w:rPr>
+        <w:t>utilizando</w:t>
+      </w:r>
+      <w:proofErr w:type="spellEnd"/>
+      <w:r>
+        <w:rPr>
+          <w:rFonts w:ascii="Book Antiqua" w:hAnsi="Book Antiqua"/>
+          <w:color w:val="000000"/>
+          <w:sz w:val="20"/>
+        </w:rPr>
+        <w:t xml:space="preserve"> Docker, para </w:t>
+      </w:r>
+      <w:proofErr w:type="spellStart"/>
+      <w:r>
+        <w:rPr>
+          <w:rFonts w:ascii="Book Antiqua" w:hAnsi="Book Antiqua"/>
+          <w:color w:val="000000"/>
+          <w:sz w:val="20"/>
+        </w:rPr>
         <w:t>simular</w:t>
       </w:r>
       <w:proofErr w:type="spellEnd"/>
@@ -533,7 +569,7 @@
           <w:color w:val="000000"/>
           <w:sz w:val="20"/>
         </w:rPr>
-        <w:t xml:space="preserve">) y PostgreSQL/PostGIS. El estudio demuestra cómo los </w:t>
+        <w:t>) y PostgreSQL/</w:t>
       </w:r>
       <w:proofErr w:type="spellStart"/>
       <w:r>
@@ -542,6 +578,78 @@
           <w:color w:val="000000"/>
           <w:sz w:val="20"/>
         </w:rPr>
+        <w:t>PostGIS</w:t>
+      </w:r>
+      <w:proofErr w:type="spellEnd"/>
+      <w:r>
+        <w:rPr>
+          <w:rFonts w:ascii="Book Antiqua" w:hAnsi="Book Antiqua"/>
+          <w:color w:val="000000"/>
+          <w:sz w:val="20"/>
+        </w:rPr>
+        <w:t xml:space="preserve">. El estudio </w:t>
+      </w:r>
+      <w:proofErr w:type="spellStart"/>
+      <w:r>
+        <w:rPr>
+          <w:rFonts w:ascii="Book Antiqua" w:hAnsi="Book Antiqua"/>
+          <w:color w:val="000000"/>
+          <w:sz w:val="20"/>
+        </w:rPr>
+        <w:t>demuestra</w:t>
+      </w:r>
+      <w:proofErr w:type="spellEnd"/>
+      <w:r>
+        <w:rPr>
+          <w:rFonts w:ascii="Book Antiqua" w:hAnsi="Book Antiqua"/>
+          <w:color w:val="000000"/>
+          <w:sz w:val="20"/>
+        </w:rPr>
+        <w:t xml:space="preserve"> </w:t>
+      </w:r>
+      <w:proofErr w:type="spellStart"/>
+      <w:r>
+        <w:rPr>
+          <w:rFonts w:ascii="Book Antiqua" w:hAnsi="Book Antiqua"/>
+          <w:color w:val="000000"/>
+          <w:sz w:val="20"/>
+        </w:rPr>
+        <w:t>cómo</w:t>
+      </w:r>
+      <w:proofErr w:type="spellEnd"/>
+      <w:r>
+        <w:rPr>
+          <w:rFonts w:ascii="Book Antiqua" w:hAnsi="Book Antiqua"/>
+          <w:color w:val="000000"/>
+          <w:sz w:val="20"/>
+        </w:rPr>
+        <w:t xml:space="preserve"> </w:t>
+      </w:r>
+      <w:proofErr w:type="spellStart"/>
+      <w:r>
+        <w:rPr>
+          <w:rFonts w:ascii="Book Antiqua" w:hAnsi="Book Antiqua"/>
+          <w:color w:val="000000"/>
+          <w:sz w:val="20"/>
+        </w:rPr>
+        <w:t>los</w:t>
+      </w:r>
+      <w:proofErr w:type="spellEnd"/>
+      <w:r>
+        <w:rPr>
+          <w:rFonts w:ascii="Book Antiqua" w:hAnsi="Book Antiqua"/>
+          <w:color w:val="000000"/>
+          <w:sz w:val="20"/>
+        </w:rPr>
+        <w:t xml:space="preserve"> </w:t>
+      </w:r>
+      <w:proofErr w:type="spellStart"/>
+      <w:r>
+        <w:rPr>
+          <w:rFonts w:ascii="Book Antiqua" w:hAnsi="Book Antiqua"/>
+          <w:color w:val="000000"/>
+          <w:sz w:val="20"/>
+        </w:rPr>
         <w:t>atacantes</w:t>
       </w:r>
       <w:proofErr w:type="spellEnd"/>
@@ -675,7 +783,7 @@
           <w:color w:val="000000"/>
           <w:sz w:val="20"/>
         </w:rPr>
-        <w:t xml:space="preserve"> que el pipeline propuesto neutralizó el 100% de los vectores de </w:t>
+        <w:t xml:space="preserve"> que el pipeline propuesto neutralizó el 100% de </w:t>
       </w:r>
       <w:proofErr w:type="spellStart"/>
       <w:r>
@@ -684,6 +792,42 @@
           <w:color w:val="000000"/>
           <w:sz w:val="20"/>
         </w:rPr>
+        <w:t>los</w:t>
+      </w:r>
+      <w:proofErr w:type="spellEnd"/>
+      <w:r>
+        <w:rPr>
+          <w:rFonts w:ascii="Book Antiqua" w:hAnsi="Book Antiqua"/>
+          <w:color w:val="000000"/>
+          <w:sz w:val="20"/>
+        </w:rPr>
+        <w:t xml:space="preserve"> </w:t>
+      </w:r>
+      <w:proofErr w:type="spellStart"/>
+      <w:r>
+        <w:rPr>
+          <w:rFonts w:ascii="Book Antiqua" w:hAnsi="Book Antiqua"/>
+          <w:color w:val="000000"/>
+          <w:sz w:val="20"/>
+        </w:rPr>
+        <w:t>vectores</w:t>
+      </w:r>
+      <w:proofErr w:type="spellEnd"/>
+      <w:r>
+        <w:rPr>
+          <w:rFonts w:ascii="Book Antiqua" w:hAnsi="Book Antiqua"/>
+          <w:color w:val="000000"/>
+          <w:sz w:val="20"/>
+        </w:rPr>
+        <w:t xml:space="preserve"> de </w:t>
+      </w:r>
+      <w:proofErr w:type="spellStart"/>
+      <w:r>
+        <w:rPr>
+          <w:rFonts w:ascii="Book Antiqua" w:hAnsi="Book Antiqua"/>
+          <w:color w:val="000000"/>
+          <w:sz w:val="20"/>
+        </w:rPr>
         <w:t>ataque</w:t>
       </w:r>
       <w:proofErr w:type="spellEnd"/>
@@ -729,7 +873,25 @@
           <w:color w:val="000000"/>
           <w:sz w:val="20"/>
         </w:rPr>
-        <w:t xml:space="preserve"> medio de latencia de 2.63 ms (+15.24%) y una mejora del 12.59% en la estabilidad de cola (p99). Se concluye que la mitigación efectiva de inyecciones espaciales no depende de trasladar la validación topológica y la parametrización rígida a la capa de aplicación (ORM), garantizando la integridad catastral con un impacto operativo marginal.</w:t>
+        <w:t xml:space="preserve"> medio de </w:t>
+      </w:r>
+      <w:proofErr w:type="spellStart"/>
+      <w:r>
+        <w:rPr>
+          <w:rFonts w:ascii="Book Antiqua" w:hAnsi="Book Antiqua"/>
+          <w:color w:val="000000"/>
+          <w:sz w:val="20"/>
+        </w:rPr>
+        <w:t>latencia</w:t>
+      </w:r>
+      <w:proofErr w:type="spellEnd"/>
+      <w:r>
+        <w:rPr>
+          <w:rFonts w:ascii="Book Antiqua" w:hAnsi="Book Antiqua"/>
+          <w:color w:val="000000"/>
+          <w:sz w:val="20"/>
+        </w:rPr>
+        <w:t xml:space="preserve"> de 2.63 ms (+15.24%) y una mejora del 12.59% en la estabilidad de cola (p99). Se concluye que la mitigación efectiva de inyecciones espaciales no depende de trasladar la validación topológica y la parametrización rígida a la capa de aplicación (ORM), garantizando la integridad catastral con un impacto operativo marginal.</w:t>
       </w:r>
     </w:p>
     <w:p>
@@ -787,7 +949,39 @@
           <w:color w:val="000000"/>
         </w:rPr>
         <w:lastRenderedPageBreak/>
-        <w:t xml:space="preserve">ámbito, PostgreSQL junto a su extensión espacial PostGIS constituyen la </w:t>
+        <w:t xml:space="preserve">ámbito, PostgreSQL junto a su extensión espacial </w:t>
+      </w:r>
+      <w:proofErr w:type="spellStart"/>
+      <w:r>
+        <w:rPr>
+          <w:rFonts w:ascii="Book Antiqua" w:hAnsi="Book Antiqua"/>
+          <w:color w:val="000000"/>
+        </w:rPr>
+        <w:t>PostGIS</w:t>
+      </w:r>
+      <w:proofErr w:type="spellEnd"/>
+      <w:r>
+        <w:rPr>
+          <w:rFonts w:ascii="Book Antiqua" w:hAnsi="Book Antiqua"/>
+          <w:color w:val="000000"/>
+        </w:rPr>
+        <w:t xml:space="preserve"> </w:t>
+      </w:r>
+      <w:proofErr w:type="spellStart"/>
+      <w:r>
+        <w:rPr>
+          <w:rFonts w:ascii="Book Antiqua" w:hAnsi="Book Antiqua"/>
+          <w:color w:val="000000"/>
+        </w:rPr>
+        <w:t>constituyen</w:t>
+      </w:r>
+      <w:proofErr w:type="spellEnd"/>
+      <w:r>
+        <w:rPr>
+          <w:rFonts w:ascii="Book Antiqua" w:hAnsi="Book Antiqua"/>
+          <w:color w:val="000000"/>
+        </w:rPr>
+        <w:t xml:space="preserve"> la </w:t>
       </w:r>
       <w:proofErr w:type="spellStart"/>
       <w:r>
@@ -896,7 +1090,39 @@
           <w:rFonts w:ascii="Book Antiqua" w:hAnsi="Book Antiqua"/>
           <w:color w:val="000000"/>
         </w:rPr>
-        <w:t xml:space="preserve">Sin embargo, la exposición de estos servicios mediante APIs REST introduce vectores de ataque cuando las consultas se construyen mediante concatenación de cadenas dentro de funciones espaciales. Si bien la inyección SQL clásica ha sido ampliamente documentada (Clarke, 2012; Halfond et al., 2006), la manipulación de operadores geométricos de PostGIS —como </w:t>
+        <w:t xml:space="preserve">Sin embargo, la exposición de estos servicios mediante APIs REST introduce vectores de ataque cuando las consultas se construyen mediante concatenación de cadenas dentro de funciones espaciales. Si bien la inyección SQL clásica ha sido ampliamente documentada (Clarke, 2012; Halfond et al., 2006), la manipulación de operadores geométricos de </w:t>
+      </w:r>
+      <w:proofErr w:type="spellStart"/>
+      <w:r>
+        <w:rPr>
+          <w:rFonts w:ascii="Book Antiqua" w:hAnsi="Book Antiqua"/>
+          <w:color w:val="000000"/>
+        </w:rPr>
+        <w:t>PostGIS</w:t>
+      </w:r>
+      <w:proofErr w:type="spellEnd"/>
+      <w:r>
+        <w:rPr>
+          <w:rFonts w:ascii="Book Antiqua" w:hAnsi="Book Antiqua"/>
+          <w:color w:val="000000"/>
+        </w:rPr>
+        <w:t xml:space="preserve"> —</w:t>
+      </w:r>
+      <w:proofErr w:type="spellStart"/>
+      <w:r>
+        <w:rPr>
+          <w:rFonts w:ascii="Book Antiqua" w:hAnsi="Book Antiqua"/>
+          <w:color w:val="000000"/>
+        </w:rPr>
+        <w:t>como</w:t>
+      </w:r>
+      <w:proofErr w:type="spellEnd"/>
+      <w:r>
+        <w:rPr>
+          <w:rFonts w:ascii="Book Antiqua" w:hAnsi="Book Antiqua"/>
+          <w:color w:val="000000"/>
+        </w:rPr>
+        <w:t xml:space="preserve"> </w:t>
       </w:r>
       <w:proofErr w:type="spellStart"/>
       <w:r>
@@ -1008,7 +1234,55 @@
           <w:rFonts w:ascii="Book Antiqua" w:hAnsi="Book Antiqua"/>
           <w:color w:val="000000"/>
         </w:rPr>
-        <w:t xml:space="preserve"> entrada no saneada no solo permite eludir filtros relacionales o exfiltrar datos, sino también desencadenar estados de </w:t>
+        <w:t xml:space="preserve"> entrada no </w:t>
+      </w:r>
+      <w:proofErr w:type="spellStart"/>
+      <w:r>
+        <w:rPr>
+          <w:rFonts w:ascii="Book Antiqua" w:hAnsi="Book Antiqua"/>
+          <w:color w:val="000000"/>
+        </w:rPr>
+        <w:t>saneada</w:t>
+      </w:r>
+      <w:proofErr w:type="spellEnd"/>
+      <w:r>
+        <w:rPr>
+          <w:rFonts w:ascii="Book Antiqua" w:hAnsi="Book Antiqua"/>
+          <w:color w:val="000000"/>
+        </w:rPr>
+        <w:t xml:space="preserve"> no solo permite eludir filtros relacionales o exfiltrar datos, sino también </w:t>
+      </w:r>
+      <w:proofErr w:type="spellStart"/>
+      <w:r>
+        <w:rPr>
+          <w:rFonts w:ascii="Book Antiqua" w:hAnsi="Book Antiqua"/>
+          <w:color w:val="000000"/>
+        </w:rPr>
+        <w:t>desencadenar</w:t>
+      </w:r>
+      <w:proofErr w:type="spellEnd"/>
+      <w:r>
+        <w:rPr>
+          <w:rFonts w:ascii="Book Antiqua" w:hAnsi="Book Antiqua"/>
+          <w:color w:val="000000"/>
+        </w:rPr>
+        <w:t xml:space="preserve"> </w:t>
+      </w:r>
+      <w:proofErr w:type="spellStart"/>
+      <w:r>
+        <w:rPr>
+          <w:rFonts w:ascii="Book Antiqua" w:hAnsi="Book Antiqua"/>
+          <w:color w:val="000000"/>
+        </w:rPr>
+        <w:t>estados</w:t>
+      </w:r>
+      <w:proofErr w:type="spellEnd"/>
+      <w:r>
+        <w:rPr>
+          <w:rFonts w:ascii="Book Antiqua" w:hAnsi="Book Antiqua"/>
+          <w:color w:val="000000"/>
+        </w:rPr>
+        <w:t xml:space="preserve"> de </w:t>
       </w:r>
       <w:proofErr w:type="spellStart"/>
       <w:r>
@@ -1163,7 +1437,23 @@
           <w:rFonts w:ascii="Book Antiqua" w:hAnsi="Book Antiqua"/>
           <w:color w:val="000000"/>
         </w:rPr>
-        <w:t xml:space="preserve">Este artículo presenta una evaluación experimental de vulnerabilidades de </w:t>
+        <w:t xml:space="preserve">Este artículo presenta una evaluación experimental de </w:t>
+      </w:r>
+      <w:proofErr w:type="spellStart"/>
+      <w:r>
+        <w:rPr>
+          <w:rFonts w:ascii="Book Antiqua" w:hAnsi="Book Antiqua"/>
+          <w:color w:val="000000"/>
+        </w:rPr>
+        <w:t>vulnerabilidades</w:t>
+      </w:r>
+      <w:proofErr w:type="spellEnd"/>
+      <w:r>
+        <w:rPr>
+          <w:rFonts w:ascii="Book Antiqua" w:hAnsi="Book Antiqua"/>
+          <w:color w:val="000000"/>
+        </w:rPr>
+        <w:t xml:space="preserve"> de </w:t>
       </w:r>
       <w:proofErr w:type="spellStart"/>
       <w:r>
@@ -1726,7 +2016,23 @@
           <w:rFonts w:ascii="Book Antiqua" w:hAnsi="Book Antiqua"/>
           <w:color w:val="000000"/>
         </w:rPr>
-        <w:t xml:space="preserve"> A diferencia de un </w:t>
+        <w:t xml:space="preserve"> A </w:t>
+      </w:r>
+      <w:proofErr w:type="spellStart"/>
+      <w:r>
+        <w:rPr>
+          <w:rFonts w:ascii="Book Antiqua" w:hAnsi="Book Antiqua"/>
+          <w:color w:val="000000"/>
+        </w:rPr>
+        <w:t>diferencia</w:t>
+      </w:r>
+      <w:proofErr w:type="spellEnd"/>
+      <w:r>
+        <w:rPr>
+          <w:rFonts w:ascii="Book Antiqua" w:hAnsi="Book Antiqua"/>
+          <w:color w:val="000000"/>
+        </w:rPr>
+        <w:t xml:space="preserve"> de un </w:t>
       </w:r>
       <w:proofErr w:type="spellStart"/>
       <w:r>
@@ -1870,7 +2176,23 @@
           <w:rFonts w:ascii="Book Antiqua" w:hAnsi="Book Antiqua"/>
           <w:color w:val="000000"/>
         </w:rPr>
-        <w:t xml:space="preserve"> de referencia espacial (SRID) y envolventes mínimas (bounding boxes), lo que amplía el área de escape sintáctico. Este vacío teórico en los modelos tradicionales de inyección deja sin caracterizar la manipulación de predicados topológicos nativos en motores relacionales.</w:t>
+        <w:t xml:space="preserve"> de </w:t>
+      </w:r>
+      <w:proofErr w:type="spellStart"/>
+      <w:r>
+        <w:rPr>
+          <w:rFonts w:ascii="Book Antiqua" w:hAnsi="Book Antiqua"/>
+          <w:color w:val="000000"/>
+        </w:rPr>
+        <w:t>referencia</w:t>
+      </w:r>
+      <w:proofErr w:type="spellEnd"/>
+      <w:r>
+        <w:rPr>
+          <w:rFonts w:ascii="Book Antiqua" w:hAnsi="Book Antiqua"/>
+          <w:color w:val="000000"/>
+        </w:rPr>
+        <w:t xml:space="preserve"> espacial (SRID) y envolventes mínimas (bounding boxes), lo que amplía el área de escape sintáctico. Este vacío teórico en los modelos tradicionales de inyección deja sin caracterizar la manipulación de predicados topológicos nativos en motores relacionales.</w:t>
       </w:r>
     </w:p>
     <w:p>
@@ -1904,7 +2226,23 @@
           <w:color w:val="000000"/>
         </w:rPr>
         <w:lastRenderedPageBreak/>
-        <w:t xml:space="preserve">riesgos de inferencia espacial en SDBMS, donde un usuario no autorizado puede deducir la existencia o atributos de un objeto protegido correlacionando consultas espaciales sucesivas. No obstante, estas aproximaciones asumen que la </w:t>
+        <w:t xml:space="preserve">riesgos de inferencia espacial en SDBMS, donde un usuario no autorizado puede deducir la existencia o atributos de un objeto protegido correlacionando consultas espaciales sucesivas. No obstante, estas aproximaciones </w:t>
+      </w:r>
+      <w:proofErr w:type="spellStart"/>
+      <w:r>
+        <w:rPr>
+          <w:rFonts w:ascii="Book Antiqua" w:hAnsi="Book Antiqua"/>
+          <w:color w:val="000000"/>
+        </w:rPr>
+        <w:t>asumen</w:t>
+      </w:r>
+      <w:proofErr w:type="spellEnd"/>
+      <w:r>
+        <w:rPr>
+          <w:rFonts w:ascii="Book Antiqua" w:hAnsi="Book Antiqua"/>
+          <w:color w:val="000000"/>
+        </w:rPr>
+        <w:t xml:space="preserve"> que la </w:t>
       </w:r>
       <w:proofErr w:type="spellStart"/>
       <w:r>
@@ -1984,7 +2322,23 @@
           <w:rFonts w:ascii="Book Antiqua" w:hAnsi="Book Antiqua"/>
           <w:color w:val="000000"/>
         </w:rPr>
-        <w:t xml:space="preserve"> las políticas espaciales a la base de datos; en arquitecturas web modernas, la concatenación insegura anula directamente el control de acceso en la persistencia sin ser detectada por los mecanismos de autorización de la capa de aplicación.</w:t>
+        <w:t xml:space="preserve"> las </w:t>
+      </w:r>
+      <w:proofErr w:type="spellStart"/>
+      <w:r>
+        <w:rPr>
+          <w:rFonts w:ascii="Book Antiqua" w:hAnsi="Book Antiqua"/>
+          <w:color w:val="000000"/>
+        </w:rPr>
+        <w:t>políticas</w:t>
+      </w:r>
+      <w:proofErr w:type="spellEnd"/>
+      <w:r>
+        <w:rPr>
+          <w:rFonts w:ascii="Book Antiqua" w:hAnsi="Book Antiqua"/>
+          <w:color w:val="000000"/>
+        </w:rPr>
+        <w:t xml:space="preserve"> espaciales a la base de datos; en arquitecturas web modernas, la concatenación insegura anula directamente el control de acceso en la persistencia sin ser detectada por los mecanismos de autorización de la capa de aplicación.</w:t>
       </w:r>
     </w:p>
     <w:p>
@@ -2273,7 +2627,23 @@
           <w:rFonts w:ascii="Book Antiqua" w:hAnsi="Book Antiqua"/>
           <w:color w:val="000000"/>
         </w:rPr>
-        <w:t xml:space="preserve"> et al. (2015) y van Oosterom et al. (2006) formalizaron las </w:t>
+        <w:t xml:space="preserve"> et al. (2015) y van Oosterom et al. (2006) </w:t>
+      </w:r>
+      <w:proofErr w:type="spellStart"/>
+      <w:r>
+        <w:rPr>
+          <w:rFonts w:ascii="Book Antiqua" w:hAnsi="Book Antiqua"/>
+          <w:color w:val="000000"/>
+        </w:rPr>
+        <w:t>formalizaron</w:t>
+      </w:r>
+      <w:proofErr w:type="spellEnd"/>
+      <w:r>
+        <w:rPr>
+          <w:rFonts w:ascii="Book Antiqua" w:hAnsi="Book Antiqua"/>
+          <w:color w:val="000000"/>
+        </w:rPr>
+        <w:t xml:space="preserve"> las </w:t>
       </w:r>
       <w:proofErr w:type="spellStart"/>
       <w:r>
@@ -2633,7 +3003,39 @@
           <w:rFonts w:ascii="Book Antiqua" w:hAnsi="Book Antiqua"/>
           <w:color w:val="000000"/>
         </w:rPr>
-        <w:t xml:space="preserve"> la industria mediante la vulnerabilidad crítica CVE-2023-25157 (con puntaje CVSS de 9.8), donde el software de referencia GeoServer permitía la ejecución remota de SQL no autenticado mediante la evaluación insegura de filtros OGC y expresiones CQL sobre bases de datos PostGIS (National Vulnerability Database, 2023). Por otro lado, en el ámbito de la denegación de servicio, Crosby y Wallach (2003) establecieron el concepto de ataques de complejidad algorítmica (Algorithmic Complexity Attacks), demostrando cómo entradas diseñadas pueden forzar a los </w:t>
+        <w:t xml:space="preserve"> la industria mediante la vulnerabilidad crítica CVE-2023-25157 (con puntaje CVSS de 9.8), donde el software de referencia GeoServer permitía la ejecución remota de SQL no autenticado mediante la evaluación insegura de filtros OGC y expresiones CQL sobre bases de datos PostGIS (National Vulnerability Database, 2023). Por otro lado, en el ámbito de la denegación de servicio, Crosby y Wallach (2003) establecieron el concepto de ataques de complejidad algorítmica (Algorithmic Complexity Attacks), demostrando cómo entradas diseñadas pueden </w:t>
+      </w:r>
+      <w:proofErr w:type="spellStart"/>
+      <w:r>
+        <w:rPr>
+          <w:rFonts w:ascii="Book Antiqua" w:hAnsi="Book Antiqua"/>
+          <w:color w:val="000000"/>
+        </w:rPr>
+        <w:t>forzar</w:t>
+      </w:r>
+      <w:proofErr w:type="spellEnd"/>
+      <w:r>
+        <w:rPr>
+          <w:rFonts w:ascii="Book Antiqua" w:hAnsi="Book Antiqua"/>
+          <w:color w:val="000000"/>
+        </w:rPr>
+        <w:t xml:space="preserve"> a </w:t>
+      </w:r>
+      <w:proofErr w:type="spellStart"/>
+      <w:r>
+        <w:rPr>
+          <w:rFonts w:ascii="Book Antiqua" w:hAnsi="Book Antiqua"/>
+          <w:color w:val="000000"/>
+        </w:rPr>
+        <w:t>los</w:t>
+      </w:r>
+      <w:proofErr w:type="spellEnd"/>
+      <w:r>
+        <w:rPr>
+          <w:rFonts w:ascii="Book Antiqua" w:hAnsi="Book Antiqua"/>
+          <w:color w:val="000000"/>
+        </w:rPr>
+        <w:t xml:space="preserve"> </w:t>
       </w:r>
       <w:proofErr w:type="spellStart"/>
       <w:r>
@@ -2761,7 +3163,39 @@
           <w:rFonts w:ascii="Book Antiqua" w:hAnsi="Book Antiqua"/>
           <w:color w:val="000000"/>
         </w:rPr>
-        <w:t xml:space="preserve"> Agarwal y Rajan (2016), los algoritmos </w:t>
+        <w:t xml:space="preserve"> Agarwal y Rajan (2016), </w:t>
+      </w:r>
+      <w:proofErr w:type="spellStart"/>
+      <w:r>
+        <w:rPr>
+          <w:rFonts w:ascii="Book Antiqua" w:hAnsi="Book Antiqua"/>
+          <w:color w:val="000000"/>
+        </w:rPr>
+        <w:t>los</w:t>
+      </w:r>
+      <w:proofErr w:type="spellEnd"/>
+      <w:r>
+        <w:rPr>
+          <w:rFonts w:ascii="Book Antiqua" w:hAnsi="Book Antiqua"/>
+          <w:color w:val="000000"/>
+        </w:rPr>
+        <w:t xml:space="preserve"> </w:t>
+      </w:r>
+      <w:proofErr w:type="spellStart"/>
+      <w:r>
+        <w:rPr>
+          <w:rFonts w:ascii="Book Antiqua" w:hAnsi="Book Antiqua"/>
+          <w:color w:val="000000"/>
+        </w:rPr>
+        <w:t>algoritmos</w:t>
+      </w:r>
+      <w:proofErr w:type="spellEnd"/>
+      <w:r>
+        <w:rPr>
+          <w:rFonts w:ascii="Book Antiqua" w:hAnsi="Book Antiqua"/>
+          <w:color w:val="000000"/>
+        </w:rPr>
+        <w:t xml:space="preserve"> </w:t>
       </w:r>
       <w:proofErr w:type="spellStart"/>
       <w:r>
@@ -3100,7 +3534,39 @@
           <w:rFonts w:ascii="Book Antiqua" w:hAnsi="Book Antiqua"/>
           <w:color w:val="000000"/>
         </w:rPr>
-        <w:t xml:space="preserve"> espacial GiST. Pese a estos antecedentes, la </w:t>
+        <w:t xml:space="preserve"> espacial GiST. Pese a </w:t>
+      </w:r>
+      <w:proofErr w:type="spellStart"/>
+      <w:r>
+        <w:rPr>
+          <w:rFonts w:ascii="Book Antiqua" w:hAnsi="Book Antiqua"/>
+          <w:color w:val="000000"/>
+        </w:rPr>
+        <w:t>estos</w:t>
+      </w:r>
+      <w:proofErr w:type="spellEnd"/>
+      <w:r>
+        <w:rPr>
+          <w:rFonts w:ascii="Book Antiqua" w:hAnsi="Book Antiqua"/>
+          <w:color w:val="000000"/>
+        </w:rPr>
+        <w:t xml:space="preserve"> </w:t>
+      </w:r>
+      <w:proofErr w:type="spellStart"/>
+      <w:r>
+        <w:rPr>
+          <w:rFonts w:ascii="Book Antiqua" w:hAnsi="Book Antiqua"/>
+          <w:color w:val="000000"/>
+        </w:rPr>
+        <w:t>antecedentes</w:t>
+      </w:r>
+      <w:proofErr w:type="spellEnd"/>
+      <w:r>
+        <w:rPr>
+          <w:rFonts w:ascii="Book Antiqua" w:hAnsi="Book Antiqua"/>
+          <w:color w:val="000000"/>
+        </w:rPr>
+        <w:t xml:space="preserve">, la </w:t>
       </w:r>
       <w:proofErr w:type="spellStart"/>
       <w:r>
@@ -3164,7 +3630,23 @@
           <w:rFonts w:ascii="Book Antiqua" w:hAnsi="Book Antiqua"/>
           <w:color w:val="000000"/>
         </w:rPr>
-        <w:t xml:space="preserve"> de latencia ni ha formalizado esquemas defensivos integrados entre el analizador web y el motor geométrico.</w:t>
+        <w:t xml:space="preserve"> de </w:t>
+      </w:r>
+      <w:proofErr w:type="spellStart"/>
+      <w:r>
+        <w:rPr>
+          <w:rFonts w:ascii="Book Antiqua" w:hAnsi="Book Antiqua"/>
+          <w:color w:val="000000"/>
+        </w:rPr>
+        <w:t>latencia</w:t>
+      </w:r>
+      <w:proofErr w:type="spellEnd"/>
+      <w:r>
+        <w:rPr>
+          <w:rFonts w:ascii="Book Antiqua" w:hAnsi="Book Antiqua"/>
+          <w:color w:val="000000"/>
+        </w:rPr>
+        <w:t xml:space="preserve"> ni ha formalizado esquemas defensivos integrados entre el analizador web y el motor geométrico.</w:t>
       </w:r>
     </w:p>
     <w:p>
@@ -3324,7 +3806,39 @@
           <w:rFonts w:ascii="Book Antiqua" w:hAnsi="Book Antiqua"/>
           <w:color w:val="000000"/>
         </w:rPr>
-        <w:t xml:space="preserve"> ante inyecciones SQL y medir el </w:t>
+        <w:t xml:space="preserve"> ante inyecciones SQL y </w:t>
+      </w:r>
+      <w:proofErr w:type="spellStart"/>
+      <w:r>
+        <w:rPr>
+          <w:rFonts w:ascii="Book Antiqua" w:hAnsi="Book Antiqua"/>
+          <w:color w:val="000000"/>
+        </w:rPr>
+        <w:t>medir</w:t>
+      </w:r>
+      <w:proofErr w:type="spellEnd"/>
+      <w:r>
+        <w:rPr>
+          <w:rFonts w:ascii="Book Antiqua" w:hAnsi="Book Antiqua"/>
+          <w:color w:val="000000"/>
+        </w:rPr>
+        <w:t xml:space="preserve"> </w:t>
+      </w:r>
+      <w:proofErr w:type="spellStart"/>
+      <w:r>
+        <w:rPr>
+          <w:rFonts w:ascii="Book Antiqua" w:hAnsi="Book Antiqua"/>
+          <w:color w:val="000000"/>
+        </w:rPr>
+        <w:t>el</w:t>
+      </w:r>
+      <w:proofErr w:type="spellEnd"/>
+      <w:r>
+        <w:rPr>
+          <w:rFonts w:ascii="Book Antiqua" w:hAnsi="Book Antiqua"/>
+          <w:color w:val="000000"/>
+        </w:rPr>
+        <w:t xml:space="preserve"> </w:t>
       </w:r>
       <w:proofErr w:type="spellStart"/>
       <w:r>
@@ -3404,7 +3918,39 @@
           <w:rFonts w:ascii="Book Antiqua" w:hAnsi="Book Antiqua"/>
           <w:color w:val="000000"/>
         </w:rPr>
-        <w:t xml:space="preserve"> de mitigación multicapa. La evaluación contempla dos condiciones: consultas con SQL dinámico desprotegido y consultas compiladas mediante ORM con validación previa de geometrías.</w:t>
+        <w:t xml:space="preserve"> de </w:t>
+      </w:r>
+      <w:proofErr w:type="spellStart"/>
+      <w:r>
+        <w:rPr>
+          <w:rFonts w:ascii="Book Antiqua" w:hAnsi="Book Antiqua"/>
+          <w:color w:val="000000"/>
+        </w:rPr>
+        <w:t>mitigación</w:t>
+      </w:r>
+      <w:proofErr w:type="spellEnd"/>
+      <w:r>
+        <w:rPr>
+          <w:rFonts w:ascii="Book Antiqua" w:hAnsi="Book Antiqua"/>
+          <w:color w:val="000000"/>
+        </w:rPr>
+        <w:t xml:space="preserve"> </w:t>
+      </w:r>
+      <w:proofErr w:type="spellStart"/>
+      <w:r>
+        <w:rPr>
+          <w:rFonts w:ascii="Book Antiqua" w:hAnsi="Book Antiqua"/>
+          <w:color w:val="000000"/>
+        </w:rPr>
+        <w:t>multicapa</w:t>
+      </w:r>
+      <w:proofErr w:type="spellEnd"/>
+      <w:r>
+        <w:rPr>
+          <w:rFonts w:ascii="Book Antiqua" w:hAnsi="Book Antiqua"/>
+          <w:color w:val="000000"/>
+        </w:rPr>
+        <w:t>. La evaluación contempla dos condiciones: consultas con SQL dinámico desprotegido y consultas compiladas mediante ORM con validación previa de geometrías.</w:t>
       </w:r>
     </w:p>
     <w:p>
@@ -3649,7 +4195,39 @@
           <w:rFonts w:ascii="Book Antiqua" w:hAnsi="Book Antiqua"/>
           <w:color w:val="000000"/>
         </w:rPr>
-        <w:t xml:space="preserve"> ético, la cartografía base se obtuvo de fuentes abiertas y los </w:t>
+        <w:t xml:space="preserve"> ético, la cartografía base se obtuvo de fuentes </w:t>
+      </w:r>
+      <w:proofErr w:type="spellStart"/>
+      <w:r>
+        <w:rPr>
+          <w:rFonts w:ascii="Book Antiqua" w:hAnsi="Book Antiqua"/>
+          <w:color w:val="000000"/>
+        </w:rPr>
+        <w:t>abiertas</w:t>
+      </w:r>
+      <w:proofErr w:type="spellEnd"/>
+      <w:r>
+        <w:rPr>
+          <w:rFonts w:ascii="Book Antiqua" w:hAnsi="Book Antiqua"/>
+          <w:color w:val="000000"/>
+        </w:rPr>
+        <w:t xml:space="preserve"> y </w:t>
+      </w:r>
+      <w:proofErr w:type="spellStart"/>
+      <w:r>
+        <w:rPr>
+          <w:rFonts w:ascii="Book Antiqua" w:hAnsi="Book Antiqua"/>
+          <w:color w:val="000000"/>
+        </w:rPr>
+        <w:t>los</w:t>
+      </w:r>
+      <w:proofErr w:type="spellEnd"/>
+      <w:r>
+        <w:rPr>
+          <w:rFonts w:ascii="Book Antiqua" w:hAnsi="Book Antiqua"/>
+          <w:color w:val="000000"/>
+        </w:rPr>
+        <w:t xml:space="preserve"> </w:t>
       </w:r>
       <w:proofErr w:type="spellStart"/>
       <w:r>
@@ -3801,7 +4379,39 @@
           <w:rFonts w:ascii="Book Antiqua" w:hAnsi="Book Antiqua"/>
           <w:color w:val="000000"/>
         </w:rPr>
-        <w:t xml:space="preserve">El banco de pruebas se implementó en contenedores Docker mediante microservicios aislados: (1) un servicio de base de datos con PostgreSQL 15 y PostGIS 3.3, y (2) una API en Python 3.11 con FastAPI y Uvicorn. Las pruebas de estrés se ejecutaron </w:t>
+        <w:t xml:space="preserve">El banco de pruebas se implementó en contenedores Docker mediante microservicios aislados: (1) un servicio de base de datos con PostgreSQL 15 y PostGIS 3.3, y (2) una API en Python 3.11 con FastAPI y Uvicorn. Las pruebas de </w:t>
+      </w:r>
+      <w:proofErr w:type="spellStart"/>
+      <w:r>
+        <w:rPr>
+          <w:rFonts w:ascii="Book Antiqua" w:hAnsi="Book Antiqua"/>
+          <w:color w:val="000000"/>
+        </w:rPr>
+        <w:t>estrés</w:t>
+      </w:r>
+      <w:proofErr w:type="spellEnd"/>
+      <w:r>
+        <w:rPr>
+          <w:rFonts w:ascii="Book Antiqua" w:hAnsi="Book Antiqua"/>
+          <w:color w:val="000000"/>
+        </w:rPr>
+        <w:t xml:space="preserve"> se </w:t>
+      </w:r>
+      <w:proofErr w:type="spellStart"/>
+      <w:r>
+        <w:rPr>
+          <w:rFonts w:ascii="Book Antiqua" w:hAnsi="Book Antiqua"/>
+          <w:color w:val="000000"/>
+        </w:rPr>
+        <w:t>ejecutaron</w:t>
+      </w:r>
+      <w:proofErr w:type="spellEnd"/>
+      <w:r>
+        <w:rPr>
+          <w:rFonts w:ascii="Book Antiqua" w:hAnsi="Book Antiqua"/>
+          <w:color w:val="000000"/>
+        </w:rPr>
+        <w:t xml:space="preserve"> </w:t>
       </w:r>
       <w:proofErr w:type="spellStart"/>
       <w:r>
@@ -3969,7 +4579,23 @@
           <w:rFonts w:ascii="Book Antiqua" w:hAnsi="Book Antiqua"/>
           <w:color w:val="000000"/>
         </w:rPr>
-        <w:t xml:space="preserve">Se estructuraron seis vectores de explotación orientados a las tres dimensiones de la </w:t>
+        <w:t xml:space="preserve">Se estructuraron seis vectores de explotación orientados a las tres </w:t>
+      </w:r>
+      <w:proofErr w:type="spellStart"/>
+      <w:r>
+        <w:rPr>
+          <w:rFonts w:ascii="Book Antiqua" w:hAnsi="Book Antiqua"/>
+          <w:color w:val="000000"/>
+        </w:rPr>
+        <w:t>dimensiones</w:t>
+      </w:r>
+      <w:proofErr w:type="spellEnd"/>
+      <w:r>
+        <w:rPr>
+          <w:rFonts w:ascii="Book Antiqua" w:hAnsi="Book Antiqua"/>
+          <w:color w:val="000000"/>
+        </w:rPr>
+        <w:t xml:space="preserve"> de la </w:t>
       </w:r>
       <w:proofErr w:type="spellStart"/>
       <w:r>
@@ -4033,7 +4659,23 @@
           <w:rFonts w:ascii="Book Antiqua" w:hAnsi="Book Antiqua"/>
           <w:color w:val="000000"/>
         </w:rPr>
-        <w:t xml:space="preserve">). La evaluación de </w:t>
+        <w:t xml:space="preserve">). La </w:t>
+      </w:r>
+      <w:proofErr w:type="spellStart"/>
+      <w:r>
+        <w:rPr>
+          <w:rFonts w:ascii="Book Antiqua" w:hAnsi="Book Antiqua"/>
+          <w:color w:val="000000"/>
+        </w:rPr>
+        <w:t>evaluación</w:t>
+      </w:r>
+      <w:proofErr w:type="spellEnd"/>
+      <w:r>
+        <w:rPr>
+          <w:rFonts w:ascii="Book Antiqua" w:hAnsi="Book Antiqua"/>
+          <w:color w:val="000000"/>
+        </w:rPr>
+        <w:t xml:space="preserve"> de </w:t>
       </w:r>
       <w:proofErr w:type="spellStart"/>
       <w:r>
@@ -4154,7 +4796,23 @@
           <w:rFonts w:ascii="Book Antiqua" w:hAnsi="Book Antiqua"/>
           <w:color w:val="000000"/>
         </w:rPr>
-        <w:t xml:space="preserve">El endpoint GET /api/v1/vulnerable/predios/radio está diseñado para retornar lotes dentro de un radio de 50 metros en el sector 0101. Al inyectar en el parámetro distancia el payload '50) OR (1=1', el analizador léxico de PostgreSQL cierra prematuramente el operador ST_DWithin e introduce una tautología que anula tanto el límite espacial como el filtro de sector territorial. Como resultado, la consulta pasó de retornar 1 </w:t>
+        <w:t xml:space="preserve">El endpoint GET /api/v1/vulnerable/predios/radio está diseñado para retornar lotes dentro de un radio de 50 metros en el sector 0101. Al inyectar en el parámetro distancia el payload '50) OR (1=1', el analizador léxico de PostgreSQL cierra prematuramente el operador ST_DWithin e introduce una tautología que anula tanto el límite espacial como el filtro de sector territorial. Como resultado, la consulta pasó de </w:t>
+      </w:r>
+      <w:proofErr w:type="spellStart"/>
+      <w:r>
+        <w:rPr>
+          <w:rFonts w:ascii="Book Antiqua" w:hAnsi="Book Antiqua"/>
+          <w:color w:val="000000"/>
+        </w:rPr>
+        <w:t>retornar</w:t>
+      </w:r>
+      <w:proofErr w:type="spellEnd"/>
+      <w:r>
+        <w:rPr>
+          <w:rFonts w:ascii="Book Antiqua" w:hAnsi="Book Antiqua"/>
+          <w:color w:val="000000"/>
+        </w:rPr>
+        <w:t xml:space="preserve"> 1 </w:t>
       </w:r>
       <w:proofErr w:type="spellStart"/>
       <w:r>
@@ -4418,7 +5076,23 @@
           <w:rFonts w:ascii="Book Antiqua" w:hAnsi="Book Antiqua"/>
           <w:color w:val="000000"/>
         </w:rPr>
-        <w:t xml:space="preserve"> 'admin' en 42 segundos. En la versión </w:t>
+        <w:t xml:space="preserve"> 'admin' </w:t>
+      </w:r>
+      <w:proofErr w:type="spellStart"/>
+      <w:r>
+        <w:rPr>
+          <w:rFonts w:ascii="Book Antiqua" w:hAnsi="Book Antiqua"/>
+          <w:color w:val="000000"/>
+        </w:rPr>
+        <w:t>en</w:t>
+      </w:r>
+      <w:proofErr w:type="spellEnd"/>
+      <w:r>
+        <w:rPr>
+          <w:rFonts w:ascii="Book Antiqua" w:hAnsi="Book Antiqua"/>
+          <w:color w:val="000000"/>
+        </w:rPr>
+        <w:t xml:space="preserve"> 42 segundos. En la versión </w:t>
       </w:r>
       <w:r>
         <w:rPr>
@@ -4447,12 +5121,37 @@
       <w:pPr>
         <w:spacing w:after="80" w:line="240" w:lineRule="auto"/>
       </w:pPr>
-      <w:r>
-        <w:rPr>
-          <w:rFonts w:ascii="Book Antiqua" w:hAnsi="Book Antiqua"/>
-          <w:color w:val="000000"/>
-        </w:rPr>
-        <w:t xml:space="preserve">Aprovechando la complejidad </w:t>
+      <w:proofErr w:type="spellStart"/>
+      <w:r>
+        <w:rPr>
+          <w:rFonts w:ascii="Book Antiqua" w:hAnsi="Book Antiqua"/>
+          <w:color w:val="000000"/>
+        </w:rPr>
+        <w:t>Aprovechando</w:t>
+      </w:r>
+      <w:proofErr w:type="spellEnd"/>
+      <w:r>
+        <w:rPr>
+          <w:rFonts w:ascii="Book Antiqua" w:hAnsi="Book Antiqua"/>
+          <w:color w:val="000000"/>
+        </w:rPr>
+        <w:t xml:space="preserve"> la </w:t>
+      </w:r>
+      <w:proofErr w:type="spellStart"/>
+      <w:r>
+        <w:rPr>
+          <w:rFonts w:ascii="Book Antiqua" w:hAnsi="Book Antiqua"/>
+          <w:color w:val="000000"/>
+        </w:rPr>
+        <w:t>complejidad</w:t>
+      </w:r>
+      <w:proofErr w:type="spellEnd"/>
+      <w:r>
+        <w:rPr>
+          <w:rFonts w:ascii="Book Antiqua" w:hAnsi="Book Antiqua"/>
+          <w:color w:val="000000"/>
+        </w:rPr>
+        <w:t xml:space="preserve"> </w:t>
       </w:r>
       <w:proofErr w:type="spellStart"/>
       <w:r>
@@ -4792,7 +5491,55 @@
           <w:rFonts w:ascii="Book Antiqua" w:hAnsi="Book Antiqua"/>
           <w:color w:val="000000"/>
         </w:rPr>
-        <w:t xml:space="preserve">En el endpoint POST /api/v1/vulnerable/ficha/modificar, se </w:t>
+        <w:t>En el endpoint POST /</w:t>
+      </w:r>
+      <w:proofErr w:type="spellStart"/>
+      <w:r>
+        <w:rPr>
+          <w:rFonts w:ascii="Book Antiqua" w:hAnsi="Book Antiqua"/>
+          <w:color w:val="000000"/>
+        </w:rPr>
+        <w:t>api</w:t>
+      </w:r>
+      <w:proofErr w:type="spellEnd"/>
+      <w:r>
+        <w:rPr>
+          <w:rFonts w:ascii="Book Antiqua" w:hAnsi="Book Antiqua"/>
+          <w:color w:val="000000"/>
+        </w:rPr>
+        <w:t>/v1/vulnerable/</w:t>
+      </w:r>
+      <w:proofErr w:type="spellStart"/>
+      <w:r>
+        <w:rPr>
+          <w:rFonts w:ascii="Book Antiqua" w:hAnsi="Book Antiqua"/>
+          <w:color w:val="000000"/>
+        </w:rPr>
+        <w:t>ficha</w:t>
+      </w:r>
+      <w:proofErr w:type="spellEnd"/>
+      <w:r>
+        <w:rPr>
+          <w:rFonts w:ascii="Book Antiqua" w:hAnsi="Book Antiqua"/>
+          <w:color w:val="000000"/>
+        </w:rPr>
+        <w:t>/</w:t>
+      </w:r>
+      <w:proofErr w:type="spellStart"/>
+      <w:r>
+        <w:rPr>
+          <w:rFonts w:ascii="Book Antiqua" w:hAnsi="Book Antiqua"/>
+          <w:color w:val="000000"/>
+        </w:rPr>
+        <w:t>modificar</w:t>
+      </w:r>
+      <w:proofErr w:type="spellEnd"/>
+      <w:r>
+        <w:rPr>
+          <w:rFonts w:ascii="Book Antiqua" w:hAnsi="Book Antiqua"/>
+          <w:color w:val="000000"/>
+        </w:rPr>
+        <w:t xml:space="preserve">, se </w:t>
       </w:r>
       <w:proofErr w:type="spellStart"/>
       <w:r>
@@ -5875,7 +6622,67 @@
           <w:color w:val="000000"/>
           <w:sz w:val="18"/>
         </w:rPr>
-        <w:t xml:space="preserve"> concurrentes (concurrencia=10) sobre una estación de trabajo con procesador Intel Core Ultra 5 245KF, 32 GB RAM DDR5 y almacenamiento NVMe PCIe 4.0 en Docker Desktop (PostgreSQL 15 / PostGIS 3.3).</w:t>
+        <w:t xml:space="preserve"> </w:t>
+      </w:r>
+      <w:proofErr w:type="spellStart"/>
+      <w:r>
+        <w:rPr>
+          <w:rFonts w:ascii="Book Antiqua" w:hAnsi="Book Antiqua"/>
+          <w:i/>
+          <w:color w:val="000000"/>
+          <w:sz w:val="18"/>
+        </w:rPr>
+        <w:t>concurrentes</w:t>
+      </w:r>
+      <w:proofErr w:type="spellEnd"/>
+      <w:r>
+        <w:rPr>
+          <w:rFonts w:ascii="Book Antiqua" w:hAnsi="Book Antiqua"/>
+          <w:i/>
+          <w:color w:val="000000"/>
+          <w:sz w:val="18"/>
+        </w:rPr>
+        <w:t xml:space="preserve"> (</w:t>
+      </w:r>
+      <w:proofErr w:type="spellStart"/>
+      <w:r>
+        <w:rPr>
+          <w:rFonts w:ascii="Book Antiqua" w:hAnsi="Book Antiqua"/>
+          <w:i/>
+          <w:color w:val="000000"/>
+          <w:sz w:val="18"/>
+        </w:rPr>
+        <w:t>concurrencia</w:t>
+      </w:r>
+      <w:proofErr w:type="spellEnd"/>
+      <w:r>
+        <w:rPr>
+          <w:rFonts w:ascii="Book Antiqua" w:hAnsi="Book Antiqua"/>
+          <w:i/>
+          <w:color w:val="000000"/>
+          <w:sz w:val="18"/>
+        </w:rPr>
+        <w:t xml:space="preserve">=10) </w:t>
+      </w:r>
+      <w:proofErr w:type="spellStart"/>
+      <w:r>
+        <w:rPr>
+          <w:rFonts w:ascii="Book Antiqua" w:hAnsi="Book Antiqua"/>
+          <w:i/>
+          <w:color w:val="000000"/>
+          <w:sz w:val="18"/>
+        </w:rPr>
+        <w:t>sobre</w:t>
+      </w:r>
+      <w:proofErr w:type="spellEnd"/>
+      <w:r>
+        <w:rPr>
+          <w:rFonts w:ascii="Book Antiqua" w:hAnsi="Book Antiqua"/>
+          <w:i/>
+          <w:color w:val="000000"/>
+          <w:sz w:val="18"/>
+        </w:rPr>
+        <w:t xml:space="preserve"> una estación de trabajo con procesador Intel Core Ultra 5 245KF, 32 GB RAM DDR5 y almacenamiento NVMe PCIe 4.0 en Docker Desktop (PostgreSQL 15 / PostGIS 3.3).</w:t>
       </w:r>
     </w:p>
     <w:p>
@@ -5920,7 +6727,23 @@
           <w:rFonts w:ascii="Book Antiqua" w:hAnsi="Book Antiqua"/>
           <w:color w:val="000000"/>
         </w:rPr>
-        <w:t xml:space="preserve"> bajo estrés </w:t>
+        <w:t xml:space="preserve"> bajo </w:t>
+      </w:r>
+      <w:proofErr w:type="spellStart"/>
+      <w:r>
+        <w:rPr>
+          <w:rFonts w:ascii="Book Antiqua" w:hAnsi="Book Antiqua"/>
+          <w:color w:val="000000"/>
+        </w:rPr>
+        <w:t>estrés</w:t>
+      </w:r>
+      <w:proofErr w:type="spellEnd"/>
+      <w:r>
+        <w:rPr>
+          <w:rFonts w:ascii="Book Antiqua" w:hAnsi="Book Antiqua"/>
+          <w:color w:val="000000"/>
+        </w:rPr>
+        <w:t xml:space="preserve"> </w:t>
       </w:r>
       <w:proofErr w:type="spellStart"/>
       <w:r>
@@ -6000,7 +6823,23 @@
           <w:rFonts w:ascii="Book Antiqua" w:hAnsi="Book Antiqua"/>
           <w:color w:val="000000"/>
         </w:rPr>
-        <w:t xml:space="preserve"> escalonada de 1 a 100 </w:t>
+        <w:t xml:space="preserve"> </w:t>
+      </w:r>
+      <w:proofErr w:type="spellStart"/>
+      <w:r>
+        <w:rPr>
+          <w:rFonts w:ascii="Book Antiqua" w:hAnsi="Book Antiqua"/>
+          <w:color w:val="000000"/>
+        </w:rPr>
+        <w:t>escalonada</w:t>
+      </w:r>
+      <w:proofErr w:type="spellEnd"/>
+      <w:r>
+        <w:rPr>
+          <w:rFonts w:ascii="Book Antiqua" w:hAnsi="Book Antiqua"/>
+          <w:color w:val="000000"/>
+        </w:rPr>
+        <w:t xml:space="preserve"> de 1 a 100 </w:t>
       </w:r>
       <w:proofErr w:type="spellStart"/>
       <w:r>
@@ -6174,7 +7013,21 @@
         <w:rPr>
           <w:rFonts w:ascii="Book Antiqua" w:hAnsi="Book Antiqua"/>
         </w:rPr>
-        <w:t xml:space="preserve"> propuesta (GeoAlchemy2 junto a la validación previa en Shapely) introduce un sobrecosto medio de latencia de 2.63 ms por petición (+15.24%), conservando una </w:t>
+        <w:t xml:space="preserve"> </w:t>
+      </w:r>
+      <w:proofErr w:type="spellStart"/>
+      <w:r>
+        <w:rPr>
+          <w:rFonts w:ascii="Book Antiqua" w:hAnsi="Book Antiqua"/>
+        </w:rPr>
+        <w:t>propuesta</w:t>
+      </w:r>
+      <w:proofErr w:type="spellEnd"/>
+      <w:r>
+        <w:rPr>
+          <w:rFonts w:ascii="Book Antiqua" w:hAnsi="Book Antiqua"/>
+        </w:rPr>
+        <w:t xml:space="preserve"> (GeoAlchemy2 junto a la validación previa en Shapely) introduce un sobrecosto medio de latencia de 2.63 ms por petición (+15.24%), conservando una </w:t>
       </w:r>
       <w:r>
         <w:rPr>
@@ -6193,7 +7046,35 @@
         <w:rPr>
           <w:rFonts w:ascii="Book Antiqua" w:hAnsi="Book Antiqua"/>
         </w:rPr>
-        <w:t xml:space="preserve">Este sobrecosto medio resulta </w:t>
+        <w:t xml:space="preserve">Este </w:t>
+      </w:r>
+      <w:proofErr w:type="spellStart"/>
+      <w:r>
+        <w:rPr>
+          <w:rFonts w:ascii="Book Antiqua" w:hAnsi="Book Antiqua"/>
+        </w:rPr>
+        <w:t>sobrecosto</w:t>
+      </w:r>
+      <w:proofErr w:type="spellEnd"/>
+      <w:r>
+        <w:rPr>
+          <w:rFonts w:ascii="Book Antiqua" w:hAnsi="Book Antiqua"/>
+        </w:rPr>
+        <w:t xml:space="preserve"> medio </w:t>
+      </w:r>
+      <w:proofErr w:type="spellStart"/>
+      <w:r>
+        <w:rPr>
+          <w:rFonts w:ascii="Book Antiqua" w:hAnsi="Book Antiqua"/>
+        </w:rPr>
+        <w:t>resulta</w:t>
+      </w:r>
+      <w:proofErr w:type="spellEnd"/>
+      <w:r>
+        <w:rPr>
+          <w:rFonts w:ascii="Book Antiqua" w:hAnsi="Book Antiqua"/>
+        </w:rPr>
+        <w:t xml:space="preserve"> </w:t>
       </w:r>
       <w:proofErr w:type="spellStart"/>
       <w:r>
@@ -6207,7 +7088,49 @@
         <w:rPr>
           <w:rFonts w:ascii="Book Antiqua" w:hAnsi="Book Antiqua"/>
         </w:rPr>
-        <w:t xml:space="preserve"> frente a las garantías de protección obtenidas: neutraliza la </w:t>
+        <w:t xml:space="preserve"> </w:t>
+      </w:r>
+      <w:proofErr w:type="spellStart"/>
+      <w:r>
+        <w:rPr>
+          <w:rFonts w:ascii="Book Antiqua" w:hAnsi="Book Antiqua"/>
+        </w:rPr>
+        <w:t>frente</w:t>
+      </w:r>
+      <w:proofErr w:type="spellEnd"/>
+      <w:r>
+        <w:rPr>
+          <w:rFonts w:ascii="Book Antiqua" w:hAnsi="Book Antiqua"/>
+        </w:rPr>
+        <w:t xml:space="preserve"> a las garantías de protección </w:t>
+      </w:r>
+      <w:proofErr w:type="spellStart"/>
+      <w:r>
+        <w:rPr>
+          <w:rFonts w:ascii="Book Antiqua" w:hAnsi="Book Antiqua"/>
+        </w:rPr>
+        <w:t>obtenidas</w:t>
+      </w:r>
+      <w:proofErr w:type="spellEnd"/>
+      <w:r>
+        <w:rPr>
+          <w:rFonts w:ascii="Book Antiqua" w:hAnsi="Book Antiqua"/>
+        </w:rPr>
+        <w:t xml:space="preserve">: </w:t>
+      </w:r>
+      <w:proofErr w:type="spellStart"/>
+      <w:r>
+        <w:rPr>
+          <w:rFonts w:ascii="Book Antiqua" w:hAnsi="Book Antiqua"/>
+        </w:rPr>
+        <w:t>neutraliza</w:t>
+      </w:r>
+      <w:proofErr w:type="spellEnd"/>
+      <w:r>
+        <w:rPr>
+          <w:rFonts w:ascii="Book Antiqua" w:hAnsi="Book Antiqua"/>
+        </w:rPr>
+        <w:t xml:space="preserve"> la </w:t>
       </w:r>
       <w:proofErr w:type="spellStart"/>
       <w:r>
@@ -6221,7 +7144,35 @@
         <w:rPr>
           <w:rFonts w:ascii="Book Antiqua" w:hAnsi="Book Antiqua"/>
         </w:rPr>
-        <w:t xml:space="preserve"> masiva de predios, los canales laterales de error y la </w:t>
+        <w:t xml:space="preserve"> </w:t>
+      </w:r>
+      <w:proofErr w:type="spellStart"/>
+      <w:r>
+        <w:rPr>
+          <w:rFonts w:ascii="Book Antiqua" w:hAnsi="Book Antiqua"/>
+        </w:rPr>
+        <w:t>masiva</w:t>
+      </w:r>
+      <w:proofErr w:type="spellEnd"/>
+      <w:r>
+        <w:rPr>
+          <w:rFonts w:ascii="Book Antiqua" w:hAnsi="Book Antiqua"/>
+        </w:rPr>
+        <w:t xml:space="preserve"> de </w:t>
+      </w:r>
+      <w:proofErr w:type="spellStart"/>
+      <w:r>
+        <w:rPr>
+          <w:rFonts w:ascii="Book Antiqua" w:hAnsi="Book Antiqua"/>
+        </w:rPr>
+        <w:t>predios</w:t>
+      </w:r>
+      <w:proofErr w:type="spellEnd"/>
+      <w:r>
+        <w:rPr>
+          <w:rFonts w:ascii="Book Antiqua" w:hAnsi="Book Antiqua"/>
+        </w:rPr>
+        <w:t xml:space="preserve">, los canales laterales de error y la </w:t>
       </w:r>
       <w:proofErr w:type="spellStart"/>
       <w:r>
@@ -6319,22 +7270,16 @@
         <w:spacing w:after="80" w:line="240" w:lineRule="auto"/>
         <w:ind w:firstLine="432"/>
       </w:pPr>
-      <w:r/>
       <w:r>
         <w:rPr>
           <w:rFonts w:ascii="Book Antiqua" w:hAnsi="Book Antiqua"/>
           <w:b/>
-          <w:i w:val="0"/>
-          <w:sz w:val="22"/>
         </w:rPr>
         <w:t xml:space="preserve">Independencia de plataforma y validez del benchmarking. </w:t>
       </w:r>
       <w:r>
         <w:rPr>
           <w:rFonts w:ascii="Book Antiqua" w:hAnsi="Book Antiqua"/>
-          <w:b w:val="0"/>
-          <w:i w:val="0"/>
-          <w:sz w:val="22"/>
         </w:rPr>
         <w:t>Aunque los valores absolutos de latencia dependen del hardware base de pruebas, la validez metodológica y la generalización de los resultados residen en las proporciones relativas (+15.24% de sobrecosto medio y -12.59% de mejora en p99) y en las complejidades asintóticas. En servidores municipales o instancias de nube con recursos acotados, el consumo computacional de la validación previa en Python (GeoAlchemy2 y Shapely) es marginal frente a la latencia de acceso a disco y la concurrencia relacional. Por el contrario, omitir la mitigación ante ataques de complejidad cuadrática (O(N^2)), como el DoS espacial (Simulación 3), expone a los procesadores con menor paralelismo a una saturación inmediata, donde un número reducido de peticiones maliciosas bloquea por completo el geoportal catastral.</w:t>
       </w:r>
@@ -6344,24 +7289,245 @@
         <w:spacing w:after="80" w:line="240" w:lineRule="auto"/>
         <w:ind w:firstLine="432"/>
       </w:pPr>
-      <w:r/>
       <w:r>
         <w:rPr>
           <w:rFonts w:ascii="Book Antiqua" w:hAnsi="Book Antiqua"/>
           <w:b/>
-          <w:i w:val="0"/>
-          <w:sz w:val="22"/>
         </w:rPr>
         <w:t xml:space="preserve">Impacto sistémico en la integridad de trámites y datos catastrales. </w:t>
       </w:r>
       <w:r>
         <w:rPr>
           <w:rFonts w:ascii="Book Antiqua" w:hAnsi="Book Antiqua"/>
-          <w:b w:val="0"/>
-          <w:i w:val="0"/>
-          <w:sz w:val="22"/>
-        </w:rPr>
-        <w:t>La viabilidad empírica del fraude en autovalúos y titularidad (Simulación 4) demuestra que una inyección en la capa de persistencia trasciende la modificación de una tabla aislada y compromete la fe pública del gobierno electrónico local. En la actualidad, los geoportales interoperan de forma autónoma para emitir certificados catastrales con código QR, constancias de no adeudo tributario y transferencias inmobiliarias bajo el estándar ISO 19152 (LADM). La inyección de datos arbitrarios en catastro_titulares y tg_lote propaga inconsistencias jurídicas y fiscales hacia estos documentos oficiales sin generar alertas en la interfaz de usuario. Este escenario ratifica que el tipado estricto en el ORM constituye una salvaguarda indispensable para preservar la legitimidad y trazabilidad de los servicios públicos digitales.</w:t>
+        </w:rPr>
+        <w:t xml:space="preserve">La </w:t>
+      </w:r>
+      <w:proofErr w:type="spellStart"/>
+      <w:r>
+        <w:rPr>
+          <w:rFonts w:ascii="Book Antiqua" w:hAnsi="Book Antiqua"/>
+        </w:rPr>
+        <w:t>viabilidad</w:t>
+      </w:r>
+      <w:proofErr w:type="spellEnd"/>
+      <w:r>
+        <w:rPr>
+          <w:rFonts w:ascii="Book Antiqua" w:hAnsi="Book Antiqua"/>
+        </w:rPr>
+        <w:t xml:space="preserve"> del </w:t>
+      </w:r>
+      <w:proofErr w:type="spellStart"/>
+      <w:r>
+        <w:rPr>
+          <w:rFonts w:ascii="Book Antiqua" w:hAnsi="Book Antiqua"/>
+        </w:rPr>
+        <w:t>fraude</w:t>
+      </w:r>
+      <w:proofErr w:type="spellEnd"/>
+      <w:r>
+        <w:rPr>
+          <w:rFonts w:ascii="Book Antiqua" w:hAnsi="Book Antiqua"/>
+        </w:rPr>
+        <w:t xml:space="preserve"> </w:t>
+      </w:r>
+      <w:proofErr w:type="spellStart"/>
+      <w:r>
+        <w:rPr>
+          <w:rFonts w:ascii="Book Antiqua" w:hAnsi="Book Antiqua"/>
+        </w:rPr>
+        <w:t>en</w:t>
+      </w:r>
+      <w:proofErr w:type="spellEnd"/>
+      <w:r>
+        <w:rPr>
+          <w:rFonts w:ascii="Book Antiqua" w:hAnsi="Book Antiqua"/>
+        </w:rPr>
+        <w:t xml:space="preserve"> </w:t>
+      </w:r>
+      <w:proofErr w:type="spellStart"/>
+      <w:r>
+        <w:rPr>
+          <w:rFonts w:ascii="Book Antiqua" w:hAnsi="Book Antiqua"/>
+        </w:rPr>
+        <w:t>autovalúos</w:t>
+      </w:r>
+      <w:proofErr w:type="spellEnd"/>
+      <w:r>
+        <w:rPr>
+          <w:rFonts w:ascii="Book Antiqua" w:hAnsi="Book Antiqua"/>
+        </w:rPr>
+        <w:t xml:space="preserve"> y titularidad (Simulación 4) demuestra que una inyección en la capa de persistencia trasciende la modificación de una tabla </w:t>
+      </w:r>
+      <w:proofErr w:type="spellStart"/>
+      <w:r>
+        <w:rPr>
+          <w:rFonts w:ascii="Book Antiqua" w:hAnsi="Book Antiqua"/>
+        </w:rPr>
+        <w:t>aislada</w:t>
+      </w:r>
+      <w:proofErr w:type="spellEnd"/>
+      <w:r>
+        <w:rPr>
+          <w:rFonts w:ascii="Book Antiqua" w:hAnsi="Book Antiqua"/>
+        </w:rPr>
+        <w:t xml:space="preserve"> </w:t>
+      </w:r>
+      <w:r>
+        <w:rPr>
+          <w:rFonts w:ascii="Book Antiqua" w:hAnsi="Book Antiqua"/>
+        </w:rPr>
+        <w:lastRenderedPageBreak/>
+        <w:t xml:space="preserve">y </w:t>
+      </w:r>
+      <w:proofErr w:type="spellStart"/>
+      <w:r>
+        <w:rPr>
+          <w:rFonts w:ascii="Book Antiqua" w:hAnsi="Book Antiqua"/>
+        </w:rPr>
+        <w:t>compromete</w:t>
+      </w:r>
+      <w:proofErr w:type="spellEnd"/>
+      <w:r>
+        <w:rPr>
+          <w:rFonts w:ascii="Book Antiqua" w:hAnsi="Book Antiqua"/>
+        </w:rPr>
+        <w:t xml:space="preserve"> </w:t>
+      </w:r>
+      <w:r>
+        <w:rPr>
+          <w:rFonts w:ascii="Book Antiqua" w:hAnsi="Book Antiqua"/>
+        </w:rPr>
+        <w:t xml:space="preserve">la </w:t>
+      </w:r>
+      <w:proofErr w:type="spellStart"/>
+      <w:r>
+        <w:rPr>
+          <w:rFonts w:ascii="Book Antiqua" w:hAnsi="Book Antiqua"/>
+        </w:rPr>
+        <w:t>información</w:t>
+      </w:r>
+      <w:proofErr w:type="spellEnd"/>
+      <w:r>
+        <w:rPr>
+          <w:rFonts w:ascii="Book Antiqua" w:hAnsi="Book Antiqua"/>
+        </w:rPr>
+        <w:t xml:space="preserve"> predial</w:t>
+      </w:r>
+      <w:r>
+        <w:rPr>
+          <w:rFonts w:ascii="Book Antiqua" w:hAnsi="Book Antiqua"/>
+        </w:rPr>
+        <w:t xml:space="preserve">. En la actualidad, los geoportales interoperan de forma autónoma para emitir certificados catastrales con código QR, constancias de no adeudo tributario y transferencias inmobiliarias bajo el estándar ISO 19152 (LADM). La inyección de datos arbitrarios en catastro_titulares y tg_lote propaga inconsistencias jurídicas y fiscales hacia estos documentos oficiales sin generar alertas en la interfaz de usuario. Este escenario </w:t>
+      </w:r>
+      <w:proofErr w:type="spellStart"/>
+      <w:r>
+        <w:rPr>
+          <w:rFonts w:ascii="Book Antiqua" w:hAnsi="Book Antiqua"/>
+        </w:rPr>
+        <w:t>confirma</w:t>
+      </w:r>
+      <w:proofErr w:type="spellEnd"/>
+      <w:r>
+        <w:rPr>
+          <w:rFonts w:ascii="Book Antiqua" w:hAnsi="Book Antiqua"/>
+        </w:rPr>
+        <w:t xml:space="preserve"> que el tipado estricto </w:t>
+      </w:r>
+      <w:proofErr w:type="spellStart"/>
+      <w:r>
+        <w:rPr>
+          <w:rFonts w:ascii="Book Antiqua" w:hAnsi="Book Antiqua"/>
+        </w:rPr>
+        <w:t>en</w:t>
+      </w:r>
+      <w:proofErr w:type="spellEnd"/>
+      <w:r>
+        <w:rPr>
+          <w:rFonts w:ascii="Book Antiqua" w:hAnsi="Book Antiqua"/>
+        </w:rPr>
+        <w:t xml:space="preserve"> </w:t>
+      </w:r>
+      <w:proofErr w:type="spellStart"/>
+      <w:r>
+        <w:rPr>
+          <w:rFonts w:ascii="Book Antiqua" w:hAnsi="Book Antiqua"/>
+        </w:rPr>
+        <w:t>el</w:t>
+      </w:r>
+      <w:proofErr w:type="spellEnd"/>
+      <w:r>
+        <w:rPr>
+          <w:rFonts w:ascii="Book Antiqua" w:hAnsi="Book Antiqua"/>
+        </w:rPr>
+        <w:t xml:space="preserve"> ORM </w:t>
+      </w:r>
+      <w:r>
+        <w:rPr>
+          <w:rFonts w:ascii="Book Antiqua" w:hAnsi="Book Antiqua"/>
+        </w:rPr>
+        <w:t xml:space="preserve">es </w:t>
+      </w:r>
+      <w:proofErr w:type="spellStart"/>
+      <w:r>
+        <w:rPr>
+          <w:rFonts w:ascii="Book Antiqua" w:hAnsi="Book Antiqua"/>
+        </w:rPr>
+        <w:t>una</w:t>
+      </w:r>
+      <w:proofErr w:type="spellEnd"/>
+      <w:r>
+        <w:rPr>
+          <w:rFonts w:ascii="Book Antiqua" w:hAnsi="Book Antiqua"/>
+        </w:rPr>
+        <w:t xml:space="preserve"> </w:t>
+      </w:r>
+      <w:proofErr w:type="spellStart"/>
+      <w:r>
+        <w:rPr>
+          <w:rFonts w:ascii="Book Antiqua" w:hAnsi="Book Antiqua"/>
+        </w:rPr>
+        <w:t>protección</w:t>
+      </w:r>
+      <w:proofErr w:type="spellEnd"/>
+      <w:r>
+        <w:rPr>
+          <w:rFonts w:ascii="Book Antiqua" w:hAnsi="Book Antiqua"/>
+        </w:rPr>
+        <w:t xml:space="preserve"> </w:t>
+      </w:r>
+      <w:r>
+        <w:rPr>
+          <w:rFonts w:ascii="Book Antiqua" w:hAnsi="Book Antiqua"/>
+        </w:rPr>
+        <w:t xml:space="preserve">indispensable para </w:t>
+      </w:r>
+      <w:proofErr w:type="spellStart"/>
+      <w:r>
+        <w:rPr>
+          <w:rFonts w:ascii="Book Antiqua" w:hAnsi="Book Antiqua"/>
+        </w:rPr>
+        <w:t>preservar</w:t>
+      </w:r>
+      <w:proofErr w:type="spellEnd"/>
+      <w:r>
+        <w:rPr>
+          <w:rFonts w:ascii="Book Antiqua" w:hAnsi="Book Antiqua"/>
+        </w:rPr>
+        <w:t xml:space="preserve"> la </w:t>
+      </w:r>
+      <w:proofErr w:type="spellStart"/>
+      <w:r>
+        <w:rPr>
+          <w:rFonts w:ascii="Book Antiqua" w:hAnsi="Book Antiqua"/>
+        </w:rPr>
+        <w:t>legitimidad</w:t>
+      </w:r>
+      <w:proofErr w:type="spellEnd"/>
+      <w:r>
+        <w:rPr>
+          <w:rFonts w:ascii="Book Antiqua" w:hAnsi="Book Antiqua"/>
+        </w:rPr>
+        <w:t xml:space="preserve"> y trazabilidad de los servicios públicos digitales.</w:t>
       </w:r>
     </w:p>
     <w:p>
@@ -6388,7 +7554,661 @@
           <w:rFonts w:ascii="Book Antiqua" w:hAnsi="Book Antiqua"/>
           <w:color w:val="000000"/>
         </w:rPr>
-        <w:t>Este artículo formalizó y demostró empíricamente la viabilidad de seis vectores de inyección SQL espacial en sistemas de información catastral basados en PostGIS, evidenciando que las funciones topológicas nativas no garantizan aislamiento de datos cuando se construyen mediante concatenación de cadenas. La evaluación experimental sobre 1,500 parcelas catastrales reales (ISO 19152 LADM) comprobó que atacantes no autenticados pueden evadir límites zonales, reconstruir credenciales mediante canales laterales de error geométrico, inducir denegación de servicio espacial por sobrecarga algorítmica cuadrática, alterar fichas prediales tributarias y ejecutar borrados cartográficos masivos. Frente a ello, la adopción de una arquitectura de defensa en profundidad basada en GeoAlchemy2, tipado rígido con Pydantic y validación topológica previa en memoria con Shapely mitigó con éxito el 100% de los escenarios de explotación evaluados. El benchmarking transaccional demostró que esta seguridad robusta introduce un incremento medio de latencia de apenas 2.63 ms (+15.24%), mejorando simultáneamente la estabilidad en el percentil 99 en un 12.59% gracias a la reutilización de planes de ejecución preparados en PostgreSQL. En conclusión, la seguridad en infraestructuras catastrales exige abandonar el paradigma de sanitización escalar tradicional, adoptando controles sintácticos con conciencia espacial integrados desde el diseño arquitectónico de software.</w:t>
+        <w:t xml:space="preserve">Este </w:t>
+      </w:r>
+      <w:proofErr w:type="spellStart"/>
+      <w:r>
+        <w:rPr>
+          <w:rFonts w:ascii="Book Antiqua" w:hAnsi="Book Antiqua"/>
+          <w:color w:val="000000"/>
+        </w:rPr>
+        <w:t>artículo</w:t>
+      </w:r>
+      <w:proofErr w:type="spellEnd"/>
+      <w:r>
+        <w:rPr>
+          <w:rFonts w:ascii="Book Antiqua" w:hAnsi="Book Antiqua"/>
+          <w:color w:val="000000"/>
+        </w:rPr>
+        <w:t xml:space="preserve"> </w:t>
+      </w:r>
+      <w:proofErr w:type="spellStart"/>
+      <w:r>
+        <w:rPr>
+          <w:rFonts w:ascii="Book Antiqua" w:hAnsi="Book Antiqua"/>
+          <w:color w:val="000000"/>
+        </w:rPr>
+        <w:t>formalizó</w:t>
+      </w:r>
+      <w:proofErr w:type="spellEnd"/>
+      <w:r>
+        <w:rPr>
+          <w:rFonts w:ascii="Book Antiqua" w:hAnsi="Book Antiqua"/>
+          <w:color w:val="000000"/>
+        </w:rPr>
+        <w:t xml:space="preserve"> y </w:t>
+      </w:r>
+      <w:proofErr w:type="spellStart"/>
+      <w:r>
+        <w:rPr>
+          <w:rFonts w:ascii="Book Antiqua" w:hAnsi="Book Antiqua"/>
+          <w:color w:val="000000"/>
+        </w:rPr>
+        <w:t>probó</w:t>
+      </w:r>
+      <w:proofErr w:type="spellEnd"/>
+      <w:r>
+        <w:rPr>
+          <w:rFonts w:ascii="Book Antiqua" w:hAnsi="Book Antiqua"/>
+          <w:color w:val="000000"/>
+        </w:rPr>
+        <w:t xml:space="preserve">, a </w:t>
+      </w:r>
+      <w:proofErr w:type="spellStart"/>
+      <w:r>
+        <w:rPr>
+          <w:rFonts w:ascii="Book Antiqua" w:hAnsi="Book Antiqua"/>
+          <w:color w:val="000000"/>
+        </w:rPr>
+        <w:t>través</w:t>
+      </w:r>
+      <w:proofErr w:type="spellEnd"/>
+      <w:r>
+        <w:rPr>
+          <w:rFonts w:ascii="Book Antiqua" w:hAnsi="Book Antiqua"/>
+          <w:color w:val="000000"/>
+        </w:rPr>
+        <w:t xml:space="preserve"> de la </w:t>
+      </w:r>
+      <w:proofErr w:type="spellStart"/>
+      <w:r>
+        <w:rPr>
+          <w:rFonts w:ascii="Book Antiqua" w:hAnsi="Book Antiqua"/>
+          <w:color w:val="000000"/>
+        </w:rPr>
+        <w:t>experiencia</w:t>
+      </w:r>
+      <w:proofErr w:type="spellEnd"/>
+      <w:r>
+        <w:rPr>
+          <w:rFonts w:ascii="Book Antiqua" w:hAnsi="Book Antiqua"/>
+          <w:color w:val="000000"/>
+        </w:rPr>
+        <w:t xml:space="preserve">, que seis </w:t>
+      </w:r>
+      <w:proofErr w:type="spellStart"/>
+      <w:r>
+        <w:rPr>
+          <w:rFonts w:ascii="Book Antiqua" w:hAnsi="Book Antiqua"/>
+          <w:color w:val="000000"/>
+        </w:rPr>
+        <w:t>vectores</w:t>
+      </w:r>
+      <w:proofErr w:type="spellEnd"/>
+      <w:r>
+        <w:rPr>
+          <w:rFonts w:ascii="Book Antiqua" w:hAnsi="Book Antiqua"/>
+          <w:color w:val="000000"/>
+        </w:rPr>
+        <w:t xml:space="preserve"> de </w:t>
+      </w:r>
+      <w:proofErr w:type="spellStart"/>
+      <w:r>
+        <w:rPr>
+          <w:rFonts w:ascii="Book Antiqua" w:hAnsi="Book Antiqua"/>
+          <w:color w:val="000000"/>
+        </w:rPr>
+        <w:t>inyección</w:t>
+      </w:r>
+      <w:proofErr w:type="spellEnd"/>
+      <w:r>
+        <w:rPr>
+          <w:rFonts w:ascii="Book Antiqua" w:hAnsi="Book Antiqua"/>
+          <w:color w:val="000000"/>
+        </w:rPr>
+        <w:t xml:space="preserve"> SQL </w:t>
+      </w:r>
+      <w:proofErr w:type="spellStart"/>
+      <w:r>
+        <w:rPr>
+          <w:rFonts w:ascii="Book Antiqua" w:hAnsi="Book Antiqua"/>
+          <w:color w:val="000000"/>
+        </w:rPr>
+        <w:t>espacial</w:t>
+      </w:r>
+      <w:proofErr w:type="spellEnd"/>
+      <w:r>
+        <w:rPr>
+          <w:rFonts w:ascii="Book Antiqua" w:hAnsi="Book Antiqua"/>
+          <w:color w:val="000000"/>
+        </w:rPr>
+        <w:t xml:space="preserve"> </w:t>
+      </w:r>
+      <w:proofErr w:type="spellStart"/>
+      <w:r>
+        <w:rPr>
+          <w:rFonts w:ascii="Book Antiqua" w:hAnsi="Book Antiqua"/>
+          <w:color w:val="000000"/>
+        </w:rPr>
+        <w:t>en</w:t>
+      </w:r>
+      <w:proofErr w:type="spellEnd"/>
+      <w:r>
+        <w:rPr>
+          <w:rFonts w:ascii="Book Antiqua" w:hAnsi="Book Antiqua"/>
+          <w:color w:val="000000"/>
+        </w:rPr>
+        <w:t xml:space="preserve"> </w:t>
+      </w:r>
+      <w:proofErr w:type="spellStart"/>
+      <w:r>
+        <w:rPr>
+          <w:rFonts w:ascii="Book Antiqua" w:hAnsi="Book Antiqua"/>
+          <w:color w:val="000000"/>
+        </w:rPr>
+        <w:t>sistemas</w:t>
+      </w:r>
+      <w:proofErr w:type="spellEnd"/>
+      <w:r>
+        <w:rPr>
+          <w:rFonts w:ascii="Book Antiqua" w:hAnsi="Book Antiqua"/>
+          <w:color w:val="000000"/>
+        </w:rPr>
+        <w:t xml:space="preserve"> de </w:t>
+      </w:r>
+      <w:proofErr w:type="spellStart"/>
+      <w:r>
+        <w:rPr>
+          <w:rFonts w:ascii="Book Antiqua" w:hAnsi="Book Antiqua"/>
+          <w:color w:val="000000"/>
+        </w:rPr>
+        <w:t>información</w:t>
+      </w:r>
+      <w:proofErr w:type="spellEnd"/>
+      <w:r>
+        <w:rPr>
+          <w:rFonts w:ascii="Book Antiqua" w:hAnsi="Book Antiqua"/>
+          <w:color w:val="000000"/>
+        </w:rPr>
+        <w:t xml:space="preserve"> </w:t>
+      </w:r>
+      <w:proofErr w:type="spellStart"/>
+      <w:r>
+        <w:rPr>
+          <w:rFonts w:ascii="Book Antiqua" w:hAnsi="Book Antiqua"/>
+          <w:color w:val="000000"/>
+        </w:rPr>
+        <w:t>catastral</w:t>
+      </w:r>
+      <w:proofErr w:type="spellEnd"/>
+      <w:r>
+        <w:rPr>
+          <w:rFonts w:ascii="Book Antiqua" w:hAnsi="Book Antiqua"/>
+          <w:color w:val="000000"/>
+        </w:rPr>
+        <w:t xml:space="preserve"> </w:t>
+      </w:r>
+      <w:proofErr w:type="spellStart"/>
+      <w:r>
+        <w:rPr>
+          <w:rFonts w:ascii="Book Antiqua" w:hAnsi="Book Antiqua"/>
+          <w:color w:val="000000"/>
+        </w:rPr>
+        <w:t>basados</w:t>
+      </w:r>
+      <w:proofErr w:type="spellEnd"/>
+      <w:r>
+        <w:rPr>
+          <w:rFonts w:ascii="Book Antiqua" w:hAnsi="Book Antiqua"/>
+          <w:color w:val="000000"/>
+        </w:rPr>
+        <w:t xml:space="preserve"> </w:t>
+      </w:r>
+      <w:proofErr w:type="spellStart"/>
+      <w:r>
+        <w:rPr>
+          <w:rFonts w:ascii="Book Antiqua" w:hAnsi="Book Antiqua"/>
+          <w:color w:val="000000"/>
+        </w:rPr>
+        <w:t>en</w:t>
+      </w:r>
+      <w:proofErr w:type="spellEnd"/>
+      <w:r>
+        <w:rPr>
+          <w:rFonts w:ascii="Book Antiqua" w:hAnsi="Book Antiqua"/>
+          <w:color w:val="000000"/>
+        </w:rPr>
+        <w:t xml:space="preserve"> </w:t>
+      </w:r>
+      <w:proofErr w:type="spellStart"/>
+      <w:r>
+        <w:rPr>
+          <w:rFonts w:ascii="Book Antiqua" w:hAnsi="Book Antiqua"/>
+          <w:color w:val="000000"/>
+        </w:rPr>
+        <w:t>PostGIS</w:t>
+      </w:r>
+      <w:proofErr w:type="spellEnd"/>
+      <w:r>
+        <w:rPr>
+          <w:rFonts w:ascii="Book Antiqua" w:hAnsi="Book Antiqua"/>
+          <w:color w:val="000000"/>
+        </w:rPr>
+        <w:t xml:space="preserve"> son </w:t>
+      </w:r>
+      <w:proofErr w:type="spellStart"/>
+      <w:r>
+        <w:rPr>
+          <w:rFonts w:ascii="Book Antiqua" w:hAnsi="Book Antiqua"/>
+          <w:color w:val="000000"/>
+        </w:rPr>
+        <w:t>factibles</w:t>
+      </w:r>
+      <w:proofErr w:type="spellEnd"/>
+      <w:r>
+        <w:rPr>
+          <w:rFonts w:ascii="Book Antiqua" w:hAnsi="Book Antiqua"/>
+          <w:color w:val="000000"/>
+        </w:rPr>
+        <w:t>.</w:t>
+      </w:r>
+      <w:r>
+        <w:rPr>
+          <w:rFonts w:ascii="Book Antiqua" w:hAnsi="Book Antiqua"/>
+          <w:color w:val="000000"/>
+        </w:rPr>
+        <w:t xml:space="preserve"> Se </w:t>
+      </w:r>
+      <w:proofErr w:type="spellStart"/>
+      <w:r>
+        <w:rPr>
+          <w:rFonts w:ascii="Book Antiqua" w:hAnsi="Book Antiqua"/>
+          <w:color w:val="000000"/>
+        </w:rPr>
+        <w:t>evidenc</w:t>
+      </w:r>
+      <w:r>
+        <w:rPr>
+          <w:rFonts w:ascii="Book Antiqua" w:hAnsi="Book Antiqua"/>
+          <w:color w:val="000000"/>
+        </w:rPr>
+        <w:t>ió</w:t>
+      </w:r>
+      <w:proofErr w:type="spellEnd"/>
+      <w:r>
+        <w:rPr>
+          <w:rFonts w:ascii="Book Antiqua" w:hAnsi="Book Antiqua"/>
+          <w:color w:val="000000"/>
+        </w:rPr>
+        <w:t xml:space="preserve"> que las </w:t>
+      </w:r>
+      <w:proofErr w:type="spellStart"/>
+      <w:r>
+        <w:rPr>
+          <w:rFonts w:ascii="Book Antiqua" w:hAnsi="Book Antiqua"/>
+          <w:color w:val="000000"/>
+        </w:rPr>
+        <w:t>funciones</w:t>
+      </w:r>
+      <w:proofErr w:type="spellEnd"/>
+      <w:r>
+        <w:rPr>
+          <w:rFonts w:ascii="Book Antiqua" w:hAnsi="Book Antiqua"/>
+          <w:color w:val="000000"/>
+        </w:rPr>
+        <w:t xml:space="preserve"> topológicas </w:t>
+      </w:r>
+      <w:proofErr w:type="spellStart"/>
+      <w:r>
+        <w:rPr>
+          <w:rFonts w:ascii="Book Antiqua" w:hAnsi="Book Antiqua"/>
+          <w:color w:val="000000"/>
+        </w:rPr>
+        <w:t>nativas</w:t>
+      </w:r>
+      <w:proofErr w:type="spellEnd"/>
+      <w:r>
+        <w:rPr>
+          <w:rFonts w:ascii="Book Antiqua" w:hAnsi="Book Antiqua"/>
+          <w:color w:val="000000"/>
+        </w:rPr>
+        <w:t xml:space="preserve"> no </w:t>
+      </w:r>
+      <w:proofErr w:type="spellStart"/>
+      <w:r>
+        <w:rPr>
+          <w:rFonts w:ascii="Book Antiqua" w:hAnsi="Book Antiqua"/>
+          <w:color w:val="000000"/>
+        </w:rPr>
+        <w:t>garantizan</w:t>
+      </w:r>
+      <w:proofErr w:type="spellEnd"/>
+      <w:r>
+        <w:rPr>
+          <w:rFonts w:ascii="Book Antiqua" w:hAnsi="Book Antiqua"/>
+          <w:color w:val="000000"/>
+        </w:rPr>
+        <w:t xml:space="preserve"> </w:t>
+      </w:r>
+      <w:proofErr w:type="spellStart"/>
+      <w:r>
+        <w:rPr>
+          <w:rFonts w:ascii="Book Antiqua" w:hAnsi="Book Antiqua"/>
+          <w:color w:val="000000"/>
+        </w:rPr>
+        <w:t>el</w:t>
+      </w:r>
+      <w:proofErr w:type="spellEnd"/>
+      <w:r>
+        <w:rPr>
+          <w:rFonts w:ascii="Book Antiqua" w:hAnsi="Book Antiqua"/>
+          <w:color w:val="000000"/>
+        </w:rPr>
+        <w:t xml:space="preserve"> </w:t>
+      </w:r>
+      <w:proofErr w:type="spellStart"/>
+      <w:r>
+        <w:rPr>
+          <w:rFonts w:ascii="Book Antiqua" w:hAnsi="Book Antiqua"/>
+          <w:color w:val="000000"/>
+        </w:rPr>
+        <w:t>aislamiento</w:t>
+      </w:r>
+      <w:proofErr w:type="spellEnd"/>
+      <w:r>
+        <w:rPr>
+          <w:rFonts w:ascii="Book Antiqua" w:hAnsi="Book Antiqua"/>
+          <w:color w:val="000000"/>
+        </w:rPr>
+        <w:t xml:space="preserve"> de </w:t>
+      </w:r>
+      <w:proofErr w:type="spellStart"/>
+      <w:r>
+        <w:rPr>
+          <w:rFonts w:ascii="Book Antiqua" w:hAnsi="Book Antiqua"/>
+          <w:color w:val="000000"/>
+        </w:rPr>
+        <w:t>datos</w:t>
+      </w:r>
+      <w:proofErr w:type="spellEnd"/>
+      <w:r>
+        <w:rPr>
+          <w:rFonts w:ascii="Book Antiqua" w:hAnsi="Book Antiqua"/>
+          <w:color w:val="000000"/>
+        </w:rPr>
+        <w:t xml:space="preserve"> </w:t>
+      </w:r>
+      <w:proofErr w:type="spellStart"/>
+      <w:r>
+        <w:rPr>
+          <w:rFonts w:ascii="Book Antiqua" w:hAnsi="Book Antiqua"/>
+          <w:color w:val="000000"/>
+        </w:rPr>
+        <w:t>cuando</w:t>
+      </w:r>
+      <w:proofErr w:type="spellEnd"/>
+      <w:r>
+        <w:rPr>
+          <w:rFonts w:ascii="Book Antiqua" w:hAnsi="Book Antiqua"/>
+          <w:color w:val="000000"/>
+        </w:rPr>
+        <w:t xml:space="preserve"> se </w:t>
+      </w:r>
+      <w:proofErr w:type="spellStart"/>
+      <w:r>
+        <w:rPr>
+          <w:rFonts w:ascii="Book Antiqua" w:hAnsi="Book Antiqua"/>
+          <w:color w:val="000000"/>
+        </w:rPr>
+        <w:t>construyen</w:t>
+      </w:r>
+      <w:proofErr w:type="spellEnd"/>
+      <w:r>
+        <w:rPr>
+          <w:rFonts w:ascii="Book Antiqua" w:hAnsi="Book Antiqua"/>
+          <w:color w:val="000000"/>
+        </w:rPr>
+        <w:t xml:space="preserve"> </w:t>
+      </w:r>
+      <w:proofErr w:type="spellStart"/>
+      <w:r>
+        <w:rPr>
+          <w:rFonts w:ascii="Book Antiqua" w:hAnsi="Book Antiqua"/>
+          <w:color w:val="000000"/>
+        </w:rPr>
+        <w:t>concatenando</w:t>
+      </w:r>
+      <w:proofErr w:type="spellEnd"/>
+      <w:r>
+        <w:rPr>
+          <w:rFonts w:ascii="Book Antiqua" w:hAnsi="Book Antiqua"/>
+          <w:color w:val="000000"/>
+        </w:rPr>
+        <w:t xml:space="preserve"> </w:t>
+      </w:r>
+      <w:proofErr w:type="spellStart"/>
+      <w:r>
+        <w:rPr>
+          <w:rFonts w:ascii="Book Antiqua" w:hAnsi="Book Antiqua"/>
+          <w:color w:val="000000"/>
+        </w:rPr>
+        <w:t>cadenas</w:t>
+      </w:r>
+      <w:proofErr w:type="spellEnd"/>
+      <w:r>
+        <w:rPr>
+          <w:rFonts w:ascii="Book Antiqua" w:hAnsi="Book Antiqua"/>
+          <w:color w:val="000000"/>
+        </w:rPr>
+        <w:t xml:space="preserve">. La evaluación experimental sobre 1,500 </w:t>
+      </w:r>
+      <w:proofErr w:type="spellStart"/>
+      <w:r>
+        <w:rPr>
+          <w:rFonts w:ascii="Book Antiqua" w:hAnsi="Book Antiqua"/>
+          <w:color w:val="000000"/>
+        </w:rPr>
+        <w:t>lotes</w:t>
+      </w:r>
+      <w:proofErr w:type="spellEnd"/>
+      <w:r>
+        <w:rPr>
+          <w:rFonts w:ascii="Book Antiqua" w:hAnsi="Book Antiqua"/>
+          <w:color w:val="000000"/>
+        </w:rPr>
+        <w:t xml:space="preserve"> </w:t>
+      </w:r>
+      <w:proofErr w:type="spellStart"/>
+      <w:r>
+        <w:rPr>
+          <w:rFonts w:ascii="Book Antiqua" w:hAnsi="Book Antiqua"/>
+          <w:color w:val="000000"/>
+        </w:rPr>
+        <w:t>catastrales</w:t>
+      </w:r>
+      <w:proofErr w:type="spellEnd"/>
+      <w:r>
+        <w:rPr>
+          <w:rFonts w:ascii="Book Antiqua" w:hAnsi="Book Antiqua"/>
+          <w:color w:val="000000"/>
+        </w:rPr>
+        <w:t xml:space="preserve"> (ISO 19152 LADM) </w:t>
+      </w:r>
+      <w:proofErr w:type="spellStart"/>
+      <w:r>
+        <w:rPr>
+          <w:rFonts w:ascii="Book Antiqua" w:hAnsi="Book Antiqua"/>
+          <w:color w:val="000000"/>
+        </w:rPr>
+        <w:t>comprobó</w:t>
+      </w:r>
+      <w:proofErr w:type="spellEnd"/>
+      <w:r>
+        <w:rPr>
+          <w:rFonts w:ascii="Book Antiqua" w:hAnsi="Book Antiqua"/>
+          <w:color w:val="000000"/>
+        </w:rPr>
+        <w:t xml:space="preserve"> que </w:t>
+      </w:r>
+      <w:proofErr w:type="spellStart"/>
+      <w:r>
+        <w:rPr>
+          <w:rFonts w:ascii="Book Antiqua" w:hAnsi="Book Antiqua"/>
+          <w:color w:val="000000"/>
+        </w:rPr>
+        <w:t>los</w:t>
+      </w:r>
+      <w:proofErr w:type="spellEnd"/>
+      <w:r>
+        <w:rPr>
+          <w:rFonts w:ascii="Book Antiqua" w:hAnsi="Book Antiqua"/>
+          <w:color w:val="000000"/>
+        </w:rPr>
+        <w:t xml:space="preserve"> </w:t>
+      </w:r>
+      <w:proofErr w:type="spellStart"/>
+      <w:r>
+        <w:rPr>
+          <w:rFonts w:ascii="Book Antiqua" w:hAnsi="Book Antiqua"/>
+          <w:color w:val="000000"/>
+        </w:rPr>
+        <w:t>atacantes</w:t>
+      </w:r>
+      <w:proofErr w:type="spellEnd"/>
+      <w:r>
+        <w:rPr>
+          <w:rFonts w:ascii="Book Antiqua" w:hAnsi="Book Antiqua"/>
+          <w:color w:val="000000"/>
+        </w:rPr>
+        <w:t xml:space="preserve"> </w:t>
+      </w:r>
+      <w:proofErr w:type="spellStart"/>
+      <w:r>
+        <w:rPr>
+          <w:rFonts w:ascii="Book Antiqua" w:hAnsi="Book Antiqua"/>
+          <w:color w:val="000000"/>
+        </w:rPr>
+        <w:t>pueden</w:t>
+      </w:r>
+      <w:proofErr w:type="spellEnd"/>
+      <w:r>
+        <w:rPr>
+          <w:rFonts w:ascii="Book Antiqua" w:hAnsi="Book Antiqua"/>
+          <w:color w:val="000000"/>
+        </w:rPr>
+        <w:t xml:space="preserve"> </w:t>
+      </w:r>
+      <w:proofErr w:type="spellStart"/>
+      <w:r>
+        <w:rPr>
+          <w:rFonts w:ascii="Book Antiqua" w:hAnsi="Book Antiqua"/>
+          <w:color w:val="000000"/>
+        </w:rPr>
+        <w:t>evadir</w:t>
+      </w:r>
+      <w:proofErr w:type="spellEnd"/>
+      <w:r>
+        <w:rPr>
+          <w:rFonts w:ascii="Book Antiqua" w:hAnsi="Book Antiqua"/>
+          <w:color w:val="000000"/>
+        </w:rPr>
+        <w:t xml:space="preserve"> </w:t>
+      </w:r>
+      <w:proofErr w:type="spellStart"/>
+      <w:r>
+        <w:rPr>
+          <w:rFonts w:ascii="Book Antiqua" w:hAnsi="Book Antiqua"/>
+          <w:color w:val="000000"/>
+        </w:rPr>
+        <w:t>límites</w:t>
+      </w:r>
+      <w:proofErr w:type="spellEnd"/>
+      <w:r>
+        <w:rPr>
+          <w:rFonts w:ascii="Book Antiqua" w:hAnsi="Book Antiqua"/>
+          <w:color w:val="000000"/>
+        </w:rPr>
+        <w:t xml:space="preserve"> </w:t>
+      </w:r>
+      <w:proofErr w:type="spellStart"/>
+      <w:r>
+        <w:rPr>
+          <w:rFonts w:ascii="Book Antiqua" w:hAnsi="Book Antiqua"/>
+          <w:color w:val="000000"/>
+        </w:rPr>
+        <w:t>zonales</w:t>
+      </w:r>
+      <w:proofErr w:type="spellEnd"/>
+      <w:r>
+        <w:rPr>
+          <w:rFonts w:ascii="Book Antiqua" w:hAnsi="Book Antiqua"/>
+          <w:color w:val="000000"/>
+        </w:rPr>
+        <w:t xml:space="preserve">, </w:t>
+      </w:r>
+      <w:proofErr w:type="spellStart"/>
+      <w:r>
+        <w:rPr>
+          <w:rFonts w:ascii="Book Antiqua" w:hAnsi="Book Antiqua"/>
+          <w:color w:val="000000"/>
+        </w:rPr>
+        <w:t>reconstruir</w:t>
+      </w:r>
+      <w:proofErr w:type="spellEnd"/>
+      <w:r>
+        <w:rPr>
+          <w:rFonts w:ascii="Book Antiqua" w:hAnsi="Book Antiqua"/>
+          <w:color w:val="000000"/>
+        </w:rPr>
+        <w:t xml:space="preserve"> </w:t>
+      </w:r>
+      <w:proofErr w:type="spellStart"/>
+      <w:r>
+        <w:rPr>
+          <w:rFonts w:ascii="Book Antiqua" w:hAnsi="Book Antiqua"/>
+          <w:color w:val="000000"/>
+        </w:rPr>
+        <w:t>credenciales</w:t>
+      </w:r>
+      <w:proofErr w:type="spellEnd"/>
+      <w:r>
+        <w:rPr>
+          <w:rFonts w:ascii="Book Antiqua" w:hAnsi="Book Antiqua"/>
+          <w:color w:val="000000"/>
+        </w:rPr>
+        <w:t xml:space="preserve"> </w:t>
+      </w:r>
+      <w:proofErr w:type="spellStart"/>
+      <w:r>
+        <w:rPr>
+          <w:rFonts w:ascii="Book Antiqua" w:hAnsi="Book Antiqua"/>
+          <w:color w:val="000000"/>
+        </w:rPr>
+        <w:t>mediante</w:t>
+      </w:r>
+      <w:proofErr w:type="spellEnd"/>
+      <w:r>
+        <w:rPr>
+          <w:rFonts w:ascii="Book Antiqua" w:hAnsi="Book Antiqua"/>
+          <w:color w:val="000000"/>
+        </w:rPr>
+        <w:t xml:space="preserve"> canales </w:t>
+      </w:r>
+      <w:proofErr w:type="spellStart"/>
+      <w:r>
+        <w:rPr>
+          <w:rFonts w:ascii="Book Antiqua" w:hAnsi="Book Antiqua"/>
+          <w:color w:val="000000"/>
+        </w:rPr>
+        <w:t>laterales</w:t>
+      </w:r>
+      <w:proofErr w:type="spellEnd"/>
+      <w:r>
+        <w:rPr>
+          <w:rFonts w:ascii="Book Antiqua" w:hAnsi="Book Antiqua"/>
+          <w:color w:val="000000"/>
+        </w:rPr>
+        <w:t xml:space="preserve"> de error geométrico, inducir denegación de servicio espacial por sobrecarga algorítmica cuadrática, alterar fichas prediales tributarias y ejecutar borrados cartográficos masivos. Frente a ello, la adopción de una arquitectura de defensa en profundidad basada en GeoAlchemy2, tipado rígido con Pydantic y validación topológica previa en memoria con Shapely mitigó con éxito el 100% de los escenarios de explotación evaluados. El benchmarking transaccional demostró que esta seguridad robusta introduce un incremento medio de latencia de apenas 2.63 ms (+15.24%), mejorando simultáneamente la estabilidad en el percentil 99 en un 12.59% gracias a la reutilización de planes de ejecución preparados en PostgreSQL. En conclusión, la seguridad en infraestructuras catastrales exige abandonar el paradigma de sanitización escalar tradicional, adoptando controles sintácticos con conciencia espacial integrados desde el diseño arquitectónico de software.</w:t>
       </w:r>
     </w:p>
     <w:p>
@@ -6442,7 +8262,6 @@
           <w:rFonts w:ascii="Book Antiqua" w:hAnsi="Book Antiqua"/>
           <w:color w:val="000000"/>
         </w:rPr>
-        <w:lastRenderedPageBreak/>
         <w:t>Bertino, E., Catania, B., &amp; Damiani, M. L. (2005). GEO-RBAC: A spatially aware RBAC. In Proceedings of the 10th ACM Symposium on Access Control Models and Technologies (SACMAT '05) (pp. 29–37). Association for Computing Machinery. https://doi.org/10.1145/1063979.1063985</w:t>
       </w:r>
     </w:p>
@@ -6456,6 +8275,7 @@
           <w:rFonts w:ascii="Book Antiqua" w:hAnsi="Book Antiqua"/>
           <w:color w:val="000000"/>
         </w:rPr>
+        <w:lastRenderedPageBreak/>
         <w:t>Chun, S. A., &amp; Atluri, V. (2008). Geospatial database security. In H. Chen, T. S. Raghu, R. Ramesh, R. Sharman, &amp; S. Chakravarty (Eds.), Handbook of Database Security: Applications and Trends (pp. 251–277). Springer. https://doi.org/10.1007/978-0-387-48533-1_11</w:t>
       </w:r>
     </w:p>
@@ -8302,7 +10122,6 @@
   <w:style w:type="character" w:default="1" w:styleId="Fuentedeprrafopredeter">
     <w:name w:val="Default Paragraph Font"/>
     <w:uiPriority w:val="1"/>
-    <w:semiHidden/>
     <w:unhideWhenUsed/>
   </w:style>
   <w:style w:type="table" w:default="1" w:styleId="Tablanormal">

</xml_diff>

<commit_message>
docs: finalize Section 7 conclusion with aseptic tone and dataset consistency
</commit_message>
<xml_diff>
--- a/Articulo_Cientifico_IMJETA_Final.docx
+++ b/Articulo_Cientifico_IMJETA_Final.docx
@@ -7548,667 +7548,17 @@
     <w:p>
       <w:pPr>
         <w:spacing w:after="80" w:line="240" w:lineRule="auto"/>
-      </w:pPr>
-      <w:r>
-        <w:rPr>
-          <w:rFonts w:ascii="Book Antiqua" w:hAnsi="Book Antiqua"/>
-          <w:color w:val="000000"/>
-        </w:rPr>
-        <w:t xml:space="preserve">Este </w:t>
-      </w:r>
-      <w:proofErr w:type="spellStart"/>
-      <w:r>
-        <w:rPr>
-          <w:rFonts w:ascii="Book Antiqua" w:hAnsi="Book Antiqua"/>
-          <w:color w:val="000000"/>
-        </w:rPr>
-        <w:t>artículo</w:t>
-      </w:r>
-      <w:proofErr w:type="spellEnd"/>
-      <w:r>
-        <w:rPr>
-          <w:rFonts w:ascii="Book Antiqua" w:hAnsi="Book Antiqua"/>
-          <w:color w:val="000000"/>
-        </w:rPr>
-        <w:t xml:space="preserve"> </w:t>
-      </w:r>
-      <w:proofErr w:type="spellStart"/>
-      <w:r>
-        <w:rPr>
-          <w:rFonts w:ascii="Book Antiqua" w:hAnsi="Book Antiqua"/>
-          <w:color w:val="000000"/>
-        </w:rPr>
-        <w:t>formalizó</w:t>
-      </w:r>
-      <w:proofErr w:type="spellEnd"/>
-      <w:r>
-        <w:rPr>
-          <w:rFonts w:ascii="Book Antiqua" w:hAnsi="Book Antiqua"/>
-          <w:color w:val="000000"/>
-        </w:rPr>
-        <w:t xml:space="preserve"> y </w:t>
-      </w:r>
-      <w:proofErr w:type="spellStart"/>
-      <w:r>
-        <w:rPr>
-          <w:rFonts w:ascii="Book Antiqua" w:hAnsi="Book Antiqua"/>
-          <w:color w:val="000000"/>
-        </w:rPr>
-        <w:t>probó</w:t>
-      </w:r>
-      <w:proofErr w:type="spellEnd"/>
-      <w:r>
-        <w:rPr>
-          <w:rFonts w:ascii="Book Antiqua" w:hAnsi="Book Antiqua"/>
-          <w:color w:val="000000"/>
-        </w:rPr>
-        <w:t xml:space="preserve">, a </w:t>
-      </w:r>
-      <w:proofErr w:type="spellStart"/>
-      <w:r>
-        <w:rPr>
-          <w:rFonts w:ascii="Book Antiqua" w:hAnsi="Book Antiqua"/>
-          <w:color w:val="000000"/>
-        </w:rPr>
-        <w:t>través</w:t>
-      </w:r>
-      <w:proofErr w:type="spellEnd"/>
-      <w:r>
-        <w:rPr>
-          <w:rFonts w:ascii="Book Antiqua" w:hAnsi="Book Antiqua"/>
-          <w:color w:val="000000"/>
-        </w:rPr>
-        <w:t xml:space="preserve"> de la </w:t>
-      </w:r>
-      <w:proofErr w:type="spellStart"/>
-      <w:r>
-        <w:rPr>
-          <w:rFonts w:ascii="Book Antiqua" w:hAnsi="Book Antiqua"/>
-          <w:color w:val="000000"/>
-        </w:rPr>
-        <w:t>experiencia</w:t>
-      </w:r>
-      <w:proofErr w:type="spellEnd"/>
-      <w:r>
-        <w:rPr>
-          <w:rFonts w:ascii="Book Antiqua" w:hAnsi="Book Antiqua"/>
-          <w:color w:val="000000"/>
-        </w:rPr>
-        <w:t xml:space="preserve">, que seis </w:t>
-      </w:r>
-      <w:proofErr w:type="spellStart"/>
-      <w:r>
-        <w:rPr>
-          <w:rFonts w:ascii="Book Antiqua" w:hAnsi="Book Antiqua"/>
-          <w:color w:val="000000"/>
-        </w:rPr>
-        <w:t>vectores</w:t>
-      </w:r>
-      <w:proofErr w:type="spellEnd"/>
-      <w:r>
-        <w:rPr>
-          <w:rFonts w:ascii="Book Antiqua" w:hAnsi="Book Antiqua"/>
-          <w:color w:val="000000"/>
-        </w:rPr>
-        <w:t xml:space="preserve"> de </w:t>
-      </w:r>
-      <w:proofErr w:type="spellStart"/>
-      <w:r>
-        <w:rPr>
-          <w:rFonts w:ascii="Book Antiqua" w:hAnsi="Book Antiqua"/>
-          <w:color w:val="000000"/>
-        </w:rPr>
-        <w:t>inyección</w:t>
-      </w:r>
-      <w:proofErr w:type="spellEnd"/>
-      <w:r>
-        <w:rPr>
-          <w:rFonts w:ascii="Book Antiqua" w:hAnsi="Book Antiqua"/>
-          <w:color w:val="000000"/>
-        </w:rPr>
-        <w:t xml:space="preserve"> SQL </w:t>
-      </w:r>
-      <w:proofErr w:type="spellStart"/>
-      <w:r>
-        <w:rPr>
-          <w:rFonts w:ascii="Book Antiqua" w:hAnsi="Book Antiqua"/>
-          <w:color w:val="000000"/>
-        </w:rPr>
-        <w:t>espacial</w:t>
-      </w:r>
-      <w:proofErr w:type="spellEnd"/>
-      <w:r>
-        <w:rPr>
-          <w:rFonts w:ascii="Book Antiqua" w:hAnsi="Book Antiqua"/>
-          <w:color w:val="000000"/>
-        </w:rPr>
-        <w:t xml:space="preserve"> </w:t>
-      </w:r>
-      <w:proofErr w:type="spellStart"/>
-      <w:r>
-        <w:rPr>
-          <w:rFonts w:ascii="Book Antiqua" w:hAnsi="Book Antiqua"/>
-          <w:color w:val="000000"/>
-        </w:rPr>
-        <w:t>en</w:t>
-      </w:r>
-      <w:proofErr w:type="spellEnd"/>
-      <w:r>
-        <w:rPr>
-          <w:rFonts w:ascii="Book Antiqua" w:hAnsi="Book Antiqua"/>
-          <w:color w:val="000000"/>
-        </w:rPr>
-        <w:t xml:space="preserve"> </w:t>
-      </w:r>
-      <w:proofErr w:type="spellStart"/>
-      <w:r>
-        <w:rPr>
-          <w:rFonts w:ascii="Book Antiqua" w:hAnsi="Book Antiqua"/>
-          <w:color w:val="000000"/>
-        </w:rPr>
-        <w:t>sistemas</w:t>
-      </w:r>
-      <w:proofErr w:type="spellEnd"/>
-      <w:r>
-        <w:rPr>
-          <w:rFonts w:ascii="Book Antiqua" w:hAnsi="Book Antiqua"/>
-          <w:color w:val="000000"/>
-        </w:rPr>
-        <w:t xml:space="preserve"> de </w:t>
-      </w:r>
-      <w:proofErr w:type="spellStart"/>
-      <w:r>
-        <w:rPr>
-          <w:rFonts w:ascii="Book Antiqua" w:hAnsi="Book Antiqua"/>
-          <w:color w:val="000000"/>
-        </w:rPr>
-        <w:t>información</w:t>
-      </w:r>
-      <w:proofErr w:type="spellEnd"/>
-      <w:r>
-        <w:rPr>
-          <w:rFonts w:ascii="Book Antiqua" w:hAnsi="Book Antiqua"/>
-          <w:color w:val="000000"/>
-        </w:rPr>
-        <w:t xml:space="preserve"> </w:t>
-      </w:r>
-      <w:proofErr w:type="spellStart"/>
-      <w:r>
-        <w:rPr>
-          <w:rFonts w:ascii="Book Antiqua" w:hAnsi="Book Antiqua"/>
-          <w:color w:val="000000"/>
-        </w:rPr>
-        <w:t>catastral</w:t>
-      </w:r>
-      <w:proofErr w:type="spellEnd"/>
-      <w:r>
-        <w:rPr>
-          <w:rFonts w:ascii="Book Antiqua" w:hAnsi="Book Antiqua"/>
-          <w:color w:val="000000"/>
-        </w:rPr>
-        <w:t xml:space="preserve"> </w:t>
-      </w:r>
-      <w:proofErr w:type="spellStart"/>
-      <w:r>
-        <w:rPr>
-          <w:rFonts w:ascii="Book Antiqua" w:hAnsi="Book Antiqua"/>
-          <w:color w:val="000000"/>
-        </w:rPr>
-        <w:t>basados</w:t>
-      </w:r>
-      <w:proofErr w:type="spellEnd"/>
-      <w:r>
-        <w:rPr>
-          <w:rFonts w:ascii="Book Antiqua" w:hAnsi="Book Antiqua"/>
-          <w:color w:val="000000"/>
-        </w:rPr>
-        <w:t xml:space="preserve"> </w:t>
-      </w:r>
-      <w:proofErr w:type="spellStart"/>
-      <w:r>
-        <w:rPr>
-          <w:rFonts w:ascii="Book Antiqua" w:hAnsi="Book Antiqua"/>
-          <w:color w:val="000000"/>
-        </w:rPr>
-        <w:t>en</w:t>
-      </w:r>
-      <w:proofErr w:type="spellEnd"/>
-      <w:r>
-        <w:rPr>
-          <w:rFonts w:ascii="Book Antiqua" w:hAnsi="Book Antiqua"/>
-          <w:color w:val="000000"/>
-        </w:rPr>
-        <w:t xml:space="preserve"> </w:t>
-      </w:r>
-      <w:proofErr w:type="spellStart"/>
-      <w:r>
-        <w:rPr>
-          <w:rFonts w:ascii="Book Antiqua" w:hAnsi="Book Antiqua"/>
-          <w:color w:val="000000"/>
-        </w:rPr>
-        <w:t>PostGIS</w:t>
-      </w:r>
-      <w:proofErr w:type="spellEnd"/>
-      <w:r>
-        <w:rPr>
-          <w:rFonts w:ascii="Book Antiqua" w:hAnsi="Book Antiqua"/>
-          <w:color w:val="000000"/>
-        </w:rPr>
-        <w:t xml:space="preserve"> son </w:t>
-      </w:r>
-      <w:proofErr w:type="spellStart"/>
-      <w:r>
-        <w:rPr>
-          <w:rFonts w:ascii="Book Antiqua" w:hAnsi="Book Antiqua"/>
-          <w:color w:val="000000"/>
-        </w:rPr>
-        <w:t>factibles</w:t>
-      </w:r>
-      <w:proofErr w:type="spellEnd"/>
-      <w:r>
-        <w:rPr>
-          <w:rFonts w:ascii="Book Antiqua" w:hAnsi="Book Antiqua"/>
-          <w:color w:val="000000"/>
-        </w:rPr>
-        <w:t>.</w:t>
-      </w:r>
-      <w:r>
-        <w:rPr>
-          <w:rFonts w:ascii="Book Antiqua" w:hAnsi="Book Antiqua"/>
-          <w:color w:val="000000"/>
-        </w:rPr>
-        <w:t xml:space="preserve"> Se </w:t>
-      </w:r>
-      <w:proofErr w:type="spellStart"/>
-      <w:r>
-        <w:rPr>
-          <w:rFonts w:ascii="Book Antiqua" w:hAnsi="Book Antiqua"/>
-          <w:color w:val="000000"/>
-        </w:rPr>
-        <w:t>evidenc</w:t>
-      </w:r>
-      <w:r>
-        <w:rPr>
-          <w:rFonts w:ascii="Book Antiqua" w:hAnsi="Book Antiqua"/>
-          <w:color w:val="000000"/>
-        </w:rPr>
-        <w:t>ió</w:t>
-      </w:r>
-      <w:proofErr w:type="spellEnd"/>
-      <w:r>
-        <w:rPr>
-          <w:rFonts w:ascii="Book Antiqua" w:hAnsi="Book Antiqua"/>
-          <w:color w:val="000000"/>
-        </w:rPr>
-        <w:t xml:space="preserve"> que las </w:t>
-      </w:r>
-      <w:proofErr w:type="spellStart"/>
-      <w:r>
-        <w:rPr>
-          <w:rFonts w:ascii="Book Antiqua" w:hAnsi="Book Antiqua"/>
-          <w:color w:val="000000"/>
-        </w:rPr>
-        <w:t>funciones</w:t>
-      </w:r>
-      <w:proofErr w:type="spellEnd"/>
-      <w:r>
-        <w:rPr>
-          <w:rFonts w:ascii="Book Antiqua" w:hAnsi="Book Antiqua"/>
-          <w:color w:val="000000"/>
-        </w:rPr>
-        <w:t xml:space="preserve"> topológicas </w:t>
-      </w:r>
-      <w:proofErr w:type="spellStart"/>
-      <w:r>
-        <w:rPr>
-          <w:rFonts w:ascii="Book Antiqua" w:hAnsi="Book Antiqua"/>
-          <w:color w:val="000000"/>
-        </w:rPr>
-        <w:t>nativas</w:t>
-      </w:r>
-      <w:proofErr w:type="spellEnd"/>
-      <w:r>
-        <w:rPr>
-          <w:rFonts w:ascii="Book Antiqua" w:hAnsi="Book Antiqua"/>
-          <w:color w:val="000000"/>
-        </w:rPr>
-        <w:t xml:space="preserve"> no </w:t>
-      </w:r>
-      <w:proofErr w:type="spellStart"/>
-      <w:r>
-        <w:rPr>
-          <w:rFonts w:ascii="Book Antiqua" w:hAnsi="Book Antiqua"/>
-          <w:color w:val="000000"/>
-        </w:rPr>
-        <w:t>garantizan</w:t>
-      </w:r>
-      <w:proofErr w:type="spellEnd"/>
-      <w:r>
-        <w:rPr>
-          <w:rFonts w:ascii="Book Antiqua" w:hAnsi="Book Antiqua"/>
-          <w:color w:val="000000"/>
-        </w:rPr>
-        <w:t xml:space="preserve"> </w:t>
-      </w:r>
-      <w:proofErr w:type="spellStart"/>
-      <w:r>
-        <w:rPr>
-          <w:rFonts w:ascii="Book Antiqua" w:hAnsi="Book Antiqua"/>
-          <w:color w:val="000000"/>
-        </w:rPr>
-        <w:t>el</w:t>
-      </w:r>
-      <w:proofErr w:type="spellEnd"/>
-      <w:r>
-        <w:rPr>
-          <w:rFonts w:ascii="Book Antiqua" w:hAnsi="Book Antiqua"/>
-          <w:color w:val="000000"/>
-        </w:rPr>
-        <w:t xml:space="preserve"> </w:t>
-      </w:r>
-      <w:proofErr w:type="spellStart"/>
-      <w:r>
-        <w:rPr>
-          <w:rFonts w:ascii="Book Antiqua" w:hAnsi="Book Antiqua"/>
-          <w:color w:val="000000"/>
-        </w:rPr>
-        <w:t>aislamiento</w:t>
-      </w:r>
-      <w:proofErr w:type="spellEnd"/>
-      <w:r>
-        <w:rPr>
-          <w:rFonts w:ascii="Book Antiqua" w:hAnsi="Book Antiqua"/>
-          <w:color w:val="000000"/>
-        </w:rPr>
-        <w:t xml:space="preserve"> de </w:t>
-      </w:r>
-      <w:proofErr w:type="spellStart"/>
-      <w:r>
-        <w:rPr>
-          <w:rFonts w:ascii="Book Antiqua" w:hAnsi="Book Antiqua"/>
-          <w:color w:val="000000"/>
-        </w:rPr>
-        <w:t>datos</w:t>
-      </w:r>
-      <w:proofErr w:type="spellEnd"/>
-      <w:r>
-        <w:rPr>
-          <w:rFonts w:ascii="Book Antiqua" w:hAnsi="Book Antiqua"/>
-          <w:color w:val="000000"/>
-        </w:rPr>
-        <w:t xml:space="preserve"> </w:t>
-      </w:r>
-      <w:proofErr w:type="spellStart"/>
-      <w:r>
-        <w:rPr>
-          <w:rFonts w:ascii="Book Antiqua" w:hAnsi="Book Antiqua"/>
-          <w:color w:val="000000"/>
-        </w:rPr>
-        <w:t>cuando</w:t>
-      </w:r>
-      <w:proofErr w:type="spellEnd"/>
-      <w:r>
-        <w:rPr>
-          <w:rFonts w:ascii="Book Antiqua" w:hAnsi="Book Antiqua"/>
-          <w:color w:val="000000"/>
-        </w:rPr>
-        <w:t xml:space="preserve"> se </w:t>
-      </w:r>
-      <w:proofErr w:type="spellStart"/>
-      <w:r>
-        <w:rPr>
-          <w:rFonts w:ascii="Book Antiqua" w:hAnsi="Book Antiqua"/>
-          <w:color w:val="000000"/>
-        </w:rPr>
-        <w:t>construyen</w:t>
-      </w:r>
-      <w:proofErr w:type="spellEnd"/>
-      <w:r>
-        <w:rPr>
-          <w:rFonts w:ascii="Book Antiqua" w:hAnsi="Book Antiqua"/>
-          <w:color w:val="000000"/>
-        </w:rPr>
-        <w:t xml:space="preserve"> </w:t>
-      </w:r>
-      <w:proofErr w:type="spellStart"/>
-      <w:r>
-        <w:rPr>
-          <w:rFonts w:ascii="Book Antiqua" w:hAnsi="Book Antiqua"/>
-          <w:color w:val="000000"/>
-        </w:rPr>
-        <w:t>concatenando</w:t>
-      </w:r>
-      <w:proofErr w:type="spellEnd"/>
-      <w:r>
-        <w:rPr>
-          <w:rFonts w:ascii="Book Antiqua" w:hAnsi="Book Antiqua"/>
-          <w:color w:val="000000"/>
-        </w:rPr>
-        <w:t xml:space="preserve"> </w:t>
-      </w:r>
-      <w:proofErr w:type="spellStart"/>
-      <w:r>
-        <w:rPr>
-          <w:rFonts w:ascii="Book Antiqua" w:hAnsi="Book Antiqua"/>
-          <w:color w:val="000000"/>
-        </w:rPr>
-        <w:t>cadenas</w:t>
-      </w:r>
-      <w:proofErr w:type="spellEnd"/>
-      <w:r>
-        <w:rPr>
-          <w:rFonts w:ascii="Book Antiqua" w:hAnsi="Book Antiqua"/>
-          <w:color w:val="000000"/>
-        </w:rPr>
-        <w:t xml:space="preserve">. La evaluación experimental sobre 1,500 </w:t>
-      </w:r>
-      <w:proofErr w:type="spellStart"/>
-      <w:r>
-        <w:rPr>
-          <w:rFonts w:ascii="Book Antiqua" w:hAnsi="Book Antiqua"/>
-          <w:color w:val="000000"/>
-        </w:rPr>
-        <w:t>lotes</w:t>
-      </w:r>
-      <w:proofErr w:type="spellEnd"/>
-      <w:r>
-        <w:rPr>
-          <w:rFonts w:ascii="Book Antiqua" w:hAnsi="Book Antiqua"/>
-          <w:color w:val="000000"/>
-        </w:rPr>
-        <w:t xml:space="preserve"> </w:t>
-      </w:r>
-      <w:proofErr w:type="spellStart"/>
-      <w:r>
-        <w:rPr>
-          <w:rFonts w:ascii="Book Antiqua" w:hAnsi="Book Antiqua"/>
-          <w:color w:val="000000"/>
-        </w:rPr>
-        <w:t>catastrales</w:t>
-      </w:r>
-      <w:proofErr w:type="spellEnd"/>
-      <w:r>
-        <w:rPr>
-          <w:rFonts w:ascii="Book Antiqua" w:hAnsi="Book Antiqua"/>
-          <w:color w:val="000000"/>
-        </w:rPr>
-        <w:t xml:space="preserve"> (ISO 19152 LADM) </w:t>
-      </w:r>
-      <w:proofErr w:type="spellStart"/>
-      <w:r>
-        <w:rPr>
-          <w:rFonts w:ascii="Book Antiqua" w:hAnsi="Book Antiqua"/>
-          <w:color w:val="000000"/>
-        </w:rPr>
-        <w:t>comprobó</w:t>
-      </w:r>
-      <w:proofErr w:type="spellEnd"/>
-      <w:r>
-        <w:rPr>
-          <w:rFonts w:ascii="Book Antiqua" w:hAnsi="Book Antiqua"/>
-          <w:color w:val="000000"/>
-        </w:rPr>
-        <w:t xml:space="preserve"> que </w:t>
-      </w:r>
-      <w:proofErr w:type="spellStart"/>
-      <w:r>
-        <w:rPr>
-          <w:rFonts w:ascii="Book Antiqua" w:hAnsi="Book Antiqua"/>
-          <w:color w:val="000000"/>
-        </w:rPr>
-        <w:t>los</w:t>
-      </w:r>
-      <w:proofErr w:type="spellEnd"/>
-      <w:r>
-        <w:rPr>
-          <w:rFonts w:ascii="Book Antiqua" w:hAnsi="Book Antiqua"/>
-          <w:color w:val="000000"/>
-        </w:rPr>
-        <w:t xml:space="preserve"> </w:t>
-      </w:r>
-      <w:proofErr w:type="spellStart"/>
-      <w:r>
-        <w:rPr>
-          <w:rFonts w:ascii="Book Antiqua" w:hAnsi="Book Antiqua"/>
-          <w:color w:val="000000"/>
-        </w:rPr>
-        <w:t>atacantes</w:t>
-      </w:r>
-      <w:proofErr w:type="spellEnd"/>
-      <w:r>
-        <w:rPr>
-          <w:rFonts w:ascii="Book Antiqua" w:hAnsi="Book Antiqua"/>
-          <w:color w:val="000000"/>
-        </w:rPr>
-        <w:t xml:space="preserve"> </w:t>
-      </w:r>
-      <w:proofErr w:type="spellStart"/>
-      <w:r>
-        <w:rPr>
-          <w:rFonts w:ascii="Book Antiqua" w:hAnsi="Book Antiqua"/>
-          <w:color w:val="000000"/>
-        </w:rPr>
-        <w:t>pueden</w:t>
-      </w:r>
-      <w:proofErr w:type="spellEnd"/>
-      <w:r>
-        <w:rPr>
-          <w:rFonts w:ascii="Book Antiqua" w:hAnsi="Book Antiqua"/>
-          <w:color w:val="000000"/>
-        </w:rPr>
-        <w:t xml:space="preserve"> </w:t>
-      </w:r>
-      <w:proofErr w:type="spellStart"/>
-      <w:r>
-        <w:rPr>
-          <w:rFonts w:ascii="Book Antiqua" w:hAnsi="Book Antiqua"/>
-          <w:color w:val="000000"/>
-        </w:rPr>
-        <w:t>evadir</w:t>
-      </w:r>
-      <w:proofErr w:type="spellEnd"/>
-      <w:r>
-        <w:rPr>
-          <w:rFonts w:ascii="Book Antiqua" w:hAnsi="Book Antiqua"/>
-          <w:color w:val="000000"/>
-        </w:rPr>
-        <w:t xml:space="preserve"> </w:t>
-      </w:r>
-      <w:proofErr w:type="spellStart"/>
-      <w:r>
-        <w:rPr>
-          <w:rFonts w:ascii="Book Antiqua" w:hAnsi="Book Antiqua"/>
-          <w:color w:val="000000"/>
-        </w:rPr>
-        <w:t>límites</w:t>
-      </w:r>
-      <w:proofErr w:type="spellEnd"/>
-      <w:r>
-        <w:rPr>
-          <w:rFonts w:ascii="Book Antiqua" w:hAnsi="Book Antiqua"/>
-          <w:color w:val="000000"/>
-        </w:rPr>
-        <w:t xml:space="preserve"> </w:t>
-      </w:r>
-      <w:proofErr w:type="spellStart"/>
-      <w:r>
-        <w:rPr>
-          <w:rFonts w:ascii="Book Antiqua" w:hAnsi="Book Antiqua"/>
-          <w:color w:val="000000"/>
-        </w:rPr>
-        <w:t>zonales</w:t>
-      </w:r>
-      <w:proofErr w:type="spellEnd"/>
-      <w:r>
-        <w:rPr>
-          <w:rFonts w:ascii="Book Antiqua" w:hAnsi="Book Antiqua"/>
-          <w:color w:val="000000"/>
-        </w:rPr>
-        <w:t xml:space="preserve">, </w:t>
-      </w:r>
-      <w:proofErr w:type="spellStart"/>
-      <w:r>
-        <w:rPr>
-          <w:rFonts w:ascii="Book Antiqua" w:hAnsi="Book Antiqua"/>
-          <w:color w:val="000000"/>
-        </w:rPr>
-        <w:t>reconstruir</w:t>
-      </w:r>
-      <w:proofErr w:type="spellEnd"/>
-      <w:r>
-        <w:rPr>
-          <w:rFonts w:ascii="Book Antiqua" w:hAnsi="Book Antiqua"/>
-          <w:color w:val="000000"/>
-        </w:rPr>
-        <w:t xml:space="preserve"> </w:t>
-      </w:r>
-      <w:proofErr w:type="spellStart"/>
-      <w:r>
-        <w:rPr>
-          <w:rFonts w:ascii="Book Antiqua" w:hAnsi="Book Antiqua"/>
-          <w:color w:val="000000"/>
-        </w:rPr>
-        <w:t>credenciales</w:t>
-      </w:r>
-      <w:proofErr w:type="spellEnd"/>
-      <w:r>
-        <w:rPr>
-          <w:rFonts w:ascii="Book Antiqua" w:hAnsi="Book Antiqua"/>
-          <w:color w:val="000000"/>
-        </w:rPr>
-        <w:t xml:space="preserve"> </w:t>
-      </w:r>
-      <w:proofErr w:type="spellStart"/>
-      <w:r>
-        <w:rPr>
-          <w:rFonts w:ascii="Book Antiqua" w:hAnsi="Book Antiqua"/>
-          <w:color w:val="000000"/>
-        </w:rPr>
-        <w:t>mediante</w:t>
-      </w:r>
-      <w:proofErr w:type="spellEnd"/>
-      <w:r>
-        <w:rPr>
-          <w:rFonts w:ascii="Book Antiqua" w:hAnsi="Book Antiqua"/>
-          <w:color w:val="000000"/>
-        </w:rPr>
-        <w:t xml:space="preserve"> canales </w:t>
-      </w:r>
-      <w:proofErr w:type="spellStart"/>
-      <w:r>
-        <w:rPr>
-          <w:rFonts w:ascii="Book Antiqua" w:hAnsi="Book Antiqua"/>
-          <w:color w:val="000000"/>
-        </w:rPr>
-        <w:t>laterales</w:t>
-      </w:r>
-      <w:proofErr w:type="spellEnd"/>
-      <w:r>
-        <w:rPr>
-          <w:rFonts w:ascii="Book Antiqua" w:hAnsi="Book Antiqua"/>
-          <w:color w:val="000000"/>
-        </w:rPr>
-        <w:t xml:space="preserve"> de error geométrico, inducir denegación de servicio espacial por sobrecarga algorítmica cuadrática, alterar fichas prediales tributarias y ejecutar borrados cartográficos masivos. Frente a ello, la adopción de una arquitectura de defensa en profundidad basada en GeoAlchemy2, tipado rígido con Pydantic y validación topológica previa en memoria con Shapely mitigó con éxito el 100% de los escenarios de explotación evaluados. El benchmarking transaccional demostró que esta seguridad robusta introduce un incremento medio de latencia de apenas 2.63 ms (+15.24%), mejorando simultáneamente la estabilidad en el percentil 99 en un 12.59% gracias a la reutilización de planes de ejecución preparados en PostgreSQL. En conclusión, la seguridad en infraestructuras catastrales exige abandonar el paradigma de sanitización escalar tradicional, adoptando controles sintácticos con conciencia espacial integrados desde el diseño arquitectónico de software.</w:t>
+        <w:ind w:firstLine="432"/>
+      </w:pPr>
+      <w:r/>
+      <w:r>
+        <w:rPr>
+          <w:rFonts w:ascii="Book Antiqua" w:hAnsi="Book Antiqua"/>
+          <w:b w:val="0"/>
+          <w:i w:val="0"/>
+          <w:sz w:val="22"/>
+        </w:rPr>
+        <w:t>Este artículo formalizó y demostró empíricamente la viabilidad de seis vectores de inyección SQL espacial en sistemas de información catastral basados en PostGIS, evidenciando que las funciones topológicas nativas no garantizan el aislamiento de datos cuando se construyen mediante concatenación de cadenas. La evaluación experimental sobre un dataset de 1,500 lotes catastrales estructurados bajo el estándar ISO 19152 (LADM) comprobó que un atacante puede evadir límites zonales, reconstruir credenciales mediante canales laterales de error geométrico, inducir denegación de servicio espacial por sobrecarga algorítmica cuadrática, alterar fichas prediales tributarias y ejecutar borrados cartográficos masivos. Frente a ello, la arquitectura de defensa en profundidad basada en GeoAlchemy2, tipado rígido con Pydantic y validación topológica previa en memoria con Shapely mitigó con éxito el 100% de los escenarios de explotación evaluados. El benchmarking transaccional demostró que este esquema introduce un sobrecosto medio de latencia de 2.63 ms (+15.24%), mejorando simultáneamente la estabilidad en el percentil 99 en un 12.59% gracias a la reutilización de planes de ejecución preparados en PostgreSQL. En conclusión, la seguridad en infraestructuras catastrales exige abandonar el paradigma de sanitización escalar tradicional, adoptando controles sintácticos con conciencia espacial integrados desde el diseño arquitectónico de software.</w:t>
       </w:r>
     </w:p>
     <w:p>

</xml_diff>

<commit_message>
chore: checkpoint author edits before integrating CIA and ORM into conclusion
</commit_message>
<xml_diff>
--- a/Articulo_Cientifico_IMJETA_Final.docx
+++ b/Articulo_Cientifico_IMJETA_Final.docx
@@ -317,7 +317,7 @@
           <w:color w:val="000000"/>
           <w:sz w:val="20"/>
         </w:rPr>
-        <w:t xml:space="preserve"> de bases de datos espaciales en arquitecturas web ha ampliado la superficie de ataque para las </w:t>
+        <w:t xml:space="preserve"> de bases de datos espaciales en arquitecturas web ha ampliado la superficie de </w:t>
       </w:r>
       <w:proofErr w:type="spellStart"/>
       <w:r>
@@ -326,6 +326,24 @@
           <w:color w:val="000000"/>
           <w:sz w:val="20"/>
         </w:rPr>
+        <w:t>ataque</w:t>
+      </w:r>
+      <w:proofErr w:type="spellEnd"/>
+      <w:r>
+        <w:rPr>
+          <w:rFonts w:ascii="Book Antiqua" w:hAnsi="Book Antiqua"/>
+          <w:color w:val="000000"/>
+          <w:sz w:val="20"/>
+        </w:rPr>
+        <w:t xml:space="preserve"> para las </w:t>
+      </w:r>
+      <w:proofErr w:type="spellStart"/>
+      <w:r>
+        <w:rPr>
+          <w:rFonts w:ascii="Book Antiqua" w:hAnsi="Book Antiqua"/>
+          <w:color w:val="000000"/>
+          <w:sz w:val="20"/>
+        </w:rPr>
         <w:t>aplicaciones</w:t>
       </w:r>
       <w:proofErr w:type="spellEnd"/>
@@ -461,7 +479,7 @@
           <w:color w:val="000000"/>
           <w:sz w:val="20"/>
         </w:rPr>
-        <w:t xml:space="preserve"> estando poco explorados. Este artículo investiga la explotación y mitigación de inyecciones SQL espaciales dentro de sistemas de información catastral que utilizan PostGIS. Se desarrolló un entorno de prueba en contenedores, </w:t>
+        <w:t xml:space="preserve"> estando poco explorados. Este artículo investiga la explotación y mitigación de inyecciones SQL espaciales dentro de sistemas de información catastral que utilizan PostGIS. Se desarrolló un entorno de </w:t>
       </w:r>
       <w:proofErr w:type="spellStart"/>
       <w:r>
@@ -470,6 +488,60 @@
           <w:color w:val="000000"/>
           <w:sz w:val="20"/>
         </w:rPr>
+        <w:t>prueba</w:t>
+      </w:r>
+      <w:proofErr w:type="spellEnd"/>
+      <w:r>
+        <w:rPr>
+          <w:rFonts w:ascii="Book Antiqua" w:hAnsi="Book Antiqua"/>
+          <w:color w:val="000000"/>
+          <w:sz w:val="20"/>
+        </w:rPr>
+        <w:t xml:space="preserve"> </w:t>
+      </w:r>
+      <w:proofErr w:type="spellStart"/>
+      <w:r>
+        <w:rPr>
+          <w:rFonts w:ascii="Book Antiqua" w:hAnsi="Book Antiqua"/>
+          <w:color w:val="000000"/>
+          <w:sz w:val="20"/>
+        </w:rPr>
+        <w:t>en</w:t>
+      </w:r>
+      <w:proofErr w:type="spellEnd"/>
+      <w:r>
+        <w:rPr>
+          <w:rFonts w:ascii="Book Antiqua" w:hAnsi="Book Antiqua"/>
+          <w:color w:val="000000"/>
+          <w:sz w:val="20"/>
+        </w:rPr>
+        <w:t xml:space="preserve"> </w:t>
+      </w:r>
+      <w:proofErr w:type="spellStart"/>
+      <w:r>
+        <w:rPr>
+          <w:rFonts w:ascii="Book Antiqua" w:hAnsi="Book Antiqua"/>
+          <w:color w:val="000000"/>
+          <w:sz w:val="20"/>
+        </w:rPr>
+        <w:t>contenedores</w:t>
+      </w:r>
+      <w:proofErr w:type="spellEnd"/>
+      <w:r>
+        <w:rPr>
+          <w:rFonts w:ascii="Book Antiqua" w:hAnsi="Book Antiqua"/>
+          <w:color w:val="000000"/>
+          <w:sz w:val="20"/>
+        </w:rPr>
+        <w:t xml:space="preserve">, </w:t>
+      </w:r>
+      <w:proofErr w:type="spellStart"/>
+      <w:r>
+        <w:rPr>
+          <w:rFonts w:ascii="Book Antiqua" w:hAnsi="Book Antiqua"/>
+          <w:color w:val="000000"/>
+          <w:sz w:val="20"/>
+        </w:rPr>
         <w:t>utilizando</w:t>
       </w:r>
       <w:proofErr w:type="spellEnd"/>
@@ -587,7 +659,7 @@
           <w:color w:val="000000"/>
           <w:sz w:val="20"/>
         </w:rPr>
-        <w:t xml:space="preserve">. El estudio </w:t>
+        <w:t xml:space="preserve">. El </w:t>
       </w:r>
       <w:proofErr w:type="spellStart"/>
       <w:r>
@@ -596,6 +668,24 @@
           <w:color w:val="000000"/>
           <w:sz w:val="20"/>
         </w:rPr>
+        <w:t>estudio</w:t>
+      </w:r>
+      <w:proofErr w:type="spellEnd"/>
+      <w:r>
+        <w:rPr>
+          <w:rFonts w:ascii="Book Antiqua" w:hAnsi="Book Antiqua"/>
+          <w:color w:val="000000"/>
+          <w:sz w:val="20"/>
+        </w:rPr>
+        <w:t xml:space="preserve"> </w:t>
+      </w:r>
+      <w:proofErr w:type="spellStart"/>
+      <w:r>
+        <w:rPr>
+          <w:rFonts w:ascii="Book Antiqua" w:hAnsi="Book Antiqua"/>
+          <w:color w:val="000000"/>
+          <w:sz w:val="20"/>
+        </w:rPr>
         <w:t>demuestra</w:t>
       </w:r>
       <w:proofErr w:type="spellEnd"/>
@@ -783,7 +873,7 @@
           <w:color w:val="000000"/>
           <w:sz w:val="20"/>
         </w:rPr>
-        <w:t xml:space="preserve"> que el pipeline propuesto neutralizó el 100% de </w:t>
+        <w:t xml:space="preserve"> que el pipeline propuesto neutralizó </w:t>
       </w:r>
       <w:proofErr w:type="spellStart"/>
       <w:r>
@@ -792,6 +882,24 @@
           <w:color w:val="000000"/>
           <w:sz w:val="20"/>
         </w:rPr>
+        <w:t>el</w:t>
+      </w:r>
+      <w:proofErr w:type="spellEnd"/>
+      <w:r>
+        <w:rPr>
+          <w:rFonts w:ascii="Book Antiqua" w:hAnsi="Book Antiqua"/>
+          <w:color w:val="000000"/>
+          <w:sz w:val="20"/>
+        </w:rPr>
+        <w:t xml:space="preserve"> 100% de </w:t>
+      </w:r>
+      <w:proofErr w:type="spellStart"/>
+      <w:r>
+        <w:rPr>
+          <w:rFonts w:ascii="Book Antiqua" w:hAnsi="Book Antiqua"/>
+          <w:color w:val="000000"/>
+          <w:sz w:val="20"/>
+        </w:rPr>
         <w:t>los</w:t>
       </w:r>
       <w:proofErr w:type="spellEnd"/>
@@ -891,7 +999,25 @@
           <w:color w:val="000000"/>
           <w:sz w:val="20"/>
         </w:rPr>
-        <w:t xml:space="preserve"> de 2.63 ms (+15.24%) y una mejora del 12.59% en la estabilidad de cola (p99). Se concluye que la mitigación efectiva de inyecciones espaciales no depende de trasladar la validación topológica y la parametrización rígida a la capa de aplicación (ORM), garantizando la integridad catastral con un impacto operativo marginal.</w:t>
+        <w:t xml:space="preserve"> de 2.63 </w:t>
+      </w:r>
+      <w:proofErr w:type="spellStart"/>
+      <w:r>
+        <w:rPr>
+          <w:rFonts w:ascii="Book Antiqua" w:hAnsi="Book Antiqua"/>
+          <w:color w:val="000000"/>
+          <w:sz w:val="20"/>
+        </w:rPr>
+        <w:t>ms</w:t>
+      </w:r>
+      <w:proofErr w:type="spellEnd"/>
+      <w:r>
+        <w:rPr>
+          <w:rFonts w:ascii="Book Antiqua" w:hAnsi="Book Antiqua"/>
+          <w:color w:val="000000"/>
+          <w:sz w:val="20"/>
+        </w:rPr>
+        <w:t xml:space="preserve"> (+15.24%) y una mejora del 12.59% en la estabilidad de cola (p99). Se concluye que la mitigación efectiva de inyecciones espaciales no depende de trasladar la validación topológica y la parametrización rígida a la capa de aplicación (ORM), garantizando la integridad catastral con un impacto operativo marginal.</w:t>
       </w:r>
     </w:p>
     <w:p>
@@ -949,7 +1075,55 @@
           <w:color w:val="000000"/>
         </w:rPr>
         <w:lastRenderedPageBreak/>
-        <w:t xml:space="preserve">ámbito, PostgreSQL junto a su extensión espacial </w:t>
+        <w:t xml:space="preserve">ámbito, PostgreSQL junto a </w:t>
+      </w:r>
+      <w:proofErr w:type="spellStart"/>
+      <w:r>
+        <w:rPr>
+          <w:rFonts w:ascii="Book Antiqua" w:hAnsi="Book Antiqua"/>
+          <w:color w:val="000000"/>
+        </w:rPr>
+        <w:t>su</w:t>
+      </w:r>
+      <w:proofErr w:type="spellEnd"/>
+      <w:r>
+        <w:rPr>
+          <w:rFonts w:ascii="Book Antiqua" w:hAnsi="Book Antiqua"/>
+          <w:color w:val="000000"/>
+        </w:rPr>
+        <w:t xml:space="preserve"> </w:t>
+      </w:r>
+      <w:proofErr w:type="spellStart"/>
+      <w:r>
+        <w:rPr>
+          <w:rFonts w:ascii="Book Antiqua" w:hAnsi="Book Antiqua"/>
+          <w:color w:val="000000"/>
+        </w:rPr>
+        <w:t>extensión</w:t>
+      </w:r>
+      <w:proofErr w:type="spellEnd"/>
+      <w:r>
+        <w:rPr>
+          <w:rFonts w:ascii="Book Antiqua" w:hAnsi="Book Antiqua"/>
+          <w:color w:val="000000"/>
+        </w:rPr>
+        <w:t xml:space="preserve"> </w:t>
+      </w:r>
+      <w:proofErr w:type="spellStart"/>
+      <w:r>
+        <w:rPr>
+          <w:rFonts w:ascii="Book Antiqua" w:hAnsi="Book Antiqua"/>
+          <w:color w:val="000000"/>
+        </w:rPr>
+        <w:t>espacial</w:t>
+      </w:r>
+      <w:proofErr w:type="spellEnd"/>
+      <w:r>
+        <w:rPr>
+          <w:rFonts w:ascii="Book Antiqua" w:hAnsi="Book Antiqua"/>
+          <w:color w:val="000000"/>
+        </w:rPr>
+        <w:t xml:space="preserve"> </w:t>
       </w:r>
       <w:proofErr w:type="spellStart"/>
       <w:r>
@@ -1090,7 +1264,39 @@
           <w:rFonts w:ascii="Book Antiqua" w:hAnsi="Book Antiqua"/>
           <w:color w:val="000000"/>
         </w:rPr>
-        <w:t xml:space="preserve">Sin embargo, la exposición de estos servicios mediante APIs REST introduce vectores de ataque cuando las consultas se construyen mediante concatenación de cadenas dentro de funciones espaciales. Si bien la inyección SQL clásica ha sido ampliamente documentada (Clarke, 2012; Halfond et al., 2006), la manipulación de operadores geométricos de </w:t>
+        <w:t xml:space="preserve">Sin embargo, la exposición de estos servicios mediante APIs REST introduce vectores de ataque cuando las consultas se construyen mediante concatenación de cadenas dentro de funciones espaciales. Si bien la inyección SQL clásica ha sido ampliamente documentada (Clarke, 2012; Halfond et al., 2006), la manipulación de </w:t>
+      </w:r>
+      <w:proofErr w:type="spellStart"/>
+      <w:r>
+        <w:rPr>
+          <w:rFonts w:ascii="Book Antiqua" w:hAnsi="Book Antiqua"/>
+          <w:color w:val="000000"/>
+        </w:rPr>
+        <w:t>operadores</w:t>
+      </w:r>
+      <w:proofErr w:type="spellEnd"/>
+      <w:r>
+        <w:rPr>
+          <w:rFonts w:ascii="Book Antiqua" w:hAnsi="Book Antiqua"/>
+          <w:color w:val="000000"/>
+        </w:rPr>
+        <w:t xml:space="preserve"> </w:t>
+      </w:r>
+      <w:proofErr w:type="spellStart"/>
+      <w:r>
+        <w:rPr>
+          <w:rFonts w:ascii="Book Antiqua" w:hAnsi="Book Antiqua"/>
+          <w:color w:val="000000"/>
+        </w:rPr>
+        <w:t>geométricos</w:t>
+      </w:r>
+      <w:proofErr w:type="spellEnd"/>
+      <w:r>
+        <w:rPr>
+          <w:rFonts w:ascii="Book Antiqua" w:hAnsi="Book Antiqua"/>
+          <w:color w:val="000000"/>
+        </w:rPr>
+        <w:t xml:space="preserve"> de </w:t>
       </w:r>
       <w:proofErr w:type="spellStart"/>
       <w:r>
@@ -1250,7 +1456,71 @@
           <w:rFonts w:ascii="Book Antiqua" w:hAnsi="Book Antiqua"/>
           <w:color w:val="000000"/>
         </w:rPr>
-        <w:t xml:space="preserve"> no solo permite eludir filtros relacionales o exfiltrar datos, sino también </w:t>
+        <w:t xml:space="preserve"> no solo </w:t>
+      </w:r>
+      <w:proofErr w:type="spellStart"/>
+      <w:r>
+        <w:rPr>
+          <w:rFonts w:ascii="Book Antiqua" w:hAnsi="Book Antiqua"/>
+          <w:color w:val="000000"/>
+        </w:rPr>
+        <w:t>permite</w:t>
+      </w:r>
+      <w:proofErr w:type="spellEnd"/>
+      <w:r>
+        <w:rPr>
+          <w:rFonts w:ascii="Book Antiqua" w:hAnsi="Book Antiqua"/>
+          <w:color w:val="000000"/>
+        </w:rPr>
+        <w:t xml:space="preserve"> eludir filtros relacionales o exfiltrar </w:t>
+      </w:r>
+      <w:proofErr w:type="spellStart"/>
+      <w:r>
+        <w:rPr>
+          <w:rFonts w:ascii="Book Antiqua" w:hAnsi="Book Antiqua"/>
+          <w:color w:val="000000"/>
+        </w:rPr>
+        <w:t>datos</w:t>
+      </w:r>
+      <w:proofErr w:type="spellEnd"/>
+      <w:r>
+        <w:rPr>
+          <w:rFonts w:ascii="Book Antiqua" w:hAnsi="Book Antiqua"/>
+          <w:color w:val="000000"/>
+        </w:rPr>
+        <w:t xml:space="preserve">, </w:t>
+      </w:r>
+      <w:proofErr w:type="spellStart"/>
+      <w:r>
+        <w:rPr>
+          <w:rFonts w:ascii="Book Antiqua" w:hAnsi="Book Antiqua"/>
+          <w:color w:val="000000"/>
+        </w:rPr>
+        <w:t>sino</w:t>
+      </w:r>
+      <w:proofErr w:type="spellEnd"/>
+      <w:r>
+        <w:rPr>
+          <w:rFonts w:ascii="Book Antiqua" w:hAnsi="Book Antiqua"/>
+          <w:color w:val="000000"/>
+        </w:rPr>
+        <w:t xml:space="preserve"> </w:t>
+      </w:r>
+      <w:proofErr w:type="spellStart"/>
+      <w:r>
+        <w:rPr>
+          <w:rFonts w:ascii="Book Antiqua" w:hAnsi="Book Antiqua"/>
+          <w:color w:val="000000"/>
+        </w:rPr>
+        <w:t>también</w:t>
+      </w:r>
+      <w:proofErr w:type="spellEnd"/>
+      <w:r>
+        <w:rPr>
+          <w:rFonts w:ascii="Book Antiqua" w:hAnsi="Book Antiqua"/>
+          <w:color w:val="000000"/>
+        </w:rPr>
+        <w:t xml:space="preserve"> </w:t>
       </w:r>
       <w:proofErr w:type="spellStart"/>
       <w:r>
@@ -1437,7 +1707,23 @@
           <w:rFonts w:ascii="Book Antiqua" w:hAnsi="Book Antiqua"/>
           <w:color w:val="000000"/>
         </w:rPr>
-        <w:t xml:space="preserve">Este artículo presenta una evaluación experimental de </w:t>
+        <w:t xml:space="preserve">Este artículo presenta una </w:t>
+      </w:r>
+      <w:proofErr w:type="spellStart"/>
+      <w:r>
+        <w:rPr>
+          <w:rFonts w:ascii="Book Antiqua" w:hAnsi="Book Antiqua"/>
+          <w:color w:val="000000"/>
+        </w:rPr>
+        <w:t>evaluación</w:t>
+      </w:r>
+      <w:proofErr w:type="spellEnd"/>
+      <w:r>
+        <w:rPr>
+          <w:rFonts w:ascii="Book Antiqua" w:hAnsi="Book Antiqua"/>
+          <w:color w:val="000000"/>
+        </w:rPr>
+        <w:t xml:space="preserve"> experimental de </w:t>
       </w:r>
       <w:proofErr w:type="spellStart"/>
       <w:r>
@@ -2192,7 +2478,23 @@
           <w:rFonts w:ascii="Book Antiqua" w:hAnsi="Book Antiqua"/>
           <w:color w:val="000000"/>
         </w:rPr>
-        <w:t xml:space="preserve"> espacial (SRID) y envolventes mínimas (bounding boxes), lo que amplía el área de escape sintáctico. Este vacío teórico en los modelos tradicionales de inyección deja sin caracterizar la manipulación de predicados topológicos nativos en motores relacionales.</w:t>
+        <w:t xml:space="preserve"> </w:t>
+      </w:r>
+      <w:proofErr w:type="spellStart"/>
+      <w:r>
+        <w:rPr>
+          <w:rFonts w:ascii="Book Antiqua" w:hAnsi="Book Antiqua"/>
+          <w:color w:val="000000"/>
+        </w:rPr>
+        <w:t>espacial</w:t>
+      </w:r>
+      <w:proofErr w:type="spellEnd"/>
+      <w:r>
+        <w:rPr>
+          <w:rFonts w:ascii="Book Antiqua" w:hAnsi="Book Antiqua"/>
+          <w:color w:val="000000"/>
+        </w:rPr>
+        <w:t xml:space="preserve"> (SRID) y envolventes mínimas (bounding boxes), lo que amplía el área de escape sintáctico. Este vacío teórico en los modelos tradicionales de inyección deja sin caracterizar la manipulación de predicados topológicos nativos en motores relacionales.</w:t>
       </w:r>
     </w:p>
     <w:p>
@@ -2226,7 +2528,39 @@
           <w:color w:val="000000"/>
         </w:rPr>
         <w:lastRenderedPageBreak/>
-        <w:t xml:space="preserve">riesgos de inferencia espacial en SDBMS, donde un usuario no autorizado puede deducir la existencia o atributos de un objeto protegido correlacionando consultas espaciales sucesivas. No obstante, estas aproximaciones </w:t>
+        <w:t xml:space="preserve">riesgos de inferencia espacial en SDBMS, donde un usuario no autorizado puede deducir la existencia o atributos de un objeto protegido correlacionando consultas espaciales sucesivas. No obstante, </w:t>
+      </w:r>
+      <w:proofErr w:type="spellStart"/>
+      <w:r>
+        <w:rPr>
+          <w:rFonts w:ascii="Book Antiqua" w:hAnsi="Book Antiqua"/>
+          <w:color w:val="000000"/>
+        </w:rPr>
+        <w:t>estas</w:t>
+      </w:r>
+      <w:proofErr w:type="spellEnd"/>
+      <w:r>
+        <w:rPr>
+          <w:rFonts w:ascii="Book Antiqua" w:hAnsi="Book Antiqua"/>
+          <w:color w:val="000000"/>
+        </w:rPr>
+        <w:t xml:space="preserve"> </w:t>
+      </w:r>
+      <w:proofErr w:type="spellStart"/>
+      <w:r>
+        <w:rPr>
+          <w:rFonts w:ascii="Book Antiqua" w:hAnsi="Book Antiqua"/>
+          <w:color w:val="000000"/>
+        </w:rPr>
+        <w:t>aproximaciones</w:t>
+      </w:r>
+      <w:proofErr w:type="spellEnd"/>
+      <w:r>
+        <w:rPr>
+          <w:rFonts w:ascii="Book Antiqua" w:hAnsi="Book Antiqua"/>
+          <w:color w:val="000000"/>
+        </w:rPr>
+        <w:t xml:space="preserve"> </w:t>
       </w:r>
       <w:proofErr w:type="spellStart"/>
       <w:r>
@@ -2338,7 +2672,23 @@
           <w:rFonts w:ascii="Book Antiqua" w:hAnsi="Book Antiqua"/>
           <w:color w:val="000000"/>
         </w:rPr>
-        <w:t xml:space="preserve"> espaciales a la base de datos; en arquitecturas web modernas, la concatenación insegura anula directamente el control de acceso en la persistencia sin ser detectada por los mecanismos de autorización de la capa de aplicación.</w:t>
+        <w:t xml:space="preserve"> </w:t>
+      </w:r>
+      <w:proofErr w:type="spellStart"/>
+      <w:r>
+        <w:rPr>
+          <w:rFonts w:ascii="Book Antiqua" w:hAnsi="Book Antiqua"/>
+          <w:color w:val="000000"/>
+        </w:rPr>
+        <w:t>espaciales</w:t>
+      </w:r>
+      <w:proofErr w:type="spellEnd"/>
+      <w:r>
+        <w:rPr>
+          <w:rFonts w:ascii="Book Antiqua" w:hAnsi="Book Antiqua"/>
+          <w:color w:val="000000"/>
+        </w:rPr>
+        <w:t xml:space="preserve"> a la base de datos; en arquitecturas web modernas, la concatenación insegura anula directamente el control de acceso en la persistencia sin ser detectada por los mecanismos de autorización de la capa de aplicación.</w:t>
       </w:r>
     </w:p>
     <w:p>
@@ -3003,7 +3353,39 @@
           <w:rFonts w:ascii="Book Antiqua" w:hAnsi="Book Antiqua"/>
           <w:color w:val="000000"/>
         </w:rPr>
-        <w:t xml:space="preserve"> la industria mediante la vulnerabilidad crítica CVE-2023-25157 (con puntaje CVSS de 9.8), donde el software de referencia GeoServer permitía la ejecución remota de SQL no autenticado mediante la evaluación insegura de filtros OGC y expresiones CQL sobre bases de datos PostGIS (National Vulnerability Database, 2023). Por otro lado, en el ámbito de la denegación de servicio, Crosby y Wallach (2003) establecieron el concepto de ataques de complejidad algorítmica (Algorithmic Complexity Attacks), demostrando cómo entradas diseñadas pueden </w:t>
+        <w:t xml:space="preserve"> la industria mediante la vulnerabilidad crítica CVE-2023-25157 (con puntaje CVSS de 9.8), donde el software de referencia GeoServer permitía la ejecución remota de SQL no autenticado mediante la evaluación insegura de filtros OGC y expresiones CQL sobre bases de datos PostGIS (National Vulnerability Database, 2023). Por otro lado, en el ámbito de la denegación de servicio, Crosby y Wallach (2003) establecieron el concepto de ataques de complejidad algorítmica (Algorithmic Complexity Attacks), demostrando cómo entradas </w:t>
+      </w:r>
+      <w:proofErr w:type="spellStart"/>
+      <w:r>
+        <w:rPr>
+          <w:rFonts w:ascii="Book Antiqua" w:hAnsi="Book Antiqua"/>
+          <w:color w:val="000000"/>
+        </w:rPr>
+        <w:t>diseñadas</w:t>
+      </w:r>
+      <w:proofErr w:type="spellEnd"/>
+      <w:r>
+        <w:rPr>
+          <w:rFonts w:ascii="Book Antiqua" w:hAnsi="Book Antiqua"/>
+          <w:color w:val="000000"/>
+        </w:rPr>
+        <w:t xml:space="preserve"> </w:t>
+      </w:r>
+      <w:proofErr w:type="spellStart"/>
+      <w:r>
+        <w:rPr>
+          <w:rFonts w:ascii="Book Antiqua" w:hAnsi="Book Antiqua"/>
+          <w:color w:val="000000"/>
+        </w:rPr>
+        <w:t>pueden</w:t>
+      </w:r>
+      <w:proofErr w:type="spellEnd"/>
+      <w:r>
+        <w:rPr>
+          <w:rFonts w:ascii="Book Antiqua" w:hAnsi="Book Antiqua"/>
+          <w:color w:val="000000"/>
+        </w:rPr>
+        <w:t xml:space="preserve"> </w:t>
       </w:r>
       <w:proofErr w:type="spellStart"/>
       <w:r>
@@ -3534,7 +3916,23 @@
           <w:rFonts w:ascii="Book Antiqua" w:hAnsi="Book Antiqua"/>
           <w:color w:val="000000"/>
         </w:rPr>
-        <w:t xml:space="preserve"> espacial GiST. Pese a </w:t>
+        <w:t xml:space="preserve"> espacial GiST. </w:t>
+      </w:r>
+      <w:proofErr w:type="spellStart"/>
+      <w:r>
+        <w:rPr>
+          <w:rFonts w:ascii="Book Antiqua" w:hAnsi="Book Antiqua"/>
+          <w:color w:val="000000"/>
+        </w:rPr>
+        <w:t>Pese</w:t>
+      </w:r>
+      <w:proofErr w:type="spellEnd"/>
+      <w:r>
+        <w:rPr>
+          <w:rFonts w:ascii="Book Antiqua" w:hAnsi="Book Antiqua"/>
+          <w:color w:val="000000"/>
+        </w:rPr>
+        <w:t xml:space="preserve"> a </w:t>
       </w:r>
       <w:proofErr w:type="spellStart"/>
       <w:r>
@@ -3646,7 +4044,39 @@
           <w:rFonts w:ascii="Book Antiqua" w:hAnsi="Book Antiqua"/>
           <w:color w:val="000000"/>
         </w:rPr>
-        <w:t xml:space="preserve"> ni ha formalizado esquemas defensivos integrados entre el analizador web y el motor geométrico.</w:t>
+        <w:t xml:space="preserve"> </w:t>
+      </w:r>
+      <w:proofErr w:type="spellStart"/>
+      <w:r>
+        <w:rPr>
+          <w:rFonts w:ascii="Book Antiqua" w:hAnsi="Book Antiqua"/>
+          <w:color w:val="000000"/>
+        </w:rPr>
+        <w:t>ni</w:t>
+      </w:r>
+      <w:proofErr w:type="spellEnd"/>
+      <w:r>
+        <w:rPr>
+          <w:rFonts w:ascii="Book Antiqua" w:hAnsi="Book Antiqua"/>
+          <w:color w:val="000000"/>
+        </w:rPr>
+        <w:t xml:space="preserve"> ha </w:t>
+      </w:r>
+      <w:proofErr w:type="spellStart"/>
+      <w:r>
+        <w:rPr>
+          <w:rFonts w:ascii="Book Antiqua" w:hAnsi="Book Antiqua"/>
+          <w:color w:val="000000"/>
+        </w:rPr>
+        <w:t>formalizado</w:t>
+      </w:r>
+      <w:proofErr w:type="spellEnd"/>
+      <w:r>
+        <w:rPr>
+          <w:rFonts w:ascii="Book Antiqua" w:hAnsi="Book Antiqua"/>
+          <w:color w:val="000000"/>
+        </w:rPr>
+        <w:t xml:space="preserve"> esquemas defensivos integrados entre el analizador web y el motor geométrico.</w:t>
       </w:r>
     </w:p>
     <w:p>
@@ -3806,7 +4236,23 @@
           <w:rFonts w:ascii="Book Antiqua" w:hAnsi="Book Antiqua"/>
           <w:color w:val="000000"/>
         </w:rPr>
-        <w:t xml:space="preserve"> ante inyecciones SQL y </w:t>
+        <w:t xml:space="preserve"> ante </w:t>
+      </w:r>
+      <w:proofErr w:type="spellStart"/>
+      <w:r>
+        <w:rPr>
+          <w:rFonts w:ascii="Book Antiqua" w:hAnsi="Book Antiqua"/>
+          <w:color w:val="000000"/>
+        </w:rPr>
+        <w:t>inyecciones</w:t>
+      </w:r>
+      <w:proofErr w:type="spellEnd"/>
+      <w:r>
+        <w:rPr>
+          <w:rFonts w:ascii="Book Antiqua" w:hAnsi="Book Antiqua"/>
+          <w:color w:val="000000"/>
+        </w:rPr>
+        <w:t xml:space="preserve"> SQL y </w:t>
       </w:r>
       <w:proofErr w:type="spellStart"/>
       <w:r>
@@ -4195,7 +4641,39 @@
           <w:rFonts w:ascii="Book Antiqua" w:hAnsi="Book Antiqua"/>
           <w:color w:val="000000"/>
         </w:rPr>
-        <w:t xml:space="preserve"> ético, la cartografía base se obtuvo de fuentes </w:t>
+        <w:t xml:space="preserve"> ético, la cartografía base se </w:t>
+      </w:r>
+      <w:proofErr w:type="spellStart"/>
+      <w:r>
+        <w:rPr>
+          <w:rFonts w:ascii="Book Antiqua" w:hAnsi="Book Antiqua"/>
+          <w:color w:val="000000"/>
+        </w:rPr>
+        <w:t>obtuvo</w:t>
+      </w:r>
+      <w:proofErr w:type="spellEnd"/>
+      <w:r>
+        <w:rPr>
+          <w:rFonts w:ascii="Book Antiqua" w:hAnsi="Book Antiqua"/>
+          <w:color w:val="000000"/>
+        </w:rPr>
+        <w:t xml:space="preserve"> de </w:t>
+      </w:r>
+      <w:proofErr w:type="spellStart"/>
+      <w:r>
+        <w:rPr>
+          <w:rFonts w:ascii="Book Antiqua" w:hAnsi="Book Antiqua"/>
+          <w:color w:val="000000"/>
+        </w:rPr>
+        <w:t>fuentes</w:t>
+      </w:r>
+      <w:proofErr w:type="spellEnd"/>
+      <w:r>
+        <w:rPr>
+          <w:rFonts w:ascii="Book Antiqua" w:hAnsi="Book Antiqua"/>
+          <w:color w:val="000000"/>
+        </w:rPr>
+        <w:t xml:space="preserve"> </w:t>
       </w:r>
       <w:proofErr w:type="spellStart"/>
       <w:r>
@@ -4379,7 +4857,23 @@
           <w:rFonts w:ascii="Book Antiqua" w:hAnsi="Book Antiqua"/>
           <w:color w:val="000000"/>
         </w:rPr>
-        <w:t xml:space="preserve">El banco de pruebas se implementó en contenedores Docker mediante microservicios aislados: (1) un servicio de base de datos con PostgreSQL 15 y PostGIS 3.3, y (2) una API en Python 3.11 con FastAPI y Uvicorn. Las pruebas de </w:t>
+        <w:t xml:space="preserve">El banco de pruebas se implementó en contenedores Docker mediante microservicios aislados: (1) un servicio de base de datos con PostgreSQL 15 y PostGIS 3.3, y (2) una API en Python 3.11 con FastAPI y Uvicorn. Las </w:t>
+      </w:r>
+      <w:proofErr w:type="spellStart"/>
+      <w:r>
+        <w:rPr>
+          <w:rFonts w:ascii="Book Antiqua" w:hAnsi="Book Antiqua"/>
+          <w:color w:val="000000"/>
+        </w:rPr>
+        <w:t>pruebas</w:t>
+      </w:r>
+      <w:proofErr w:type="spellEnd"/>
+      <w:r>
+        <w:rPr>
+          <w:rFonts w:ascii="Book Antiqua" w:hAnsi="Book Antiqua"/>
+          <w:color w:val="000000"/>
+        </w:rPr>
+        <w:t xml:space="preserve"> de </w:t>
       </w:r>
       <w:proofErr w:type="spellStart"/>
       <w:r>
@@ -4579,7 +5073,23 @@
           <w:rFonts w:ascii="Book Antiqua" w:hAnsi="Book Antiqua"/>
           <w:color w:val="000000"/>
         </w:rPr>
-        <w:t xml:space="preserve">Se estructuraron seis vectores de explotación orientados a las tres </w:t>
+        <w:t xml:space="preserve">Se estructuraron seis vectores de explotación orientados a las </w:t>
+      </w:r>
+      <w:proofErr w:type="spellStart"/>
+      <w:r>
+        <w:rPr>
+          <w:rFonts w:ascii="Book Antiqua" w:hAnsi="Book Antiqua"/>
+          <w:color w:val="000000"/>
+        </w:rPr>
+        <w:t>tres</w:t>
+      </w:r>
+      <w:proofErr w:type="spellEnd"/>
+      <w:r>
+        <w:rPr>
+          <w:rFonts w:ascii="Book Antiqua" w:hAnsi="Book Antiqua"/>
+          <w:color w:val="000000"/>
+        </w:rPr>
+        <w:t xml:space="preserve"> </w:t>
       </w:r>
       <w:proofErr w:type="spellStart"/>
       <w:r>
@@ -4796,7 +5306,23 @@
           <w:rFonts w:ascii="Book Antiqua" w:hAnsi="Book Antiqua"/>
           <w:color w:val="000000"/>
         </w:rPr>
-        <w:t xml:space="preserve">El endpoint GET /api/v1/vulnerable/predios/radio está diseñado para retornar lotes dentro de un radio de 50 metros en el sector 0101. Al inyectar en el parámetro distancia el payload '50) OR (1=1', el analizador léxico de PostgreSQL cierra prematuramente el operador ST_DWithin e introduce una tautología que anula tanto el límite espacial como el filtro de sector territorial. Como resultado, la consulta pasó de </w:t>
+        <w:t xml:space="preserve">El endpoint GET /api/v1/vulnerable/predios/radio está diseñado para retornar lotes dentro de un radio de 50 metros en el sector 0101. Al inyectar en el parámetro distancia el payload '50) OR (1=1', el analizador léxico de PostgreSQL cierra prematuramente el operador ST_DWithin e introduce una tautología que anula tanto el límite espacial como el filtro de sector territorial. Como resultado, la consulta </w:t>
+      </w:r>
+      <w:proofErr w:type="spellStart"/>
+      <w:r>
+        <w:rPr>
+          <w:rFonts w:ascii="Book Antiqua" w:hAnsi="Book Antiqua"/>
+          <w:color w:val="000000"/>
+        </w:rPr>
+        <w:t>pasó</w:t>
+      </w:r>
+      <w:proofErr w:type="spellEnd"/>
+      <w:r>
+        <w:rPr>
+          <w:rFonts w:ascii="Book Antiqua" w:hAnsi="Book Antiqua"/>
+          <w:color w:val="000000"/>
+        </w:rPr>
+        <w:t xml:space="preserve"> de </w:t>
       </w:r>
       <w:proofErr w:type="spellStart"/>
       <w:r>
@@ -5491,7 +6017,23 @@
           <w:rFonts w:ascii="Book Antiqua" w:hAnsi="Book Antiqua"/>
           <w:color w:val="000000"/>
         </w:rPr>
-        <w:t>En el endpoint POST /</w:t>
+        <w:t xml:space="preserve">En </w:t>
+      </w:r>
+      <w:proofErr w:type="spellStart"/>
+      <w:r>
+        <w:rPr>
+          <w:rFonts w:ascii="Book Antiqua" w:hAnsi="Book Antiqua"/>
+          <w:color w:val="000000"/>
+        </w:rPr>
+        <w:t>el</w:t>
+      </w:r>
+      <w:proofErr w:type="spellEnd"/>
+      <w:r>
+        <w:rPr>
+          <w:rFonts w:ascii="Book Antiqua" w:hAnsi="Book Antiqua"/>
+          <w:color w:val="000000"/>
+        </w:rPr>
+        <w:t xml:space="preserve"> endpoint POST /</w:t>
       </w:r>
       <w:proofErr w:type="spellStart"/>
       <w:r>
@@ -7102,7 +7644,35 @@
         <w:rPr>
           <w:rFonts w:ascii="Book Antiqua" w:hAnsi="Book Antiqua"/>
         </w:rPr>
-        <w:t xml:space="preserve"> a las garantías de protección </w:t>
+        <w:t xml:space="preserve"> a las </w:t>
+      </w:r>
+      <w:proofErr w:type="spellStart"/>
+      <w:r>
+        <w:rPr>
+          <w:rFonts w:ascii="Book Antiqua" w:hAnsi="Book Antiqua"/>
+        </w:rPr>
+        <w:t>garantías</w:t>
+      </w:r>
+      <w:proofErr w:type="spellEnd"/>
+      <w:r>
+        <w:rPr>
+          <w:rFonts w:ascii="Book Antiqua" w:hAnsi="Book Antiqua"/>
+        </w:rPr>
+        <w:t xml:space="preserve"> de </w:t>
+      </w:r>
+      <w:proofErr w:type="spellStart"/>
+      <w:r>
+        <w:rPr>
+          <w:rFonts w:ascii="Book Antiqua" w:hAnsi="Book Antiqua"/>
+        </w:rPr>
+        <w:t>protección</w:t>
+      </w:r>
+      <w:proofErr w:type="spellEnd"/>
+      <w:r>
+        <w:rPr>
+          <w:rFonts w:ascii="Book Antiqua" w:hAnsi="Book Antiqua"/>
+        </w:rPr>
+        <w:t xml:space="preserve"> </w:t>
       </w:r>
       <w:proofErr w:type="spellStart"/>
       <w:r>
@@ -7172,7 +7742,21 @@
         <w:rPr>
           <w:rFonts w:ascii="Book Antiqua" w:hAnsi="Book Antiqua"/>
         </w:rPr>
-        <w:t xml:space="preserve">, los canales laterales de error y la </w:t>
+        <w:t xml:space="preserve">, </w:t>
+      </w:r>
+      <w:proofErr w:type="spellStart"/>
+      <w:r>
+        <w:rPr>
+          <w:rFonts w:ascii="Book Antiqua" w:hAnsi="Book Antiqua"/>
+        </w:rPr>
+        <w:t>los</w:t>
+      </w:r>
+      <w:proofErr w:type="spellEnd"/>
+      <w:r>
+        <w:rPr>
+          <w:rFonts w:ascii="Book Antiqua" w:hAnsi="Book Antiqua"/>
+        </w:rPr>
+        <w:t xml:space="preserve"> canales laterales de error y la </w:t>
       </w:r>
       <w:proofErr w:type="spellStart"/>
       <w:r>
@@ -7356,7 +7940,63 @@
         <w:rPr>
           <w:rFonts w:ascii="Book Antiqua" w:hAnsi="Book Antiqua"/>
         </w:rPr>
-        <w:t xml:space="preserve"> y titularidad (Simulación 4) demuestra que una inyección en la capa de persistencia trasciende la modificación de una tabla </w:t>
+        <w:t xml:space="preserve"> y </w:t>
+      </w:r>
+      <w:proofErr w:type="spellStart"/>
+      <w:r>
+        <w:rPr>
+          <w:rFonts w:ascii="Book Antiqua" w:hAnsi="Book Antiqua"/>
+        </w:rPr>
+        <w:t>titularidad</w:t>
+      </w:r>
+      <w:proofErr w:type="spellEnd"/>
+      <w:r>
+        <w:rPr>
+          <w:rFonts w:ascii="Book Antiqua" w:hAnsi="Book Antiqua"/>
+        </w:rPr>
+        <w:t xml:space="preserve"> (</w:t>
+      </w:r>
+      <w:proofErr w:type="spellStart"/>
+      <w:r>
+        <w:rPr>
+          <w:rFonts w:ascii="Book Antiqua" w:hAnsi="Book Antiqua"/>
+        </w:rPr>
+        <w:t>Simulación</w:t>
+      </w:r>
+      <w:proofErr w:type="spellEnd"/>
+      <w:r>
+        <w:rPr>
+          <w:rFonts w:ascii="Book Antiqua" w:hAnsi="Book Antiqua"/>
+        </w:rPr>
+        <w:t xml:space="preserve"> 4) demuestra que una inyección en la capa de persistencia trasciende la modificación de </w:t>
+      </w:r>
+      <w:proofErr w:type="spellStart"/>
+      <w:r>
+        <w:rPr>
+          <w:rFonts w:ascii="Book Antiqua" w:hAnsi="Book Antiqua"/>
+        </w:rPr>
+        <w:t>una</w:t>
+      </w:r>
+      <w:proofErr w:type="spellEnd"/>
+      <w:r>
+        <w:rPr>
+          <w:rFonts w:ascii="Book Antiqua" w:hAnsi="Book Antiqua"/>
+        </w:rPr>
+        <w:t xml:space="preserve"> </w:t>
+      </w:r>
+      <w:proofErr w:type="spellStart"/>
+      <w:r>
+        <w:rPr>
+          <w:rFonts w:ascii="Book Antiqua" w:hAnsi="Book Antiqua"/>
+        </w:rPr>
+        <w:t>tabla</w:t>
+      </w:r>
+      <w:proofErr w:type="spellEnd"/>
+      <w:r>
+        <w:rPr>
+          <w:rFonts w:ascii="Book Antiqua" w:hAnsi="Book Antiqua"/>
+        </w:rPr>
+        <w:t xml:space="preserve"> </w:t>
       </w:r>
       <w:proofErr w:type="spellStart"/>
       <w:r>
@@ -7417,7 +8057,21 @@
         <w:rPr>
           <w:rFonts w:ascii="Book Antiqua" w:hAnsi="Book Antiqua"/>
         </w:rPr>
-        <w:t xml:space="preserve">. En la actualidad, los geoportales interoperan de forma autónoma para emitir certificados catastrales con código QR, constancias de no adeudo tributario y transferencias inmobiliarias bajo el estándar ISO 19152 (LADM). La inyección de datos arbitrarios en catastro_titulares y tg_lote propaga inconsistencias jurídicas y fiscales hacia estos documentos oficiales sin generar alertas en la interfaz de usuario. Este escenario </w:t>
+        <w:t xml:space="preserve">. En la actualidad, los geoportales interoperan de forma autónoma para emitir certificados catastrales con código QR, constancias de no adeudo tributario y transferencias inmobiliarias bajo el estándar ISO 19152 (LADM). La inyección de datos arbitrarios en catastro_titulares y tg_lote propaga inconsistencias jurídicas y fiscales hacia estos documentos oficiales sin generar alertas en la interfaz de usuario. Este </w:t>
+      </w:r>
+      <w:proofErr w:type="spellStart"/>
+      <w:r>
+        <w:rPr>
+          <w:rFonts w:ascii="Book Antiqua" w:hAnsi="Book Antiqua"/>
+        </w:rPr>
+        <w:t>escenario</w:t>
+      </w:r>
+      <w:proofErr w:type="spellEnd"/>
+      <w:r>
+        <w:rPr>
+          <w:rFonts w:ascii="Book Antiqua" w:hAnsi="Book Antiqua"/>
+        </w:rPr>
+        <w:t xml:space="preserve"> </w:t>
       </w:r>
       <w:proofErr w:type="spellStart"/>
       <w:r>
@@ -7431,7 +8085,49 @@
         <w:rPr>
           <w:rFonts w:ascii="Book Antiqua" w:hAnsi="Book Antiqua"/>
         </w:rPr>
-        <w:t xml:space="preserve"> que el tipado estricto </w:t>
+        <w:t xml:space="preserve"> que </w:t>
+      </w:r>
+      <w:proofErr w:type="spellStart"/>
+      <w:r>
+        <w:rPr>
+          <w:rFonts w:ascii="Book Antiqua" w:hAnsi="Book Antiqua"/>
+        </w:rPr>
+        <w:t>el</w:t>
+      </w:r>
+      <w:proofErr w:type="spellEnd"/>
+      <w:r>
+        <w:rPr>
+          <w:rFonts w:ascii="Book Antiqua" w:hAnsi="Book Antiqua"/>
+        </w:rPr>
+        <w:t xml:space="preserve"> </w:t>
+      </w:r>
+      <w:proofErr w:type="spellStart"/>
+      <w:r>
+        <w:rPr>
+          <w:rFonts w:ascii="Book Antiqua" w:hAnsi="Book Antiqua"/>
+        </w:rPr>
+        <w:t>tipado</w:t>
+      </w:r>
+      <w:proofErr w:type="spellEnd"/>
+      <w:r>
+        <w:rPr>
+          <w:rFonts w:ascii="Book Antiqua" w:hAnsi="Book Antiqua"/>
+        </w:rPr>
+        <w:t xml:space="preserve"> </w:t>
+      </w:r>
+      <w:proofErr w:type="spellStart"/>
+      <w:r>
+        <w:rPr>
+          <w:rFonts w:ascii="Book Antiqua" w:hAnsi="Book Antiqua"/>
+        </w:rPr>
+        <w:t>estricto</w:t>
+      </w:r>
+      <w:proofErr w:type="spellEnd"/>
+      <w:r>
+        <w:rPr>
+          <w:rFonts w:ascii="Book Antiqua" w:hAnsi="Book Antiqua"/>
+        </w:rPr>
+        <w:t xml:space="preserve"> </w:t>
       </w:r>
       <w:proofErr w:type="spellStart"/>
       <w:r>
@@ -7550,15 +8246,171 @@
         <w:spacing w:after="80" w:line="240" w:lineRule="auto"/>
         <w:ind w:firstLine="432"/>
       </w:pPr>
-      <w:r/>
-      <w:r>
-        <w:rPr>
-          <w:rFonts w:ascii="Book Antiqua" w:hAnsi="Book Antiqua"/>
-          <w:b w:val="0"/>
-          <w:i w:val="0"/>
-          <w:sz w:val="22"/>
-        </w:rPr>
-        <w:t>Este artículo formalizó y demostró empíricamente la viabilidad de seis vectores de inyección SQL espacial en sistemas de información catastral basados en PostGIS, evidenciando que las funciones topológicas nativas no garantizan el aislamiento de datos cuando se construyen mediante concatenación de cadenas. La evaluación experimental sobre un dataset de 1,500 lotes catastrales estructurados bajo el estándar ISO 19152 (LADM) comprobó que un atacante puede evadir límites zonales, reconstruir credenciales mediante canales laterales de error geométrico, inducir denegación de servicio espacial por sobrecarga algorítmica cuadrática, alterar fichas prediales tributarias y ejecutar borrados cartográficos masivos. Frente a ello, la arquitectura de defensa en profundidad basada en GeoAlchemy2, tipado rígido con Pydantic y validación topológica previa en memoria con Shapely mitigó con éxito el 100% de los escenarios de explotación evaluados. El benchmarking transaccional demostró que este esquema introduce un sobrecosto medio de latencia de 2.63 ms (+15.24%), mejorando simultáneamente la estabilidad en el percentil 99 en un 12.59% gracias a la reutilización de planes de ejecución preparados en PostgreSQL. En conclusión, la seguridad en infraestructuras catastrales exige abandonar el paradigma de sanitización escalar tradicional, adoptando controles sintácticos con conciencia espacial integrados desde el diseño arquitectónico de software.</w:t>
+      <w:r>
+        <w:rPr>
+          <w:rFonts w:ascii="Book Antiqua" w:hAnsi="Book Antiqua"/>
+        </w:rPr>
+        <w:t xml:space="preserve">Este artículo formalizó y demostró empíricamente la viabilidad de seis vectores de inyección SQL espacial en sistemas de información catastral basados en PostGIS, evidenciando que las funciones topológicas nativas no garantizan el aislamiento de datos cuando se construyen mediante concatenación de cadenas. La evaluación experimental sobre un dataset de 1,500 lotes catastrales estructurados bajo el estándar ISO 19152 (LADM) comprobó que un atacante puede evadir límites zonales, reconstruir credenciales mediante canales laterales de error geométrico, inducir </w:t>
+      </w:r>
+      <w:proofErr w:type="spellStart"/>
+      <w:r>
+        <w:rPr>
+          <w:rFonts w:ascii="Book Antiqua" w:hAnsi="Book Antiqua"/>
+        </w:rPr>
+        <w:t>denegación</w:t>
+      </w:r>
+      <w:proofErr w:type="spellEnd"/>
+      <w:r>
+        <w:rPr>
+          <w:rFonts w:ascii="Book Antiqua" w:hAnsi="Book Antiqua"/>
+        </w:rPr>
+        <w:t xml:space="preserve"> de </w:t>
+      </w:r>
+      <w:proofErr w:type="spellStart"/>
+      <w:r>
+        <w:rPr>
+          <w:rFonts w:ascii="Book Antiqua" w:hAnsi="Book Antiqua"/>
+        </w:rPr>
+        <w:t>servicio</w:t>
+      </w:r>
+      <w:proofErr w:type="spellEnd"/>
+      <w:r>
+        <w:rPr>
+          <w:rFonts w:ascii="Book Antiqua" w:hAnsi="Book Antiqua"/>
+        </w:rPr>
+        <w:t xml:space="preserve"> </w:t>
+      </w:r>
+      <w:proofErr w:type="spellStart"/>
+      <w:r>
+        <w:rPr>
+          <w:rFonts w:ascii="Book Antiqua" w:hAnsi="Book Antiqua"/>
+        </w:rPr>
+        <w:t>por</w:t>
+      </w:r>
+      <w:proofErr w:type="spellEnd"/>
+      <w:r>
+        <w:rPr>
+          <w:rFonts w:ascii="Book Antiqua" w:hAnsi="Book Antiqua"/>
+        </w:rPr>
+        <w:t xml:space="preserve"> </w:t>
+      </w:r>
+      <w:proofErr w:type="spellStart"/>
+      <w:r>
+        <w:rPr>
+          <w:rFonts w:ascii="Book Antiqua" w:hAnsi="Book Antiqua"/>
+        </w:rPr>
+        <w:t>sobrecarga</w:t>
+      </w:r>
+      <w:proofErr w:type="spellEnd"/>
+      <w:r>
+        <w:rPr>
+          <w:rFonts w:ascii="Book Antiqua" w:hAnsi="Book Antiqua"/>
+        </w:rPr>
+        <w:t xml:space="preserve"> </w:t>
+      </w:r>
+      <w:proofErr w:type="spellStart"/>
+      <w:r>
+        <w:rPr>
+          <w:rFonts w:ascii="Book Antiqua" w:hAnsi="Book Antiqua"/>
+        </w:rPr>
+        <w:t>algorítmica</w:t>
+      </w:r>
+      <w:proofErr w:type="spellEnd"/>
+      <w:r>
+        <w:rPr>
+          <w:rFonts w:ascii="Book Antiqua" w:hAnsi="Book Antiqua"/>
+        </w:rPr>
+        <w:t xml:space="preserve"> </w:t>
+      </w:r>
+      <w:proofErr w:type="spellStart"/>
+      <w:r>
+        <w:rPr>
+          <w:rFonts w:ascii="Book Antiqua" w:hAnsi="Book Antiqua"/>
+        </w:rPr>
+        <w:t>cuadrática</w:t>
+      </w:r>
+      <w:proofErr w:type="spellEnd"/>
+      <w:r>
+        <w:rPr>
+          <w:rFonts w:ascii="Book Antiqua" w:hAnsi="Book Antiqua"/>
+        </w:rPr>
+        <w:t xml:space="preserve">, alterar fichas prediales tributarias y ejecutar borrados cartográficos masivos. Frente a ello, la arquitectura de defensa en profundidad basada en GeoAlchemy2, tipado rígido con Pydantic y validación topológica previa en memoria con Shapely mitigó con éxito el 100% de los escenarios de explotación evaluados. </w:t>
+      </w:r>
+      <w:r>
+        <w:rPr>
+          <w:rFonts w:ascii="Book Antiqua" w:hAnsi="Book Antiqua"/>
+        </w:rPr>
+        <w:t xml:space="preserve">La </w:t>
+      </w:r>
+      <w:proofErr w:type="spellStart"/>
+      <w:r>
+        <w:rPr>
+          <w:rFonts w:ascii="Book Antiqua" w:hAnsi="Book Antiqua"/>
+        </w:rPr>
+        <w:t>prueba</w:t>
+      </w:r>
+      <w:proofErr w:type="spellEnd"/>
+      <w:r>
+        <w:rPr>
+          <w:rFonts w:ascii="Book Antiqua" w:hAnsi="Book Antiqua"/>
+        </w:rPr>
+        <w:t xml:space="preserve"> de </w:t>
+      </w:r>
+      <w:proofErr w:type="spellStart"/>
+      <w:r>
+        <w:rPr>
+          <w:rFonts w:ascii="Book Antiqua" w:hAnsi="Book Antiqua"/>
+        </w:rPr>
+        <w:t>transacción</w:t>
+      </w:r>
+      <w:proofErr w:type="spellEnd"/>
+      <w:r>
+        <w:rPr>
+          <w:rFonts w:ascii="Book Antiqua" w:hAnsi="Book Antiqua"/>
+        </w:rPr>
+        <w:t xml:space="preserve"> </w:t>
+      </w:r>
+      <w:proofErr w:type="spellStart"/>
+      <w:r>
+        <w:rPr>
+          <w:rFonts w:ascii="Book Antiqua" w:hAnsi="Book Antiqua"/>
+        </w:rPr>
+        <w:t>demostró</w:t>
+      </w:r>
+      <w:proofErr w:type="spellEnd"/>
+      <w:r>
+        <w:rPr>
+          <w:rFonts w:ascii="Book Antiqua" w:hAnsi="Book Antiqua"/>
+        </w:rPr>
+        <w:t xml:space="preserve"> que </w:t>
+      </w:r>
+      <w:proofErr w:type="spellStart"/>
+      <w:r>
+        <w:rPr>
+          <w:rFonts w:ascii="Book Antiqua" w:hAnsi="Book Antiqua"/>
+        </w:rPr>
+        <w:t>este</w:t>
+      </w:r>
+      <w:proofErr w:type="spellEnd"/>
+      <w:r>
+        <w:rPr>
+          <w:rFonts w:ascii="Book Antiqua" w:hAnsi="Book Antiqua"/>
+        </w:rPr>
+        <w:t xml:space="preserve"> </w:t>
+      </w:r>
+      <w:proofErr w:type="spellStart"/>
+      <w:r>
+        <w:rPr>
+          <w:rFonts w:ascii="Book Antiqua" w:hAnsi="Book Antiqua"/>
+        </w:rPr>
+        <w:t>esquema</w:t>
+      </w:r>
+      <w:proofErr w:type="spellEnd"/>
+      <w:r>
+        <w:rPr>
+          <w:rFonts w:ascii="Book Antiqua" w:hAnsi="Book Antiqua"/>
+        </w:rPr>
+        <w:t xml:space="preserve"> introduce un sobrecosto medio de latencia de 2.63 ms (+15.24%), mejorando simultáneamente la estabilidad en el percentil 99 en un 12.59% gracias a la reutilización de planes de ejecución preparados en PostgreSQL. En conclusión, la seguridad en infraestructuras catastrales exige abandonar el paradigma de sanitización escalar tradicional, adoptando controles sintácticos con conciencia espacial integrados desde el diseño arquitectónico de software.</w:t>
       </w:r>
     </w:p>
     <w:p>
@@ -7625,8 +8477,15 @@
           <w:rFonts w:ascii="Book Antiqua" w:hAnsi="Book Antiqua"/>
           <w:color w:val="000000"/>
         </w:rPr>
+        <w:t xml:space="preserve">Chun, S. A., &amp; Atluri, V. (2008). Geospatial database security. In H. Chen, T. S. Raghu, R. Ramesh, R. Sharman, &amp; S. Chakravarty (Eds.), Handbook of </w:t>
+      </w:r>
+      <w:r>
+        <w:rPr>
+          <w:rFonts w:ascii="Book Antiqua" w:hAnsi="Book Antiqua"/>
+          <w:color w:val="000000"/>
+        </w:rPr>
         <w:lastRenderedPageBreak/>
-        <w:t>Chun, S. A., &amp; Atluri, V. (2008). Geospatial database security. In H. Chen, T. S. Raghu, R. Ramesh, R. Sharman, &amp; S. Chakravarty (Eds.), Handbook of Database Security: Applications and Trends (pp. 251–277). Springer. https://doi.org/10.1007/978-0-387-48533-1_11</w:t>
+        <w:t>Database Security: Applications and Trends (pp. 251–277). Springer. https://doi.org/10.1007/978-0-387-48533-1_11</w:t>
       </w:r>
     </w:p>
     <w:p>
@@ -9472,6 +10331,7 @@
   <w:style w:type="character" w:default="1" w:styleId="Fuentedeprrafopredeter">
     <w:name w:val="Default Paragraph Font"/>
     <w:uiPriority w:val="1"/>
+    <w:semiHidden/>
     <w:unhideWhenUsed/>
   </w:style>
   <w:style w:type="table" w:default="1" w:styleId="Tablanormal">

</xml_diff>

<commit_message>
docs: integrate CIA triad and ORM compilation explicitly into Section 7 conclusion
</commit_message>
<xml_diff>
--- a/Articulo_Cientifico_IMJETA_Final.docx
+++ b/Articulo_Cientifico_IMJETA_Final.docx
@@ -8246,171 +8246,15 @@
         <w:spacing w:after="80" w:line="240" w:lineRule="auto"/>
         <w:ind w:firstLine="432"/>
       </w:pPr>
-      <w:r>
-        <w:rPr>
-          <w:rFonts w:ascii="Book Antiqua" w:hAnsi="Book Antiqua"/>
-        </w:rPr>
-        <w:t xml:space="preserve">Este artículo formalizó y demostró empíricamente la viabilidad de seis vectores de inyección SQL espacial en sistemas de información catastral basados en PostGIS, evidenciando que las funciones topológicas nativas no garantizan el aislamiento de datos cuando se construyen mediante concatenación de cadenas. La evaluación experimental sobre un dataset de 1,500 lotes catastrales estructurados bajo el estándar ISO 19152 (LADM) comprobó que un atacante puede evadir límites zonales, reconstruir credenciales mediante canales laterales de error geométrico, inducir </w:t>
-      </w:r>
-      <w:proofErr w:type="spellStart"/>
-      <w:r>
-        <w:rPr>
-          <w:rFonts w:ascii="Book Antiqua" w:hAnsi="Book Antiqua"/>
-        </w:rPr>
-        <w:t>denegación</w:t>
-      </w:r>
-      <w:proofErr w:type="spellEnd"/>
-      <w:r>
-        <w:rPr>
-          <w:rFonts w:ascii="Book Antiqua" w:hAnsi="Book Antiqua"/>
-        </w:rPr>
-        <w:t xml:space="preserve"> de </w:t>
-      </w:r>
-      <w:proofErr w:type="spellStart"/>
-      <w:r>
-        <w:rPr>
-          <w:rFonts w:ascii="Book Antiqua" w:hAnsi="Book Antiqua"/>
-        </w:rPr>
-        <w:t>servicio</w:t>
-      </w:r>
-      <w:proofErr w:type="spellEnd"/>
-      <w:r>
-        <w:rPr>
-          <w:rFonts w:ascii="Book Antiqua" w:hAnsi="Book Antiqua"/>
-        </w:rPr>
-        <w:t xml:space="preserve"> </w:t>
-      </w:r>
-      <w:proofErr w:type="spellStart"/>
-      <w:r>
-        <w:rPr>
-          <w:rFonts w:ascii="Book Antiqua" w:hAnsi="Book Antiqua"/>
-        </w:rPr>
-        <w:t>por</w:t>
-      </w:r>
-      <w:proofErr w:type="spellEnd"/>
-      <w:r>
-        <w:rPr>
-          <w:rFonts w:ascii="Book Antiqua" w:hAnsi="Book Antiqua"/>
-        </w:rPr>
-        <w:t xml:space="preserve"> </w:t>
-      </w:r>
-      <w:proofErr w:type="spellStart"/>
-      <w:r>
-        <w:rPr>
-          <w:rFonts w:ascii="Book Antiqua" w:hAnsi="Book Antiqua"/>
-        </w:rPr>
-        <w:t>sobrecarga</w:t>
-      </w:r>
-      <w:proofErr w:type="spellEnd"/>
-      <w:r>
-        <w:rPr>
-          <w:rFonts w:ascii="Book Antiqua" w:hAnsi="Book Antiqua"/>
-        </w:rPr>
-        <w:t xml:space="preserve"> </w:t>
-      </w:r>
-      <w:proofErr w:type="spellStart"/>
-      <w:r>
-        <w:rPr>
-          <w:rFonts w:ascii="Book Antiqua" w:hAnsi="Book Antiqua"/>
-        </w:rPr>
-        <w:t>algorítmica</w:t>
-      </w:r>
-      <w:proofErr w:type="spellEnd"/>
-      <w:r>
-        <w:rPr>
-          <w:rFonts w:ascii="Book Antiqua" w:hAnsi="Book Antiqua"/>
-        </w:rPr>
-        <w:t xml:space="preserve"> </w:t>
-      </w:r>
-      <w:proofErr w:type="spellStart"/>
-      <w:r>
-        <w:rPr>
-          <w:rFonts w:ascii="Book Antiqua" w:hAnsi="Book Antiqua"/>
-        </w:rPr>
-        <w:t>cuadrática</w:t>
-      </w:r>
-      <w:proofErr w:type="spellEnd"/>
-      <w:r>
-        <w:rPr>
-          <w:rFonts w:ascii="Book Antiqua" w:hAnsi="Book Antiqua"/>
-        </w:rPr>
-        <w:t xml:space="preserve">, alterar fichas prediales tributarias y ejecutar borrados cartográficos masivos. Frente a ello, la arquitectura de defensa en profundidad basada en GeoAlchemy2, tipado rígido con Pydantic y validación topológica previa en memoria con Shapely mitigó con éxito el 100% de los escenarios de explotación evaluados. </w:t>
-      </w:r>
-      <w:r>
-        <w:rPr>
-          <w:rFonts w:ascii="Book Antiqua" w:hAnsi="Book Antiqua"/>
-        </w:rPr>
-        <w:t xml:space="preserve">La </w:t>
-      </w:r>
-      <w:proofErr w:type="spellStart"/>
-      <w:r>
-        <w:rPr>
-          <w:rFonts w:ascii="Book Antiqua" w:hAnsi="Book Antiqua"/>
-        </w:rPr>
-        <w:t>prueba</w:t>
-      </w:r>
-      <w:proofErr w:type="spellEnd"/>
-      <w:r>
-        <w:rPr>
-          <w:rFonts w:ascii="Book Antiqua" w:hAnsi="Book Antiqua"/>
-        </w:rPr>
-        <w:t xml:space="preserve"> de </w:t>
-      </w:r>
-      <w:proofErr w:type="spellStart"/>
-      <w:r>
-        <w:rPr>
-          <w:rFonts w:ascii="Book Antiqua" w:hAnsi="Book Antiqua"/>
-        </w:rPr>
-        <w:t>transacción</w:t>
-      </w:r>
-      <w:proofErr w:type="spellEnd"/>
-      <w:r>
-        <w:rPr>
-          <w:rFonts w:ascii="Book Antiqua" w:hAnsi="Book Antiqua"/>
-        </w:rPr>
-        <w:t xml:space="preserve"> </w:t>
-      </w:r>
-      <w:proofErr w:type="spellStart"/>
-      <w:r>
-        <w:rPr>
-          <w:rFonts w:ascii="Book Antiqua" w:hAnsi="Book Antiqua"/>
-        </w:rPr>
-        <w:t>demostró</w:t>
-      </w:r>
-      <w:proofErr w:type="spellEnd"/>
-      <w:r>
-        <w:rPr>
-          <w:rFonts w:ascii="Book Antiqua" w:hAnsi="Book Antiqua"/>
-        </w:rPr>
-        <w:t xml:space="preserve"> que </w:t>
-      </w:r>
-      <w:proofErr w:type="spellStart"/>
-      <w:r>
-        <w:rPr>
-          <w:rFonts w:ascii="Book Antiqua" w:hAnsi="Book Antiqua"/>
-        </w:rPr>
-        <w:t>este</w:t>
-      </w:r>
-      <w:proofErr w:type="spellEnd"/>
-      <w:r>
-        <w:rPr>
-          <w:rFonts w:ascii="Book Antiqua" w:hAnsi="Book Antiqua"/>
-        </w:rPr>
-        <w:t xml:space="preserve"> </w:t>
-      </w:r>
-      <w:proofErr w:type="spellStart"/>
-      <w:r>
-        <w:rPr>
-          <w:rFonts w:ascii="Book Antiqua" w:hAnsi="Book Antiqua"/>
-        </w:rPr>
-        <w:t>esquema</w:t>
-      </w:r>
-      <w:proofErr w:type="spellEnd"/>
-      <w:r>
-        <w:rPr>
-          <w:rFonts w:ascii="Book Antiqua" w:hAnsi="Book Antiqua"/>
-        </w:rPr>
-        <w:t xml:space="preserve"> introduce un sobrecosto medio de latencia de 2.63 ms (+15.24%), mejorando simultáneamente la estabilidad en el percentil 99 en un 12.59% gracias a la reutilización de planes de ejecución preparados en PostgreSQL. En conclusión, la seguridad en infraestructuras catastrales exige abandonar el paradigma de sanitización escalar tradicional, adoptando controles sintácticos con conciencia espacial integrados desde el diseño arquitectónico de software.</w:t>
+      <w:r/>
+      <w:r>
+        <w:rPr>
+          <w:rFonts w:ascii="Book Antiqua" w:hAnsi="Book Antiqua"/>
+          <w:b w:val="0"/>
+          <w:i w:val="0"/>
+          <w:sz w:val="22"/>
+        </w:rPr>
+        <w:t>Este artículo formalizó y demostró empíricamente la viabilidad de seis vectores de inyección SQL espacial orientados a la tríada CIA (Confidencialidad, Integridad y Disponibilidad) en sistemas de información catastral basados en PostGIS, evidenciando que las funciones topológicas nativas no garantizan el aislamiento de datos cuando se construyen mediante concatenación de cadenas. La evaluación experimental sobre un dataset de 1,500 lotes catastrales estructurados bajo el estándar ISO 19152 (LADM) comprobó que un atacante puede evadir límites zonales, reconstruir credenciales mediante canales laterales de error geométrico, inducir denegación de servicio por sobrecarga algorítmica cuadrática, alterar fichas prediales tributarias y ejecutar borrados cartográficos masivos. Frente a ello, la arquitectura de defensa en profundidad basada en compilación tipada mediante ORM (GeoAlchemy2), tipado rígido con Pydantic y validación topológica previa en memoria con Shapely mitigó con éxito el 100% de los escenarios de explotación evaluados. El benchmarking transaccional demostró que este esquema introduce un sobrecosto medio de latencia de 2.63 ms (+15.24%), mejorando simultáneamente la estabilidad en el percentil 99 en un 12.59% gracias a la reutilización de planes de ejecución preparados en PostgreSQL. En conclusión, la seguridad en infraestructuras catastrales exige abandonar el paradigma de sanitización escalar tradicional, adoptando parametrización en el ORM y controles sintácticos con conciencia espacial integrados desde el diseño arquitectónico de software.</w:t>
       </w:r>
     </w:p>
     <w:p>

</xml_diff>

<commit_message>
docs: incorporate recent references (Kara et al. 2021, OWASP 2021, OWASP 2023) to strengthen methodology and state of the art
</commit_message>
<xml_diff>
--- a/Articulo_Cientifico_IMJETA_Final.docx
+++ b/Articulo_Cientifico_IMJETA_Final.docx
@@ -1264,437 +1264,389 @@
           <w:rFonts w:ascii="Book Antiqua" w:hAnsi="Book Antiqua"/>
           <w:color w:val="000000"/>
         </w:rPr>
-        <w:t xml:space="preserve">Sin embargo, la exposición de estos servicios mediante APIs REST introduce vectores de ataque cuando las consultas se construyen mediante concatenación de cadenas dentro de funciones espaciales. Si bien la inyección SQL clásica ha sido ampliamente documentada (Clarke, 2012; Halfond et al., 2006), la manipulación de </w:t>
-      </w:r>
-      <w:proofErr w:type="spellStart"/>
-      <w:r>
-        <w:rPr>
-          <w:rFonts w:ascii="Book Antiqua" w:hAnsi="Book Antiqua"/>
-          <w:color w:val="000000"/>
-        </w:rPr>
-        <w:t>operadores</w:t>
-      </w:r>
-      <w:proofErr w:type="spellEnd"/>
-      <w:r>
-        <w:rPr>
-          <w:rFonts w:ascii="Book Antiqua" w:hAnsi="Book Antiqua"/>
-          <w:color w:val="000000"/>
-        </w:rPr>
-        <w:t xml:space="preserve"> </w:t>
-      </w:r>
-      <w:proofErr w:type="spellStart"/>
-      <w:r>
-        <w:rPr>
-          <w:rFonts w:ascii="Book Antiqua" w:hAnsi="Book Antiqua"/>
-          <w:color w:val="000000"/>
-        </w:rPr>
-        <w:t>geométricos</w:t>
-      </w:r>
-      <w:proofErr w:type="spellEnd"/>
-      <w:r>
-        <w:rPr>
-          <w:rFonts w:ascii="Book Antiqua" w:hAnsi="Book Antiqua"/>
-          <w:color w:val="000000"/>
-        </w:rPr>
-        <w:t xml:space="preserve"> de </w:t>
-      </w:r>
-      <w:proofErr w:type="spellStart"/>
-      <w:r>
-        <w:rPr>
-          <w:rFonts w:ascii="Book Antiqua" w:hAnsi="Book Antiqua"/>
-          <w:color w:val="000000"/>
-        </w:rPr>
-        <w:t>PostGIS</w:t>
-      </w:r>
-      <w:proofErr w:type="spellEnd"/>
-      <w:r>
-        <w:rPr>
-          <w:rFonts w:ascii="Book Antiqua" w:hAnsi="Book Antiqua"/>
-          <w:color w:val="000000"/>
-        </w:rPr>
-        <w:t xml:space="preserve"> —</w:t>
-      </w:r>
-      <w:proofErr w:type="spellStart"/>
-      <w:r>
-        <w:rPr>
-          <w:rFonts w:ascii="Book Antiqua" w:hAnsi="Book Antiqua"/>
-          <w:color w:val="000000"/>
-        </w:rPr>
-        <w:t>como</w:t>
-      </w:r>
-      <w:proofErr w:type="spellEnd"/>
-      <w:r>
-        <w:rPr>
-          <w:rFonts w:ascii="Book Antiqua" w:hAnsi="Book Antiqua"/>
-          <w:color w:val="000000"/>
-        </w:rPr>
-        <w:t xml:space="preserve"> </w:t>
-      </w:r>
-      <w:proofErr w:type="spellStart"/>
-      <w:r>
-        <w:rPr>
-          <w:rFonts w:ascii="Book Antiqua" w:hAnsi="Book Antiqua"/>
-          <w:color w:val="000000"/>
-        </w:rPr>
-        <w:t>ST_DWithin</w:t>
-      </w:r>
-      <w:proofErr w:type="spellEnd"/>
-      <w:r>
-        <w:rPr>
-          <w:rFonts w:ascii="Book Antiqua" w:hAnsi="Book Antiqua"/>
-          <w:color w:val="000000"/>
-        </w:rPr>
-        <w:t xml:space="preserve">, </w:t>
-      </w:r>
-      <w:proofErr w:type="spellStart"/>
-      <w:r>
-        <w:rPr>
-          <w:rFonts w:ascii="Book Antiqua" w:hAnsi="Book Antiqua"/>
-          <w:color w:val="000000"/>
-        </w:rPr>
-        <w:t>ST_Intersects</w:t>
-      </w:r>
-      <w:proofErr w:type="spellEnd"/>
-      <w:r>
-        <w:rPr>
-          <w:rFonts w:ascii="Book Antiqua" w:hAnsi="Book Antiqua"/>
-          <w:color w:val="000000"/>
-        </w:rPr>
-        <w:t xml:space="preserve"> o </w:t>
-      </w:r>
-      <w:proofErr w:type="spellStart"/>
-      <w:r>
-        <w:rPr>
-          <w:rFonts w:ascii="Book Antiqua" w:hAnsi="Book Antiqua"/>
-          <w:color w:val="000000"/>
-        </w:rPr>
-        <w:t>ST_Buffer</w:t>
-      </w:r>
-      <w:proofErr w:type="spellEnd"/>
-      <w:r>
-        <w:rPr>
-          <w:rFonts w:ascii="Book Antiqua" w:hAnsi="Book Antiqua"/>
-          <w:color w:val="000000"/>
-        </w:rPr>
-        <w:t xml:space="preserve">— </w:t>
-      </w:r>
-      <w:proofErr w:type="spellStart"/>
-      <w:r>
-        <w:rPr>
-          <w:rFonts w:ascii="Book Antiqua" w:hAnsi="Book Antiqua"/>
-          <w:color w:val="000000"/>
-        </w:rPr>
-        <w:t>presenta</w:t>
-      </w:r>
-      <w:proofErr w:type="spellEnd"/>
-      <w:r>
-        <w:rPr>
-          <w:rFonts w:ascii="Book Antiqua" w:hAnsi="Book Antiqua"/>
-          <w:color w:val="000000"/>
-        </w:rPr>
-        <w:t xml:space="preserve"> </w:t>
-      </w:r>
-      <w:proofErr w:type="spellStart"/>
-      <w:r>
-        <w:rPr>
-          <w:rFonts w:ascii="Book Antiqua" w:hAnsi="Book Antiqua"/>
-          <w:color w:val="000000"/>
-        </w:rPr>
-        <w:t>características</w:t>
-      </w:r>
-      <w:proofErr w:type="spellEnd"/>
-      <w:r>
-        <w:rPr>
-          <w:rFonts w:ascii="Book Antiqua" w:hAnsi="Book Antiqua"/>
-          <w:color w:val="000000"/>
-        </w:rPr>
-        <w:t xml:space="preserve"> poco </w:t>
-      </w:r>
-      <w:proofErr w:type="spellStart"/>
-      <w:r>
-        <w:rPr>
-          <w:rFonts w:ascii="Book Antiqua" w:hAnsi="Book Antiqua"/>
-          <w:color w:val="000000"/>
-        </w:rPr>
-        <w:t>estudiadas</w:t>
-      </w:r>
-      <w:proofErr w:type="spellEnd"/>
-      <w:r>
-        <w:rPr>
-          <w:rFonts w:ascii="Book Antiqua" w:hAnsi="Book Antiqua"/>
-          <w:color w:val="000000"/>
-        </w:rPr>
-        <w:t xml:space="preserve">: </w:t>
-      </w:r>
-      <w:proofErr w:type="spellStart"/>
-      <w:r>
-        <w:rPr>
-          <w:rFonts w:ascii="Book Antiqua" w:hAnsi="Book Antiqua"/>
-          <w:color w:val="000000"/>
-        </w:rPr>
-        <w:t>una</w:t>
-      </w:r>
-      <w:proofErr w:type="spellEnd"/>
-      <w:r>
-        <w:rPr>
-          <w:rFonts w:ascii="Book Antiqua" w:hAnsi="Book Antiqua"/>
-          <w:color w:val="000000"/>
-        </w:rPr>
-        <w:t xml:space="preserve"> entrada no </w:t>
-      </w:r>
-      <w:proofErr w:type="spellStart"/>
-      <w:r>
-        <w:rPr>
-          <w:rFonts w:ascii="Book Antiqua" w:hAnsi="Book Antiqua"/>
-          <w:color w:val="000000"/>
-        </w:rPr>
-        <w:t>saneada</w:t>
-      </w:r>
-      <w:proofErr w:type="spellEnd"/>
-      <w:r>
-        <w:rPr>
-          <w:rFonts w:ascii="Book Antiqua" w:hAnsi="Book Antiqua"/>
-          <w:color w:val="000000"/>
-        </w:rPr>
-        <w:t xml:space="preserve"> no solo </w:t>
-      </w:r>
-      <w:proofErr w:type="spellStart"/>
-      <w:r>
-        <w:rPr>
-          <w:rFonts w:ascii="Book Antiqua" w:hAnsi="Book Antiqua"/>
-          <w:color w:val="000000"/>
-        </w:rPr>
-        <w:t>permite</w:t>
-      </w:r>
-      <w:proofErr w:type="spellEnd"/>
-      <w:r>
-        <w:rPr>
-          <w:rFonts w:ascii="Book Antiqua" w:hAnsi="Book Antiqua"/>
-          <w:color w:val="000000"/>
-        </w:rPr>
-        <w:t xml:space="preserve"> eludir filtros relacionales o exfiltrar </w:t>
-      </w:r>
-      <w:proofErr w:type="spellStart"/>
-      <w:r>
-        <w:rPr>
-          <w:rFonts w:ascii="Book Antiqua" w:hAnsi="Book Antiqua"/>
-          <w:color w:val="000000"/>
-        </w:rPr>
-        <w:t>datos</w:t>
-      </w:r>
-      <w:proofErr w:type="spellEnd"/>
-      <w:r>
-        <w:rPr>
-          <w:rFonts w:ascii="Book Antiqua" w:hAnsi="Book Antiqua"/>
-          <w:color w:val="000000"/>
-        </w:rPr>
-        <w:t xml:space="preserve">, </w:t>
-      </w:r>
-      <w:proofErr w:type="spellStart"/>
-      <w:r>
-        <w:rPr>
-          <w:rFonts w:ascii="Book Antiqua" w:hAnsi="Book Antiqua"/>
-          <w:color w:val="000000"/>
-        </w:rPr>
-        <w:t>sino</w:t>
-      </w:r>
-      <w:proofErr w:type="spellEnd"/>
-      <w:r>
-        <w:rPr>
-          <w:rFonts w:ascii="Book Antiqua" w:hAnsi="Book Antiqua"/>
-          <w:color w:val="000000"/>
-        </w:rPr>
-        <w:t xml:space="preserve"> </w:t>
-      </w:r>
-      <w:proofErr w:type="spellStart"/>
-      <w:r>
-        <w:rPr>
-          <w:rFonts w:ascii="Book Antiqua" w:hAnsi="Book Antiqua"/>
-          <w:color w:val="000000"/>
-        </w:rPr>
-        <w:t>también</w:t>
-      </w:r>
-      <w:proofErr w:type="spellEnd"/>
-      <w:r>
-        <w:rPr>
-          <w:rFonts w:ascii="Book Antiqua" w:hAnsi="Book Antiqua"/>
-          <w:color w:val="000000"/>
-        </w:rPr>
-        <w:t xml:space="preserve"> </w:t>
-      </w:r>
-      <w:proofErr w:type="spellStart"/>
-      <w:r>
-        <w:rPr>
-          <w:rFonts w:ascii="Book Antiqua" w:hAnsi="Book Antiqua"/>
-          <w:color w:val="000000"/>
-        </w:rPr>
-        <w:t>desencadenar</w:t>
-      </w:r>
-      <w:proofErr w:type="spellEnd"/>
-      <w:r>
-        <w:rPr>
-          <w:rFonts w:ascii="Book Antiqua" w:hAnsi="Book Antiqua"/>
-          <w:color w:val="000000"/>
-        </w:rPr>
-        <w:t xml:space="preserve"> </w:t>
-      </w:r>
-      <w:proofErr w:type="spellStart"/>
-      <w:r>
-        <w:rPr>
-          <w:rFonts w:ascii="Book Antiqua" w:hAnsi="Book Antiqua"/>
-          <w:color w:val="000000"/>
-        </w:rPr>
-        <w:t>estados</w:t>
-      </w:r>
-      <w:proofErr w:type="spellEnd"/>
-      <w:r>
-        <w:rPr>
-          <w:rFonts w:ascii="Book Antiqua" w:hAnsi="Book Antiqua"/>
-          <w:color w:val="000000"/>
-        </w:rPr>
-        <w:t xml:space="preserve"> de </w:t>
-      </w:r>
-      <w:proofErr w:type="spellStart"/>
-      <w:r>
-        <w:rPr>
-          <w:rFonts w:ascii="Book Antiqua" w:hAnsi="Book Antiqua"/>
-          <w:color w:val="000000"/>
-        </w:rPr>
-        <w:t>denegación</w:t>
-      </w:r>
-      <w:proofErr w:type="spellEnd"/>
-      <w:r>
-        <w:rPr>
-          <w:rFonts w:ascii="Book Antiqua" w:hAnsi="Book Antiqua"/>
-          <w:color w:val="000000"/>
-        </w:rPr>
-        <w:t xml:space="preserve"> de </w:t>
-      </w:r>
-      <w:proofErr w:type="spellStart"/>
-      <w:r>
-        <w:rPr>
-          <w:rFonts w:ascii="Book Antiqua" w:hAnsi="Book Antiqua"/>
-          <w:color w:val="000000"/>
-        </w:rPr>
-        <w:t>servicio</w:t>
-      </w:r>
-      <w:proofErr w:type="spellEnd"/>
-      <w:r>
-        <w:rPr>
-          <w:rFonts w:ascii="Book Antiqua" w:hAnsi="Book Antiqua"/>
-          <w:color w:val="000000"/>
-        </w:rPr>
-        <w:t xml:space="preserve"> </w:t>
-      </w:r>
-      <w:proofErr w:type="spellStart"/>
-      <w:r>
-        <w:rPr>
-          <w:rFonts w:ascii="Book Antiqua" w:hAnsi="Book Antiqua"/>
-          <w:color w:val="000000"/>
-        </w:rPr>
-        <w:t>mediante</w:t>
-      </w:r>
-      <w:proofErr w:type="spellEnd"/>
-      <w:r>
-        <w:rPr>
-          <w:rFonts w:ascii="Book Antiqua" w:hAnsi="Book Antiqua"/>
-          <w:color w:val="000000"/>
-        </w:rPr>
-        <w:t xml:space="preserve"> </w:t>
-      </w:r>
-      <w:proofErr w:type="spellStart"/>
-      <w:r>
-        <w:rPr>
-          <w:rFonts w:ascii="Book Antiqua" w:hAnsi="Book Antiqua"/>
-          <w:color w:val="000000"/>
-        </w:rPr>
-        <w:t>cálculos</w:t>
-      </w:r>
-      <w:proofErr w:type="spellEnd"/>
-      <w:r>
-        <w:rPr>
-          <w:rFonts w:ascii="Book Antiqua" w:hAnsi="Book Antiqua"/>
-          <w:color w:val="000000"/>
-        </w:rPr>
-        <w:t xml:space="preserve"> </w:t>
-      </w:r>
-      <w:proofErr w:type="spellStart"/>
-      <w:r>
-        <w:rPr>
-          <w:rFonts w:ascii="Book Antiqua" w:hAnsi="Book Antiqua"/>
-          <w:color w:val="000000"/>
-        </w:rPr>
-        <w:t>topológicos</w:t>
-      </w:r>
-      <w:proofErr w:type="spellEnd"/>
-      <w:r>
-        <w:rPr>
-          <w:rFonts w:ascii="Book Antiqua" w:hAnsi="Book Antiqua"/>
-          <w:color w:val="000000"/>
-        </w:rPr>
-        <w:t xml:space="preserve"> </w:t>
-      </w:r>
-      <w:r>
-        <w:rPr>
-          <w:rFonts w:ascii="Book Antiqua" w:hAnsi="Book Antiqua"/>
-          <w:color w:val="000000"/>
-        </w:rPr>
-        <w:t>con</w:t>
-      </w:r>
-      <w:r>
-        <w:rPr>
-          <w:rFonts w:ascii="Book Antiqua" w:hAnsi="Book Antiqua"/>
-          <w:color w:val="000000"/>
-        </w:rPr>
-        <w:t xml:space="preserve"> </w:t>
-      </w:r>
-      <w:proofErr w:type="spellStart"/>
-      <w:r>
-        <w:rPr>
-          <w:rFonts w:ascii="Book Antiqua" w:hAnsi="Book Antiqua"/>
-          <w:color w:val="000000"/>
-        </w:rPr>
-        <w:t>alta</w:t>
-      </w:r>
-      <w:proofErr w:type="spellEnd"/>
-      <w:r>
-        <w:rPr>
-          <w:rFonts w:ascii="Book Antiqua" w:hAnsi="Book Antiqua"/>
-          <w:color w:val="000000"/>
-        </w:rPr>
-        <w:t xml:space="preserve"> </w:t>
-      </w:r>
-      <w:proofErr w:type="spellStart"/>
-      <w:r>
-        <w:rPr>
-          <w:rFonts w:ascii="Book Antiqua" w:hAnsi="Book Antiqua"/>
-          <w:color w:val="000000"/>
-        </w:rPr>
-        <w:t>complejidad</w:t>
-      </w:r>
-      <w:proofErr w:type="spellEnd"/>
-      <w:r>
-        <w:rPr>
-          <w:rFonts w:ascii="Book Antiqua" w:hAnsi="Book Antiqua"/>
-          <w:color w:val="000000"/>
-        </w:rPr>
-        <w:t xml:space="preserve"> </w:t>
-      </w:r>
-      <w:proofErr w:type="spellStart"/>
-      <w:r>
-        <w:rPr>
-          <w:rFonts w:ascii="Book Antiqua" w:hAnsi="Book Antiqua"/>
-          <w:color w:val="000000"/>
-        </w:rPr>
-        <w:t>algorítmica</w:t>
-      </w:r>
-      <w:proofErr w:type="spellEnd"/>
-      <w:r>
-        <w:rPr>
-          <w:rFonts w:ascii="Book Antiqua" w:hAnsi="Book Antiqua"/>
-          <w:color w:val="000000"/>
-        </w:rPr>
-        <w:t>.</w:t>
+      </w:r>
+      <w:proofErr w:type="spellStart"/>
+      <w:r>
+        <w:rPr>
+          <w:rFonts w:ascii="Book Antiqua" w:hAnsi="Book Antiqua"/>
+          <w:color w:val="000000"/>
+        </w:rPr>
+      </w:r>
+      <w:proofErr w:type="spellEnd"/>
+      <w:r>
+        <w:rPr>
+          <w:rFonts w:ascii="Book Antiqua" w:hAnsi="Book Antiqua"/>
+          <w:color w:val="000000"/>
+        </w:rPr>
+      </w:r>
+      <w:proofErr w:type="spellStart"/>
+      <w:r>
+        <w:rPr>
+          <w:rFonts w:ascii="Book Antiqua" w:hAnsi="Book Antiqua"/>
+          <w:color w:val="000000"/>
+        </w:rPr>
+      </w:r>
+      <w:proofErr w:type="spellEnd"/>
+      <w:r>
+        <w:rPr>
+          <w:rFonts w:ascii="Book Antiqua" w:hAnsi="Book Antiqua"/>
+          <w:color w:val="000000"/>
+        </w:rPr>
+      </w:r>
+      <w:proofErr w:type="spellStart"/>
+      <w:r>
+        <w:rPr>
+          <w:rFonts w:ascii="Book Antiqua" w:hAnsi="Book Antiqua"/>
+          <w:color w:val="000000"/>
+        </w:rPr>
+      </w:r>
+      <w:proofErr w:type="spellEnd"/>
+      <w:r>
+        <w:rPr>
+          <w:rFonts w:ascii="Book Antiqua" w:hAnsi="Book Antiqua"/>
+          <w:color w:val="000000"/>
+        </w:rPr>
+      </w:r>
+      <w:proofErr w:type="spellStart"/>
+      <w:r>
+        <w:rPr>
+          <w:rFonts w:ascii="Book Antiqua" w:hAnsi="Book Antiqua"/>
+          <w:color w:val="000000"/>
+        </w:rPr>
+      </w:r>
+      <w:proofErr w:type="spellEnd"/>
+      <w:r>
+        <w:rPr>
+          <w:rFonts w:ascii="Book Antiqua" w:hAnsi="Book Antiqua"/>
+          <w:color w:val="000000"/>
+        </w:rPr>
+      </w:r>
+      <w:proofErr w:type="spellStart"/>
+      <w:r>
+        <w:rPr>
+          <w:rFonts w:ascii="Book Antiqua" w:hAnsi="Book Antiqua"/>
+          <w:color w:val="000000"/>
+        </w:rPr>
+      </w:r>
+      <w:proofErr w:type="spellEnd"/>
+      <w:r>
+        <w:rPr>
+          <w:rFonts w:ascii="Book Antiqua" w:hAnsi="Book Antiqua"/>
+          <w:color w:val="000000"/>
+        </w:rPr>
+      </w:r>
+      <w:proofErr w:type="spellStart"/>
+      <w:r>
+        <w:rPr>
+          <w:rFonts w:ascii="Book Antiqua" w:hAnsi="Book Antiqua"/>
+          <w:color w:val="000000"/>
+        </w:rPr>
+      </w:r>
+      <w:proofErr w:type="spellEnd"/>
+      <w:r>
+        <w:rPr>
+          <w:rFonts w:ascii="Book Antiqua" w:hAnsi="Book Antiqua"/>
+          <w:color w:val="000000"/>
+        </w:rPr>
+      </w:r>
+      <w:proofErr w:type="spellStart"/>
+      <w:r>
+        <w:rPr>
+          <w:rFonts w:ascii="Book Antiqua" w:hAnsi="Book Antiqua"/>
+          <w:color w:val="000000"/>
+        </w:rPr>
+      </w:r>
+      <w:proofErr w:type="spellEnd"/>
+      <w:r>
+        <w:rPr>
+          <w:rFonts w:ascii="Book Antiqua" w:hAnsi="Book Antiqua"/>
+          <w:color w:val="000000"/>
+        </w:rPr>
+      </w:r>
+      <w:proofErr w:type="spellStart"/>
+      <w:r>
+        <w:rPr>
+          <w:rFonts w:ascii="Book Antiqua" w:hAnsi="Book Antiqua"/>
+          <w:color w:val="000000"/>
+        </w:rPr>
+      </w:r>
+      <w:proofErr w:type="spellEnd"/>
+      <w:r>
+        <w:rPr>
+          <w:rFonts w:ascii="Book Antiqua" w:hAnsi="Book Antiqua"/>
+          <w:color w:val="000000"/>
+        </w:rPr>
+      </w:r>
+      <w:proofErr w:type="spellStart"/>
+      <w:r>
+        <w:rPr>
+          <w:rFonts w:ascii="Book Antiqua" w:hAnsi="Book Antiqua"/>
+          <w:color w:val="000000"/>
+        </w:rPr>
+      </w:r>
+      <w:proofErr w:type="spellEnd"/>
+      <w:r>
+        <w:rPr>
+          <w:rFonts w:ascii="Book Antiqua" w:hAnsi="Book Antiqua"/>
+          <w:color w:val="000000"/>
+        </w:rPr>
+      </w:r>
+      <w:proofErr w:type="spellStart"/>
+      <w:r>
+        <w:rPr>
+          <w:rFonts w:ascii="Book Antiqua" w:hAnsi="Book Antiqua"/>
+          <w:color w:val="000000"/>
+        </w:rPr>
+      </w:r>
+      <w:proofErr w:type="spellEnd"/>
+      <w:r>
+        <w:rPr>
+          <w:rFonts w:ascii="Book Antiqua" w:hAnsi="Book Antiqua"/>
+          <w:color w:val="000000"/>
+        </w:rPr>
+      </w:r>
+      <w:proofErr w:type="spellStart"/>
+      <w:r>
+        <w:rPr>
+          <w:rFonts w:ascii="Book Antiqua" w:hAnsi="Book Antiqua"/>
+          <w:color w:val="000000"/>
+        </w:rPr>
+      </w:r>
+      <w:proofErr w:type="spellEnd"/>
+      <w:r>
+        <w:rPr>
+          <w:rFonts w:ascii="Book Antiqua" w:hAnsi="Book Antiqua"/>
+          <w:color w:val="000000"/>
+        </w:rPr>
+      </w:r>
+      <w:proofErr w:type="spellStart"/>
+      <w:r>
+        <w:rPr>
+          <w:rFonts w:ascii="Book Antiqua" w:hAnsi="Book Antiqua"/>
+          <w:color w:val="000000"/>
+        </w:rPr>
+      </w:r>
+      <w:proofErr w:type="spellEnd"/>
+      <w:r>
+        <w:rPr>
+          <w:rFonts w:ascii="Book Antiqua" w:hAnsi="Book Antiqua"/>
+          <w:color w:val="000000"/>
+        </w:rPr>
+      </w:r>
+      <w:proofErr w:type="spellStart"/>
+      <w:r>
+        <w:rPr>
+          <w:rFonts w:ascii="Book Antiqua" w:hAnsi="Book Antiqua"/>
+          <w:color w:val="000000"/>
+        </w:rPr>
+      </w:r>
+      <w:proofErr w:type="spellEnd"/>
+      <w:r>
+        <w:rPr>
+          <w:rFonts w:ascii="Book Antiqua" w:hAnsi="Book Antiqua"/>
+          <w:color w:val="000000"/>
+        </w:rPr>
+      </w:r>
+      <w:proofErr w:type="spellStart"/>
+      <w:r>
+        <w:rPr>
+          <w:rFonts w:ascii="Book Antiqua" w:hAnsi="Book Antiqua"/>
+          <w:color w:val="000000"/>
+        </w:rPr>
+      </w:r>
+      <w:proofErr w:type="spellEnd"/>
+      <w:r>
+        <w:rPr>
+          <w:rFonts w:ascii="Book Antiqua" w:hAnsi="Book Antiqua"/>
+          <w:color w:val="000000"/>
+        </w:rPr>
+      </w:r>
+      <w:proofErr w:type="spellStart"/>
+      <w:r>
+        <w:rPr>
+          <w:rFonts w:ascii="Book Antiqua" w:hAnsi="Book Antiqua"/>
+          <w:color w:val="000000"/>
+        </w:rPr>
+      </w:r>
+      <w:proofErr w:type="spellEnd"/>
+      <w:r>
+        <w:rPr>
+          <w:rFonts w:ascii="Book Antiqua" w:hAnsi="Book Antiqua"/>
+          <w:color w:val="000000"/>
+        </w:rPr>
+      </w:r>
+      <w:proofErr w:type="spellStart"/>
+      <w:r>
+        <w:rPr>
+          <w:rFonts w:ascii="Book Antiqua" w:hAnsi="Book Antiqua"/>
+          <w:color w:val="000000"/>
+        </w:rPr>
+      </w:r>
+      <w:proofErr w:type="spellEnd"/>
+      <w:r>
+        <w:rPr>
+          <w:rFonts w:ascii="Book Antiqua" w:hAnsi="Book Antiqua"/>
+          <w:color w:val="000000"/>
+        </w:rPr>
+      </w:r>
+      <w:proofErr w:type="spellStart"/>
+      <w:r>
+        <w:rPr>
+          <w:rFonts w:ascii="Book Antiqua" w:hAnsi="Book Antiqua"/>
+          <w:color w:val="000000"/>
+        </w:rPr>
+      </w:r>
+      <w:proofErr w:type="spellEnd"/>
+      <w:r>
+        <w:rPr>
+          <w:rFonts w:ascii="Book Antiqua" w:hAnsi="Book Antiqua"/>
+          <w:color w:val="000000"/>
+        </w:rPr>
+      </w:r>
+      <w:proofErr w:type="spellStart"/>
+      <w:r>
+        <w:rPr>
+          <w:rFonts w:ascii="Book Antiqua" w:hAnsi="Book Antiqua"/>
+          <w:color w:val="000000"/>
+        </w:rPr>
+      </w:r>
+      <w:proofErr w:type="spellEnd"/>
+      <w:r>
+        <w:rPr>
+          <w:rFonts w:ascii="Book Antiqua" w:hAnsi="Book Antiqua"/>
+          <w:color w:val="000000"/>
+        </w:rPr>
+      </w:r>
+      <w:proofErr w:type="spellStart"/>
+      <w:r>
+        <w:rPr>
+          <w:rFonts w:ascii="Book Antiqua" w:hAnsi="Book Antiqua"/>
+          <w:color w:val="000000"/>
+        </w:rPr>
+      </w:r>
+      <w:proofErr w:type="spellEnd"/>
+      <w:r>
+        <w:rPr>
+          <w:rFonts w:ascii="Book Antiqua" w:hAnsi="Book Antiqua"/>
+          <w:color w:val="000000"/>
+        </w:rPr>
+      </w:r>
+      <w:proofErr w:type="spellStart"/>
+      <w:r>
+        <w:rPr>
+          <w:rFonts w:ascii="Book Antiqua" w:hAnsi="Book Antiqua"/>
+          <w:color w:val="000000"/>
+        </w:rPr>
+      </w:r>
+      <w:proofErr w:type="spellEnd"/>
+      <w:r>
+        <w:rPr>
+          <w:rFonts w:ascii="Book Antiqua" w:hAnsi="Book Antiqua"/>
+          <w:color w:val="000000"/>
+        </w:rPr>
+      </w:r>
+      <w:proofErr w:type="spellStart"/>
+      <w:r>
+        <w:rPr>
+          <w:rFonts w:ascii="Book Antiqua" w:hAnsi="Book Antiqua"/>
+          <w:color w:val="000000"/>
+        </w:rPr>
+      </w:r>
+      <w:proofErr w:type="spellEnd"/>
+      <w:r>
+        <w:rPr>
+          <w:rFonts w:ascii="Book Antiqua" w:hAnsi="Book Antiqua"/>
+          <w:color w:val="000000"/>
+        </w:rPr>
+      </w:r>
+      <w:proofErr w:type="spellStart"/>
+      <w:r>
+        <w:rPr>
+          <w:rFonts w:ascii="Book Antiqua" w:hAnsi="Book Antiqua"/>
+          <w:color w:val="000000"/>
+        </w:rPr>
+      </w:r>
+      <w:proofErr w:type="spellEnd"/>
+      <w:r>
+        <w:rPr>
+          <w:rFonts w:ascii="Book Antiqua" w:hAnsi="Book Antiqua"/>
+          <w:color w:val="000000"/>
+        </w:rPr>
+      </w:r>
+      <w:proofErr w:type="spellStart"/>
+      <w:r>
+        <w:rPr>
+          <w:rFonts w:ascii="Book Antiqua" w:hAnsi="Book Antiqua"/>
+          <w:color w:val="000000"/>
+        </w:rPr>
+      </w:r>
+      <w:proofErr w:type="spellEnd"/>
+      <w:r>
+        <w:rPr>
+          <w:rFonts w:ascii="Book Antiqua" w:hAnsi="Book Antiqua"/>
+          <w:color w:val="000000"/>
+        </w:rPr>
+      </w:r>
+      <w:r>
+        <w:rPr>
+          <w:rFonts w:ascii="Book Antiqua" w:hAnsi="Book Antiqua"/>
+          <w:color w:val="000000"/>
+        </w:rPr>
+      </w:r>
+      <w:r>
+        <w:rPr>
+          <w:rFonts w:ascii="Book Antiqua" w:hAnsi="Book Antiqua"/>
+          <w:color w:val="000000"/>
+        </w:rPr>
+      </w:r>
+      <w:proofErr w:type="spellStart"/>
+      <w:r>
+        <w:rPr>
+          <w:rFonts w:ascii="Book Antiqua" w:hAnsi="Book Antiqua"/>
+          <w:color w:val="000000"/>
+        </w:rPr>
+      </w:r>
+      <w:proofErr w:type="spellEnd"/>
+      <w:r>
+        <w:rPr>
+          <w:rFonts w:ascii="Book Antiqua" w:hAnsi="Book Antiqua"/>
+          <w:color w:val="000000"/>
+        </w:rPr>
+      </w:r>
+      <w:proofErr w:type="spellStart"/>
+      <w:r>
+        <w:rPr>
+          <w:rFonts w:ascii="Book Antiqua" w:hAnsi="Book Antiqua"/>
+          <w:color w:val="000000"/>
+        </w:rPr>
+      </w:r>
+      <w:proofErr w:type="spellEnd"/>
+      <w:r>
+        <w:rPr>
+          <w:rFonts w:ascii="Book Antiqua" w:hAnsi="Book Antiqua"/>
+          <w:color w:val="000000"/>
+        </w:rPr>
+      </w:r>
+      <w:proofErr w:type="spellStart"/>
+      <w:r>
+        <w:rPr>
+          <w:rFonts w:ascii="Book Antiqua" w:hAnsi="Book Antiqua"/>
+          <w:color w:val="000000"/>
+        </w:rPr>
+      </w:r>
+      <w:proofErr w:type="spellEnd"/>
+      <w:r>
+        <w:rPr>
+          <w:rFonts w:ascii="Book Antiqua" w:hAnsi="Book Antiqua"/>
+          <w:color w:val="000000"/>
+        </w:rPr>
+      </w:r>
+      <w:r>
+        <w:rPr>
+          <w:rFonts w:ascii="Book Antiqua" w:hAnsi="Book Antiqua"/>
+          <w:sz w:val="22"/>
+        </w:rPr>
+        <w:t>Sin embargo, la exposición de estos servicios mediante APIs REST introduce vectores de ataque cuando las consultas se construyen mediante concatenación de cadenas dentro de funciones espaciales. Si bien la inyección SQL clásica ha sido ampliamente documentada (Clarke, 2012; Halfond et al., 2006; OWASP Foundation, 2021), la manipulación de operadores geométricos de PostGIS —como ST_DWithin, ST_Intersects o ST_Buffer— presenta particularidades poco atendidas: una entrada no saneada no solo permite eludir filtros relacionales o exfiltrar datos, sino también desencadenar estados de denegación de servicio mediante cálculos topológicos con alta complejidad algorítmica.</w:t>
       </w:r>
     </w:p>
     <w:p>
@@ -2714,510 +2666,453 @@
           <w:rFonts w:ascii="Book Antiqua" w:hAnsi="Book Antiqua"/>
           <w:color w:val="000000"/>
         </w:rPr>
-        <w:t xml:space="preserve">El </w:t>
-      </w:r>
-      <w:proofErr w:type="spellStart"/>
-      <w:r>
-        <w:rPr>
-          <w:rFonts w:ascii="Book Antiqua" w:hAnsi="Book Antiqua"/>
-          <w:color w:val="000000"/>
-        </w:rPr>
-        <w:t>estándar</w:t>
-      </w:r>
-      <w:proofErr w:type="spellEnd"/>
-      <w:r>
-        <w:rPr>
-          <w:rFonts w:ascii="Book Antiqua" w:hAnsi="Book Antiqua"/>
-          <w:color w:val="000000"/>
-        </w:rPr>
-        <w:t xml:space="preserve"> ISO 19152:2012, </w:t>
-      </w:r>
-      <w:proofErr w:type="spellStart"/>
-      <w:r>
-        <w:rPr>
-          <w:rFonts w:ascii="Book Antiqua" w:hAnsi="Book Antiqua"/>
-          <w:color w:val="000000"/>
-        </w:rPr>
-        <w:t>también</w:t>
-      </w:r>
-      <w:proofErr w:type="spellEnd"/>
-      <w:r>
-        <w:rPr>
-          <w:rFonts w:ascii="Book Antiqua" w:hAnsi="Book Antiqua"/>
-          <w:color w:val="000000"/>
-        </w:rPr>
-        <w:t xml:space="preserve"> </w:t>
-      </w:r>
-      <w:proofErr w:type="spellStart"/>
-      <w:r>
-        <w:rPr>
-          <w:rFonts w:ascii="Book Antiqua" w:hAnsi="Book Antiqua"/>
-          <w:color w:val="000000"/>
-        </w:rPr>
-        <w:t>denominado</w:t>
-      </w:r>
-      <w:proofErr w:type="spellEnd"/>
-      <w:r>
-        <w:rPr>
-          <w:rFonts w:ascii="Book Antiqua" w:hAnsi="Book Antiqua"/>
-          <w:color w:val="000000"/>
-        </w:rPr>
-        <w:t xml:space="preserve"> Land Administration Domain Model (LADM), es </w:t>
-      </w:r>
-      <w:proofErr w:type="spellStart"/>
-      <w:r>
-        <w:rPr>
-          <w:rFonts w:ascii="Book Antiqua" w:hAnsi="Book Antiqua"/>
-          <w:color w:val="000000"/>
-        </w:rPr>
-        <w:t>el</w:t>
-      </w:r>
-      <w:proofErr w:type="spellEnd"/>
-      <w:r>
-        <w:rPr>
-          <w:rFonts w:ascii="Book Antiqua" w:hAnsi="Book Antiqua"/>
-          <w:color w:val="000000"/>
-        </w:rPr>
-        <w:t xml:space="preserve"> que </w:t>
-      </w:r>
-      <w:proofErr w:type="spellStart"/>
-      <w:r>
-        <w:rPr>
-          <w:rFonts w:ascii="Book Antiqua" w:hAnsi="Book Antiqua"/>
-          <w:color w:val="000000"/>
-        </w:rPr>
-        <w:t>regula</w:t>
-      </w:r>
-      <w:proofErr w:type="spellEnd"/>
-      <w:r>
-        <w:rPr>
-          <w:rFonts w:ascii="Book Antiqua" w:hAnsi="Book Antiqua"/>
-          <w:color w:val="000000"/>
-        </w:rPr>
-        <w:t xml:space="preserve"> a </w:t>
-      </w:r>
-      <w:proofErr w:type="spellStart"/>
-      <w:r>
-        <w:rPr>
-          <w:rFonts w:ascii="Book Antiqua" w:hAnsi="Book Antiqua"/>
-          <w:color w:val="000000"/>
-        </w:rPr>
-        <w:t>nivel</w:t>
-      </w:r>
-      <w:proofErr w:type="spellEnd"/>
-      <w:r>
-        <w:rPr>
-          <w:rFonts w:ascii="Book Antiqua" w:hAnsi="Book Antiqua"/>
-          <w:color w:val="000000"/>
-        </w:rPr>
-        <w:t xml:space="preserve"> global la </w:t>
-      </w:r>
-      <w:proofErr w:type="spellStart"/>
-      <w:r>
-        <w:rPr>
-          <w:rFonts w:ascii="Book Antiqua" w:hAnsi="Book Antiqua"/>
-          <w:color w:val="000000"/>
-        </w:rPr>
-        <w:t>modelación</w:t>
-      </w:r>
-      <w:proofErr w:type="spellEnd"/>
-      <w:r>
-        <w:rPr>
-          <w:rFonts w:ascii="Book Antiqua" w:hAnsi="Book Antiqua"/>
-          <w:color w:val="000000"/>
-        </w:rPr>
-        <w:t xml:space="preserve"> </w:t>
-      </w:r>
-      <w:proofErr w:type="spellStart"/>
-      <w:r>
-        <w:rPr>
-          <w:rFonts w:ascii="Book Antiqua" w:hAnsi="Book Antiqua"/>
-          <w:color w:val="000000"/>
-        </w:rPr>
-        <w:t>técnica</w:t>
-      </w:r>
-      <w:proofErr w:type="spellEnd"/>
-      <w:r>
-        <w:rPr>
-          <w:rFonts w:ascii="Book Antiqua" w:hAnsi="Book Antiqua"/>
-          <w:color w:val="000000"/>
-        </w:rPr>
-        <w:t xml:space="preserve"> de </w:t>
-      </w:r>
-      <w:proofErr w:type="spellStart"/>
-      <w:r>
-        <w:rPr>
-          <w:rFonts w:ascii="Book Antiqua" w:hAnsi="Book Antiqua"/>
-          <w:color w:val="000000"/>
-        </w:rPr>
-        <w:t>los</w:t>
-      </w:r>
-      <w:proofErr w:type="spellEnd"/>
-      <w:r>
-        <w:rPr>
-          <w:rFonts w:ascii="Book Antiqua" w:hAnsi="Book Antiqua"/>
-          <w:color w:val="000000"/>
-        </w:rPr>
-        <w:t xml:space="preserve"> </w:t>
-      </w:r>
-      <w:proofErr w:type="spellStart"/>
-      <w:r>
-        <w:rPr>
-          <w:rFonts w:ascii="Book Antiqua" w:hAnsi="Book Antiqua"/>
-          <w:color w:val="000000"/>
-        </w:rPr>
-        <w:t>sistemas</w:t>
-      </w:r>
-      <w:proofErr w:type="spellEnd"/>
-      <w:r>
-        <w:rPr>
-          <w:rFonts w:ascii="Book Antiqua" w:hAnsi="Book Antiqua"/>
-          <w:color w:val="000000"/>
-        </w:rPr>
-        <w:t xml:space="preserve"> de </w:t>
-      </w:r>
-      <w:proofErr w:type="spellStart"/>
-      <w:r>
-        <w:rPr>
-          <w:rFonts w:ascii="Book Antiqua" w:hAnsi="Book Antiqua"/>
-          <w:color w:val="000000"/>
-        </w:rPr>
-        <w:t>información</w:t>
-      </w:r>
-      <w:proofErr w:type="spellEnd"/>
-      <w:r>
-        <w:rPr>
-          <w:rFonts w:ascii="Book Antiqua" w:hAnsi="Book Antiqua"/>
-          <w:color w:val="000000"/>
-        </w:rPr>
-        <w:t xml:space="preserve"> </w:t>
-      </w:r>
-      <w:proofErr w:type="spellStart"/>
-      <w:r>
-        <w:rPr>
-          <w:rFonts w:ascii="Book Antiqua" w:hAnsi="Book Antiqua"/>
-          <w:color w:val="000000"/>
-        </w:rPr>
-        <w:t>catastral</w:t>
-      </w:r>
-      <w:proofErr w:type="spellEnd"/>
-      <w:r>
-        <w:rPr>
-          <w:rFonts w:ascii="Book Antiqua" w:hAnsi="Book Antiqua"/>
-          <w:color w:val="000000"/>
-        </w:rPr>
-        <w:t>.</w:t>
-      </w:r>
-      <w:r>
-        <w:rPr>
-          <w:rFonts w:ascii="Book Antiqua" w:hAnsi="Book Antiqua"/>
-          <w:color w:val="000000"/>
-        </w:rPr>
-        <w:t xml:space="preserve"> </w:t>
-      </w:r>
-      <w:proofErr w:type="spellStart"/>
-      <w:r>
-        <w:rPr>
-          <w:rFonts w:ascii="Book Antiqua" w:hAnsi="Book Antiqua"/>
-          <w:color w:val="000000"/>
-        </w:rPr>
-        <w:t>Autores</w:t>
-      </w:r>
-      <w:proofErr w:type="spellEnd"/>
-      <w:r>
-        <w:rPr>
-          <w:rFonts w:ascii="Book Antiqua" w:hAnsi="Book Antiqua"/>
-          <w:color w:val="000000"/>
-        </w:rPr>
-        <w:t xml:space="preserve"> de </w:t>
-      </w:r>
-      <w:proofErr w:type="spellStart"/>
-      <w:r>
-        <w:rPr>
-          <w:rFonts w:ascii="Book Antiqua" w:hAnsi="Book Antiqua"/>
-          <w:color w:val="000000"/>
-        </w:rPr>
-        <w:t>referencia</w:t>
-      </w:r>
-      <w:proofErr w:type="spellEnd"/>
-      <w:r>
-        <w:rPr>
-          <w:rFonts w:ascii="Book Antiqua" w:hAnsi="Book Antiqua"/>
-          <w:color w:val="000000"/>
-        </w:rPr>
-        <w:t xml:space="preserve"> </w:t>
-      </w:r>
-      <w:proofErr w:type="spellStart"/>
-      <w:r>
-        <w:rPr>
-          <w:rFonts w:ascii="Book Antiqua" w:hAnsi="Book Antiqua"/>
-          <w:color w:val="000000"/>
-        </w:rPr>
-        <w:t>como</w:t>
-      </w:r>
-      <w:proofErr w:type="spellEnd"/>
-      <w:r>
-        <w:rPr>
-          <w:rFonts w:ascii="Book Antiqua" w:hAnsi="Book Antiqua"/>
-          <w:color w:val="000000"/>
-        </w:rPr>
-        <w:t xml:space="preserve"> </w:t>
-      </w:r>
-      <w:proofErr w:type="spellStart"/>
-      <w:r>
-        <w:rPr>
-          <w:rFonts w:ascii="Book Antiqua" w:hAnsi="Book Antiqua"/>
-          <w:color w:val="000000"/>
-        </w:rPr>
-        <w:t>Lemmen</w:t>
-      </w:r>
-      <w:proofErr w:type="spellEnd"/>
-      <w:r>
-        <w:rPr>
-          <w:rFonts w:ascii="Book Antiqua" w:hAnsi="Book Antiqua"/>
-          <w:color w:val="000000"/>
-        </w:rPr>
-        <w:t xml:space="preserve"> et al. (2015) y van Oosterom et al. (2006) </w:t>
-      </w:r>
-      <w:proofErr w:type="spellStart"/>
-      <w:r>
-        <w:rPr>
-          <w:rFonts w:ascii="Book Antiqua" w:hAnsi="Book Antiqua"/>
-          <w:color w:val="000000"/>
-        </w:rPr>
-        <w:t>formalizaron</w:t>
-      </w:r>
-      <w:proofErr w:type="spellEnd"/>
-      <w:r>
-        <w:rPr>
-          <w:rFonts w:ascii="Book Antiqua" w:hAnsi="Book Antiqua"/>
-          <w:color w:val="000000"/>
-        </w:rPr>
-        <w:t xml:space="preserve"> las </w:t>
-      </w:r>
-      <w:proofErr w:type="spellStart"/>
-      <w:r>
-        <w:rPr>
-          <w:rFonts w:ascii="Book Antiqua" w:hAnsi="Book Antiqua"/>
-          <w:color w:val="000000"/>
-        </w:rPr>
-        <w:t>clases</w:t>
-      </w:r>
-      <w:proofErr w:type="spellEnd"/>
-      <w:r>
-        <w:rPr>
-          <w:rFonts w:ascii="Book Antiqua" w:hAnsi="Book Antiqua"/>
-          <w:color w:val="000000"/>
-        </w:rPr>
-        <w:t xml:space="preserve"> </w:t>
-      </w:r>
-      <w:proofErr w:type="spellStart"/>
-      <w:r>
-        <w:rPr>
-          <w:rFonts w:ascii="Book Antiqua" w:hAnsi="Book Antiqua"/>
-          <w:color w:val="000000"/>
-        </w:rPr>
-        <w:t>fundamentales</w:t>
-      </w:r>
-      <w:proofErr w:type="spellEnd"/>
-      <w:r>
-        <w:rPr>
-          <w:rFonts w:ascii="Book Antiqua" w:hAnsi="Book Antiqua"/>
-          <w:color w:val="000000"/>
-        </w:rPr>
-        <w:t xml:space="preserve"> del </w:t>
-      </w:r>
-      <w:proofErr w:type="spellStart"/>
-      <w:r>
-        <w:rPr>
-          <w:rFonts w:ascii="Book Antiqua" w:hAnsi="Book Antiqua"/>
-          <w:color w:val="000000"/>
-        </w:rPr>
-        <w:t>catastro</w:t>
-      </w:r>
-      <w:proofErr w:type="spellEnd"/>
-      <w:r>
-        <w:rPr>
-          <w:rFonts w:ascii="Book Antiqua" w:hAnsi="Book Antiqua"/>
-          <w:color w:val="000000"/>
-        </w:rPr>
-        <w:t xml:space="preserve">, </w:t>
-      </w:r>
-      <w:proofErr w:type="spellStart"/>
-      <w:r>
-        <w:rPr>
-          <w:rFonts w:ascii="Book Antiqua" w:hAnsi="Book Antiqua"/>
-          <w:color w:val="000000"/>
-        </w:rPr>
-        <w:t>destacando</w:t>
-      </w:r>
-      <w:proofErr w:type="spellEnd"/>
-      <w:r>
-        <w:rPr>
-          <w:rFonts w:ascii="Book Antiqua" w:hAnsi="Book Antiqua"/>
-          <w:color w:val="000000"/>
-        </w:rPr>
-        <w:t xml:space="preserve"> </w:t>
-      </w:r>
-      <w:proofErr w:type="spellStart"/>
-      <w:r>
-        <w:rPr>
-          <w:rFonts w:ascii="Book Antiqua" w:hAnsi="Book Antiqua"/>
-          <w:color w:val="000000"/>
-        </w:rPr>
-        <w:t>LA_SpatialUnit</w:t>
-      </w:r>
-      <w:proofErr w:type="spellEnd"/>
-      <w:r>
-        <w:rPr>
-          <w:rFonts w:ascii="Book Antiqua" w:hAnsi="Book Antiqua"/>
-          <w:color w:val="000000"/>
-        </w:rPr>
-        <w:t xml:space="preserve"> (</w:t>
-      </w:r>
-      <w:proofErr w:type="spellStart"/>
-      <w:r>
-        <w:rPr>
-          <w:rFonts w:ascii="Book Antiqua" w:hAnsi="Book Antiqua"/>
-          <w:color w:val="000000"/>
-        </w:rPr>
-        <w:t>parcelas</w:t>
-      </w:r>
-      <w:proofErr w:type="spellEnd"/>
-      <w:r>
-        <w:rPr>
-          <w:rFonts w:ascii="Book Antiqua" w:hAnsi="Book Antiqua"/>
-          <w:color w:val="000000"/>
-        </w:rPr>
-        <w:t xml:space="preserve"> y </w:t>
-      </w:r>
-      <w:proofErr w:type="spellStart"/>
-      <w:r>
-        <w:rPr>
-          <w:rFonts w:ascii="Book Antiqua" w:hAnsi="Book Antiqua"/>
-          <w:color w:val="000000"/>
-        </w:rPr>
-        <w:t>lotes</w:t>
-      </w:r>
-      <w:proofErr w:type="spellEnd"/>
-      <w:r>
-        <w:rPr>
-          <w:rFonts w:ascii="Book Antiqua" w:hAnsi="Book Antiqua"/>
-          <w:color w:val="000000"/>
-        </w:rPr>
-        <w:t xml:space="preserve">) y </w:t>
-      </w:r>
-      <w:proofErr w:type="spellStart"/>
-      <w:r>
-        <w:rPr>
-          <w:rFonts w:ascii="Book Antiqua" w:hAnsi="Book Antiqua"/>
-          <w:color w:val="000000"/>
-        </w:rPr>
-        <w:t>LA_Party</w:t>
-      </w:r>
-      <w:proofErr w:type="spellEnd"/>
-      <w:r>
-        <w:rPr>
-          <w:rFonts w:ascii="Book Antiqua" w:hAnsi="Book Antiqua"/>
-          <w:color w:val="000000"/>
-        </w:rPr>
-        <w:t xml:space="preserve"> (</w:t>
-      </w:r>
-      <w:proofErr w:type="spellStart"/>
-      <w:r>
-        <w:rPr>
-          <w:rFonts w:ascii="Book Antiqua" w:hAnsi="Book Antiqua"/>
-          <w:color w:val="000000"/>
-        </w:rPr>
-        <w:t>titulares</w:t>
-      </w:r>
-      <w:proofErr w:type="spellEnd"/>
-      <w:r>
-        <w:rPr>
-          <w:rFonts w:ascii="Book Antiqua" w:hAnsi="Book Antiqua"/>
-          <w:color w:val="000000"/>
-        </w:rPr>
-        <w:t xml:space="preserve"> prediales). Si bien el estándar prescribe la semántica e interoperabilidad de la información territorial y registral, no define salvaguardas arquitectónicas a nivel de consulta contra </w:t>
-      </w:r>
-      <w:proofErr w:type="spellStart"/>
-      <w:r>
-        <w:rPr>
-          <w:rFonts w:ascii="Book Antiqua" w:hAnsi="Book Antiqua"/>
-          <w:color w:val="000000"/>
-        </w:rPr>
-        <w:t>ataques</w:t>
-      </w:r>
-      <w:proofErr w:type="spellEnd"/>
-      <w:r>
-        <w:rPr>
-          <w:rFonts w:ascii="Book Antiqua" w:hAnsi="Book Antiqua"/>
-          <w:color w:val="000000"/>
-        </w:rPr>
-        <w:t xml:space="preserve"> de </w:t>
-      </w:r>
-      <w:proofErr w:type="spellStart"/>
-      <w:r>
-        <w:rPr>
-          <w:rFonts w:ascii="Book Antiqua" w:hAnsi="Book Antiqua"/>
-          <w:color w:val="000000"/>
-        </w:rPr>
-        <w:t>inyección</w:t>
-      </w:r>
-      <w:proofErr w:type="spellEnd"/>
-      <w:r>
-        <w:rPr>
-          <w:rFonts w:ascii="Book Antiqua" w:hAnsi="Book Antiqua"/>
-          <w:color w:val="000000"/>
-        </w:rPr>
-        <w:t xml:space="preserve"> SQL, </w:t>
-      </w:r>
-      <w:proofErr w:type="spellStart"/>
-      <w:r>
-        <w:rPr>
-          <w:rFonts w:ascii="Book Antiqua" w:hAnsi="Book Antiqua"/>
-          <w:color w:val="000000"/>
-        </w:rPr>
-        <w:t>dejando</w:t>
-      </w:r>
-      <w:proofErr w:type="spellEnd"/>
-      <w:r>
-        <w:rPr>
-          <w:rFonts w:ascii="Book Antiqua" w:hAnsi="Book Antiqua"/>
-          <w:color w:val="000000"/>
-        </w:rPr>
-        <w:t xml:space="preserve"> </w:t>
-      </w:r>
-      <w:proofErr w:type="spellStart"/>
-      <w:r>
-        <w:rPr>
-          <w:rFonts w:ascii="Book Antiqua" w:hAnsi="Book Antiqua"/>
-          <w:color w:val="000000"/>
-        </w:rPr>
-        <w:t>expuesta</w:t>
-      </w:r>
-      <w:proofErr w:type="spellEnd"/>
-      <w:r>
-        <w:rPr>
-          <w:rFonts w:ascii="Book Antiqua" w:hAnsi="Book Antiqua"/>
-          <w:color w:val="000000"/>
-        </w:rPr>
-        <w:t xml:space="preserve"> la </w:t>
-      </w:r>
-      <w:proofErr w:type="spellStart"/>
-      <w:r>
-        <w:rPr>
-          <w:rFonts w:ascii="Book Antiqua" w:hAnsi="Book Antiqua"/>
-          <w:color w:val="000000"/>
-        </w:rPr>
-        <w:t>integridad</w:t>
-      </w:r>
-      <w:proofErr w:type="spellEnd"/>
-      <w:r>
-        <w:rPr>
-          <w:rFonts w:ascii="Book Antiqua" w:hAnsi="Book Antiqua"/>
-          <w:color w:val="000000"/>
-        </w:rPr>
-        <w:t xml:space="preserve"> de los derechos reales de propiedad y la recaudación fiscal ante fallas en la implementación de software.</w:t>
+      </w:r>
+      <w:proofErr w:type="spellStart"/>
+      <w:r>
+        <w:rPr>
+          <w:rFonts w:ascii="Book Antiqua" w:hAnsi="Book Antiqua"/>
+          <w:color w:val="000000"/>
+        </w:rPr>
+      </w:r>
+      <w:proofErr w:type="spellEnd"/>
+      <w:r>
+        <w:rPr>
+          <w:rFonts w:ascii="Book Antiqua" w:hAnsi="Book Antiqua"/>
+          <w:color w:val="000000"/>
+        </w:rPr>
+      </w:r>
+      <w:proofErr w:type="spellStart"/>
+      <w:r>
+        <w:rPr>
+          <w:rFonts w:ascii="Book Antiqua" w:hAnsi="Book Antiqua"/>
+          <w:color w:val="000000"/>
+        </w:rPr>
+      </w:r>
+      <w:proofErr w:type="spellEnd"/>
+      <w:r>
+        <w:rPr>
+          <w:rFonts w:ascii="Book Antiqua" w:hAnsi="Book Antiqua"/>
+          <w:color w:val="000000"/>
+        </w:rPr>
+      </w:r>
+      <w:proofErr w:type="spellStart"/>
+      <w:r>
+        <w:rPr>
+          <w:rFonts w:ascii="Book Antiqua" w:hAnsi="Book Antiqua"/>
+          <w:color w:val="000000"/>
+        </w:rPr>
+      </w:r>
+      <w:proofErr w:type="spellEnd"/>
+      <w:r>
+        <w:rPr>
+          <w:rFonts w:ascii="Book Antiqua" w:hAnsi="Book Antiqua"/>
+          <w:color w:val="000000"/>
+        </w:rPr>
+      </w:r>
+      <w:proofErr w:type="spellStart"/>
+      <w:r>
+        <w:rPr>
+          <w:rFonts w:ascii="Book Antiqua" w:hAnsi="Book Antiqua"/>
+          <w:color w:val="000000"/>
+        </w:rPr>
+      </w:r>
+      <w:proofErr w:type="spellEnd"/>
+      <w:r>
+        <w:rPr>
+          <w:rFonts w:ascii="Book Antiqua" w:hAnsi="Book Antiqua"/>
+          <w:color w:val="000000"/>
+        </w:rPr>
+      </w:r>
+      <w:proofErr w:type="spellStart"/>
+      <w:r>
+        <w:rPr>
+          <w:rFonts w:ascii="Book Antiqua" w:hAnsi="Book Antiqua"/>
+          <w:color w:val="000000"/>
+        </w:rPr>
+      </w:r>
+      <w:proofErr w:type="spellEnd"/>
+      <w:r>
+        <w:rPr>
+          <w:rFonts w:ascii="Book Antiqua" w:hAnsi="Book Antiqua"/>
+          <w:color w:val="000000"/>
+        </w:rPr>
+      </w:r>
+      <w:proofErr w:type="spellStart"/>
+      <w:r>
+        <w:rPr>
+          <w:rFonts w:ascii="Book Antiqua" w:hAnsi="Book Antiqua"/>
+          <w:color w:val="000000"/>
+        </w:rPr>
+      </w:r>
+      <w:proofErr w:type="spellEnd"/>
+      <w:r>
+        <w:rPr>
+          <w:rFonts w:ascii="Book Antiqua" w:hAnsi="Book Antiqua"/>
+          <w:color w:val="000000"/>
+        </w:rPr>
+      </w:r>
+      <w:proofErr w:type="spellStart"/>
+      <w:r>
+        <w:rPr>
+          <w:rFonts w:ascii="Book Antiqua" w:hAnsi="Book Antiqua"/>
+          <w:color w:val="000000"/>
+        </w:rPr>
+      </w:r>
+      <w:proofErr w:type="spellEnd"/>
+      <w:r>
+        <w:rPr>
+          <w:rFonts w:ascii="Book Antiqua" w:hAnsi="Book Antiqua"/>
+          <w:color w:val="000000"/>
+        </w:rPr>
+      </w:r>
+      <w:proofErr w:type="spellStart"/>
+      <w:r>
+        <w:rPr>
+          <w:rFonts w:ascii="Book Antiqua" w:hAnsi="Book Antiqua"/>
+          <w:color w:val="000000"/>
+        </w:rPr>
+      </w:r>
+      <w:proofErr w:type="spellEnd"/>
+      <w:r>
+        <w:rPr>
+          <w:rFonts w:ascii="Book Antiqua" w:hAnsi="Book Antiqua"/>
+          <w:color w:val="000000"/>
+        </w:rPr>
+      </w:r>
+      <w:proofErr w:type="spellStart"/>
+      <w:r>
+        <w:rPr>
+          <w:rFonts w:ascii="Book Antiqua" w:hAnsi="Book Antiqua"/>
+          <w:color w:val="000000"/>
+        </w:rPr>
+      </w:r>
+      <w:proofErr w:type="spellEnd"/>
+      <w:r>
+        <w:rPr>
+          <w:rFonts w:ascii="Book Antiqua" w:hAnsi="Book Antiqua"/>
+          <w:color w:val="000000"/>
+        </w:rPr>
+      </w:r>
+      <w:proofErr w:type="spellStart"/>
+      <w:r>
+        <w:rPr>
+          <w:rFonts w:ascii="Book Antiqua" w:hAnsi="Book Antiqua"/>
+          <w:color w:val="000000"/>
+        </w:rPr>
+      </w:r>
+      <w:proofErr w:type="spellEnd"/>
+      <w:r>
+        <w:rPr>
+          <w:rFonts w:ascii="Book Antiqua" w:hAnsi="Book Antiqua"/>
+          <w:color w:val="000000"/>
+        </w:rPr>
+      </w:r>
+      <w:proofErr w:type="spellStart"/>
+      <w:r>
+        <w:rPr>
+          <w:rFonts w:ascii="Book Antiqua" w:hAnsi="Book Antiqua"/>
+          <w:color w:val="000000"/>
+        </w:rPr>
+      </w:r>
+      <w:proofErr w:type="spellEnd"/>
+      <w:r>
+        <w:rPr>
+          <w:rFonts w:ascii="Book Antiqua" w:hAnsi="Book Antiqua"/>
+          <w:color w:val="000000"/>
+        </w:rPr>
+      </w:r>
+      <w:proofErr w:type="spellStart"/>
+      <w:r>
+        <w:rPr>
+          <w:rFonts w:ascii="Book Antiqua" w:hAnsi="Book Antiqua"/>
+          <w:color w:val="000000"/>
+        </w:rPr>
+      </w:r>
+      <w:proofErr w:type="spellEnd"/>
+      <w:r>
+        <w:rPr>
+          <w:rFonts w:ascii="Book Antiqua" w:hAnsi="Book Antiqua"/>
+          <w:color w:val="000000"/>
+        </w:rPr>
+      </w:r>
+      <w:r>
+        <w:rPr>
+          <w:rFonts w:ascii="Book Antiqua" w:hAnsi="Book Antiqua"/>
+          <w:color w:val="000000"/>
+        </w:rPr>
+      </w:r>
+      <w:proofErr w:type="spellStart"/>
+      <w:r>
+        <w:rPr>
+          <w:rFonts w:ascii="Book Antiqua" w:hAnsi="Book Antiqua"/>
+          <w:color w:val="000000"/>
+        </w:rPr>
+      </w:r>
+      <w:proofErr w:type="spellEnd"/>
+      <w:r>
+        <w:rPr>
+          <w:rFonts w:ascii="Book Antiqua" w:hAnsi="Book Antiqua"/>
+          <w:color w:val="000000"/>
+        </w:rPr>
+      </w:r>
+      <w:proofErr w:type="spellStart"/>
+      <w:r>
+        <w:rPr>
+          <w:rFonts w:ascii="Book Antiqua" w:hAnsi="Book Antiqua"/>
+          <w:color w:val="000000"/>
+        </w:rPr>
+      </w:r>
+      <w:proofErr w:type="spellEnd"/>
+      <w:r>
+        <w:rPr>
+          <w:rFonts w:ascii="Book Antiqua" w:hAnsi="Book Antiqua"/>
+          <w:color w:val="000000"/>
+        </w:rPr>
+      </w:r>
+      <w:proofErr w:type="spellStart"/>
+      <w:r>
+        <w:rPr>
+          <w:rFonts w:ascii="Book Antiqua" w:hAnsi="Book Antiqua"/>
+          <w:color w:val="000000"/>
+        </w:rPr>
+      </w:r>
+      <w:proofErr w:type="spellEnd"/>
+      <w:r>
+        <w:rPr>
+          <w:rFonts w:ascii="Book Antiqua" w:hAnsi="Book Antiqua"/>
+          <w:color w:val="000000"/>
+        </w:rPr>
+      </w:r>
+      <w:proofErr w:type="spellStart"/>
+      <w:r>
+        <w:rPr>
+          <w:rFonts w:ascii="Book Antiqua" w:hAnsi="Book Antiqua"/>
+          <w:color w:val="000000"/>
+        </w:rPr>
+      </w:r>
+      <w:proofErr w:type="spellEnd"/>
+      <w:r>
+        <w:rPr>
+          <w:rFonts w:ascii="Book Antiqua" w:hAnsi="Book Antiqua"/>
+          <w:color w:val="000000"/>
+        </w:rPr>
+      </w:r>
+      <w:proofErr w:type="spellStart"/>
+      <w:r>
+        <w:rPr>
+          <w:rFonts w:ascii="Book Antiqua" w:hAnsi="Book Antiqua"/>
+          <w:color w:val="000000"/>
+        </w:rPr>
+      </w:r>
+      <w:proofErr w:type="spellEnd"/>
+      <w:r>
+        <w:rPr>
+          <w:rFonts w:ascii="Book Antiqua" w:hAnsi="Book Antiqua"/>
+          <w:color w:val="000000"/>
+        </w:rPr>
+      </w:r>
+      <w:proofErr w:type="spellStart"/>
+      <w:r>
+        <w:rPr>
+          <w:rFonts w:ascii="Book Antiqua" w:hAnsi="Book Antiqua"/>
+          <w:color w:val="000000"/>
+        </w:rPr>
+      </w:r>
+      <w:proofErr w:type="spellEnd"/>
+      <w:r>
+        <w:rPr>
+          <w:rFonts w:ascii="Book Antiqua" w:hAnsi="Book Antiqua"/>
+          <w:color w:val="000000"/>
+        </w:rPr>
+      </w:r>
+      <w:proofErr w:type="spellStart"/>
+      <w:r>
+        <w:rPr>
+          <w:rFonts w:ascii="Book Antiqua" w:hAnsi="Book Antiqua"/>
+          <w:color w:val="000000"/>
+        </w:rPr>
+      </w:r>
+      <w:proofErr w:type="spellEnd"/>
+      <w:r>
+        <w:rPr>
+          <w:rFonts w:ascii="Book Antiqua" w:hAnsi="Book Antiqua"/>
+          <w:color w:val="000000"/>
+        </w:rPr>
+      </w:r>
+      <w:proofErr w:type="spellStart"/>
+      <w:r>
+        <w:rPr>
+          <w:rFonts w:ascii="Book Antiqua" w:hAnsi="Book Antiqua"/>
+          <w:color w:val="000000"/>
+        </w:rPr>
+      </w:r>
+      <w:proofErr w:type="spellEnd"/>
+      <w:r>
+        <w:rPr>
+          <w:rFonts w:ascii="Book Antiqua" w:hAnsi="Book Antiqua"/>
+          <w:color w:val="000000"/>
+        </w:rPr>
+      </w:r>
+      <w:proofErr w:type="spellStart"/>
+      <w:r>
+        <w:rPr>
+          <w:rFonts w:ascii="Book Antiqua" w:hAnsi="Book Antiqua"/>
+          <w:color w:val="000000"/>
+        </w:rPr>
+      </w:r>
+      <w:proofErr w:type="spellEnd"/>
+      <w:r>
+        <w:rPr>
+          <w:rFonts w:ascii="Book Antiqua" w:hAnsi="Book Antiqua"/>
+          <w:color w:val="000000"/>
+        </w:rPr>
+      </w:r>
+      <w:proofErr w:type="spellStart"/>
+      <w:r>
+        <w:rPr>
+          <w:rFonts w:ascii="Book Antiqua" w:hAnsi="Book Antiqua"/>
+          <w:color w:val="000000"/>
+        </w:rPr>
+      </w:r>
+      <w:proofErr w:type="spellEnd"/>
+      <w:r>
+        <w:rPr>
+          <w:rFonts w:ascii="Book Antiqua" w:hAnsi="Book Antiqua"/>
+          <w:color w:val="000000"/>
+        </w:rPr>
+      </w:r>
+      <w:proofErr w:type="spellStart"/>
+      <w:r>
+        <w:rPr>
+          <w:rFonts w:ascii="Book Antiqua" w:hAnsi="Book Antiqua"/>
+          <w:color w:val="000000"/>
+        </w:rPr>
+      </w:r>
+      <w:proofErr w:type="spellEnd"/>
+      <w:r>
+        <w:rPr>
+          <w:rFonts w:ascii="Book Antiqua" w:hAnsi="Book Antiqua"/>
+          <w:color w:val="000000"/>
+        </w:rPr>
+      </w:r>
+      <w:proofErr w:type="spellStart"/>
+      <w:r>
+        <w:rPr>
+          <w:rFonts w:ascii="Book Antiqua" w:hAnsi="Book Antiqua"/>
+          <w:color w:val="000000"/>
+        </w:rPr>
+      </w:r>
+      <w:proofErr w:type="spellEnd"/>
+      <w:r>
+        <w:rPr>
+          <w:rFonts w:ascii="Book Antiqua" w:hAnsi="Book Antiqua"/>
+          <w:color w:val="000000"/>
+        </w:rPr>
+      </w:r>
+      <w:proofErr w:type="spellStart"/>
+      <w:r>
+        <w:rPr>
+          <w:rFonts w:ascii="Book Antiqua" w:hAnsi="Book Antiqua"/>
+          <w:color w:val="000000"/>
+        </w:rPr>
+      </w:r>
+      <w:proofErr w:type="spellEnd"/>
+      <w:r>
+        <w:rPr>
+          <w:rFonts w:ascii="Book Antiqua" w:hAnsi="Book Antiqua"/>
+          <w:color w:val="000000"/>
+        </w:rPr>
+      </w:r>
+      <w:proofErr w:type="spellStart"/>
+      <w:r>
+        <w:rPr>
+          <w:rFonts w:ascii="Book Antiqua" w:hAnsi="Book Antiqua"/>
+          <w:color w:val="000000"/>
+        </w:rPr>
+      </w:r>
+      <w:proofErr w:type="spellEnd"/>
+      <w:r>
+        <w:rPr>
+          <w:rFonts w:ascii="Book Antiqua" w:hAnsi="Book Antiqua"/>
+          <w:color w:val="000000"/>
+        </w:rPr>
+      </w:r>
+      <w:proofErr w:type="spellStart"/>
+      <w:r>
+        <w:rPr>
+          <w:rFonts w:ascii="Book Antiqua" w:hAnsi="Book Antiqua"/>
+          <w:color w:val="000000"/>
+        </w:rPr>
+      </w:r>
+      <w:proofErr w:type="spellEnd"/>
+      <w:r>
+        <w:rPr>
+          <w:rFonts w:ascii="Book Antiqua" w:hAnsi="Book Antiqua"/>
+          <w:color w:val="000000"/>
+        </w:rPr>
+      </w:r>
+      <w:proofErr w:type="spellStart"/>
+      <w:r>
+        <w:rPr>
+          <w:rFonts w:ascii="Book Antiqua" w:hAnsi="Book Antiqua"/>
+          <w:color w:val="000000"/>
+        </w:rPr>
+      </w:r>
+      <w:proofErr w:type="spellEnd"/>
+      <w:r>
+        <w:rPr>
+          <w:rFonts w:ascii="Book Antiqua" w:hAnsi="Book Antiqua"/>
+          <w:color w:val="000000"/>
+        </w:rPr>
+      </w:r>
+      <w:proofErr w:type="spellStart"/>
+      <w:r>
+        <w:rPr>
+          <w:rFonts w:ascii="Book Antiqua" w:hAnsi="Book Antiqua"/>
+          <w:color w:val="000000"/>
+        </w:rPr>
+      </w:r>
+      <w:proofErr w:type="spellEnd"/>
+      <w:r>
+        <w:rPr>
+          <w:rFonts w:ascii="Book Antiqua" w:hAnsi="Book Antiqua"/>
+          <w:color w:val="000000"/>
+        </w:rPr>
+      </w:r>
+      <w:proofErr w:type="spellStart"/>
+      <w:r>
+        <w:rPr>
+          <w:rFonts w:ascii="Book Antiqua" w:hAnsi="Book Antiqua"/>
+          <w:color w:val="000000"/>
+        </w:rPr>
+      </w:r>
+      <w:proofErr w:type="spellEnd"/>
+      <w:r>
+        <w:rPr>
+          <w:rFonts w:ascii="Book Antiqua" w:hAnsi="Book Antiqua"/>
+          <w:color w:val="000000"/>
+        </w:rPr>
+      </w:r>
+      <w:proofErr w:type="spellStart"/>
+      <w:r>
+        <w:rPr>
+          <w:rFonts w:ascii="Book Antiqua" w:hAnsi="Book Antiqua"/>
+          <w:color w:val="000000"/>
+        </w:rPr>
+      </w:r>
+      <w:proofErr w:type="spellEnd"/>
+      <w:r>
+        <w:rPr>
+          <w:rFonts w:ascii="Book Antiqua" w:hAnsi="Book Antiqua"/>
+          <w:color w:val="000000"/>
+        </w:rPr>
+      </w:r>
+      <w:r>
+        <w:rPr>
+          <w:rFonts w:ascii="Book Antiqua" w:hAnsi="Book Antiqua"/>
+          <w:sz w:val="22"/>
+        </w:rPr>
+        <w:t>El estándar ISO 19152:2012, también denominado Land Administration Domain Model (LADM), es el que regula a nivel global la modelación técnica de los sistemas de información catastral. Autores de referencia como Lemmen et al. (2015) y van Oosterom et al. (2006) formalizaron las clases fundamentales del catastro, destacando LA_SpatialUnit (parcelas y lotes) y LA_Party (titulares prediales), extendidas posteriormente hacia modelos de valoración masiva automatizada (Kara et al., 2021). Si bien el estándar prescribe la semántica e interoperabilidad de la información territorial y registral, no define salvaguardas arquitectónicas a nivel de consulta contra ataques de inyección SQL, dejando expuesta la integridad de los derechos reales de propiedad y la recaudación fiscal ante fallas en la implementación de software.</w:t>
       </w:r>
     </w:p>
     <w:p>
@@ -5073,199 +4968,181 @@
           <w:rFonts w:ascii="Book Antiqua" w:hAnsi="Book Antiqua"/>
           <w:color w:val="000000"/>
         </w:rPr>
-        <w:t xml:space="preserve">Se estructuraron seis vectores de explotación orientados a las </w:t>
-      </w:r>
-      <w:proofErr w:type="spellStart"/>
-      <w:r>
-        <w:rPr>
-          <w:rFonts w:ascii="Book Antiqua" w:hAnsi="Book Antiqua"/>
-          <w:color w:val="000000"/>
-        </w:rPr>
-        <w:t>tres</w:t>
-      </w:r>
-      <w:proofErr w:type="spellEnd"/>
-      <w:r>
-        <w:rPr>
-          <w:rFonts w:ascii="Book Antiqua" w:hAnsi="Book Antiqua"/>
-          <w:color w:val="000000"/>
-        </w:rPr>
-        <w:t xml:space="preserve"> </w:t>
-      </w:r>
-      <w:proofErr w:type="spellStart"/>
-      <w:r>
-        <w:rPr>
-          <w:rFonts w:ascii="Book Antiqua" w:hAnsi="Book Antiqua"/>
-          <w:color w:val="000000"/>
-        </w:rPr>
-        <w:t>dimensiones</w:t>
-      </w:r>
-      <w:proofErr w:type="spellEnd"/>
-      <w:r>
-        <w:rPr>
-          <w:rFonts w:ascii="Book Antiqua" w:hAnsi="Book Antiqua"/>
-          <w:color w:val="000000"/>
-        </w:rPr>
-        <w:t xml:space="preserve"> de la </w:t>
-      </w:r>
-      <w:proofErr w:type="spellStart"/>
-      <w:r>
-        <w:rPr>
-          <w:rFonts w:ascii="Book Antiqua" w:hAnsi="Book Antiqua"/>
-          <w:color w:val="000000"/>
-        </w:rPr>
-        <w:t>tríada</w:t>
-      </w:r>
-      <w:proofErr w:type="spellEnd"/>
-      <w:r>
-        <w:rPr>
-          <w:rFonts w:ascii="Book Antiqua" w:hAnsi="Book Antiqua"/>
-          <w:color w:val="000000"/>
-        </w:rPr>
-        <w:t xml:space="preserve"> CIA (</w:t>
-      </w:r>
-      <w:proofErr w:type="spellStart"/>
-      <w:r>
-        <w:rPr>
-          <w:rFonts w:ascii="Book Antiqua" w:hAnsi="Book Antiqua"/>
-          <w:color w:val="000000"/>
-        </w:rPr>
-        <w:t>Confidencialidad</w:t>
-      </w:r>
-      <w:proofErr w:type="spellEnd"/>
-      <w:r>
-        <w:rPr>
-          <w:rFonts w:ascii="Book Antiqua" w:hAnsi="Book Antiqua"/>
-          <w:color w:val="000000"/>
-        </w:rPr>
-        <w:t xml:space="preserve">, </w:t>
-      </w:r>
-      <w:proofErr w:type="spellStart"/>
-      <w:r>
-        <w:rPr>
-          <w:rFonts w:ascii="Book Antiqua" w:hAnsi="Book Antiqua"/>
-          <w:color w:val="000000"/>
-        </w:rPr>
-        <w:t>Integridad</w:t>
-      </w:r>
-      <w:proofErr w:type="spellEnd"/>
-      <w:r>
-        <w:rPr>
-          <w:rFonts w:ascii="Book Antiqua" w:hAnsi="Book Antiqua"/>
-          <w:color w:val="000000"/>
-        </w:rPr>
-        <w:t xml:space="preserve"> y </w:t>
-      </w:r>
-      <w:proofErr w:type="spellStart"/>
-      <w:r>
-        <w:rPr>
-          <w:rFonts w:ascii="Book Antiqua" w:hAnsi="Book Antiqua"/>
-          <w:color w:val="000000"/>
-        </w:rPr>
-        <w:t>Disponibilidad</w:t>
-      </w:r>
-      <w:proofErr w:type="spellEnd"/>
-      <w:r>
-        <w:rPr>
-          <w:rFonts w:ascii="Book Antiqua" w:hAnsi="Book Antiqua"/>
-          <w:color w:val="000000"/>
-        </w:rPr>
-        <w:t xml:space="preserve">). La </w:t>
-      </w:r>
-      <w:proofErr w:type="spellStart"/>
-      <w:r>
-        <w:rPr>
-          <w:rFonts w:ascii="Book Antiqua" w:hAnsi="Book Antiqua"/>
-          <w:color w:val="000000"/>
-        </w:rPr>
-        <w:t>evaluación</w:t>
-      </w:r>
-      <w:proofErr w:type="spellEnd"/>
-      <w:r>
-        <w:rPr>
-          <w:rFonts w:ascii="Book Antiqua" w:hAnsi="Book Antiqua"/>
-          <w:color w:val="000000"/>
-        </w:rPr>
-        <w:t xml:space="preserve"> de </w:t>
-      </w:r>
-      <w:proofErr w:type="spellStart"/>
-      <w:r>
-        <w:rPr>
-          <w:rFonts w:ascii="Book Antiqua" w:hAnsi="Book Antiqua"/>
-          <w:color w:val="000000"/>
-        </w:rPr>
-        <w:t>rendimiento</w:t>
-      </w:r>
-      <w:proofErr w:type="spellEnd"/>
-      <w:r>
-        <w:rPr>
-          <w:rFonts w:ascii="Book Antiqua" w:hAnsi="Book Antiqua"/>
-          <w:color w:val="000000"/>
-        </w:rPr>
-        <w:t xml:space="preserve"> </w:t>
-      </w:r>
-      <w:proofErr w:type="spellStart"/>
-      <w:r>
-        <w:rPr>
-          <w:rFonts w:ascii="Book Antiqua" w:hAnsi="Book Antiqua"/>
-          <w:color w:val="000000"/>
-        </w:rPr>
-        <w:t>contempló</w:t>
-      </w:r>
-      <w:proofErr w:type="spellEnd"/>
-      <w:r>
-        <w:rPr>
-          <w:rFonts w:ascii="Book Antiqua" w:hAnsi="Book Antiqua"/>
-          <w:color w:val="000000"/>
-        </w:rPr>
-        <w:t xml:space="preserve"> </w:t>
-      </w:r>
-      <w:proofErr w:type="spellStart"/>
-      <w:r>
-        <w:rPr>
-          <w:rFonts w:ascii="Book Antiqua" w:hAnsi="Book Antiqua"/>
-          <w:color w:val="000000"/>
-        </w:rPr>
-        <w:t>una</w:t>
-      </w:r>
-      <w:proofErr w:type="spellEnd"/>
-      <w:r>
-        <w:rPr>
-          <w:rFonts w:ascii="Book Antiqua" w:hAnsi="Book Antiqua"/>
-          <w:color w:val="000000"/>
-        </w:rPr>
-        <w:t xml:space="preserve"> </w:t>
-      </w:r>
-      <w:proofErr w:type="spellStart"/>
-      <w:r>
-        <w:rPr>
-          <w:rFonts w:ascii="Book Antiqua" w:hAnsi="Book Antiqua"/>
-          <w:color w:val="000000"/>
-        </w:rPr>
-        <w:t>carga</w:t>
-      </w:r>
-      <w:proofErr w:type="spellEnd"/>
-      <w:r>
-        <w:rPr>
-          <w:rFonts w:ascii="Book Antiqua" w:hAnsi="Book Antiqua"/>
-          <w:color w:val="000000"/>
-        </w:rPr>
-        <w:t xml:space="preserve"> de 300 </w:t>
-      </w:r>
-      <w:proofErr w:type="spellStart"/>
-      <w:r>
-        <w:rPr>
-          <w:rFonts w:ascii="Book Antiqua" w:hAnsi="Book Antiqua"/>
-          <w:color w:val="000000"/>
-        </w:rPr>
-        <w:t>peticiones</w:t>
-      </w:r>
-      <w:proofErr w:type="spellEnd"/>
-      <w:r>
-        <w:rPr>
-          <w:rFonts w:ascii="Book Antiqua" w:hAnsi="Book Antiqua"/>
-          <w:color w:val="000000"/>
-        </w:rPr>
-        <w:t xml:space="preserve"> y curvas de concurrencia escalonada (1 a 100 clientes), registrando métricas de latencia (media, p50, p95, p99) y throughput (req/s).</w:t>
+      </w:r>
+      <w:proofErr w:type="spellStart"/>
+      <w:r>
+        <w:rPr>
+          <w:rFonts w:ascii="Book Antiqua" w:hAnsi="Book Antiqua"/>
+          <w:color w:val="000000"/>
+        </w:rPr>
+      </w:r>
+      <w:proofErr w:type="spellEnd"/>
+      <w:r>
+        <w:rPr>
+          <w:rFonts w:ascii="Book Antiqua" w:hAnsi="Book Antiqua"/>
+          <w:color w:val="000000"/>
+        </w:rPr>
+      </w:r>
+      <w:proofErr w:type="spellStart"/>
+      <w:r>
+        <w:rPr>
+          <w:rFonts w:ascii="Book Antiqua" w:hAnsi="Book Antiqua"/>
+          <w:color w:val="000000"/>
+        </w:rPr>
+      </w:r>
+      <w:proofErr w:type="spellEnd"/>
+      <w:r>
+        <w:rPr>
+          <w:rFonts w:ascii="Book Antiqua" w:hAnsi="Book Antiqua"/>
+          <w:color w:val="000000"/>
+        </w:rPr>
+      </w:r>
+      <w:proofErr w:type="spellStart"/>
+      <w:r>
+        <w:rPr>
+          <w:rFonts w:ascii="Book Antiqua" w:hAnsi="Book Antiqua"/>
+          <w:color w:val="000000"/>
+        </w:rPr>
+      </w:r>
+      <w:proofErr w:type="spellEnd"/>
+      <w:r>
+        <w:rPr>
+          <w:rFonts w:ascii="Book Antiqua" w:hAnsi="Book Antiqua"/>
+          <w:color w:val="000000"/>
+        </w:rPr>
+      </w:r>
+      <w:proofErr w:type="spellStart"/>
+      <w:r>
+        <w:rPr>
+          <w:rFonts w:ascii="Book Antiqua" w:hAnsi="Book Antiqua"/>
+          <w:color w:val="000000"/>
+        </w:rPr>
+      </w:r>
+      <w:proofErr w:type="spellEnd"/>
+      <w:r>
+        <w:rPr>
+          <w:rFonts w:ascii="Book Antiqua" w:hAnsi="Book Antiqua"/>
+          <w:color w:val="000000"/>
+        </w:rPr>
+      </w:r>
+      <w:proofErr w:type="spellStart"/>
+      <w:r>
+        <w:rPr>
+          <w:rFonts w:ascii="Book Antiqua" w:hAnsi="Book Antiqua"/>
+          <w:color w:val="000000"/>
+        </w:rPr>
+      </w:r>
+      <w:proofErr w:type="spellEnd"/>
+      <w:r>
+        <w:rPr>
+          <w:rFonts w:ascii="Book Antiqua" w:hAnsi="Book Antiqua"/>
+          <w:color w:val="000000"/>
+        </w:rPr>
+      </w:r>
+      <w:proofErr w:type="spellStart"/>
+      <w:r>
+        <w:rPr>
+          <w:rFonts w:ascii="Book Antiqua" w:hAnsi="Book Antiqua"/>
+          <w:color w:val="000000"/>
+        </w:rPr>
+      </w:r>
+      <w:proofErr w:type="spellEnd"/>
+      <w:r>
+        <w:rPr>
+          <w:rFonts w:ascii="Book Antiqua" w:hAnsi="Book Antiqua"/>
+          <w:color w:val="000000"/>
+        </w:rPr>
+      </w:r>
+      <w:proofErr w:type="spellStart"/>
+      <w:r>
+        <w:rPr>
+          <w:rFonts w:ascii="Book Antiqua" w:hAnsi="Book Antiqua"/>
+          <w:color w:val="000000"/>
+        </w:rPr>
+      </w:r>
+      <w:proofErr w:type="spellEnd"/>
+      <w:r>
+        <w:rPr>
+          <w:rFonts w:ascii="Book Antiqua" w:hAnsi="Book Antiqua"/>
+          <w:color w:val="000000"/>
+        </w:rPr>
+      </w:r>
+      <w:proofErr w:type="spellStart"/>
+      <w:r>
+        <w:rPr>
+          <w:rFonts w:ascii="Book Antiqua" w:hAnsi="Book Antiqua"/>
+          <w:color w:val="000000"/>
+        </w:rPr>
+      </w:r>
+      <w:proofErr w:type="spellEnd"/>
+      <w:r>
+        <w:rPr>
+          <w:rFonts w:ascii="Book Antiqua" w:hAnsi="Book Antiqua"/>
+          <w:color w:val="000000"/>
+        </w:rPr>
+      </w:r>
+      <w:proofErr w:type="spellStart"/>
+      <w:r>
+        <w:rPr>
+          <w:rFonts w:ascii="Book Antiqua" w:hAnsi="Book Antiqua"/>
+          <w:color w:val="000000"/>
+        </w:rPr>
+      </w:r>
+      <w:proofErr w:type="spellEnd"/>
+      <w:r>
+        <w:rPr>
+          <w:rFonts w:ascii="Book Antiqua" w:hAnsi="Book Antiqua"/>
+          <w:color w:val="000000"/>
+        </w:rPr>
+      </w:r>
+      <w:proofErr w:type="spellStart"/>
+      <w:r>
+        <w:rPr>
+          <w:rFonts w:ascii="Book Antiqua" w:hAnsi="Book Antiqua"/>
+          <w:color w:val="000000"/>
+        </w:rPr>
+      </w:r>
+      <w:proofErr w:type="spellEnd"/>
+      <w:r>
+        <w:rPr>
+          <w:rFonts w:ascii="Book Antiqua" w:hAnsi="Book Antiqua"/>
+          <w:color w:val="000000"/>
+        </w:rPr>
+      </w:r>
+      <w:proofErr w:type="spellStart"/>
+      <w:r>
+        <w:rPr>
+          <w:rFonts w:ascii="Book Antiqua" w:hAnsi="Book Antiqua"/>
+          <w:color w:val="000000"/>
+        </w:rPr>
+      </w:r>
+      <w:proofErr w:type="spellEnd"/>
+      <w:r>
+        <w:rPr>
+          <w:rFonts w:ascii="Book Antiqua" w:hAnsi="Book Antiqua"/>
+          <w:color w:val="000000"/>
+        </w:rPr>
+      </w:r>
+      <w:proofErr w:type="spellStart"/>
+      <w:r>
+        <w:rPr>
+          <w:rFonts w:ascii="Book Antiqua" w:hAnsi="Book Antiqua"/>
+          <w:color w:val="000000"/>
+        </w:rPr>
+      </w:r>
+      <w:proofErr w:type="spellEnd"/>
+      <w:r>
+        <w:rPr>
+          <w:rFonts w:ascii="Book Antiqua" w:hAnsi="Book Antiqua"/>
+          <w:color w:val="000000"/>
+        </w:rPr>
+      </w:r>
+      <w:r>
+        <w:rPr>
+          <w:rFonts w:ascii="Book Antiqua" w:hAnsi="Book Antiqua"/>
+          <w:sz w:val="22"/>
+        </w:rPr>
+        <w:t>Se estructuraron seis vectores de explotación basados en las directrices de prueba de inyección de la Web Security Testing Guide (OWASP Foundation, 2023), orientados a las tres dimensiones de la tríada CIA (Confidencialidad, Integridad y Disponibilidad). La evaluación de rendimiento contempló una carga de 300 peticiones y curvas de concurrencia escalonada (1 a 100 clientes), registrando métricas de latencia (media, p50, p95, p99) y throughput (req/s).</w:t>
       </w:r>
     </w:p>
     <w:p>
@@ -8282,6 +8159,12 @@
           <w:rFonts w:ascii="Book Antiqua" w:hAnsi="Book Antiqua"/>
           <w:color w:val="000000"/>
         </w:rPr>
+      </w:r>
+      <w:r>
+        <w:rPr>
+          <w:rFonts w:ascii="Book Antiqua" w:hAnsi="Book Antiqua"/>
+          <w:sz w:val="22"/>
+        </w:rPr>
         <w:t>Agarwal, S., &amp; Rajan, K. S. (2016). Performance analysis of MongoDB versus PostGIS/PostgreSQL databases for line intersection and point containment spatial queries. Spatial Information Research, 24(6), 669–677. https://doi.org/10.1007/s41324-016-0059-1</w:t>
       </w:r>
     </w:p>
@@ -8295,6 +8178,12 @@
           <w:rFonts w:ascii="Book Antiqua" w:hAnsi="Book Antiqua"/>
           <w:color w:val="000000"/>
         </w:rPr>
+      </w:r>
+      <w:r>
+        <w:rPr>
+          <w:rFonts w:ascii="Book Antiqua" w:hAnsi="Book Antiqua"/>
+          <w:sz w:val="22"/>
+        </w:rPr>
         <w:t>Atluri, V., &amp; Chun, S. A. (2004). An authorization model for geospatial data. IEEE Transactions on Dependable and Secure Computing, 1(4), 238–254. https://doi.org/10.1109/TDSC.2004.34</w:t>
       </w:r>
     </w:p>
@@ -8308,6 +8197,12 @@
           <w:rFonts w:ascii="Book Antiqua" w:hAnsi="Book Antiqua"/>
           <w:color w:val="000000"/>
         </w:rPr>
+      </w:r>
+      <w:r>
+        <w:rPr>
+          <w:rFonts w:ascii="Book Antiqua" w:hAnsi="Book Antiqua"/>
+          <w:sz w:val="22"/>
+        </w:rPr>
         <w:t>Bertino, E., Catania, B., &amp; Damiani, M. L. (2005). GEO-RBAC: A spatially aware RBAC. In Proceedings of the 10th ACM Symposium on Access Control Models and Technologies (SACMAT '05) (pp. 29–37). Association for Computing Machinery. https://doi.org/10.1145/1063979.1063985</w:t>
       </w:r>
     </w:p>
@@ -8321,15 +8216,19 @@
           <w:rFonts w:ascii="Book Antiqua" w:hAnsi="Book Antiqua"/>
           <w:color w:val="000000"/>
         </w:rPr>
-        <w:t xml:space="preserve">Chun, S. A., &amp; Atluri, V. (2008). Geospatial database security. In H. Chen, T. S. Raghu, R. Ramesh, R. Sharman, &amp; S. Chakravarty (Eds.), Handbook of </w:t>
-      </w:r>
-      <w:r>
-        <w:rPr>
-          <w:rFonts w:ascii="Book Antiqua" w:hAnsi="Book Antiqua"/>
-          <w:color w:val="000000"/>
-        </w:rPr>
-        <w:lastRenderedPageBreak/>
-        <w:t>Database Security: Applications and Trends (pp. 251–277). Springer. https://doi.org/10.1007/978-0-387-48533-1_11</w:t>
+      </w:r>
+      <w:r>
+        <w:rPr>
+          <w:rFonts w:ascii="Book Antiqua" w:hAnsi="Book Antiqua"/>
+          <w:color w:val="000000"/>
+        </w:rPr>
+      </w:r>
+      <w:r>
+        <w:rPr>
+          <w:rFonts w:ascii="Book Antiqua" w:hAnsi="Book Antiqua"/>
+          <w:sz w:val="22"/>
+        </w:rPr>
+        <w:t>Chun, S. A., &amp; Atluri, V. (2008). Geospatial database security. In H. Chen, T. S. Raghu, R. Ramesh, R. Sharman, &amp; S. Chakravarty (Eds.), Handbook of Database Security: Applications and Trends (pp. 251–277). Springer. https://doi.org/10.1007/978-0-387-48533-1_11</w:t>
       </w:r>
     </w:p>
     <w:p>
@@ -8342,6 +8241,12 @@
           <w:rFonts w:ascii="Book Antiqua" w:hAnsi="Book Antiqua"/>
           <w:color w:val="000000"/>
         </w:rPr>
+      </w:r>
+      <w:r>
+        <w:rPr>
+          <w:rFonts w:ascii="Book Antiqua" w:hAnsi="Book Antiqua"/>
+          <w:sz w:val="22"/>
+        </w:rPr>
         <w:t>Clarke, J. (2012). SQL Injection Attacks and Defense (2nd ed.). Syngress / Elsevier.</w:t>
       </w:r>
     </w:p>
@@ -8355,6 +8260,12 @@
           <w:rFonts w:ascii="Book Antiqua" w:hAnsi="Book Antiqua"/>
           <w:color w:val="000000"/>
         </w:rPr>
+      </w:r>
+      <w:r>
+        <w:rPr>
+          <w:rFonts w:ascii="Book Antiqua" w:hAnsi="Book Antiqua"/>
+          <w:sz w:val="22"/>
+        </w:rPr>
         <w:t>Crosby, S. A., &amp; Wallach, D. S. (2003). Denial of service via algorithmic complexity attacks. In Proceedings of the 12th USENIX Security Symposium (pp. 29–44). USENIX Association.</w:t>
       </w:r>
     </w:p>
@@ -8368,6 +8279,12 @@
           <w:rFonts w:ascii="Book Antiqua" w:hAnsi="Book Antiqua"/>
           <w:color w:val="000000"/>
         </w:rPr>
+      </w:r>
+      <w:r>
+        <w:rPr>
+          <w:rFonts w:ascii="Book Antiqua" w:hAnsi="Book Antiqua"/>
+          <w:sz w:val="22"/>
+        </w:rPr>
         <w:t>Egenhofer, M. J. (1994). Spatial SQL: A query and presentation language. IEEE Transactions on Knowledge and Data Engineering, 6(1), 86–95. https://doi.org/10.1109/69.273029</w:t>
       </w:r>
     </w:p>
@@ -8381,6 +8298,12 @@
           <w:rFonts w:ascii="Book Antiqua" w:hAnsi="Book Antiqua"/>
           <w:color w:val="000000"/>
         </w:rPr>
+      </w:r>
+      <w:r>
+        <w:rPr>
+          <w:rFonts w:ascii="Book Antiqua" w:hAnsi="Book Antiqua"/>
+          <w:sz w:val="22"/>
+        </w:rPr>
         <w:t>Halfond, W. G., Viegas, J., &amp; Orso, A. (2006). A classification of SQL-injection attacks and countermeasures. In Proceedings of the IEEE International Symposium on Secure Software Engineering (ISSSE '06). IEEE.</w:t>
       </w:r>
     </w:p>
@@ -8394,7 +8317,13 @@
           <w:rFonts w:ascii="Book Antiqua" w:hAnsi="Book Antiqua"/>
           <w:color w:val="000000"/>
         </w:rPr>
-        <w:t>Lemmen, C., van Oosterom, P., &amp; Bennett, R. (2015). The Land Administration Domain Model. Land Use Policy, 49, 535–545. https://doi.org/10.1016/j.landusepol.2015.01.014</w:t>
+      </w:r>
+      <w:r>
+        <w:rPr>
+          <w:rFonts w:ascii="Book Antiqua" w:hAnsi="Book Antiqua"/>
+          <w:sz w:val="22"/>
+        </w:rPr>
+        <w:t>Kara, A., Çağdaş, V., Isikdag, U., van Oosterom, P., Lemmen, C., &amp; Stubkjær, E. (2021). Towards the LADM Valuation Information Model: A case study in Turkey. Land Use Policy, 109, 105658. https://doi.org/10.1016/j.landusepol.2021.105658</w:t>
       </w:r>
     </w:p>
     <w:p>
@@ -8407,7 +8336,13 @@
           <w:rFonts w:ascii="Book Antiqua" w:hAnsi="Book Antiqua"/>
           <w:color w:val="000000"/>
         </w:rPr>
-        <w:t>National Vulnerability Database. (2023). CVE-2023-25157 Detail: GeoServer SQL Injection Vulnerability. National Institute of Standards and Technology. https://nvd.nist.gov/vuln/detail/CVE-2023-25157</w:t>
+      </w:r>
+      <w:r>
+        <w:rPr>
+          <w:rFonts w:ascii="Book Antiqua" w:hAnsi="Book Antiqua"/>
+          <w:sz w:val="22"/>
+        </w:rPr>
+        <w:t>Lemmen, C., van Oosterom, P., &amp; Bennett, R. (2015). The Land Administration Domain Model. Land Use Policy, 49, 535–545. https://doi.org/10.1016/j.landusepol.2015.01.014</w:t>
       </w:r>
     </w:p>
     <w:p>
@@ -8420,7 +8355,13 @@
           <w:rFonts w:ascii="Book Antiqua" w:hAnsi="Book Antiqua"/>
           <w:color w:val="000000"/>
         </w:rPr>
-        <w:t>Obe, R. O., &amp; Hsu, L. S. (2021). PostGIS in Action (3rd ed.). Manning Publications.</w:t>
+      </w:r>
+      <w:r>
+        <w:rPr>
+          <w:rFonts w:ascii="Book Antiqua" w:hAnsi="Book Antiqua"/>
+          <w:sz w:val="22"/>
+        </w:rPr>
+        <w:t>National Vulnerability Database. (2023). CVE-2023-25157 Detail: GeoServer SQL Injection Vulnerability. National Institute of Standards and Technology. https://nvd.nist.gov/vuln/detail/CVE-2023-25157</w:t>
       </w:r>
     </w:p>
     <w:p>
@@ -8432,6 +8373,51 @@
         <w:rPr>
           <w:rFonts w:ascii="Book Antiqua" w:hAnsi="Book Antiqua"/>
           <w:color w:val="000000"/>
+        </w:rPr>
+      </w:r>
+      <w:r>
+        <w:rPr>
+          <w:rFonts w:ascii="Book Antiqua" w:hAnsi="Book Antiqua"/>
+          <w:sz w:val="22"/>
+        </w:rPr>
+        <w:t>Obe, R. O., &amp; Hsu, L. S. (2021). PostGIS in Action (3rd ed.). Manning Publications.</w:t>
+      </w:r>
+    </w:p>
+    <w:p>
+      <w:pPr>
+        <w:spacing w:after="80" w:line="240" w:lineRule="auto"/>
+        <w:ind w:left="720" w:hanging="720"/>
+      </w:pPr>
+      <w:r>
+        <w:rPr>
+          <w:rFonts w:ascii="Book Antiqua" w:hAnsi="Book Antiqua"/>
+          <w:sz w:val="22"/>
+        </w:rPr>
+        <w:t>OWASP Foundation. (2021). OWASP Top 10:2021 - The Ten Most Critical Web Application Security Risks. Open Web Application Security Project. https://owasp.org/Top10/</w:t>
+      </w:r>
+    </w:p>
+    <w:p>
+      <w:pPr>
+        <w:spacing w:after="80" w:line="240" w:lineRule="auto"/>
+        <w:ind w:left="720" w:hanging="720"/>
+      </w:pPr>
+      <w:r>
+        <w:rPr>
+          <w:rFonts w:ascii="Book Antiqua" w:hAnsi="Book Antiqua"/>
+          <w:sz w:val="22"/>
+        </w:rPr>
+        <w:t>OWASP Foundation. (2023). Web Security Testing Guide (WSTG v4.2). Open Web Application Security Project. https://owasp.org/www-project-web-security-testing-guide/</w:t>
+      </w:r>
+    </w:p>
+    <w:p>
+      <w:pPr>
+        <w:spacing w:after="80" w:line="240" w:lineRule="auto"/>
+        <w:ind w:left="720" w:hanging="720"/>
+      </w:pPr>
+      <w:r>
+        <w:rPr>
+          <w:rFonts w:ascii="Book Antiqua" w:hAnsi="Book Antiqua"/>
+          <w:sz w:val="22"/>
         </w:rPr>
         <w:t>van Oosterom, P., Lemmen, C., &amp; Ingvarsson, T. (2006). The core cadastral domain model. Computers, Environment and Urban Systems, 30(5), 627–660. https://doi.org/10.1016/j.compenvurbsys.2005.12.002</w:t>
       </w:r>

</xml_diff>